<commit_message>
docs: refine delivery visuals round 5
</commit_message>
<xml_diff>
--- a/docs/design/cc_ep_protocol_overview.docx
+++ b/docs/design/cc_ep_protocol_overview.docx
@@ -23,18 +23,18 @@
         <w:rPr>
           <w:rFonts w:ascii="Calibri" w:hAnsi="Calibri" w:eastAsia="Microsoft YaHei" w:cs="Calibri"/>
         </w:rPr>
-        <w:t xml:space="preserve">文档版本﻿：﻿V﻿1﻿.﻿0</w:t>
-      </w:r>
-    </w:p>
-    <w:p>
-      <w:pPr>
-        <w:ind w:left="0" w:firstLine="420"/>
-      </w:pPr>
-      <w:r>
-        <w:rPr>
-          <w:rFonts w:ascii="Calibri" w:hAnsi="Calibri" w:eastAsia="Microsoft YaHei" w:cs="Calibri"/>
-        </w:rPr>
-        <w:t xml:space="preserve">交付阶段：正式﻿文﻿档﻿第﻿一﻿版</w:t>
+        <w:t xml:space="preserve">文档版本⁠：⁠V⁠1⁠.⁠0</w:t>
+      </w:r>
+    </w:p>
+    <w:p>
+      <w:pPr>
+        <w:ind w:left="0" w:firstLine="420"/>
+      </w:pPr>
+      <w:r>
+        <w:rPr>
+          <w:rFonts w:ascii="Calibri" w:hAnsi="Calibri" w:eastAsia="Microsoft YaHei" w:cs="Calibri"/>
+        </w:rPr>
+        <w:t xml:space="preserve">交付阶段：正式⁠文⁠档⁠第⁠一⁠版</w:t>
       </w:r>
     </w:p>
     <w:p>
@@ -84,84 +84,84 @@
         <w:rPr>
           <w:rFonts w:ascii="Calibri" w:hAnsi="Calibri" w:eastAsia="Microsoft YaHei" w:cs="Calibri"/>
         </w:rPr>
-        <w:t xml:space="preserve">1.﻿ ﻿方﻿案﻿概﻿述</w:t>
-      </w:r>
-    </w:p>
-    <w:p>
-      <w:pPr>
-        <w:ind w:left="0" w:firstLine="420"/>
-      </w:pPr>
-      <w:r>
-        <w:rPr>
-          <w:rFonts w:ascii="Calibri" w:hAnsi="Calibri" w:eastAsia="Microsoft YaHei" w:cs="Calibri"/>
-        </w:rPr>
-        <w:t xml:space="preserve">2. 总﻿体﻿体﻿系﻿结﻿构</w:t>
-      </w:r>
-    </w:p>
-    <w:p>
-      <w:pPr>
-        <w:ind w:left="0" w:firstLine="420"/>
-      </w:pPr>
-      <w:r>
-        <w:rPr>
-          <w:rFonts w:ascii="Calibri" w:hAnsi="Calibri" w:eastAsia="Microsoft YaHei" w:cs="Calibri"/>
-        </w:rPr>
-        <w:t xml:space="preserve">3. 核﻿心﻿组﻿件﻿设﻿计</w:t>
-      </w:r>
-    </w:p>
-    <w:p>
-      <w:pPr>
-        <w:ind w:left="0" w:firstLine="420"/>
-      </w:pPr>
-      <w:r>
-        <w:rPr>
-          <w:rFonts w:ascii="Calibri" w:hAnsi="Calibri" w:eastAsia="Microsoft YaHei" w:cs="Calibri"/>
-        </w:rPr>
-        <w:t xml:space="preserve">4. 全局﻿一﻿致﻿性﻿语﻿义</w:t>
-      </w:r>
-    </w:p>
-    <w:p>
-      <w:pPr>
-        <w:ind w:left="0" w:firstLine="420"/>
-      </w:pPr>
-      <w:r>
-        <w:rPr>
-          <w:rFonts w:ascii="Calibri" w:hAnsi="Calibri" w:eastAsia="Microsoft YaHei" w:cs="Calibri"/>
-        </w:rPr>
-        <w:t xml:space="preserve">5. 关﻿键﻿协﻿议﻿路﻿径</w:t>
-      </w:r>
-    </w:p>
-    <w:p>
-      <w:pPr>
-        <w:ind w:left="0" w:firstLine="420"/>
-      </w:pPr>
-      <w:r>
-        <w:rPr>
-          <w:rFonts w:ascii="Calibri" w:hAnsi="Calibri" w:eastAsia="Microsoft YaHei" w:cs="Calibri"/>
-        </w:rPr>
-        <w:t xml:space="preserve">6. 并发仲裁﻿与﻿活﻿性﻿机﻿制</w:t>
-      </w:r>
-    </w:p>
-    <w:p>
-      <w:pPr>
-        <w:ind w:left="0" w:firstLine="420"/>
-      </w:pPr>
-      <w:r>
-        <w:rPr>
-          <w:rFonts w:ascii="Calibri" w:hAnsi="Calibri" w:eastAsia="Microsoft YaHei" w:cs="Calibri"/>
-        </w:rPr>
-        <w:t xml:space="preserve">7. 方案价值﻿与﻿架﻿构﻿比﻿较</w:t>
-      </w:r>
-    </w:p>
-    <w:p>
-      <w:pPr>
-        <w:ind w:left="0" w:firstLine="420"/>
-      </w:pPr>
-      <w:r>
-        <w:rPr>
-          <w:rFonts w:ascii="Calibri" w:hAnsi="Calibri" w:eastAsia="Microsoft YaHei" w:cs="Calibri"/>
-        </w:rPr>
-        <w:t xml:space="preserve">8.﻿ ﻿集﻿成﻿边﻿界</w:t>
+        <w:t xml:space="preserve">1.⁠ ⁠方⁠案⁠概⁠述</w:t>
+      </w:r>
+    </w:p>
+    <w:p>
+      <w:pPr>
+        <w:ind w:left="0" w:firstLine="420"/>
+      </w:pPr>
+      <w:r>
+        <w:rPr>
+          <w:rFonts w:ascii="Calibri" w:hAnsi="Calibri" w:eastAsia="Microsoft YaHei" w:cs="Calibri"/>
+        </w:rPr>
+        <w:t xml:space="preserve">2. 总⁠体⁠体⁠系⁠结⁠构</w:t>
+      </w:r>
+    </w:p>
+    <w:p>
+      <w:pPr>
+        <w:ind w:left="0" w:firstLine="420"/>
+      </w:pPr>
+      <w:r>
+        <w:rPr>
+          <w:rFonts w:ascii="Calibri" w:hAnsi="Calibri" w:eastAsia="Microsoft YaHei" w:cs="Calibri"/>
+        </w:rPr>
+        <w:t xml:space="preserve">3. 核⁠心⁠组⁠件⁠设⁠计</w:t>
+      </w:r>
+    </w:p>
+    <w:p>
+      <w:pPr>
+        <w:ind w:left="0" w:firstLine="420"/>
+      </w:pPr>
+      <w:r>
+        <w:rPr>
+          <w:rFonts w:ascii="Calibri" w:hAnsi="Calibri" w:eastAsia="Microsoft YaHei" w:cs="Calibri"/>
+        </w:rPr>
+        <w:t xml:space="preserve">4. 全局⁠一⁠致⁠性⁠语⁠义</w:t>
+      </w:r>
+    </w:p>
+    <w:p>
+      <w:pPr>
+        <w:ind w:left="0" w:firstLine="420"/>
+      </w:pPr>
+      <w:r>
+        <w:rPr>
+          <w:rFonts w:ascii="Calibri" w:hAnsi="Calibri" w:eastAsia="Microsoft YaHei" w:cs="Calibri"/>
+        </w:rPr>
+        <w:t xml:space="preserve">5. 关⁠键⁠协⁠议⁠路⁠径</w:t>
+      </w:r>
+    </w:p>
+    <w:p>
+      <w:pPr>
+        <w:ind w:left="0" w:firstLine="420"/>
+      </w:pPr>
+      <w:r>
+        <w:rPr>
+          <w:rFonts w:ascii="Calibri" w:hAnsi="Calibri" w:eastAsia="Microsoft YaHei" w:cs="Calibri"/>
+        </w:rPr>
+        <w:t xml:space="preserve">6. 并发仲裁⁠与⁠活⁠性⁠机⁠制</w:t>
+      </w:r>
+    </w:p>
+    <w:p>
+      <w:pPr>
+        <w:ind w:left="0" w:firstLine="420"/>
+      </w:pPr>
+      <w:r>
+        <w:rPr>
+          <w:rFonts w:ascii="Calibri" w:hAnsi="Calibri" w:eastAsia="Microsoft YaHei" w:cs="Calibri"/>
+        </w:rPr>
+        <w:t xml:space="preserve">7. 方案价值⁠与⁠架⁠构⁠比⁠较</w:t>
+      </w:r>
+    </w:p>
+    <w:p>
+      <w:pPr>
+        <w:ind w:left="0" w:firstLine="420"/>
+      </w:pPr>
+      <w:r>
+        <w:rPr>
+          <w:rFonts w:ascii="Calibri" w:hAnsi="Calibri" w:eastAsia="Microsoft YaHei" w:cs="Calibri"/>
+        </w:rPr>
+        <w:t xml:space="preserve">8.⁠ ⁠集⁠成⁠边⁠界</w:t>
       </w:r>
     </w:p>
     <w:p>
@@ -183,29 +183,29 @@
         <w:rPr>
           <w:rFonts w:ascii="Calibri" w:hAnsi="Calibri" w:eastAsia="Microsoft YaHei" w:cs="Calibri"/>
         </w:rPr>
-        <w:t xml:space="preserve">附录 A 消息与﻿状﻿态﻿速﻿查﻿表</w:t>
-      </w:r>
-    </w:p>
-    <w:p>
-      <w:pPr>
-        <w:ind w:left="0" w:firstLine="420"/>
-      </w:pPr>
-      <w:r>
-        <w:rPr>
-          <w:rFonts w:ascii="Calibri" w:hAnsi="Calibri" w:eastAsia="Microsoft YaHei" w:cs="Calibri"/>
-        </w:rPr>
-        <w:t xml:space="preserve">附录 B EP-RNF﻿ ﻿仲﻿裁﻿规﻿则</w:t>
-      </w:r>
-    </w:p>
-    <w:p>
-      <w:pPr>
-        <w:ind w:left="0" w:firstLine="420"/>
-      </w:pPr>
-      <w:r>
-        <w:rPr>
-          <w:rFonts w:ascii="Calibri" w:hAnsi="Calibri" w:eastAsia="Microsoft YaHei" w:cs="Calibri"/>
-        </w:rPr>
-        <w:t xml:space="preserve">附录 ﻿C﻿ ﻿术﻿语﻿表</w:t>
+        <w:t xml:space="preserve">附录 A 消息与⁠状⁠态⁠速⁠查⁠表</w:t>
+      </w:r>
+    </w:p>
+    <w:p>
+      <w:pPr>
+        <w:ind w:left="0" w:firstLine="420"/>
+      </w:pPr>
+      <w:r>
+        <w:rPr>
+          <w:rFonts w:ascii="Calibri" w:hAnsi="Calibri" w:eastAsia="Microsoft YaHei" w:cs="Calibri"/>
+        </w:rPr>
+        <w:t xml:space="preserve">附录 B EP-RNF⁠ ⁠仲⁠裁⁠规⁠则</w:t>
+      </w:r>
+    </w:p>
+    <w:p>
+      <w:pPr>
+        <w:ind w:left="0" w:firstLine="420"/>
+      </w:pPr>
+      <w:r>
+        <w:rPr>
+          <w:rFonts w:ascii="Calibri" w:hAnsi="Calibri" w:eastAsia="Microsoft YaHei" w:cs="Calibri"/>
+        </w:rPr>
+        <w:t xml:space="preserve">附录 ⁠C⁠ ⁠术⁠语⁠表</w:t>
       </w:r>
     </w:p>
     <w:p>
@@ -245,84 +245,84 @@
         <w:rPr>
           <w:rFonts w:ascii="Calibri" w:hAnsi="Calibri" w:eastAsia="Microsoft YaHei" w:cs="Calibri"/>
         </w:rPr>
-        <w:t xml:space="preserve">UBCC 是面向多节点系统的跨节点缓存一致性方案。该方案在节点内标准 CHI 一致﻿性﻿域﻿之﻿上﻿，</w:t>
-      </w:r>
-    </w:p>
-    <w:p>
-      <w:pPr>
-        <w:ind w:left="0" w:firstLine="420"/>
-      </w:pPr>
-      <w:r>
-        <w:rPr>
-          <w:rFonts w:ascii="Calibri" w:hAnsi="Calibri" w:eastAsia="Microsoft YaHei" w:cs="Calibri"/>
-        </w:rPr>
-        <w:t xml:space="preserve">构建独立的跨节点目录与仲裁层，并通过 EP 接入现有处理器﻿缓﻿存﻿层﻿级﻿。</w:t>
-      </w:r>
-    </w:p>
-    <w:p>
-      <w:pPr>
-        <w:ind w:left="0" w:firstLine="420"/>
-      </w:pPr>
-      <w:r>
-        <w:rPr>
-          <w:rFonts w:ascii="Calibri" w:hAnsi="Calibri" w:eastAsia="Microsoft YaHei" w:cs="Calibri"/>
-        </w:rPr>
-        <w:t xml:space="preserve">UBCC 的核心价值是将全局目录、跨节点权限仲裁和元数据容量管理从节点内 HN-F﻿ ﻿资﻿源﻿域﻿中</w:t>
-      </w:r>
-    </w:p>
-    <w:p>
-      <w:pPr>
-        <w:ind w:left="0" w:firstLine="420"/>
-      </w:pPr>
-      <w:r>
-        <w:rPr>
-          <w:rFonts w:ascii="Calibri" w:hAnsi="Calibri" w:eastAsia="Microsoft YaHei" w:cs="Calibri"/>
-        </w:rPr>
-        <w:t xml:space="preserve">分离出来，使节点内一致性与跨节点一致性保持﻿清﻿晰﻿边﻿界﻿：</w:t>
-      </w:r>
-    </w:p>
-    <w:p>
-      <w:pPr>
-        <w:ind w:left="0" w:firstLine="420"/>
-      </w:pPr>
-      <w:r>
-        <w:rPr>
-          <w:rFonts w:ascii="Calibri" w:hAnsi="Calibri" w:eastAsia="Microsoft YaHei" w:cs="Calibri"/>
-        </w:rPr>
-        <w:t xml:space="preserve">1. 节点内缓存层级继续使用标准 CH﻿I﻿ ﻿机﻿制﻿；</w:t>
-      </w:r>
-    </w:p>
-    <w:p>
-      <w:pPr>
-        <w:ind w:left="0" w:firstLine="420"/>
-      </w:pPr>
-      <w:r>
-        <w:rPr>
-          <w:rFonts w:ascii="Calibri" w:hAnsi="Calibri" w:eastAsia="Microsoft YaHei" w:cs="Calibri"/>
-        </w:rPr>
-        <w:t xml:space="preserve">2. 跨节点 sharer、owner 和权限迁移由 UBCC ﻿统﻿一﻿管﻿理﻿；</w:t>
-      </w:r>
-    </w:p>
-    <w:p>
-      <w:pPr>
-        <w:ind w:left="0" w:firstLine="420"/>
-      </w:pPr>
-      <w:r>
-        <w:rPr>
-          <w:rFonts w:ascii="Calibri" w:hAnsi="Calibri" w:eastAsia="Microsoft YaHei" w:cs="Calibri"/>
-        </w:rPr>
-        <w:t xml:space="preserve">3. ResidentDir 与 Backstore 组成分层元﻿数﻿据﻿体﻿系﻿；</w:t>
-      </w:r>
-    </w:p>
-    <w:p>
-      <w:pPr>
-        <w:ind w:left="0" w:firstLine="420"/>
-      </w:pPr>
-      <w:r>
-        <w:rPr>
-          <w:rFonts w:ascii="Calibri" w:hAnsi="Calibri" w:eastAsia="Microsoft YaHei" w:cs="Calibri"/>
-        </w:rPr>
-        <w:t xml:space="preserve">4. EP-RNF、EP-SNF 与 UBAdapter 负责两个一致性域之间的﻿协﻿议﻿衔﻿接﻿。</w:t>
+        <w:t xml:space="preserve">UBCC 是面向多节点系统的跨节点缓存一致性方案。该方案在节点内标准 CHI 一致⁠性⁠域⁠之⁠上⁠，</w:t>
+      </w:r>
+    </w:p>
+    <w:p>
+      <w:pPr>
+        <w:ind w:left="0" w:firstLine="420"/>
+      </w:pPr>
+      <w:r>
+        <w:rPr>
+          <w:rFonts w:ascii="Calibri" w:hAnsi="Calibri" w:eastAsia="Microsoft YaHei" w:cs="Calibri"/>
+        </w:rPr>
+        <w:t xml:space="preserve">构建独立的跨节点目录与仲裁层，并通过 EP 接入现有处理器⁠缓⁠存⁠层⁠级⁠。</w:t>
+      </w:r>
+    </w:p>
+    <w:p>
+      <w:pPr>
+        <w:ind w:left="0" w:firstLine="420"/>
+      </w:pPr>
+      <w:r>
+        <w:rPr>
+          <w:rFonts w:ascii="Calibri" w:hAnsi="Calibri" w:eastAsia="Microsoft YaHei" w:cs="Calibri"/>
+        </w:rPr>
+        <w:t xml:space="preserve">UBCC 的核心价值是将全局目录、跨节点权限仲裁和元数据容量管理从节点内 HN-F⁠ ⁠资⁠源⁠域⁠中</w:t>
+      </w:r>
+    </w:p>
+    <w:p>
+      <w:pPr>
+        <w:ind w:left="0" w:firstLine="420"/>
+      </w:pPr>
+      <w:r>
+        <w:rPr>
+          <w:rFonts w:ascii="Calibri" w:hAnsi="Calibri" w:eastAsia="Microsoft YaHei" w:cs="Calibri"/>
+        </w:rPr>
+        <w:t xml:space="preserve">分离出来，使节点内一致性与跨节点一致性保持⁠清⁠晰⁠边⁠界⁠：</w:t>
+      </w:r>
+    </w:p>
+    <w:p>
+      <w:pPr>
+        <w:ind w:left="0" w:firstLine="420"/>
+      </w:pPr>
+      <w:r>
+        <w:rPr>
+          <w:rFonts w:ascii="Calibri" w:hAnsi="Calibri" w:eastAsia="Microsoft YaHei" w:cs="Calibri"/>
+        </w:rPr>
+        <w:t xml:space="preserve">1. 节点内缓存层级继续使用标准 CH⁠I⁠ ⁠机⁠制⁠；</w:t>
+      </w:r>
+    </w:p>
+    <w:p>
+      <w:pPr>
+        <w:ind w:left="0" w:firstLine="420"/>
+      </w:pPr>
+      <w:r>
+        <w:rPr>
+          <w:rFonts w:ascii="Calibri" w:hAnsi="Calibri" w:eastAsia="Microsoft YaHei" w:cs="Calibri"/>
+        </w:rPr>
+        <w:t xml:space="preserve">2. 跨节点 sharer、owner 和权限迁移由 UBCC ⁠统⁠一⁠管⁠理⁠；</w:t>
+      </w:r>
+    </w:p>
+    <w:p>
+      <w:pPr>
+        <w:ind w:left="0" w:firstLine="420"/>
+      </w:pPr>
+      <w:r>
+        <w:rPr>
+          <w:rFonts w:ascii="Calibri" w:hAnsi="Calibri" w:eastAsia="Microsoft YaHei" w:cs="Calibri"/>
+        </w:rPr>
+        <w:t xml:space="preserve">3. ResidentDir 与 Backstore 组成分层元⁠数⁠据⁠体⁠系⁠；</w:t>
+      </w:r>
+    </w:p>
+    <w:p>
+      <w:pPr>
+        <w:ind w:left="0" w:firstLine="420"/>
+      </w:pPr>
+      <w:r>
+        <w:rPr>
+          <w:rFonts w:ascii="Calibri" w:hAnsi="Calibri" w:eastAsia="Microsoft YaHei" w:cs="Calibri"/>
+        </w:rPr>
+        <w:t xml:space="preserve">4. EP-RNF、EP-SNF 与 UBAdapter 负责两个一致性域之间的⁠协⁠议⁠衔⁠接⁠。</w:t>
       </w:r>
     </w:p>
     <w:p>
@@ -345,7 +345,7 @@
         <w:rPr>
           <w:rFonts w:ascii="Calibri" w:hAnsi="Calibri" w:eastAsia="Microsoft YaHei" w:cs="Calibri"/>
         </w:rPr>
-        <w:t xml:space="preserve">UBCC 围绕以下目标﻿进﻿行﻿设﻿计﻿：</w:t>
+        <w:t xml:space="preserve">UBCC 围绕以下目标⁠进⁠行⁠设⁠计⁠：</w:t>
       </w:r>
     </w:p>
     <w:p>
@@ -434,29 +434,29 @@
         <w:rPr>
           <w:rFonts w:ascii="Calibri" w:hAnsi="Calibri" w:eastAsia="Microsoft YaHei" w:cs="Calibri"/>
         </w:rPr>
-        <w:t xml:space="preserve">UBCC 已形成完整的跨节点一致性数据通路和控制通路，覆盖远程读、所有权迁移、共﻿享﻿转﻿写﻿者﻿、</w:t>
-      </w:r>
-    </w:p>
-    <w:p>
-      <w:pPr>
-        <w:ind w:left="0" w:firstLine="420"/>
-      </w:pPr>
-      <w:r>
-        <w:rPr>
-          <w:rFonts w:ascii="Calibri" w:hAnsi="Calibri" w:eastAsia="Microsoft YaHei" w:cs="Calibri"/>
-        </w:rPr>
-        <w:t xml:space="preserve">写回、逐出以及目录换入换出等关键路径。方案通过分层验证确认协议状态安全、﻿消﻿息﻿幂﻿等﻿和</w:t>
-      </w:r>
-    </w:p>
-    <w:p>
-      <w:pPr>
-        <w:ind w:left="0" w:firstLine="420"/>
-      </w:pPr>
-      <w:r>
-        <w:rPr>
-          <w:rFonts w:ascii="Calibri" w:hAnsi="Calibri" w:eastAsia="Microsoft YaHei" w:cs="Calibri"/>
-        </w:rPr>
-        <w:t xml:space="preserve">事务收敛，并在正式性能验收中达到三项﻿冻﻿结﻿指﻿标﻿。</w:t>
+        <w:t xml:space="preserve">UBCC 已形成完整的跨节点一致性数据通路和控制通路，覆盖远程读、所有权迁移、共⁠享⁠转⁠写⁠者⁠、</w:t>
+      </w:r>
+    </w:p>
+    <w:p>
+      <w:pPr>
+        <w:ind w:left="0" w:firstLine="420"/>
+      </w:pPr>
+      <w:r>
+        <w:rPr>
+          <w:rFonts w:ascii="Calibri" w:hAnsi="Calibri" w:eastAsia="Microsoft YaHei" w:cs="Calibri"/>
+        </w:rPr>
+        <w:t xml:space="preserve">写回、逐出以及目录换入换出等关键路径。方案通过分层验证确认协议状态安全、⁠消⁠息⁠幂⁠等⁠和</w:t>
+      </w:r>
+    </w:p>
+    <w:p>
+      <w:pPr>
+        <w:ind w:left="0" w:firstLine="420"/>
+      </w:pPr>
+      <w:r>
+        <w:rPr>
+          <w:rFonts w:ascii="Calibri" w:hAnsi="Calibri" w:eastAsia="Microsoft YaHei" w:cs="Calibri"/>
+        </w:rPr>
+        <w:t xml:space="preserve">事务收敛，并在正式性能验收中达到三项⁠冻⁠结⁠指⁠标⁠。</w:t>
       </w:r>
     </w:p>
     <w:p>
@@ -588,25 +588,25 @@
                 <w:sz w:val="18"/>
                 <w:szCs w:val="18"/>
               </w:rPr>
-              <w:t xml:space="preserve">独立 O﻿u﻿t﻿e﻿r 域、分层目录和 E﻿P 接入路径已形成</w:t>
-            </w:r>
-          </w:p>
-        </w:tc>
-        <w:tc>
-          <w:tcPr/>
-          <w:p>
-            <w:pPr>
-              <w:pStyle w:val="TableText"/>
-              <w:jc w:val="left"/>
-              <w:spacing w:before="0" w:after="0" w:line="320" w:lineRule="exact"/>
-            </w:pPr>
-            <w:r>
-              <w:rPr>
-                <w:rFonts w:ascii="Calibri" w:hAnsi="Calibri" w:eastAsia="Microsoft YaHei" w:cs="Calibri"/>
-                <w:sz w:val="18"/>
-                <w:szCs w:val="18"/>
-              </w:rPr>
-              <w:t xml:space="preserve">当前 U﻿B﻿C﻿C 实现及已验证拓扑</w:t>
+              <w:t xml:space="preserve">独立 O⁠u⁠t⁠e⁠r 域、分层目录和 E⁠P 接入路径已形成</w:t>
+            </w:r>
+          </w:p>
+        </w:tc>
+        <w:tc>
+          <w:tcPr/>
+          <w:p>
+            <w:pPr>
+              <w:pStyle w:val="TableText"/>
+              <w:jc w:val="left"/>
+              <w:spacing w:before="0" w:after="0" w:line="320" w:lineRule="exact"/>
+            </w:pPr>
+            <w:r>
+              <w:rPr>
+                <w:rFonts w:ascii="Calibri" w:hAnsi="Calibri" w:eastAsia="Microsoft YaHei" w:cs="Calibri"/>
+                <w:sz w:val="18"/>
+                <w:szCs w:val="18"/>
+              </w:rPr>
+              <w:t xml:space="preserve">当前 U⁠B⁠C⁠C 实现及已验证拓扑</w:t>
             </w:r>
           </w:p>
         </w:tc>
@@ -724,7 +724,7 @@
                 <w:sz w:val="18"/>
                 <w:szCs w:val="18"/>
               </w:rPr>
-              <w:t xml:space="preserve">冻结 w﻿o﻿r﻿k﻿l﻿o﻿a﻿d、完成边界与参考模型条件</w:t>
+              <w:t xml:space="preserve">冻结 w⁠o⁠r⁠k⁠l⁠o⁠a⁠d、完成边界与参考模型条件</w:t>
             </w:r>
           </w:p>
         </w:tc>
@@ -783,7 +783,7 @@
                 <w:sz w:val="18"/>
                 <w:szCs w:val="18"/>
               </w:rPr>
-              <w:t xml:space="preserve">永久 H﻿o﻿m﻿e 故障在线恢复和端口级 S﻿w﻿i﻿t﻿c﻿h 微体系结构</w:t>
+              <w:t xml:space="preserve">永久 H⁠o⁠m⁠e 故障在线恢复和端口级 S⁠w⁠i⁠t⁠c⁠h 微体系结构</w:t>
             </w:r>
           </w:p>
         </w:tc>
@@ -821,7 +821,7 @@
         <w:rPr>
           <w:rFonts w:ascii="Calibri" w:hAnsi="Calibri" w:eastAsia="Microsoft YaHei" w:cs="Calibri"/>
         </w:rPr>
-        <w:t xml:space="preserve">UBCC 将系统划分为两个协同的﻿一﻿致﻿性﻿域﻿：</w:t>
+        <w:t xml:space="preserve">UBCC 将系统划分为两个协同的⁠一⁠致⁠性⁠域⁠：</w:t>
       </w:r>
     </w:p>
     <w:p>
@@ -854,29 +854,29 @@
         <w:rPr>
           <w:rFonts w:ascii="Calibri" w:hAnsi="Calibri" w:eastAsia="Microsoft YaHei" w:cs="Calibri"/>
         </w:rPr>
-        <w:t xml:space="preserve">Invalidat﻿e﻿ ﻿收﻿敛﻿。</w:t>
-      </w:r>
-    </w:p>
-    <w:p>
-      <w:pPr>
-        <w:ind w:left="0" w:firstLine="420"/>
-      </w:pPr>
-      <w:r>
-        <w:rPr>
-          <w:rFonts w:ascii="Calibri" w:hAnsi="Calibri" w:eastAsia="Microsoft YaHei" w:cs="Calibri"/>
-        </w:rPr>
-        <w:t xml:space="preserve">节点内请求经 EP 接入 UBCC；UBCC 根据全局目录状态完成权限判断，并经跨节点通﻿信﻿平﻿面﻿交﻿换</w:t>
-      </w:r>
-    </w:p>
-    <w:p>
-      <w:pPr>
-        <w:ind w:left="0" w:firstLine="420"/>
-      </w:pPr>
-      <w:r>
-        <w:rPr>
-          <w:rFonts w:ascii="Calibri" w:hAnsi="Calibri" w:eastAsia="Microsoft YaHei" w:cs="Calibri"/>
-        </w:rPr>
-        <w:t xml:space="preserve">一﻿致﻿性﻿消﻿息﻿。</w:t>
+        <w:t xml:space="preserve">Invalidat⁠e⁠ ⁠收⁠敛⁠。</w:t>
+      </w:r>
+    </w:p>
+    <w:p>
+      <w:pPr>
+        <w:ind w:left="0" w:firstLine="420"/>
+      </w:pPr>
+      <w:r>
+        <w:rPr>
+          <w:rFonts w:ascii="Calibri" w:hAnsi="Calibri" w:eastAsia="Microsoft YaHei" w:cs="Calibri"/>
+        </w:rPr>
+        <w:t xml:space="preserve">节点内请求经 EP 接入 UBCC；UBCC 根据全局目录状态完成权限判断，并经跨节点通⁠信⁠平⁠面⁠交⁠换</w:t>
+      </w:r>
+    </w:p>
+    <w:p>
+      <w:pPr>
+        <w:ind w:left="0" w:firstLine="420"/>
+      </w:pPr>
+      <w:r>
+        <w:rPr>
+          <w:rFonts w:ascii="Calibri" w:hAnsi="Calibri" w:eastAsia="Microsoft YaHei" w:cs="Calibri"/>
+        </w:rPr>
+        <w:t xml:space="preserve">一⁠致⁠性⁠消⁠息⁠。</w:t>
       </w:r>
     </w:p>
     <w:p>
@@ -954,7 +954,7 @@
         <w:rPr>
           <w:rFonts w:ascii="Calibri" w:hAnsi="Calibri" w:eastAsia="Microsoft YaHei" w:cs="Calibri"/>
         </w:rPr>
-        <w:t xml:space="preserve">UBCC 对控制信息与数据传输采用统一事务身份﻿进﻿行﻿关﻿联﻿：</w:t>
+        <w:t xml:space="preserve">UBCC 对控制信息与数据传输采用统一事务身份⁠进⁠行⁠关⁠联⁠：</w:t>
       </w:r>
     </w:p>
     <w:p>
@@ -998,18 +998,18 @@
         <w:rPr>
           <w:rFonts w:ascii="Calibri" w:hAnsi="Calibri" w:eastAsia="Microsoft YaHei" w:cs="Calibri"/>
         </w:rPr>
-        <w:t xml:space="preserve">数据来源由全局目录状态决定。若最新数据位于远程 owner，UBCC 发起 Recall；若 Ho﻿m﻿e﻿ ﻿已﻿有</w:t>
-      </w:r>
-    </w:p>
-    <w:p>
-      <w:pPr>
-        <w:ind w:left="0" w:firstLine="420"/>
-      </w:pPr>
-      <w:r>
-        <w:rPr>
-          <w:rFonts w:ascii="Calibri" w:hAnsi="Calibri" w:eastAsia="Microsoft YaHei" w:cs="Calibri"/>
-        </w:rPr>
-        <w:t xml:space="preserve">权威数据，则直接组织授权返回。该设计避免由节点内任意缓存副本替代全局 owne﻿r﻿ ﻿语﻿义﻿。</w:t>
+        <w:t xml:space="preserve">数据来源由全局目录状态决定。若最新数据位于远程 owner，UBCC 发起 Recall；若 Ho⁠m⁠e⁠ ⁠已⁠有</w:t>
+      </w:r>
+    </w:p>
+    <w:p>
+      <w:pPr>
+        <w:ind w:left="0" w:firstLine="420"/>
+      </w:pPr>
+      <w:r>
+        <w:rPr>
+          <w:rFonts w:ascii="Calibri" w:hAnsi="Calibri" w:eastAsia="Microsoft YaHei" w:cs="Calibri"/>
+        </w:rPr>
+        <w:t xml:space="preserve">权威数据，则直接组织授权返回。该设计避免由节点内任意缓存副本替代全局 owne⁠r⁠ ⁠语⁠义⁠。</w:t>
       </w:r>
     </w:p>
     <w:p>
@@ -1123,25 +1123,25 @@
                 <w:sz w:val="18"/>
                 <w:szCs w:val="18"/>
               </w:rPr>
-              <w:t xml:space="preserve">C﻿P﻿U C﻿a﻿c﻿h﻿e / H﻿N﻿-﻿F</w:t>
-            </w:r>
-          </w:p>
-        </w:tc>
-        <w:tc>
-          <w:tcPr/>
-          <w:p>
-            <w:pPr>
-              <w:pStyle w:val="TableText"/>
-              <w:jc w:val="left"/>
-              <w:spacing w:before="0" w:after="0" w:line="320" w:lineRule="exact"/>
-            </w:pPr>
-            <w:r>
-              <w:rPr>
-                <w:rFonts w:ascii="Calibri" w:hAnsi="Calibri" w:eastAsia="Microsoft YaHei" w:cs="Calibri"/>
-                <w:sz w:val="18"/>
-                <w:szCs w:val="18"/>
-              </w:rPr>
-              <w:t xml:space="preserve">I﻿n﻿n﻿e﻿r 域</w:t>
+              <w:t xml:space="preserve">C⁠P⁠U C⁠a⁠c⁠h⁠e / H⁠N⁠-⁠F</w:t>
+            </w:r>
+          </w:p>
+        </w:tc>
+        <w:tc>
+          <w:tcPr/>
+          <w:p>
+            <w:pPr>
+              <w:pStyle w:val="TableText"/>
+              <w:jc w:val="left"/>
+              <w:spacing w:before="0" w:after="0" w:line="320" w:lineRule="exact"/>
+            </w:pPr>
+            <w:r>
+              <w:rPr>
+                <w:rFonts w:ascii="Calibri" w:hAnsi="Calibri" w:eastAsia="Microsoft YaHei" w:cs="Calibri"/>
+                <w:sz w:val="18"/>
+                <w:szCs w:val="18"/>
+              </w:rPr>
+              <w:t xml:space="preserve">I⁠n⁠n⁠e⁠r 域</w:t>
             </w:r>
           </w:p>
         </w:tc>
@@ -1182,7 +1182,7 @@
                 <w:sz w:val="18"/>
                 <w:szCs w:val="18"/>
               </w:rPr>
-              <w:t xml:space="preserve">E﻿P﻿-﻿R﻿N﻿F</w:t>
+              <w:t xml:space="preserve">E⁠P⁠-⁠R⁠N⁠F</w:t>
             </w:r>
           </w:p>
         </w:tc>
@@ -1218,7 +1218,7 @@
                 <w:sz w:val="18"/>
                 <w:szCs w:val="18"/>
               </w:rPr>
-              <w:t xml:space="preserve">代表 O﻿u﻿t﻿e﻿r 域响应 H﻿N﻿-﻿F s﻿n﻿o﻿o﻿p，并发起跨节点权限操作</w:t>
+              <w:t xml:space="preserve">代表 O⁠u⁠t⁠e⁠r 域响应 H⁠N⁠-⁠F s⁠n⁠o⁠o⁠p，并发起跨节点权限操作</w:t>
             </w:r>
           </w:p>
         </w:tc>
@@ -1241,7 +1241,7 @@
                 <w:sz w:val="18"/>
                 <w:szCs w:val="18"/>
               </w:rPr>
-              <w:t xml:space="preserve">E﻿P﻿-﻿S﻿N﻿F</w:t>
+              <w:t xml:space="preserve">E⁠P⁠-⁠S⁠N⁠F</w:t>
             </w:r>
           </w:p>
         </w:tc>
@@ -1277,7 +1277,7 @@
                 <w:sz w:val="18"/>
                 <w:szCs w:val="18"/>
               </w:rPr>
-              <w:t xml:space="preserve">将节点内服务请求接入 U﻿B﻿C﻿C 数据路径</w:t>
+              <w:t xml:space="preserve">将节点内服务请求接入 U⁠B⁠C⁠C 数据路径</w:t>
             </w:r>
           </w:p>
         </w:tc>
@@ -1300,7 +1300,7 @@
                 <w:sz w:val="18"/>
                 <w:szCs w:val="18"/>
               </w:rPr>
-              <w:t xml:space="preserve">U﻿B﻿A﻿d﻿a﻿p﻿t﻿e﻿r</w:t>
+              <w:t xml:space="preserve">U⁠B⁠A⁠d⁠a⁠p⁠t⁠e⁠r</w:t>
             </w:r>
           </w:p>
         </w:tc>
@@ -1336,7 +1336,7 @@
                 <w:sz w:val="18"/>
                 <w:szCs w:val="18"/>
               </w:rPr>
-              <w:t xml:space="preserve">完成 C﻿H﻿I 端点与 U﻿B﻿I﻿O 之间的消息适配和事务关联</w:t>
+              <w:t xml:space="preserve">完成 C⁠H⁠I 端点与 U⁠B⁠I⁠O 之间的消息适配和事务关联</w:t>
             </w:r>
           </w:p>
         </w:tc>
@@ -1359,25 +1359,25 @@
                 <w:sz w:val="18"/>
                 <w:szCs w:val="18"/>
               </w:rPr>
-              <w:t xml:space="preserve">U﻿B﻿C﻿C 控制器</w:t>
-            </w:r>
-          </w:p>
-        </w:tc>
-        <w:tc>
-          <w:tcPr/>
-          <w:p>
-            <w:pPr>
-              <w:pStyle w:val="TableText"/>
-              <w:jc w:val="left"/>
-              <w:spacing w:before="0" w:after="0" w:line="320" w:lineRule="exact"/>
-            </w:pPr>
-            <w:r>
-              <w:rPr>
-                <w:rFonts w:ascii="Calibri" w:hAnsi="Calibri" w:eastAsia="Microsoft YaHei" w:cs="Calibri"/>
-                <w:sz w:val="18"/>
-                <w:szCs w:val="18"/>
-              </w:rPr>
-              <w:t xml:space="preserve">O﻿u﻿t﻿e﻿r 域</w:t>
+              <w:t xml:space="preserve">U⁠B⁠C⁠C 控制器</w:t>
+            </w:r>
+          </w:p>
+        </w:tc>
+        <w:tc>
+          <w:tcPr/>
+          <w:p>
+            <w:pPr>
+              <w:pStyle w:val="TableText"/>
+              <w:jc w:val="left"/>
+              <w:spacing w:before="0" w:after="0" w:line="320" w:lineRule="exact"/>
+            </w:pPr>
+            <w:r>
+              <w:rPr>
+                <w:rFonts w:ascii="Calibri" w:hAnsi="Calibri" w:eastAsia="Microsoft YaHei" w:cs="Calibri"/>
+                <w:sz w:val="18"/>
+                <w:szCs w:val="18"/>
+              </w:rPr>
+              <w:t xml:space="preserve">O⁠u⁠t⁠e⁠r 域</w:t>
             </w:r>
           </w:p>
         </w:tc>
@@ -1418,25 +1418,25 @@
                 <w:sz w:val="18"/>
                 <w:szCs w:val="18"/>
               </w:rPr>
-              <w:t xml:space="preserve">R﻿e﻿s﻿i﻿d﻿e﻿n﻿t﻿D﻿i﻿r</w:t>
-            </w:r>
-          </w:p>
-        </w:tc>
-        <w:tc>
-          <w:tcPr/>
-          <w:p>
-            <w:pPr>
-              <w:pStyle w:val="TableText"/>
-              <w:jc w:val="left"/>
-              <w:spacing w:before="0" w:after="0" w:line="320" w:lineRule="exact"/>
-            </w:pPr>
-            <w:r>
-              <w:rPr>
-                <w:rFonts w:ascii="Calibri" w:hAnsi="Calibri" w:eastAsia="Microsoft YaHei" w:cs="Calibri"/>
-                <w:sz w:val="18"/>
-                <w:szCs w:val="18"/>
-              </w:rPr>
-              <w:t xml:space="preserve">O﻿u﻿t﻿e﻿r 域</w:t>
+              <w:t xml:space="preserve">R⁠e⁠s⁠i⁠d⁠e⁠n⁠t⁠D⁠i⁠r</w:t>
+            </w:r>
+          </w:p>
+        </w:tc>
+        <w:tc>
+          <w:tcPr/>
+          <w:p>
+            <w:pPr>
+              <w:pStyle w:val="TableText"/>
+              <w:jc w:val="left"/>
+              <w:spacing w:before="0" w:after="0" w:line="320" w:lineRule="exact"/>
+            </w:pPr>
+            <w:r>
+              <w:rPr>
+                <w:rFonts w:ascii="Calibri" w:hAnsi="Calibri" w:eastAsia="Microsoft YaHei" w:cs="Calibri"/>
+                <w:sz w:val="18"/>
+                <w:szCs w:val="18"/>
+              </w:rPr>
+              <w:t xml:space="preserve">O⁠u⁠t⁠e⁠r 域</w:t>
             </w:r>
           </w:p>
         </w:tc>
@@ -1477,25 +1477,25 @@
                 <w:sz w:val="18"/>
                 <w:szCs w:val="18"/>
               </w:rPr>
-              <w:t xml:space="preserve">B﻿a﻿c﻿k﻿s﻿t﻿o﻿r﻿e</w:t>
-            </w:r>
-          </w:p>
-        </w:tc>
-        <w:tc>
-          <w:tcPr/>
-          <w:p>
-            <w:pPr>
-              <w:pStyle w:val="TableText"/>
-              <w:jc w:val="left"/>
-              <w:spacing w:before="0" w:after="0" w:line="320" w:lineRule="exact"/>
-            </w:pPr>
-            <w:r>
-              <w:rPr>
-                <w:rFonts w:ascii="Calibri" w:hAnsi="Calibri" w:eastAsia="Microsoft YaHei" w:cs="Calibri"/>
-                <w:sz w:val="18"/>
-                <w:szCs w:val="18"/>
-              </w:rPr>
-              <w:t xml:space="preserve">O﻿u﻿t﻿e﻿r 域</w:t>
+              <w:t xml:space="preserve">B⁠a⁠c⁠k⁠s⁠t⁠o⁠r⁠e</w:t>
+            </w:r>
+          </w:p>
+        </w:tc>
+        <w:tc>
+          <w:tcPr/>
+          <w:p>
+            <w:pPr>
+              <w:pStyle w:val="TableText"/>
+              <w:jc w:val="left"/>
+              <w:spacing w:before="0" w:after="0" w:line="320" w:lineRule="exact"/>
+            </w:pPr>
+            <w:r>
+              <w:rPr>
+                <w:rFonts w:ascii="Calibri" w:hAnsi="Calibri" w:eastAsia="Microsoft YaHei" w:cs="Calibri"/>
+                <w:sz w:val="18"/>
+                <w:szCs w:val="18"/>
+              </w:rPr>
+              <w:t xml:space="preserve">O⁠u⁠t⁠e⁠r 域</w:t>
             </w:r>
           </w:p>
         </w:tc>
@@ -1551,7 +1551,7 @@
         <w:rPr>
           <w:rFonts w:ascii="Calibri" w:hAnsi="Calibri" w:eastAsia="Microsoft YaHei" w:cs="Calibri"/>
         </w:rPr>
-        <w:t xml:space="preserve">UBCC 控制器是全局一致性仲裁中心。其主要﻿功﻿能﻿包﻿括﻿：</w:t>
+        <w:t xml:space="preserve">UBCC 控制器是全局一致性仲裁中心。其主要⁠功⁠能⁠包⁠括⁠：</w:t>
       </w:r>
     </w:p>
     <w:p>
@@ -1573,29 +1573,29 @@
         <w:rPr>
           <w:rFonts w:ascii="Calibri" w:hAnsi="Calibri" w:eastAsia="Microsoft YaHei" w:cs="Calibri"/>
         </w:rPr>
-        <w:t xml:space="preserve">2. 查询和更新全局 sharer/owne﻿r﻿ ﻿状﻿态﻿；</w:t>
-      </w:r>
-    </w:p>
-    <w:p>
-      <w:pPr>
-        <w:ind w:left="0" w:firstLine="420"/>
-      </w:pPr>
-      <w:r>
-        <w:rPr>
-          <w:rFonts w:ascii="Calibri" w:hAnsi="Calibri" w:eastAsia="Microsoft YaHei" w:cs="Calibri"/>
-        </w:rPr>
-        <w:t xml:space="preserve">3. 为远程读选择权﻿威﻿数﻿据﻿源﻿；</w:t>
-      </w:r>
-    </w:p>
-    <w:p>
-      <w:pPr>
-        <w:ind w:left="0" w:firstLine="420"/>
-      </w:pPr>
-      <w:r>
-        <w:rPr>
-          <w:rFonts w:ascii="Calibri" w:hAnsi="Calibri" w:eastAsia="Microsoft YaHei" w:cs="Calibri"/>
-        </w:rPr>
-        <w:t xml:space="preserve">4. 为写权限请求生成精确失效﻿目﻿标﻿集﻿合﻿；</w:t>
+        <w:t xml:space="preserve">2. 查询和更新全局 sharer/owne⁠r⁠ ⁠状⁠态⁠；</w:t>
+      </w:r>
+    </w:p>
+    <w:p>
+      <w:pPr>
+        <w:ind w:left="0" w:firstLine="420"/>
+      </w:pPr>
+      <w:r>
+        <w:rPr>
+          <w:rFonts w:ascii="Calibri" w:hAnsi="Calibri" w:eastAsia="Microsoft YaHei" w:cs="Calibri"/>
+        </w:rPr>
+        <w:t xml:space="preserve">3. 为远程读选择权⁠威⁠数⁠据⁠源⁠；</w:t>
+      </w:r>
+    </w:p>
+    <w:p>
+      <w:pPr>
+        <w:ind w:left="0" w:firstLine="420"/>
+      </w:pPr>
+      <w:r>
+        <w:rPr>
+          <w:rFonts w:ascii="Calibri" w:hAnsi="Calibri" w:eastAsia="Microsoft YaHei" w:cs="Calibri"/>
+        </w:rPr>
+        <w:t xml:space="preserve">4. 为写权限请求生成精确失效⁠目⁠标⁠集⁠合⁠；</w:t>
       </w:r>
     </w:p>
     <w:p>
@@ -1617,18 +1617,18 @@
         <w:rPr>
           <w:rFonts w:ascii="Calibri" w:hAnsi="Calibri" w:eastAsia="Microsoft YaHei" w:cs="Calibri"/>
         </w:rPr>
-        <w:t xml:space="preserve">6. 管理同址 outstanding、waiter 和﻿重﻿试﻿事﻿务﻿；</w:t>
-      </w:r>
-    </w:p>
-    <w:p>
-      <w:pPr>
-        <w:ind w:left="0" w:firstLine="420"/>
-      </w:pPr>
-      <w:r>
-        <w:rPr>
-          <w:rFonts w:ascii="Calibri" w:hAnsi="Calibri" w:eastAsia="Microsoft YaHei" w:cs="Calibri"/>
-        </w:rPr>
-        <w:t xml:space="preserve">7. 在 ResidentDir 与 Backstore 之间迁移目﻿录﻿元﻿数﻿据﻿。</w:t>
+        <w:t xml:space="preserve">6. 管理同址 outstanding、waiter 和⁠重⁠试⁠事⁠务⁠；</w:t>
+      </w:r>
+    </w:p>
+    <w:p>
+      <w:pPr>
+        <w:ind w:left="0" w:firstLine="420"/>
+      </w:pPr>
+      <w:r>
+        <w:rPr>
+          <w:rFonts w:ascii="Calibri" w:hAnsi="Calibri" w:eastAsia="Microsoft YaHei" w:cs="Calibri"/>
+        </w:rPr>
+        <w:t xml:space="preserve">7. 在 ResidentDir 与 Backstore 之间迁移目⁠录⁠元⁠数⁠据⁠。</w:t>
       </w:r>
     </w:p>
     <w:p>
@@ -1651,29 +1651,29 @@
         <w:rPr>
           <w:rFonts w:ascii="Calibri" w:hAnsi="Calibri" w:eastAsia="Microsoft YaHei" w:cs="Calibri"/>
         </w:rPr>
-        <w:t xml:space="preserve">ResidentDir 保存当前活跃的跨节点目录条目，提供低时延的 SRAM 查询路径。Backsto﻿r﻿e﻿ ﻿保﻿存</w:t>
-      </w:r>
-    </w:p>
-    <w:p>
-      <w:pPr>
-        <w:ind w:left="0" w:firstLine="420"/>
-      </w:pPr>
-      <w:r>
-        <w:rPr>
-          <w:rFonts w:ascii="Calibri" w:hAnsi="Calibri" w:eastAsia="Microsoft YaHei" w:cs="Calibri"/>
-        </w:rPr>
-        <w:t xml:space="preserve">从 ResidentDir 换出的冷元数据，并在后续访问时﻿按﻿需﻿换﻿入﻿。</w:t>
-      </w:r>
-    </w:p>
-    <w:p>
-      <w:pPr>
-        <w:ind w:left="0" w:firstLine="420"/>
-      </w:pPr>
-      <w:r>
-        <w:rPr>
-          <w:rFonts w:ascii="Calibri" w:hAnsi="Calibri" w:eastAsia="Microsoft YaHei" w:cs="Calibri"/>
-        </w:rPr>
-        <w:t xml:space="preserve">分层目录带来两项﻿直﻿接﻿收﻿益﻿：</w:t>
+        <w:t xml:space="preserve">ResidentDir 保存当前活跃的跨节点目录条目，提供低时延的 SRAM 查询路径。Backsto⁠r⁠e⁠ ⁠保⁠存</w:t>
+      </w:r>
+    </w:p>
+    <w:p>
+      <w:pPr>
+        <w:ind w:left="0" w:firstLine="420"/>
+      </w:pPr>
+      <w:r>
+        <w:rPr>
+          <w:rFonts w:ascii="Calibri" w:hAnsi="Calibri" w:eastAsia="Microsoft YaHei" w:cs="Calibri"/>
+        </w:rPr>
+        <w:t xml:space="preserve">从 ResidentDir 换出的冷元数据，并在后续访问时⁠按⁠需⁠换⁠入⁠。</w:t>
+      </w:r>
+    </w:p>
+    <w:p>
+      <w:pPr>
+        <w:ind w:left="0" w:firstLine="420"/>
+      </w:pPr>
+      <w:r>
+        <w:rPr>
+          <w:rFonts w:ascii="Calibri" w:hAnsi="Calibri" w:eastAsia="Microsoft YaHei" w:cs="Calibri"/>
+        </w:rPr>
+        <w:t xml:space="preserve">分层目录带来两项⁠直⁠接⁠收⁠益⁠：</w:t>
       </w:r>
     </w:p>
     <w:p>
@@ -1706,7 +1706,7 @@
         <w:rPr>
           <w:rFonts w:ascii="Calibri" w:hAnsi="Calibri" w:eastAsia="Microsoft YaHei" w:cs="Calibri"/>
         </w:rPr>
-        <w:t xml:space="preserve">目录容量以 ResidentDir 和已持久化 Backstore 元数据的去重覆盖量计算，避免﻿重﻿复﻿计﻿数﻿。</w:t>
+        <w:t xml:space="preserve">目录容量以 ResidentDir 和已持久化 Backstore 元数据的去重覆盖量计算，避免⁠重⁠复⁠计⁠数⁠。</w:t>
       </w:r>
     </w:p>
     <w:p>
@@ -1729,29 +1729,29 @@
         <w:rPr>
           <w:rFonts w:ascii="Calibri" w:hAnsi="Calibri" w:eastAsia="Microsoft YaHei" w:cs="Calibri"/>
         </w:rPr>
-        <w:t xml:space="preserve">EP-RNF 在节点内 CHI 域中代表跨节点一致性域。HN-F 对共享或独占缓存行发起 sno﻿o﻿p﻿ ﻿时﻿，</w:t>
-      </w:r>
-    </w:p>
-    <w:p>
-      <w:pPr>
-        <w:ind w:left="0" w:firstLine="420"/>
-      </w:pPr>
-      <w:r>
-        <w:rPr>
-          <w:rFonts w:ascii="Calibri" w:hAnsi="Calibri" w:eastAsia="Microsoft YaHei" w:cs="Calibri"/>
-        </w:rPr>
-        <w:t xml:space="preserve">EP-RNF 根据当前 Outer 事务状态选择即时响应、返回 stale 结果或发起跨节点﻿权﻿限﻿操﻿作﻿。</w:t>
-      </w:r>
-    </w:p>
-    <w:p>
-      <w:pPr>
-        <w:ind w:left="0" w:firstLine="420"/>
-      </w:pPr>
-      <w:r>
-        <w:rPr>
-          <w:rFonts w:ascii="Calibri" w:hAnsi="Calibri" w:eastAsia="Microsoft YaHei" w:cs="Calibri"/>
-        </w:rPr>
-        <w:t xml:space="preserve">EP-RNF 的关键﻿职﻿责﻿包﻿括﻿：</w:t>
+        <w:t xml:space="preserve">EP-RNF 在节点内 CHI 域中代表跨节点一致性域。HN-F 对共享或独占缓存行发起 sno⁠o⁠p⁠ ⁠时⁠，</w:t>
+      </w:r>
+    </w:p>
+    <w:p>
+      <w:pPr>
+        <w:ind w:left="0" w:firstLine="420"/>
+      </w:pPr>
+      <w:r>
+        <w:rPr>
+          <w:rFonts w:ascii="Calibri" w:hAnsi="Calibri" w:eastAsia="Microsoft YaHei" w:cs="Calibri"/>
+        </w:rPr>
+        <w:t xml:space="preserve">EP-RNF 根据当前 Outer 事务状态选择即时响应、返回 stale 结果或发起跨节点⁠权⁠限⁠操⁠作⁠。</w:t>
+      </w:r>
+    </w:p>
+    <w:p>
+      <w:pPr>
+        <w:ind w:left="0" w:firstLine="420"/>
+      </w:pPr>
+      <w:r>
+        <w:rPr>
+          <w:rFonts w:ascii="Calibri" w:hAnsi="Calibri" w:eastAsia="Microsoft YaHei" w:cs="Calibri"/>
+        </w:rPr>
+        <w:t xml:space="preserve">EP-RNF 的关键⁠职⁠责⁠包⁠括⁠：</w:t>
       </w:r>
     </w:p>
     <w:p>
@@ -1818,18 +1818,18 @@
         <w:rPr>
           <w:rFonts w:ascii="Calibri" w:hAnsi="Calibri" w:eastAsia="Microsoft YaHei" w:cs="Calibri"/>
         </w:rPr>
-        <w:t xml:space="preserve">EP-SNF 将节点内无 snoop 服务请求连接到 UBCC。它接收节点内请求，完成地址﻿和﻿事﻿务﻿信﻿息</w:t>
-      </w:r>
-    </w:p>
-    <w:p>
-      <w:pPr>
-        <w:ind w:left="0" w:firstLine="420"/>
-      </w:pPr>
-      <w:r>
-        <w:rPr>
-          <w:rFonts w:ascii="Calibri" w:hAnsi="Calibri" w:eastAsia="Microsoft YaHei" w:cs="Calibri"/>
-        </w:rPr>
-        <w:t xml:space="preserve">封装，并在 UBCC 返回数据与授权后生成节﻿点﻿内﻿响﻿应﻿。</w:t>
+        <w:t xml:space="preserve">EP-SNF 将节点内无 snoop 服务请求连接到 UBCC。它接收节点内请求，完成地址⁠和⁠事⁠务⁠信⁠息</w:t>
+      </w:r>
+    </w:p>
+    <w:p>
+      <w:pPr>
+        <w:ind w:left="0" w:firstLine="420"/>
+      </w:pPr>
+      <w:r>
+        <w:rPr>
+          <w:rFonts w:ascii="Calibri" w:hAnsi="Calibri" w:eastAsia="Microsoft YaHei" w:cs="Calibri"/>
+        </w:rPr>
+        <w:t xml:space="preserve">封装，并在 UBCC 返回数据与授权后生成节⁠点⁠内⁠响⁠应⁠。</w:t>
       </w:r>
     </w:p>
     <w:p>
@@ -1852,7 +1852,7 @@
         <w:rPr>
           <w:rFonts w:ascii="Calibri" w:hAnsi="Calibri" w:eastAsia="Microsoft YaHei" w:cs="Calibri"/>
         </w:rPr>
-        <w:t xml:space="preserve">UBAdapter 提供稳定的消息适配边﻿界﻿，﻿负﻿责﻿：</w:t>
+        <w:t xml:space="preserve">UBAdapter 提供稳定的消息适配边⁠界⁠，⁠负⁠责⁠：</w:t>
       </w:r>
     </w:p>
     <w:p>
@@ -1930,7 +1930,7 @@
         <w:rPr>
           <w:rFonts w:ascii="Calibri" w:hAnsi="Calibri" w:eastAsia="Microsoft YaHei" w:cs="Calibri"/>
         </w:rPr>
-        <w:t xml:space="preserve">参与、服务请求接入和跨域﻿事﻿务﻿关﻿联﻿。</w:t>
+        <w:t xml:space="preserve">参与、服务请求接入和跨域⁠事⁠务⁠关⁠联⁠。</w:t>
       </w:r>
     </w:p>
     <w:p>
@@ -2020,7 +2020,7 @@
         <w:rPr>
           <w:rFonts w:ascii="Calibri" w:hAnsi="Calibri" w:eastAsia="Microsoft YaHei" w:cs="Calibri"/>
         </w:rPr>
-        <w:t xml:space="preserve">UBCC 目录记录每条缓存行的全局权限关系，核心﻿信﻿息﻿包﻿括﻿：</w:t>
+        <w:t xml:space="preserve">UBCC 目录记录每条缓存行的全局权限关系，核心⁠信⁠息⁠包⁠括⁠：</w:t>
       </w:r>
     </w:p>
     <w:p>
@@ -2086,18 +2086,18 @@
         <w:rPr>
           <w:rFonts w:ascii="Calibri" w:hAnsi="Calibri" w:eastAsia="Microsoft YaHei" w:cs="Calibri"/>
         </w:rPr>
-        <w:t xml:space="preserve">全局状态采用单调 epoch 区分新旧事务。reqId 标识同一 epoch 内的具体请求，使﻿重﻿试﻿、﻿重﻿复</w:t>
-      </w:r>
-    </w:p>
-    <w:p>
-      <w:pPr>
-        <w:ind w:left="0" w:firstLine="420"/>
-      </w:pPr>
-      <w:r>
-        <w:rPr>
-          <w:rFonts w:ascii="Calibri" w:hAnsi="Calibri" w:eastAsia="Microsoft YaHei" w:cs="Calibri"/>
-        </w:rPr>
-        <w:t xml:space="preserve">消息和延迟消息可以被﻿准﻿确﻿识﻿别﻿。</w:t>
+        <w:t xml:space="preserve">全局状态采用单调 epoch 区分新旧事务。reqId 标识同一 epoch 内的具体请求，使⁠重⁠试⁠、⁠重⁠复</w:t>
+      </w:r>
+    </w:p>
+    <w:p>
+      <w:pPr>
+        <w:ind w:left="0" w:firstLine="420"/>
+      </w:pPr>
+      <w:r>
+        <w:rPr>
+          <w:rFonts w:ascii="Calibri" w:hAnsi="Calibri" w:eastAsia="Microsoft YaHei" w:cs="Calibri"/>
+        </w:rPr>
+        <w:t xml:space="preserve">消息和延迟消息可以被⁠准⁠确⁠识⁠别⁠。</w:t>
       </w:r>
     </w:p>
     <w:p>
@@ -2120,29 +2120,29 @@
         <w:rPr>
           <w:rFonts w:ascii="Calibri" w:hAnsi="Calibri" w:eastAsia="Microsoft YaHei" w:cs="Calibri"/>
         </w:rPr>
-        <w:t xml:space="preserve">一次跨节点操作由请求、仲裁、授权和﻿提﻿交﻿组﻿成﻿：</w:t>
-      </w:r>
-    </w:p>
-    <w:p>
-      <w:pPr>
-        <w:ind w:left="0" w:firstLine="420"/>
-      </w:pPr>
-      <w:r>
-        <w:rPr>
-          <w:rFonts w:ascii="Calibri" w:hAnsi="Calibri" w:eastAsia="Microsoft YaHei" w:cs="Calibri"/>
-        </w:rPr>
-        <w:t xml:space="preserve">1. requester 发送读或写﻿权﻿限﻿请﻿求﻿；</w:t>
-      </w:r>
-    </w:p>
-    <w:p>
-      <w:pPr>
-        <w:ind w:left="0" w:firstLine="420"/>
-      </w:pPr>
-      <w:r>
-        <w:rPr>
-          <w:rFonts w:ascii="Calibri" w:hAnsi="Calibri" w:eastAsia="Microsoft YaHei" w:cs="Calibri"/>
-        </w:rPr>
-        <w:t xml:space="preserve">2. UBCC 查询已提交﻿目﻿录﻿状﻿态﻿；</w:t>
+        <w:t xml:space="preserve">一次跨节点操作由请求、仲裁、授权和⁠提⁠交⁠组⁠成⁠：</w:t>
+      </w:r>
+    </w:p>
+    <w:p>
+      <w:pPr>
+        <w:ind w:left="0" w:firstLine="420"/>
+      </w:pPr>
+      <w:r>
+        <w:rPr>
+          <w:rFonts w:ascii="Calibri" w:hAnsi="Calibri" w:eastAsia="Microsoft YaHei" w:cs="Calibri"/>
+        </w:rPr>
+        <w:t xml:space="preserve">1. requester 发送读或写⁠权⁠限⁠请⁠求⁠；</w:t>
+      </w:r>
+    </w:p>
+    <w:p>
+      <w:pPr>
+        <w:ind w:left="0" w:firstLine="420"/>
+      </w:pPr>
+      <w:r>
+        <w:rPr>
+          <w:rFonts w:ascii="Calibri" w:hAnsi="Calibri" w:eastAsia="Microsoft YaHei" w:cs="Calibri"/>
+        </w:rPr>
+        <w:t xml:space="preserve">2. UBCC 查询已提交⁠目⁠录⁠状⁠态⁠；</w:t>
       </w:r>
     </w:p>
     <w:p>
@@ -2164,7 +2164,7 @@
         <w:rPr>
           <w:rFonts w:ascii="Calibri" w:hAnsi="Calibri" w:eastAsia="Microsoft YaHei" w:cs="Calibri"/>
         </w:rPr>
-        <w:t xml:space="preserve">4. UBCC 返回数据和﻿临﻿时﻿授﻿权﻿；</w:t>
+        <w:t xml:space="preserve">4. UBCC 返回数据和⁠临⁠时⁠授⁠权⁠；</w:t>
       </w:r>
     </w:p>
     <w:p>
@@ -2186,7 +2186,7 @@
         <w:rPr>
           <w:rFonts w:ascii="Calibri" w:hAnsi="Calibri" w:eastAsia="Microsoft YaHei" w:cs="Calibri"/>
         </w:rPr>
-        <w:t xml:space="preserve">6. UBCC 校验事务身份并提交新﻿目﻿录﻿状﻿态﻿。</w:t>
+        <w:t xml:space="preserve">6. UBCC 校验事务身份并提交新⁠目⁠录⁠状⁠态⁠。</w:t>
       </w:r>
     </w:p>
     <w:p>
@@ -2209,7 +2209,7 @@
         <w:rPr>
           <w:rFonts w:ascii="Calibri" w:hAnsi="Calibri" w:eastAsia="Microsoft YaHei" w:cs="Calibri"/>
         </w:rPr>
-        <w:t xml:space="preserve">UBCC 将授权发送与目录提交分为﻿两﻿个﻿阶﻿段﻿：</w:t>
+        <w:t xml:space="preserve">UBCC 将授权发送与目录提交分为⁠两⁠个⁠阶⁠段⁠：</w:t>
       </w:r>
     </w:p>
     <w:p>
@@ -2242,7 +2242,7 @@
         <w:rPr>
           <w:rFonts w:ascii="Calibri" w:hAnsi="Calibri" w:eastAsia="Microsoft YaHei" w:cs="Calibri"/>
         </w:rPr>
-        <w:t xml:space="preserve">该语义保证 Grant 在途期间目录仍保持安全状态，并使重复请求能够返回同一﻿授﻿权﻿结﻿果﻿。</w:t>
+        <w:t xml:space="preserve">该语义保证 Grant 在途期间目录仍保持安全状态，并使重复请求能够返回同一⁠授⁠权⁠结⁠果⁠。</w:t>
       </w:r>
     </w:p>
     <w:p>
@@ -2265,7 +2265,7 @@
         <w:rPr>
           <w:rFonts w:ascii="Calibri" w:hAnsi="Calibri" w:eastAsia="Microsoft YaHei" w:cs="Calibri"/>
         </w:rPr>
-        <w:t xml:space="preserve">UBCC 使用以下机制处理消息重复、延﻿迟﻿和﻿重﻿试﻿：</w:t>
+        <w:t xml:space="preserve">UBCC 使用以下机制处理消息重复、延⁠迟⁠和⁠重⁠试⁠：</w:t>
       </w:r>
     </w:p>
     <w:p>
@@ -2432,7 +2432,7 @@
         <w:rPr>
           <w:rFonts w:ascii="Calibri" w:hAnsi="Calibri" w:eastAsia="Microsoft YaHei" w:cs="Calibri"/>
         </w:rPr>
-        <w:t xml:space="preserve">2. UBCC 查询 owner 和 share﻿r﻿ ﻿状﻿态﻿；</w:t>
+        <w:t xml:space="preserve">2. UBCC 查询 owner 和 share⁠r⁠ ⁠状⁠态⁠；</w:t>
       </w:r>
     </w:p>
     <w:p>
@@ -2454,18 +2454,18 @@
         <w:rPr>
           <w:rFonts w:ascii="Calibri" w:hAnsi="Calibri" w:eastAsia="Microsoft YaHei" w:cs="Calibri"/>
         </w:rPr>
-        <w:t xml:space="preserve">4. owner 节点经 EP-RNF 读取节点内权威副本并﻿返﻿回﻿数﻿据﻿；</w:t>
-      </w:r>
-    </w:p>
-    <w:p>
-      <w:pPr>
-        <w:ind w:left="0" w:firstLine="420"/>
-      </w:pPr>
-      <w:r>
-        <w:rPr>
-          <w:rFonts w:ascii="Calibri" w:hAnsi="Calibri" w:eastAsia="Microsoft YaHei" w:cs="Calibri"/>
-        </w:rPr>
-        <w:t xml:space="preserve">5. UBCC 更新共享关系并向 requester 返回数﻿据﻿和﻿授﻿权﻿。</w:t>
+        <w:t xml:space="preserve">4. owner 节点经 EP-RNF 读取节点内权威副本并⁠返⁠回⁠数⁠据⁠；</w:t>
+      </w:r>
+    </w:p>
+    <w:p>
+      <w:pPr>
+        <w:ind w:left="0" w:firstLine="420"/>
+      </w:pPr>
+      <w:r>
+        <w:rPr>
+          <w:rFonts w:ascii="Calibri" w:hAnsi="Calibri" w:eastAsia="Microsoft YaHei" w:cs="Calibri"/>
+        </w:rPr>
+        <w:t xml:space="preserve">5. UBCC 更新共享关系并向 requester 返回数⁠据⁠和⁠授⁠权⁠。</w:t>
       </w:r>
     </w:p>
     <w:p>
@@ -2499,7 +2499,7 @@
         <w:rPr>
           <w:rFonts w:ascii="Calibri" w:hAnsi="Calibri" w:eastAsia="Microsoft YaHei" w:cs="Calibri"/>
         </w:rPr>
-        <w:t xml:space="preserve">1. 新写者向 Home UBCC 请求独占或﻿修﻿改﻿权﻿限﻿；</w:t>
+        <w:t xml:space="preserve">1. 新写者向 Home UBCC 请求独占或⁠修⁠改⁠权⁠限⁠；</w:t>
       </w:r>
     </w:p>
     <w:p>
@@ -2521,40 +2521,40 @@
         <w:rPr>
           <w:rFonts w:ascii="Calibri" w:hAnsi="Calibri" w:eastAsia="Microsoft YaHei" w:cs="Calibri"/>
         </w:rPr>
-        <w:t xml:space="preserve">3. 旧 owner 完成本地降级或失效，并返回﻿最﻿新﻿数﻿据﻿；</w:t>
-      </w:r>
-    </w:p>
-    <w:p>
-      <w:pPr>
-        <w:ind w:left="0" w:firstLine="420"/>
-      </w:pPr>
-      <w:r>
-        <w:rPr>
-          <w:rFonts w:ascii="Calibri" w:hAnsi="Calibri" w:eastAsia="Microsoft YaHei" w:cs="Calibri"/>
-        </w:rPr>
-        <w:t xml:space="preserve">4. UBCC 完成权﻿限﻿重﻿配﻿置﻿；</w:t>
-      </w:r>
-    </w:p>
-    <w:p>
-      <w:pPr>
-        <w:ind w:left="0" w:firstLine="420"/>
-      </w:pPr>
-      <w:r>
-        <w:rPr>
-          <w:rFonts w:ascii="Calibri" w:hAnsi="Calibri" w:eastAsia="Microsoft YaHei" w:cs="Calibri"/>
-        </w:rPr>
-        <w:t xml:space="preserve">5. 新写者获得数据和单﻿一﻿写﻿权﻿限﻿。</w:t>
-      </w:r>
-    </w:p>
-    <w:p>
-      <w:pPr>
-        <w:ind w:left="0" w:firstLine="420"/>
-      </w:pPr>
-      <w:r>
-        <w:rPr>
-          <w:rFonts w:ascii="Calibri" w:hAnsi="Calibri" w:eastAsia="Microsoft YaHei" w:cs="Calibri"/>
-        </w:rPr>
-        <w:t xml:space="preserve">该路径的优势来自全局目录对最新数据位置的直接定位，以及权限释放与新授权﻿之﻿间﻿的﻿统﻿一</w:t>
+        <w:t xml:space="preserve">3. 旧 owner 完成本地降级或失效，并返回⁠最⁠新⁠数⁠据⁠；</w:t>
+      </w:r>
+    </w:p>
+    <w:p>
+      <w:pPr>
+        <w:ind w:left="0" w:firstLine="420"/>
+      </w:pPr>
+      <w:r>
+        <w:rPr>
+          <w:rFonts w:ascii="Calibri" w:hAnsi="Calibri" w:eastAsia="Microsoft YaHei" w:cs="Calibri"/>
+        </w:rPr>
+        <w:t xml:space="preserve">4. UBCC 完成权⁠限⁠重⁠配⁠置⁠；</w:t>
+      </w:r>
+    </w:p>
+    <w:p>
+      <w:pPr>
+        <w:ind w:left="0" w:firstLine="420"/>
+      </w:pPr>
+      <w:r>
+        <w:rPr>
+          <w:rFonts w:ascii="Calibri" w:hAnsi="Calibri" w:eastAsia="Microsoft YaHei" w:cs="Calibri"/>
+        </w:rPr>
+        <w:t xml:space="preserve">5. 新写者获得数据和单⁠一⁠写⁠权⁠限⁠。</w:t>
+      </w:r>
+    </w:p>
+    <w:p>
+      <w:pPr>
+        <w:ind w:left="0" w:firstLine="420"/>
+      </w:pPr>
+      <w:r>
+        <w:rPr>
+          <w:rFonts w:ascii="Calibri" w:hAnsi="Calibri" w:eastAsia="Microsoft YaHei" w:cs="Calibri"/>
+        </w:rPr>
+        <w:t xml:space="preserve">该路径的优势来自全局目录对最新数据位置的直接定位，以及权限释放与新授权⁠之⁠间⁠的⁠统⁠一</w:t>
       </w:r>
     </w:p>
     <w:p>
@@ -2588,29 +2588,29 @@
         <w:rPr>
           <w:rFonts w:ascii="Calibri" w:hAnsi="Calibri" w:eastAsia="Microsoft YaHei" w:cs="Calibri"/>
         </w:rPr>
-        <w:t xml:space="preserve">共享转写者路径用于将多个共享副本收敛为﻿单﻿一﻿写﻿者﻿：</w:t>
-      </w:r>
-    </w:p>
-    <w:p>
-      <w:pPr>
-        <w:ind w:left="0" w:firstLine="420"/>
-      </w:pPr>
-      <w:r>
-        <w:rPr>
-          <w:rFonts w:ascii="Calibri" w:hAnsi="Calibri" w:eastAsia="Microsoft YaHei" w:cs="Calibri"/>
-        </w:rPr>
-        <w:t xml:space="preserve">1. requester 发起写﻿权﻿限﻿请﻿求﻿；</w:t>
-      </w:r>
-    </w:p>
-    <w:p>
-      <w:pPr>
-        <w:ind w:left="0" w:firstLine="420"/>
-      </w:pPr>
-      <w:r>
-        <w:rPr>
-          <w:rFonts w:ascii="Calibri" w:hAnsi="Calibri" w:eastAsia="Microsoft YaHei" w:cs="Calibri"/>
-        </w:rPr>
-        <w:t xml:space="preserve">2. UBCC 冻结本次事务的有效 sharer ﻿目﻿标﻿集﻿合﻿；</w:t>
+        <w:t xml:space="preserve">共享转写者路径用于将多个共享副本收敛为⁠单⁠一⁠写⁠者⁠：</w:t>
+      </w:r>
+    </w:p>
+    <w:p>
+      <w:pPr>
+        <w:ind w:left="0" w:firstLine="420"/>
+      </w:pPr>
+      <w:r>
+        <w:rPr>
+          <w:rFonts w:ascii="Calibri" w:hAnsi="Calibri" w:eastAsia="Microsoft YaHei" w:cs="Calibri"/>
+        </w:rPr>
+        <w:t xml:space="preserve">1. requester 发起写⁠权⁠限⁠请⁠求⁠；</w:t>
+      </w:r>
+    </w:p>
+    <w:p>
+      <w:pPr>
+        <w:ind w:left="0" w:firstLine="420"/>
+      </w:pPr>
+      <w:r>
+        <w:rPr>
+          <w:rFonts w:ascii="Calibri" w:hAnsi="Calibri" w:eastAsia="Microsoft YaHei" w:cs="Calibri"/>
+        </w:rPr>
+        <w:t xml:space="preserve">2. UBCC 冻结本次事务的有效 sharer ⁠目⁠标⁠集⁠合⁠；</w:t>
       </w:r>
     </w:p>
     <w:p>
@@ -2632,29 +2632,29 @@
         <w:rPr>
           <w:rFonts w:ascii="Calibri" w:hAnsi="Calibri" w:eastAsia="Microsoft YaHei" w:cs="Calibri"/>
         </w:rPr>
-        <w:t xml:space="preserve">4. 每个目标完成本地失效并返回﻿ ﻿A﻿c﻿k﻿；</w:t>
-      </w:r>
-    </w:p>
-    <w:p>
-      <w:pPr>
-        <w:ind w:left="0" w:firstLine="420"/>
-      </w:pPr>
-      <w:r>
-        <w:rPr>
-          <w:rFonts w:ascii="Calibri" w:hAnsi="Calibri" w:eastAsia="Microsoft YaHei" w:cs="Calibri"/>
-        </w:rPr>
-        <w:t xml:space="preserve">5. UBCC 在 Ack 集合收敛后向 requeste﻿r﻿ ﻿授﻿权﻿；</w:t>
-      </w:r>
-    </w:p>
-    <w:p>
-      <w:pPr>
-        <w:ind w:left="0" w:firstLine="420"/>
-      </w:pPr>
-      <w:r>
-        <w:rPr>
-          <w:rFonts w:ascii="Calibri" w:hAnsi="Calibri" w:eastAsia="Microsoft YaHei" w:cs="Calibri"/>
-        </w:rPr>
-        <w:t xml:space="preserve">6. Clear 到达后提交新的 owne﻿r﻿ ﻿状﻿态﻿。</w:t>
+        <w:t xml:space="preserve">4. 每个目标完成本地失效并返回⁠ ⁠A⁠c⁠k⁠；</w:t>
+      </w:r>
+    </w:p>
+    <w:p>
+      <w:pPr>
+        <w:ind w:left="0" w:firstLine="420"/>
+      </w:pPr>
+      <w:r>
+        <w:rPr>
+          <w:rFonts w:ascii="Calibri" w:hAnsi="Calibri" w:eastAsia="Microsoft YaHei" w:cs="Calibri"/>
+        </w:rPr>
+        <w:t xml:space="preserve">5. UBCC 在 Ack 集合收敛后向 requeste⁠r⁠ ⁠授⁠权⁠；</w:t>
+      </w:r>
+    </w:p>
+    <w:p>
+      <w:pPr>
+        <w:ind w:left="0" w:firstLine="420"/>
+      </w:pPr>
+      <w:r>
+        <w:rPr>
+          <w:rFonts w:ascii="Calibri" w:hAnsi="Calibri" w:eastAsia="Microsoft YaHei" w:cs="Calibri"/>
+        </w:rPr>
+        <w:t xml:space="preserve">6. Clear 到达后提交新的 owne⁠r⁠ ⁠状⁠态⁠。</w:t>
       </w:r>
     </w:p>
     <w:p>
@@ -2677,18 +2677,18 @@
         <w:rPr>
           <w:rFonts w:ascii="Calibri" w:hAnsi="Calibri" w:eastAsia="Microsoft YaHei" w:cs="Calibri"/>
         </w:rPr>
-        <w:t xml:space="preserve">节点逐出脏数据时，UBCC 根据 committed directory 和事务 epoch 校验写回来源﻿。﻿有﻿效﻿写﻿回</w:t>
-      </w:r>
-    </w:p>
-    <w:p>
-      <w:pPr>
-        <w:ind w:left="0" w:firstLine="420"/>
-      </w:pPr>
-      <w:r>
-        <w:rPr>
-          <w:rFonts w:ascii="Calibri" w:hAnsi="Calibri" w:eastAsia="Microsoft YaHei" w:cs="Calibri"/>
-        </w:rPr>
-        <w:t xml:space="preserve">可作为 Recall 的权威数据返回；重复或过期写回不会重复提交﻿目﻿录﻿状﻿态﻿。</w:t>
+        <w:t xml:space="preserve">节点逐出脏数据时，UBCC 根据 committed directory 和事务 epoch 校验写回来源⁠。⁠有⁠效⁠写⁠回</w:t>
+      </w:r>
+    </w:p>
+    <w:p>
+      <w:pPr>
+        <w:ind w:left="0" w:firstLine="420"/>
+      </w:pPr>
+      <w:r>
+        <w:rPr>
+          <w:rFonts w:ascii="Calibri" w:hAnsi="Calibri" w:eastAsia="Microsoft YaHei" w:cs="Calibri"/>
+        </w:rPr>
+        <w:t xml:space="preserve">可作为 Recall 的权威数据返回；重复或过期写回不会重复提交⁠目⁠录⁠状⁠态⁠。</w:t>
       </w:r>
     </w:p>
     <w:p>
@@ -2711,18 +2711,18 @@
         <w:rPr>
           <w:rFonts w:ascii="Calibri" w:hAnsi="Calibri" w:eastAsia="Microsoft YaHei" w:cs="Calibri"/>
         </w:rPr>
-        <w:t xml:space="preserve">ResidentDir 达到容量边界时，冷目录条目写入 Backstore。后续访问由 Home 重新﻿装﻿入﻿条﻿目﻿并</w:t>
-      </w:r>
-    </w:p>
-    <w:p>
-      <w:pPr>
-        <w:ind w:left="0" w:firstLine="420"/>
-      </w:pPr>
-      <w:r>
-        <w:rPr>
-          <w:rFonts w:ascii="Calibri" w:hAnsi="Calibri" w:eastAsia="Microsoft YaHei" w:cs="Calibri"/>
-        </w:rPr>
-        <w:t xml:space="preserve">恢复全局 sharer/owner 信息。对同一 set 的并发请求进入 waiter 队列，在条目可﻿用﻿后﻿按﻿事﻿务</w:t>
+        <w:t xml:space="preserve">ResidentDir 达到容量边界时，冷目录条目写入 Backstore。后续访问由 Home 重新⁠装⁠入⁠条⁠目⁠并</w:t>
+      </w:r>
+    </w:p>
+    <w:p>
+      <w:pPr>
+        <w:ind w:left="0" w:firstLine="420"/>
+      </w:pPr>
+      <w:r>
+        <w:rPr>
+          <w:rFonts w:ascii="Calibri" w:hAnsi="Calibri" w:eastAsia="Microsoft YaHei" w:cs="Calibri"/>
+        </w:rPr>
+        <w:t xml:space="preserve">恢复全局 sharer/owner 信息。对同一 set 的并发请求进入 waiter 队列，在条目可⁠用⁠后⁠按⁠事⁠务</w:t>
       </w:r>
     </w:p>
     <w:p>
@@ -2768,18 +2768,18 @@
         <w:rPr>
           <w:rFonts w:ascii="Calibri" w:hAnsi="Calibri" w:eastAsia="Microsoft YaHei" w:cs="Calibri"/>
         </w:rPr>
-        <w:t xml:space="preserve">UBCC 对同一缓存行保持单一主事务。并发请求根据 committed state、outstanding st﻿a﻿g﻿e﻿ ﻿和</w:t>
-      </w:r>
-    </w:p>
-    <w:p>
-      <w:pPr>
-        <w:ind w:left="0" w:firstLine="420"/>
-      </w:pPr>
-      <w:r>
-        <w:rPr>
-          <w:rFonts w:ascii="Calibri" w:hAnsi="Calibri" w:eastAsia="Microsoft YaHei" w:cs="Calibri"/>
-        </w:rPr>
-        <w:t xml:space="preserve">请求类型进入以下﻿处﻿理﻿之﻿一﻿：</w:t>
+        <w:t xml:space="preserve">UBCC 对同一缓存行保持单一主事务。并发请求根据 committed state、outstanding st⁠a⁠g⁠e⁠ ⁠和</w:t>
+      </w:r>
+    </w:p>
+    <w:p>
+      <w:pPr>
+        <w:ind w:left="0" w:firstLine="420"/>
+      </w:pPr>
+      <w:r>
+        <w:rPr>
+          <w:rFonts w:ascii="Calibri" w:hAnsi="Calibri" w:eastAsia="Microsoft YaHei" w:cs="Calibri"/>
+        </w:rPr>
+        <w:t xml:space="preserve">请求类型进入以下⁠处⁠理⁠之⁠一⁠：</w:t>
       </w:r>
     </w:p>
     <w:p>
@@ -2846,18 +2846,18 @@
         <w:rPr>
           <w:rFonts w:ascii="Calibri" w:hAnsi="Calibri" w:eastAsia="Microsoft YaHei" w:cs="Calibri"/>
         </w:rPr>
-        <w:t xml:space="preserve">失效目标以发送时刻的 committed directory 为基础计算，并扣除已完成降级或已确﻿认﻿的﻿目﻿标﻿。</w:t>
-      </w:r>
-    </w:p>
-    <w:p>
-      <w:pPr>
-        <w:ind w:left="0" w:firstLine="420"/>
-      </w:pPr>
-      <w:r>
-        <w:rPr>
-          <w:rFonts w:ascii="Calibri" w:hAnsi="Calibri" w:eastAsia="Microsoft YaHei" w:cs="Calibri"/>
-        </w:rPr>
-        <w:t xml:space="preserve">该机制使 partial Ack 重试只覆盖尚未确认的节点，避免重复扩大﻿失﻿效﻿范﻿围﻿。</w:t>
+        <w:t xml:space="preserve">失效目标以发送时刻的 committed directory 为基础计算，并扣除已完成降级或已确⁠认⁠的⁠目⁠标⁠。</w:t>
+      </w:r>
+    </w:p>
+    <w:p>
+      <w:pPr>
+        <w:ind w:left="0" w:firstLine="420"/>
+      </w:pPr>
+      <w:r>
+        <w:rPr>
+          <w:rFonts w:ascii="Calibri" w:hAnsi="Calibri" w:eastAsia="Microsoft YaHei" w:cs="Calibri"/>
+        </w:rPr>
+        <w:t xml:space="preserve">该机制使 partial Ack 重试只覆盖尚未确认的节点，避免重复扩大⁠失⁠效⁠范⁠围⁠。</w:t>
       </w:r>
     </w:p>
     <w:p>
@@ -2880,7 +2880,7 @@
         <w:rPr>
           <w:rFonts w:ascii="Calibri" w:hAnsi="Calibri" w:eastAsia="Microsoft YaHei" w:cs="Calibri"/>
         </w:rPr>
-        <w:t xml:space="preserve">EP-RNF 对同址 CHI 事务和 snoop 采用﻿分﻿类﻿仲﻿裁﻿：</w:t>
+        <w:t xml:space="preserve">EP-RNF 对同址 CHI 事务和 snoop 采用⁠分⁠类⁠仲⁠裁⁠：</w:t>
       </w:r>
     </w:p>
     <w:p>
@@ -2958,7 +2958,7 @@
         <w:rPr>
           <w:rFonts w:ascii="Calibri" w:hAnsi="Calibri" w:eastAsia="Microsoft YaHei" w:cs="Calibri"/>
         </w:rPr>
-        <w:t xml:space="preserve">保留其他 requester、其他事务身份和其他操作类型的 waiter，再安全重放﻿剩﻿余﻿请﻿求﻿。</w:t>
+        <w:t xml:space="preserve">保留其他 requester、其他事务身份和其他操作类型的 waiter，再安全重放⁠剩⁠余⁠请⁠求⁠。</w:t>
       </w:r>
     </w:p>
     <w:p>
@@ -2981,18 +2981,18 @@
         <w:rPr>
           <w:rFonts w:ascii="Calibri" w:hAnsi="Calibri" w:eastAsia="Microsoft YaHei" w:cs="Calibri"/>
         </w:rPr>
-        <w:t xml:space="preserve">Clear、Upgrade、Invalidate 和 Recall 路径均保存原事务身份。发生可恢复消息丢﻿失﻿时﻿，﻿协﻿议</w:t>
-      </w:r>
-    </w:p>
-    <w:p>
-      <w:pPr>
-        <w:ind w:left="0" w:firstLine="420"/>
-      </w:pPr>
-      <w:r>
-        <w:rPr>
-          <w:rFonts w:ascii="Calibri" w:hAnsi="Calibri" w:eastAsia="Microsoft YaHei" w:cs="Calibri"/>
-        </w:rPr>
-        <w:t xml:space="preserve">重发相同 tuple，并由接收方按 epoch、reqId 和 Ack 状态执行﻿幂﻿等﻿处﻿理﻿。</w:t>
+        <w:t xml:space="preserve">Clear、Upgrade、Invalidate 和 Recall 路径均保存原事务身份。发生可恢复消息丢⁠失⁠时⁠，⁠协⁠议</w:t>
+      </w:r>
+    </w:p>
+    <w:p>
+      <w:pPr>
+        <w:ind w:left="0" w:firstLine="420"/>
+      </w:pPr>
+      <w:r>
+        <w:rPr>
+          <w:rFonts w:ascii="Calibri" w:hAnsi="Calibri" w:eastAsia="Microsoft YaHei" w:cs="Calibri"/>
+        </w:rPr>
+        <w:t xml:space="preserve">重发相同 tuple，并由接收方按 epoch、reqId 和 Ack 状态执行⁠幂⁠等⁠处⁠理⁠。</w:t>
       </w:r>
     </w:p>
     <w:p>
@@ -3027,18 +3027,18 @@
         <w:rPr>
           <w:rFonts w:ascii="Calibri" w:hAnsi="Calibri" w:eastAsia="Microsoft YaHei" w:cs="Calibri"/>
         </w:rPr>
-        <w:t xml:space="preserve">UBCC 将全局目录与仲裁逻辑置于独立模块，避免全局元数据直接占用节点内 HN-F﻿ ﻿的﻿目﻿录﻿和</w:t>
-      </w:r>
-    </w:p>
-    <w:p>
-      <w:pPr>
-        <w:ind w:left="0" w:firstLine="420"/>
-      </w:pPr>
-      <w:r>
-        <w:rPr>
-          <w:rFonts w:ascii="Calibri" w:hAnsi="Calibri" w:eastAsia="Microsoft YaHei" w:cs="Calibri"/>
-        </w:rPr>
-        <w:t xml:space="preserve">事务资源。该边界有利于容量扩展、协议演进和多仿﻿真﻿器﻿集﻿成﻿。</w:t>
+        <w:t xml:space="preserve">UBCC 将全局目录与仲裁逻辑置于独立模块，避免全局元数据直接占用节点内 HN-F⁠ ⁠的⁠目⁠录⁠和</w:t>
+      </w:r>
+    </w:p>
+    <w:p>
+      <w:pPr>
+        <w:ind w:left="0" w:firstLine="420"/>
+      </w:pPr>
+      <w:r>
+        <w:rPr>
+          <w:rFonts w:ascii="Calibri" w:hAnsi="Calibri" w:eastAsia="Microsoft YaHei" w:cs="Calibri"/>
+        </w:rPr>
+        <w:t xml:space="preserve">事务资源。该边界有利于容量扩展、协议演进和多仿⁠真⁠器⁠集⁠成⁠。</w:t>
       </w:r>
     </w:p>
     <w:p>
@@ -3061,18 +3061,18 @@
         <w:rPr>
           <w:rFonts w:ascii="Calibri" w:hAnsi="Calibri" w:eastAsia="Microsoft YaHei" w:cs="Calibri"/>
         </w:rPr>
-        <w:t xml:space="preserve">ResidentDir 为热点目录提供低时延访问，Backstore 为冷元数据提供容量扩展。正﻿式﻿验﻿收﻿中﻿，</w:t>
-      </w:r>
-    </w:p>
-    <w:p>
-      <w:pPr>
-        <w:ind w:left="0" w:firstLine="420"/>
-      </w:pPr>
-      <w:r>
-        <w:rPr>
-          <w:rFonts w:ascii="Calibri" w:hAnsi="Calibri" w:eastAsia="Microsoft YaHei" w:cs="Calibri"/>
-        </w:rPr>
-        <w:t xml:space="preserve">UBCC 的等效追踪容量达到 naive 基线的 1.5﻿1﻿5﻿ ﻿倍﻿。</w:t>
+        <w:t xml:space="preserve">ResidentDir 为热点目录提供低时延访问，Backstore 为冷元数据提供容量扩展。正⁠式⁠验⁠收⁠中⁠，</w:t>
+      </w:r>
+    </w:p>
+    <w:p>
+      <w:pPr>
+        <w:ind w:left="0" w:firstLine="420"/>
+      </w:pPr>
+      <w:r>
+        <w:rPr>
+          <w:rFonts w:ascii="Calibri" w:hAnsi="Calibri" w:eastAsia="Microsoft YaHei" w:cs="Calibri"/>
+        </w:rPr>
+        <w:t xml:space="preserve">UBCC 的等效追踪容量达到 naive 基线的 1.5⁠1⁠5⁠ ⁠倍⁠。</w:t>
       </w:r>
     </w:p>
     <w:p>
@@ -3095,18 +3095,18 @@
         <w:rPr>
           <w:rFonts w:ascii="Calibri" w:hAnsi="Calibri" w:eastAsia="Microsoft YaHei" w:cs="Calibri"/>
         </w:rPr>
-        <w:t xml:space="preserve">UBCC 依据全局 sharer/owner 状态生成 Recall 和 Invalidate 目标，避免将所有远﻿程﻿节﻿点﻿作﻿为</w:t>
-      </w:r>
-    </w:p>
-    <w:p>
-      <w:pPr>
-        <w:ind w:left="0" w:firstLine="420"/>
-      </w:pPr>
-      <w:r>
-        <w:rPr>
-          <w:rFonts w:ascii="Calibri" w:hAnsi="Calibri" w:eastAsia="Microsoft YaHei" w:cs="Calibri"/>
-        </w:rPr>
-        <w:t xml:space="preserve">默认广播对象。随着节点规模增加，精确目标选择能够直接降低无效消息和目﻿标﻿端﻿干﻿扰﻿。</w:t>
+        <w:t xml:space="preserve">UBCC 依据全局 sharer/owner 状态生成 Recall 和 Invalidate 目标，避免将所有远⁠程⁠节⁠点⁠作⁠为</w:t>
+      </w:r>
+    </w:p>
+    <w:p>
+      <w:pPr>
+        <w:ind w:left="0" w:firstLine="420"/>
+      </w:pPr>
+      <w:r>
+        <w:rPr>
+          <w:rFonts w:ascii="Calibri" w:hAnsi="Calibri" w:eastAsia="Microsoft YaHei" w:cs="Calibri"/>
+        </w:rPr>
+        <w:t xml:space="preserve">默认广播对象。随着节点规模增加，精确目标选择能够直接降低无效消息和目⁠标⁠端⁠干⁠扰⁠。</w:t>
       </w:r>
     </w:p>
     <w:p>
@@ -3129,18 +3129,18 @@
         <w:rPr>
           <w:rFonts w:ascii="Calibri" w:hAnsi="Calibri" w:eastAsia="Microsoft YaHei" w:cs="Calibri"/>
         </w:rPr>
-        <w:t xml:space="preserve">UBCC 支持单向完成语义、直接数据路径和批量共享者处理。相关性能收益由《UBCC﻿ ﻿性﻿能﻿验﻿收</w:t>
-      </w:r>
-    </w:p>
-    <w:p>
-      <w:pPr>
-        <w:ind w:left="0" w:firstLine="420"/>
-      </w:pPr>
-      <w:r>
-        <w:rPr>
-          <w:rFonts w:ascii="Calibri" w:hAnsi="Calibri" w:eastAsia="Microsoft YaHei" w:cs="Calibri"/>
-        </w:rPr>
-        <w:t xml:space="preserve">与集成接口说明》中的配对﻿实﻿验﻿给﻿出﻿。</w:t>
+        <w:t xml:space="preserve">UBCC 支持单向完成语义、直接数据路径和批量共享者处理。相关性能收益由《UBCC⁠ ⁠性⁠能⁠验⁠收</w:t>
+      </w:r>
+    </w:p>
+    <w:p>
+      <w:pPr>
+        <w:ind w:left="0" w:firstLine="420"/>
+      </w:pPr>
+      <w:r>
+        <w:rPr>
+          <w:rFonts w:ascii="Calibri" w:hAnsi="Calibri" w:eastAsia="Microsoft YaHei" w:cs="Calibri"/>
+        </w:rPr>
+        <w:t xml:space="preserve">与集成接口说明》中的配对⁠实⁠验⁠给⁠出⁠。</w:t>
       </w:r>
     </w:p>
     <w:p>
@@ -3210,7 +3210,7 @@
                 <w:sz w:val="18"/>
                 <w:szCs w:val="18"/>
               </w:rPr>
-              <w:t xml:space="preserve">U﻿B﻿C﻿C</w:t>
+              <w:t xml:space="preserve">U⁠B⁠C⁠C</w:t>
             </w:r>
           </w:p>
         </w:tc>
@@ -3231,7 +3231,7 @@
                 <w:sz w:val="18"/>
                 <w:szCs w:val="18"/>
               </w:rPr>
-              <w:t xml:space="preserve">H﻿N﻿-﻿F 内置全局目录方案</w:t>
+              <w:t xml:space="preserve">H⁠N⁠-⁠F 内置全局目录方案</w:t>
             </w:r>
           </w:p>
         </w:tc>
@@ -3272,25 +3272,25 @@
                 <w:sz w:val="18"/>
                 <w:szCs w:val="18"/>
               </w:rPr>
-              <w:t xml:space="preserve">独立 U﻿B﻿I﻿O 模块</w:t>
-            </w:r>
-          </w:p>
-        </w:tc>
-        <w:tc>
-          <w:tcPr/>
-          <w:p>
-            <w:pPr>
-              <w:pStyle w:val="TableText"/>
-              <w:jc w:val="left"/>
-              <w:spacing w:before="0" w:after="0" w:line="320" w:lineRule="exact"/>
-            </w:pPr>
-            <w:r>
-              <w:rPr>
-                <w:rFonts w:ascii="Calibri" w:hAnsi="Calibri" w:eastAsia="Microsoft YaHei" w:cs="Calibri"/>
-                <w:sz w:val="18"/>
-                <w:szCs w:val="18"/>
-              </w:rPr>
-              <w:t xml:space="preserve">节点内 H﻿N﻿-﻿F</w:t>
+              <w:t xml:space="preserve">独立 U⁠B⁠I⁠O 模块</w:t>
+            </w:r>
+          </w:p>
+        </w:tc>
+        <w:tc>
+          <w:tcPr/>
+          <w:p>
+            <w:pPr>
+              <w:pStyle w:val="TableText"/>
+              <w:jc w:val="left"/>
+              <w:spacing w:before="0" w:after="0" w:line="320" w:lineRule="exact"/>
+            </w:pPr>
+            <w:r>
+              <w:rPr>
+                <w:rFonts w:ascii="Calibri" w:hAnsi="Calibri" w:eastAsia="Microsoft YaHei" w:cs="Calibri"/>
+                <w:sz w:val="18"/>
+                <w:szCs w:val="18"/>
+              </w:rPr>
+              <w:t xml:space="preserve">节点内 H⁠N⁠-⁠F</w:t>
             </w:r>
           </w:p>
         </w:tc>
@@ -3390,25 +3390,25 @@
                 <w:sz w:val="18"/>
                 <w:szCs w:val="18"/>
               </w:rPr>
-              <w:t xml:space="preserve">R﻿e﻿s﻿i﻿d﻿e﻿n﻿t﻿D﻿i﻿r + B﻿a﻿c﻿k﻿s﻿t﻿o﻿r﻿e</w:t>
-            </w:r>
-          </w:p>
-        </w:tc>
-        <w:tc>
-          <w:tcPr/>
-          <w:p>
-            <w:pPr>
-              <w:pStyle w:val="TableText"/>
-              <w:jc w:val="left"/>
-              <w:spacing w:before="0" w:after="0" w:line="320" w:lineRule="exact"/>
-            </w:pPr>
-            <w:r>
-              <w:rPr>
-                <w:rFonts w:ascii="Calibri" w:hAnsi="Calibri" w:eastAsia="Microsoft YaHei" w:cs="Calibri"/>
-                <w:sz w:val="18"/>
-                <w:szCs w:val="18"/>
-              </w:rPr>
-              <w:t xml:space="preserve">由 H﻿N﻿-﻿F 目录容量决定</w:t>
+              <w:t xml:space="preserve">R⁠e⁠s⁠i⁠d⁠e⁠n⁠t⁠D⁠i⁠r + B⁠a⁠c⁠k⁠s⁠t⁠o⁠r⁠e</w:t>
+            </w:r>
+          </w:p>
+        </w:tc>
+        <w:tc>
+          <w:tcPr/>
+          <w:p>
+            <w:pPr>
+              <w:pStyle w:val="TableText"/>
+              <w:jc w:val="left"/>
+              <w:spacing w:before="0" w:after="0" w:line="320" w:lineRule="exact"/>
+            </w:pPr>
+            <w:r>
+              <w:rPr>
+                <w:rFonts w:ascii="Calibri" w:hAnsi="Calibri" w:eastAsia="Microsoft YaHei" w:cs="Calibri"/>
+                <w:sz w:val="18"/>
+                <w:szCs w:val="18"/>
+              </w:rPr>
+              <w:t xml:space="preserve">由 H⁠N⁠-⁠F 目录容量决定</w:t>
             </w:r>
           </w:p>
         </w:tc>
@@ -3449,25 +3449,25 @@
                 <w:sz w:val="18"/>
                 <w:szCs w:val="18"/>
               </w:rPr>
-              <w:t xml:space="preserve">全局 s﻿h﻿a﻿r﻿e﻿r/o﻿w﻿n﻿e﻿r 精确选择</w:t>
-            </w:r>
-          </w:p>
-        </w:tc>
-        <w:tc>
-          <w:tcPr/>
-          <w:p>
-            <w:pPr>
-              <w:pStyle w:val="TableText"/>
-              <w:jc w:val="left"/>
-              <w:spacing w:before="0" w:after="0" w:line="320" w:lineRule="exact"/>
-            </w:pPr>
-            <w:r>
-              <w:rPr>
-                <w:rFonts w:ascii="Calibri" w:hAnsi="Calibri" w:eastAsia="Microsoft YaHei" w:cs="Calibri"/>
-                <w:sz w:val="18"/>
-                <w:szCs w:val="18"/>
-              </w:rPr>
-              <w:t xml:space="preserve">取决于具体 H﻿A 目录组织</w:t>
+              <w:t xml:space="preserve">全局 s⁠h⁠a⁠r⁠e⁠r/o⁠w⁠n⁠e⁠r 精确选择</w:t>
+            </w:r>
+          </w:p>
+        </w:tc>
+        <w:tc>
+          <w:tcPr/>
+          <w:p>
+            <w:pPr>
+              <w:pStyle w:val="TableText"/>
+              <w:jc w:val="left"/>
+              <w:spacing w:before="0" w:after="0" w:line="320" w:lineRule="exact"/>
+            </w:pPr>
+            <w:r>
+              <w:rPr>
+                <w:rFonts w:ascii="Calibri" w:hAnsi="Calibri" w:eastAsia="Microsoft YaHei" w:cs="Calibri"/>
+                <w:sz w:val="18"/>
+                <w:szCs w:val="18"/>
+              </w:rPr>
+              <w:t xml:space="preserve">取决于具体 H⁠A 目录组织</w:t>
             </w:r>
           </w:p>
         </w:tc>
@@ -3508,7 +3508,7 @@
                 <w:sz w:val="18"/>
                 <w:szCs w:val="18"/>
               </w:rPr>
-              <w:t xml:space="preserve">O﻿u﻿t﻿e﻿r 域独立演进</w:t>
+              <w:t xml:space="preserve">O⁠u⁠t⁠e⁠r 域独立演进</w:t>
             </w:r>
           </w:p>
         </w:tc>
@@ -3552,7 +3552,7 @@
         <w:rPr>
           <w:rFonts w:ascii="Calibri" w:hAnsi="Calibri" w:eastAsia="Microsoft YaHei" w:cs="Calibri"/>
         </w:rPr>
-        <w:t xml:space="preserve">Phase-1 先比较了若干候选组织方式，再收敛到当前方案。候选方案的职责﻿边﻿界﻿如﻿下﻿：</w:t>
+        <w:t xml:space="preserve">Phase-1 先比较了若干候选组织方式，再收敛到当前方案。候选方案的职责⁠边⁠界⁠如⁠下⁠：</w:t>
       </w:r>
     </w:p>
     <w:tbl>
@@ -3631,7 +3631,7 @@
                 <w:sz w:val="18"/>
                 <w:szCs w:val="18"/>
               </w:rPr>
-              <w:t xml:space="preserve">P﻿h﻿a﻿s﻿e﻿-﻿1 判断</w:t>
+              <w:t xml:space="preserve">P⁠h⁠a⁠s⁠e⁠-⁠1 判断</w:t>
             </w:r>
           </w:p>
         </w:tc>
@@ -3654,25 +3654,25 @@
                 <w:sz w:val="18"/>
                 <w:szCs w:val="18"/>
               </w:rPr>
-              <w:t xml:space="preserve">H﻿N﻿-﻿F 内置全局目录</w:t>
-            </w:r>
-          </w:p>
-        </w:tc>
-        <w:tc>
-          <w:tcPr/>
-          <w:p>
-            <w:pPr>
-              <w:pStyle w:val="TableText"/>
-              <w:jc w:val="left"/>
-              <w:spacing w:before="0" w:after="0" w:line="320" w:lineRule="exact"/>
-            </w:pPr>
-            <w:r>
-              <w:rPr>
-                <w:rFonts w:ascii="Calibri" w:hAnsi="Calibri" w:eastAsia="Microsoft YaHei" w:cs="Calibri"/>
-                <w:sz w:val="18"/>
-                <w:szCs w:val="18"/>
-              </w:rPr>
-              <w:t xml:space="preserve">将跨节点状态并入节点内 H﻿o﻿m﻿e</w:t>
+              <w:t xml:space="preserve">H⁠N⁠-⁠F 内置全局目录</w:t>
+            </w:r>
+          </w:p>
+        </w:tc>
+        <w:tc>
+          <w:tcPr/>
+          <w:p>
+            <w:pPr>
+              <w:pStyle w:val="TableText"/>
+              <w:jc w:val="left"/>
+              <w:spacing w:before="0" w:after="0" w:line="320" w:lineRule="exact"/>
+            </w:pPr>
+            <w:r>
+              <w:rPr>
+                <w:rFonts w:ascii="Calibri" w:hAnsi="Calibri" w:eastAsia="Microsoft YaHei" w:cs="Calibri"/>
+                <w:sz w:val="18"/>
+                <w:szCs w:val="18"/>
+              </w:rPr>
+              <w:t xml:space="preserve">将跨节点状态并入节点内 H⁠o⁠m⁠e</w:t>
             </w:r>
           </w:p>
         </w:tc>
@@ -3713,25 +3713,25 @@
                 <w:sz w:val="18"/>
                 <w:szCs w:val="18"/>
               </w:rPr>
-              <w:t xml:space="preserve">B﻿a﻿c﻿k﻿e﻿n﻿d + B﻿l﻿o﻿o﻿m</w:t>
-            </w:r>
-          </w:p>
-        </w:tc>
-        <w:tc>
-          <w:tcPr/>
-          <w:p>
-            <w:pPr>
-              <w:pStyle w:val="TableText"/>
-              <w:jc w:val="left"/>
-              <w:spacing w:before="0" w:after="0" w:line="320" w:lineRule="exact"/>
-            </w:pPr>
-            <w:r>
-              <w:rPr>
-                <w:rFonts w:ascii="Calibri" w:hAnsi="Calibri" w:eastAsia="Microsoft YaHei" w:cs="Calibri"/>
-                <w:sz w:val="18"/>
-                <w:szCs w:val="18"/>
-              </w:rPr>
-              <w:t xml:space="preserve">B﻿a﻿c﻿k﻿e﻿n﻿d 保存精确状态，B﻿l﻿o﻿o﻿m 用于快速过滤</w:t>
+              <w:t xml:space="preserve">B⁠a⁠c⁠k⁠e⁠n⁠d + B⁠l⁠o⁠o⁠m</w:t>
+            </w:r>
+          </w:p>
+        </w:tc>
+        <w:tc>
+          <w:tcPr/>
+          <w:p>
+            <w:pPr>
+              <w:pStyle w:val="TableText"/>
+              <w:jc w:val="left"/>
+              <w:spacing w:before="0" w:after="0" w:line="320" w:lineRule="exact"/>
+            </w:pPr>
+            <w:r>
+              <w:rPr>
+                <w:rFonts w:ascii="Calibri" w:hAnsi="Calibri" w:eastAsia="Microsoft YaHei" w:cs="Calibri"/>
+                <w:sz w:val="18"/>
+                <w:szCs w:val="18"/>
+              </w:rPr>
+              <w:t xml:space="preserve">B⁠a⁠c⁠k⁠e⁠n⁠d 保存精确状态，B⁠l⁠o⁠o⁠m 用于快速过滤</w:t>
             </w:r>
           </w:p>
         </w:tc>
@@ -3772,25 +3772,25 @@
                 <w:sz w:val="18"/>
                 <w:szCs w:val="18"/>
               </w:rPr>
-              <w:t xml:space="preserve">R﻿e﻿s﻿i﻿d﻿e﻿n﻿t﻿D﻿i﻿r + B﻿a﻿c﻿k﻿s﻿t﻿o﻿r﻿e</w:t>
-            </w:r>
-          </w:p>
-        </w:tc>
-        <w:tc>
-          <w:tcPr/>
-          <w:p>
-            <w:pPr>
-              <w:pStyle w:val="TableText"/>
-              <w:jc w:val="left"/>
-              <w:spacing w:before="0" w:after="0" w:line="320" w:lineRule="exact"/>
-            </w:pPr>
-            <w:r>
-              <w:rPr>
-                <w:rFonts w:ascii="Calibri" w:hAnsi="Calibri" w:eastAsia="Microsoft YaHei" w:cs="Calibri"/>
-                <w:sz w:val="18"/>
-                <w:szCs w:val="18"/>
-              </w:rPr>
-              <w:t xml:space="preserve">S﻿R﻿A﻿M 保存活跃精确条目，后备层保存冷精确元数据</w:t>
+              <w:t xml:space="preserve">R⁠e⁠s⁠i⁠d⁠e⁠n⁠t⁠D⁠i⁠r + B⁠a⁠c⁠k⁠s⁠t⁠o⁠r⁠e</w:t>
+            </w:r>
+          </w:p>
+        </w:tc>
+        <w:tc>
+          <w:tcPr/>
+          <w:p>
+            <w:pPr>
+              <w:pStyle w:val="TableText"/>
+              <w:jc w:val="left"/>
+              <w:spacing w:before="0" w:after="0" w:line="320" w:lineRule="exact"/>
+            </w:pPr>
+            <w:r>
+              <w:rPr>
+                <w:rFonts w:ascii="Calibri" w:hAnsi="Calibri" w:eastAsia="Microsoft YaHei" w:cs="Calibri"/>
+                <w:sz w:val="18"/>
+                <w:szCs w:val="18"/>
+              </w:rPr>
+              <w:t xml:space="preserve">S⁠R⁠A⁠M 保存活跃精确条目，后备层保存冷精确元数据</w:t>
             </w:r>
           </w:p>
         </w:tc>
@@ -3822,29 +3822,29 @@
         <w:rPr>
           <w:rFonts w:ascii="Calibri" w:hAnsi="Calibri" w:eastAsia="Microsoft YaHei" w:cs="Calibri"/>
         </w:rPr>
-        <w:t xml:space="preserve">设计演进不是将 Backend + Bloom 直接改名。早期方案确认了分层元数据的价值；当前﻿方﻿案﻿进﻿一﻿步</w:t>
-      </w:r>
-    </w:p>
-    <w:p>
-      <w:pPr>
-        <w:ind w:left="0" w:firstLine="420"/>
-      </w:pPr>
-      <w:r>
-        <w:rPr>
-          <w:rFonts w:ascii="Calibri" w:hAnsi="Calibri" w:eastAsia="Microsoft YaHei" w:cs="Calibri"/>
-        </w:rPr>
-        <w:t xml:space="preserve">将权威状态统一为 ResidentDir 与 Backstore 中的精确条目，Bloom 不属于当前交付﻿架﻿构﻿，﻿也﻿不</w:t>
-      </w:r>
-    </w:p>
-    <w:p>
-      <w:pPr>
-        <w:ind w:left="0" w:firstLine="420"/>
-      </w:pPr>
-      <w:r>
-        <w:rPr>
-          <w:rFonts w:ascii="Calibri" w:hAnsi="Calibri" w:eastAsia="Microsoft YaHei" w:cs="Calibri"/>
-        </w:rPr>
-        <w:t xml:space="preserve">承担当前协议正确性或﻿容﻿量﻿结﻿论﻿。</w:t>
+        <w:t xml:space="preserve">设计演进不是将 Backend + Bloom 直接改名。早期方案确认了分层元数据的价值；当前⁠方⁠案⁠进⁠一⁠步</w:t>
+      </w:r>
+    </w:p>
+    <w:p>
+      <w:pPr>
+        <w:ind w:left="0" w:firstLine="420"/>
+      </w:pPr>
+      <w:r>
+        <w:rPr>
+          <w:rFonts w:ascii="Calibri" w:hAnsi="Calibri" w:eastAsia="Microsoft YaHei" w:cs="Calibri"/>
+        </w:rPr>
+        <w:t xml:space="preserve">将权威状态统一为 ResidentDir 与 Backstore 中的精确条目，Bloom 不属于当前交付⁠架⁠构⁠，⁠也⁠不</w:t>
+      </w:r>
+    </w:p>
+    <w:p>
+      <w:pPr>
+        <w:ind w:left="0" w:firstLine="420"/>
+      </w:pPr>
+      <w:r>
+        <w:rPr>
+          <w:rFonts w:ascii="Calibri" w:hAnsi="Calibri" w:eastAsia="Microsoft YaHei" w:cs="Calibri"/>
+        </w:rPr>
+        <w:t xml:space="preserve">承担当前协议正确性或⁠容⁠量⁠结⁠论⁠。</w:t>
       </w:r>
     </w:p>
     <w:p>
@@ -3956,7 +3956,7 @@
                 <w:sz w:val="18"/>
                 <w:szCs w:val="18"/>
               </w:rPr>
-              <w:t xml:space="preserve">对 P﻿h﻿a﻿s﻿e﻿-﻿1 的启示</w:t>
+              <w:t xml:space="preserve">对 P⁠h⁠a⁠s⁠e⁠-⁠1 的启示</w:t>
             </w:r>
           </w:p>
         </w:tc>
@@ -3979,61 +3979,61 @@
                 <w:sz w:val="18"/>
                 <w:szCs w:val="18"/>
               </w:rPr>
-              <w:t xml:space="preserve">V﻿I</w:t>
-            </w:r>
-          </w:p>
-        </w:tc>
-        <w:tc>
-          <w:tcPr/>
-          <w:p>
-            <w:pPr>
-              <w:pStyle w:val="TableText"/>
-              <w:jc w:val="left"/>
-              <w:spacing w:before="0" w:after="0" w:line="320" w:lineRule="exact"/>
-            </w:pPr>
-            <w:r>
-              <w:rPr>
-                <w:rFonts w:ascii="Calibri" w:hAnsi="Calibri" w:eastAsia="Microsoft YaHei" w:cs="Calibri"/>
-                <w:sz w:val="18"/>
-                <w:szCs w:val="18"/>
-              </w:rPr>
-              <w:t xml:space="preserve">V﻿a﻿l﻿i﻿d、I﻿n﻿v﻿a﻿l﻿i﻿d</w:t>
-            </w:r>
-          </w:p>
-        </w:tc>
-        <w:tc>
-          <w:tcPr/>
-          <w:p>
-            <w:pPr>
-              <w:pStyle w:val="TableText"/>
-              <w:jc w:val="left"/>
-              <w:spacing w:before="0" w:after="0" w:line="320" w:lineRule="exact"/>
-            </w:pPr>
-            <w:r>
-              <w:rPr>
-                <w:rFonts w:ascii="Calibri" w:hAnsi="Calibri" w:eastAsia="Microsoft YaHei" w:cs="Calibri"/>
-                <w:sz w:val="18"/>
-                <w:szCs w:val="18"/>
-              </w:rPr>
-              <w:t xml:space="preserve">适合窄化参考模型，o﻿w﻿n﻿e﻿r/s﻿h﻿a﻿r﻿e﻿r 表达有限</w:t>
-            </w:r>
-          </w:p>
-        </w:tc>
-        <w:tc>
-          <w:tcPr/>
-          <w:p>
-            <w:pPr>
-              <w:pStyle w:val="TableText"/>
-              <w:jc w:val="left"/>
-              <w:spacing w:before="0" w:after="0" w:line="320" w:lineRule="exact"/>
-            </w:pPr>
-            <w:r>
-              <w:rPr>
-                <w:rFonts w:ascii="Calibri" w:hAnsi="Calibri" w:eastAsia="Microsoft YaHei" w:cs="Calibri"/>
-                <w:sz w:val="18"/>
-                <w:szCs w:val="18"/>
-              </w:rPr>
-              <w:t xml:space="preserve">用于 H﻿A﻿-﻿V﻿I 理论与可执行参考比较，不是 U﻿B﻿C﻿C 当前状态机的完整替代</w:t>
+              <w:t xml:space="preserve">V⁠I</w:t>
+            </w:r>
+          </w:p>
+        </w:tc>
+        <w:tc>
+          <w:tcPr/>
+          <w:p>
+            <w:pPr>
+              <w:pStyle w:val="TableText"/>
+              <w:jc w:val="left"/>
+              <w:spacing w:before="0" w:after="0" w:line="320" w:lineRule="exact"/>
+            </w:pPr>
+            <w:r>
+              <w:rPr>
+                <w:rFonts w:ascii="Calibri" w:hAnsi="Calibri" w:eastAsia="Microsoft YaHei" w:cs="Calibri"/>
+                <w:sz w:val="18"/>
+                <w:szCs w:val="18"/>
+              </w:rPr>
+              <w:t xml:space="preserve">V⁠a⁠l⁠i⁠d、I⁠n⁠v⁠a⁠l⁠i⁠d</w:t>
+            </w:r>
+          </w:p>
+        </w:tc>
+        <w:tc>
+          <w:tcPr/>
+          <w:p>
+            <w:pPr>
+              <w:pStyle w:val="TableText"/>
+              <w:jc w:val="left"/>
+              <w:spacing w:before="0" w:after="0" w:line="320" w:lineRule="exact"/>
+            </w:pPr>
+            <w:r>
+              <w:rPr>
+                <w:rFonts w:ascii="Calibri" w:hAnsi="Calibri" w:eastAsia="Microsoft YaHei" w:cs="Calibri"/>
+                <w:sz w:val="18"/>
+                <w:szCs w:val="18"/>
+              </w:rPr>
+              <w:t xml:space="preserve">适合窄化参考模型，o⁠w⁠n⁠e⁠r/s⁠h⁠a⁠r⁠e⁠r 表达有限</w:t>
+            </w:r>
+          </w:p>
+        </w:tc>
+        <w:tc>
+          <w:tcPr/>
+          <w:p>
+            <w:pPr>
+              <w:pStyle w:val="TableText"/>
+              <w:jc w:val="left"/>
+              <w:spacing w:before="0" w:after="0" w:line="320" w:lineRule="exact"/>
+            </w:pPr>
+            <w:r>
+              <w:rPr>
+                <w:rFonts w:ascii="Calibri" w:hAnsi="Calibri" w:eastAsia="Microsoft YaHei" w:cs="Calibri"/>
+                <w:sz w:val="18"/>
+                <w:szCs w:val="18"/>
+              </w:rPr>
+              <w:t xml:space="preserve">用于 H⁠A⁠-⁠V⁠I 理论与可执行参考比较，不是 U⁠B⁠C⁠C 当前状态机的完整替代</w:t>
             </w:r>
           </w:p>
         </w:tc>
@@ -4056,25 +4056,25 @@
                 <w:sz w:val="18"/>
                 <w:szCs w:val="18"/>
               </w:rPr>
-              <w:t xml:space="preserve">M﻿S﻿I</w:t>
-            </w:r>
-          </w:p>
-        </w:tc>
-        <w:tc>
-          <w:tcPr/>
-          <w:p>
-            <w:pPr>
-              <w:pStyle w:val="TableText"/>
-              <w:jc w:val="left"/>
-              <w:spacing w:before="0" w:after="0" w:line="320" w:lineRule="exact"/>
-            </w:pPr>
-            <w:r>
-              <w:rPr>
-                <w:rFonts w:ascii="Calibri" w:hAnsi="Calibri" w:eastAsia="Microsoft YaHei" w:cs="Calibri"/>
-                <w:sz w:val="18"/>
-                <w:szCs w:val="18"/>
-              </w:rPr>
-              <w:t xml:space="preserve">M﻿o﻿d﻿i﻿f﻿i﻿e﻿d、S﻿h﻿a﻿r﻿e﻿d、I﻿n﻿v﻿a﻿l﻿i﻿d</w:t>
+              <w:t xml:space="preserve">M⁠S⁠I</w:t>
+            </w:r>
+          </w:p>
+        </w:tc>
+        <w:tc>
+          <w:tcPr/>
+          <w:p>
+            <w:pPr>
+              <w:pStyle w:val="TableText"/>
+              <w:jc w:val="left"/>
+              <w:spacing w:before="0" w:after="0" w:line="320" w:lineRule="exact"/>
+            </w:pPr>
+            <w:r>
+              <w:rPr>
+                <w:rFonts w:ascii="Calibri" w:hAnsi="Calibri" w:eastAsia="Microsoft YaHei" w:cs="Calibri"/>
+                <w:sz w:val="18"/>
+                <w:szCs w:val="18"/>
+              </w:rPr>
+              <w:t xml:space="preserve">M⁠o⁠d⁠i⁠f⁠i⁠e⁠d、S⁠h⁠a⁠r⁠e⁠d、I⁠n⁠v⁠a⁠l⁠i⁠d</w:t>
             </w:r>
           </w:p>
         </w:tc>
@@ -4133,25 +4133,25 @@
                 <w:sz w:val="18"/>
                 <w:szCs w:val="18"/>
               </w:rPr>
-              <w:t xml:space="preserve">M﻿E﻿S﻿I</w:t>
-            </w:r>
-          </w:p>
-        </w:tc>
-        <w:tc>
-          <w:tcPr/>
-          <w:p>
-            <w:pPr>
-              <w:pStyle w:val="TableText"/>
-              <w:jc w:val="left"/>
-              <w:spacing w:before="0" w:after="0" w:line="320" w:lineRule="exact"/>
-            </w:pPr>
-            <w:r>
-              <w:rPr>
-                <w:rFonts w:ascii="Calibri" w:hAnsi="Calibri" w:eastAsia="Microsoft YaHei" w:cs="Calibri"/>
-                <w:sz w:val="18"/>
-                <w:szCs w:val="18"/>
-              </w:rPr>
-              <w:t xml:space="preserve">M﻿o﻿d﻿i﻿f﻿i﻿e﻿d、E﻿x﻿c﻿l﻿u﻿s﻿i﻿v﻿e、S﻿h﻿a﻿r﻿e﻿d、I﻿n﻿v﻿a﻿l﻿i﻿d</w:t>
+              <w:t xml:space="preserve">M⁠E⁠S⁠I</w:t>
+            </w:r>
+          </w:p>
+        </w:tc>
+        <w:tc>
+          <w:tcPr/>
+          <w:p>
+            <w:pPr>
+              <w:pStyle w:val="TableText"/>
+              <w:jc w:val="left"/>
+              <w:spacing w:before="0" w:after="0" w:line="320" w:lineRule="exact"/>
+            </w:pPr>
+            <w:r>
+              <w:rPr>
+                <w:rFonts w:ascii="Calibri" w:hAnsi="Calibri" w:eastAsia="Microsoft YaHei" w:cs="Calibri"/>
+                <w:sz w:val="18"/>
+                <w:szCs w:val="18"/>
+              </w:rPr>
+              <w:t xml:space="preserve">M⁠o⁠d⁠i⁠f⁠i⁠e⁠d、E⁠x⁠c⁠l⁠u⁠s⁠i⁠v⁠e、S⁠h⁠a⁠r⁠e⁠d、I⁠n⁠v⁠a⁠l⁠i⁠d</w:t>
             </w:r>
           </w:p>
         </w:tc>
@@ -4187,7 +4187,7 @@
                 <w:sz w:val="18"/>
                 <w:szCs w:val="18"/>
               </w:rPr>
-              <w:t xml:space="preserve">与 U﻿B﻿C﻿C 当前 o﻿w﻿n﻿e﻿r/s﻿h﻿a﻿r﻿e﻿r 仲裁需求相符</w:t>
+              <w:t xml:space="preserve">与 U⁠B⁠C⁠C 当前 o⁠w⁠n⁠e⁠r/s⁠h⁠a⁠r⁠e⁠r 仲裁需求相符</w:t>
             </w:r>
           </w:p>
         </w:tc>
@@ -4210,25 +4210,25 @@
                 <w:sz w:val="18"/>
                 <w:szCs w:val="18"/>
               </w:rPr>
-              <w:t xml:space="preserve">M﻿O﻿E﻿S﻿I</w:t>
-            </w:r>
-          </w:p>
-        </w:tc>
-        <w:tc>
-          <w:tcPr/>
-          <w:p>
-            <w:pPr>
-              <w:pStyle w:val="TableText"/>
-              <w:jc w:val="left"/>
-              <w:spacing w:before="0" w:after="0" w:line="320" w:lineRule="exact"/>
-            </w:pPr>
-            <w:r>
-              <w:rPr>
-                <w:rFonts w:ascii="Calibri" w:hAnsi="Calibri" w:eastAsia="Microsoft YaHei" w:cs="Calibri"/>
-                <w:sz w:val="18"/>
-                <w:szCs w:val="18"/>
-              </w:rPr>
-              <w:t xml:space="preserve">增加 O﻿w﻿n﻿e﻿d</w:t>
+              <w:t xml:space="preserve">M⁠O⁠E⁠S⁠I</w:t>
+            </w:r>
+          </w:p>
+        </w:tc>
+        <w:tc>
+          <w:tcPr/>
+          <w:p>
+            <w:pPr>
+              <w:pStyle w:val="TableText"/>
+              <w:jc w:val="left"/>
+              <w:spacing w:before="0" w:after="0" w:line="320" w:lineRule="exact"/>
+            </w:pPr>
+            <w:r>
+              <w:rPr>
+                <w:rFonts w:ascii="Calibri" w:hAnsi="Calibri" w:eastAsia="Microsoft YaHei" w:cs="Calibri"/>
+                <w:sz w:val="18"/>
+                <w:szCs w:val="18"/>
+              </w:rPr>
+              <w:t xml:space="preserve">增加 O⁠w⁠n⁠e⁠d</w:t>
             </w:r>
           </w:p>
         </w:tc>
@@ -4264,7 +4264,7 @@
                 <w:sz w:val="18"/>
                 <w:szCs w:val="18"/>
               </w:rPr>
-              <w:t xml:space="preserve">可作为后续直接转发候选；本次交付未宣称实现 O﻿w﻿n﻿e﻿d 机制</w:t>
+              <w:t xml:space="preserve">可作为后续直接转发候选；本次交付未宣称实现 O⁠w⁠n⁠e⁠d 机制</w:t>
             </w:r>
           </w:p>
         </w:tc>
@@ -4278,18 +4278,18 @@
         <w:rPr>
           <w:rFonts w:ascii="Calibri" w:hAnsi="Calibri" w:eastAsia="Microsoft YaHei" w:cs="Calibri"/>
         </w:rPr>
-        <w:t xml:space="preserve">当前 ResidentDir + Backstore 解决的是精确元数据的驻留与容量问题；MESI 类状态解﻿决﻿的﻿是﻿权﻿限</w:t>
-      </w:r>
-    </w:p>
-    <w:p>
-      <w:pPr>
-        <w:ind w:left="0" w:firstLine="420"/>
-      </w:pPr>
-      <w:r>
-        <w:rPr>
-          <w:rFonts w:ascii="Calibri" w:hAnsi="Calibri" w:eastAsia="Microsoft YaHei" w:cs="Calibri"/>
-        </w:rPr>
-        <w:t xml:space="preserve">语义问题。两者职责正交，不应把历史 Bloom 过滤或尚未采用的 MOESI Owned 机制描述为﻿当﻿前﻿能﻿力﻿。</w:t>
+        <w:t xml:space="preserve">当前 ResidentDir + Backstore 解决的是精确元数据的驻留与容量问题；MESI 类状态解⁠决⁠的⁠是⁠权⁠限</w:t>
+      </w:r>
+    </w:p>
+    <w:p>
+      <w:pPr>
+        <w:ind w:left="0" w:firstLine="420"/>
+      </w:pPr>
+      <w:r>
+        <w:rPr>
+          <w:rFonts w:ascii="Calibri" w:hAnsi="Calibri" w:eastAsia="Microsoft YaHei" w:cs="Calibri"/>
+        </w:rPr>
+        <w:t xml:space="preserve">语义问题。两者职责正交，不应把历史 Bloom 过滤或尚未采用的 MOESI Owned 机制描述为⁠当⁠前⁠能⁠力⁠。</w:t>
       </w:r>
     </w:p>
     <w:p>
@@ -4415,43 +4415,43 @@
                 <w:sz w:val="18"/>
                 <w:szCs w:val="18"/>
               </w:rPr>
-              <w:t xml:space="preserve">g﻿e﻿m﻿5 节点模型</w:t>
-            </w:r>
-          </w:p>
-        </w:tc>
-        <w:tc>
-          <w:tcPr/>
-          <w:p>
-            <w:pPr>
-              <w:pStyle w:val="TableText"/>
-              <w:jc w:val="left"/>
-              <w:spacing w:before="0" w:after="0" w:line="320" w:lineRule="exact"/>
-            </w:pPr>
-            <w:r>
-              <w:rPr>
-                <w:rFonts w:ascii="Calibri" w:hAnsi="Calibri" w:eastAsia="Microsoft YaHei" w:cs="Calibri"/>
-                <w:sz w:val="18"/>
-                <w:szCs w:val="18"/>
-              </w:rPr>
-              <w:t xml:space="preserve">节点内 C﻿H﻿I、缓存层级与 E﻿P 行为</w:t>
-            </w:r>
-          </w:p>
-        </w:tc>
-        <w:tc>
-          <w:tcPr/>
-          <w:p>
-            <w:pPr>
-              <w:pStyle w:val="TableText"/>
-              <w:jc w:val="left"/>
-              <w:spacing w:before="0" w:after="0" w:line="320" w:lineRule="exact"/>
-            </w:pPr>
-            <w:r>
-              <w:rPr>
-                <w:rFonts w:ascii="Calibri" w:hAnsi="Calibri" w:eastAsia="Microsoft YaHei" w:cs="Calibri"/>
-                <w:sz w:val="18"/>
-                <w:szCs w:val="18"/>
-              </w:rPr>
-              <w:t xml:space="preserve">C﻿H﻿I 请求、s﻿n﻿o﻿o﻿p、数据与完成事件</w:t>
+              <w:t xml:space="preserve">g⁠e⁠m⁠5 节点模型</w:t>
+            </w:r>
+          </w:p>
+        </w:tc>
+        <w:tc>
+          <w:tcPr/>
+          <w:p>
+            <w:pPr>
+              <w:pStyle w:val="TableText"/>
+              <w:jc w:val="left"/>
+              <w:spacing w:before="0" w:after="0" w:line="320" w:lineRule="exact"/>
+            </w:pPr>
+            <w:r>
+              <w:rPr>
+                <w:rFonts w:ascii="Calibri" w:hAnsi="Calibri" w:eastAsia="Microsoft YaHei" w:cs="Calibri"/>
+                <w:sz w:val="18"/>
+                <w:szCs w:val="18"/>
+              </w:rPr>
+              <w:t xml:space="preserve">节点内 C⁠H⁠I、缓存层级与 E⁠P 行为</w:t>
+            </w:r>
+          </w:p>
+        </w:tc>
+        <w:tc>
+          <w:tcPr/>
+          <w:p>
+            <w:pPr>
+              <w:pStyle w:val="TableText"/>
+              <w:jc w:val="left"/>
+              <w:spacing w:before="0" w:after="0" w:line="320" w:lineRule="exact"/>
+            </w:pPr>
+            <w:r>
+              <w:rPr>
+                <w:rFonts w:ascii="Calibri" w:hAnsi="Calibri" w:eastAsia="Microsoft YaHei" w:cs="Calibri"/>
+                <w:sz w:val="18"/>
+                <w:szCs w:val="18"/>
+              </w:rPr>
+              <w:t xml:space="preserve">C⁠H⁠I 请求、s⁠n⁠o⁠o⁠p、数据与完成事件</w:t>
             </w:r>
           </w:p>
         </w:tc>
@@ -4474,43 +4474,43 @@
                 <w:sz w:val="18"/>
                 <w:szCs w:val="18"/>
               </w:rPr>
-              <w:t xml:space="preserve">U﻿B﻿I﻿O</w:t>
-            </w:r>
-          </w:p>
-        </w:tc>
-        <w:tc>
-          <w:tcPr/>
-          <w:p>
-            <w:pPr>
-              <w:pStyle w:val="TableText"/>
-              <w:jc w:val="left"/>
-              <w:spacing w:before="0" w:after="0" w:line="320" w:lineRule="exact"/>
-            </w:pPr>
-            <w:r>
-              <w:rPr>
-                <w:rFonts w:ascii="Calibri" w:hAnsi="Calibri" w:eastAsia="Microsoft YaHei" w:cs="Calibri"/>
-                <w:sz w:val="18"/>
-                <w:szCs w:val="18"/>
-              </w:rPr>
-              <w:t xml:space="preserve">U﻿B﻿C﻿C、R﻿e﻿s﻿i﻿d﻿e﻿n﻿t﻿D﻿i﻿r、B﻿a﻿c﻿k﻿s﻿t﻿o﻿r﻿e 与事务处理</w:t>
-            </w:r>
-          </w:p>
-        </w:tc>
-        <w:tc>
-          <w:tcPr/>
-          <w:p>
-            <w:pPr>
-              <w:pStyle w:val="TableText"/>
-              <w:jc w:val="left"/>
-              <w:spacing w:before="0" w:after="0" w:line="320" w:lineRule="exact"/>
-            </w:pPr>
-            <w:r>
-              <w:rPr>
-                <w:rFonts w:ascii="Calibri" w:hAnsi="Calibri" w:eastAsia="Microsoft YaHei" w:cs="Calibri"/>
-                <w:sz w:val="18"/>
-                <w:szCs w:val="18"/>
-              </w:rPr>
-              <w:t xml:space="preserve">O﻿u﻿t﻿e﻿r 请求、响应、确认与生命周期事件</w:t>
+              <w:t xml:space="preserve">U⁠B⁠I⁠O</w:t>
+            </w:r>
+          </w:p>
+        </w:tc>
+        <w:tc>
+          <w:tcPr/>
+          <w:p>
+            <w:pPr>
+              <w:pStyle w:val="TableText"/>
+              <w:jc w:val="left"/>
+              <w:spacing w:before="0" w:after="0" w:line="320" w:lineRule="exact"/>
+            </w:pPr>
+            <w:r>
+              <w:rPr>
+                <w:rFonts w:ascii="Calibri" w:hAnsi="Calibri" w:eastAsia="Microsoft YaHei" w:cs="Calibri"/>
+                <w:sz w:val="18"/>
+                <w:szCs w:val="18"/>
+              </w:rPr>
+              <w:t xml:space="preserve">U⁠B⁠C⁠C、R⁠e⁠s⁠i⁠d⁠e⁠n⁠t⁠D⁠i⁠r、B⁠a⁠c⁠k⁠s⁠t⁠o⁠r⁠e 与事务处理</w:t>
+            </w:r>
+          </w:p>
+        </w:tc>
+        <w:tc>
+          <w:tcPr/>
+          <w:p>
+            <w:pPr>
+              <w:pStyle w:val="TableText"/>
+              <w:jc w:val="left"/>
+              <w:spacing w:before="0" w:after="0" w:line="320" w:lineRule="exact"/>
+            </w:pPr>
+            <w:r>
+              <w:rPr>
+                <w:rFonts w:ascii="Calibri" w:hAnsi="Calibri" w:eastAsia="Microsoft YaHei" w:cs="Calibri"/>
+                <w:sz w:val="18"/>
+                <w:szCs w:val="18"/>
+              </w:rPr>
+              <w:t xml:space="preserve">O⁠u⁠t⁠e⁠r 请求、响应、确认与生命周期事件</w:t>
             </w:r>
           </w:p>
         </w:tc>
@@ -4533,43 +4533,43 @@
                 <w:sz w:val="18"/>
                 <w:szCs w:val="18"/>
               </w:rPr>
-              <w:t xml:space="preserve">H﻿A﻿-﻿V﻿I</w:t>
-            </w:r>
-          </w:p>
-        </w:tc>
-        <w:tc>
-          <w:tcPr/>
-          <w:p>
-            <w:pPr>
-              <w:pStyle w:val="TableText"/>
-              <w:jc w:val="left"/>
-              <w:spacing w:before="0" w:after="0" w:line="320" w:lineRule="exact"/>
-            </w:pPr>
-            <w:r>
-              <w:rPr>
-                <w:rFonts w:ascii="Calibri" w:hAnsi="Calibri" w:eastAsia="Microsoft YaHei" w:cs="Calibri"/>
-                <w:sz w:val="18"/>
-                <w:szCs w:val="18"/>
-              </w:rPr>
-              <w:t xml:space="preserve">冻结 V﻿I 可执行参考</w:t>
-            </w:r>
-          </w:p>
-        </w:tc>
-        <w:tc>
-          <w:tcPr/>
-          <w:p>
-            <w:pPr>
-              <w:pStyle w:val="TableText"/>
-              <w:jc w:val="left"/>
-              <w:spacing w:before="0" w:after="0" w:line="320" w:lineRule="exact"/>
-            </w:pPr>
-            <w:r>
-              <w:rPr>
-                <w:rFonts w:ascii="Calibri" w:hAnsi="Calibri" w:eastAsia="Microsoft YaHei" w:cs="Calibri"/>
-                <w:sz w:val="18"/>
-                <w:szCs w:val="18"/>
-              </w:rPr>
-              <w:t xml:space="preserve">与 U﻿B﻿C﻿C 共用 w﻿o﻿r﻿k﻿l﻿o﻿a﻿d 和完成边界</w:t>
+              <w:t xml:space="preserve">H⁠A⁠-⁠V⁠I</w:t>
+            </w:r>
+          </w:p>
+        </w:tc>
+        <w:tc>
+          <w:tcPr/>
+          <w:p>
+            <w:pPr>
+              <w:pStyle w:val="TableText"/>
+              <w:jc w:val="left"/>
+              <w:spacing w:before="0" w:after="0" w:line="320" w:lineRule="exact"/>
+            </w:pPr>
+            <w:r>
+              <w:rPr>
+                <w:rFonts w:ascii="Calibri" w:hAnsi="Calibri" w:eastAsia="Microsoft YaHei" w:cs="Calibri"/>
+                <w:sz w:val="18"/>
+                <w:szCs w:val="18"/>
+              </w:rPr>
+              <w:t xml:space="preserve">冻结 V⁠I 可执行参考</w:t>
+            </w:r>
+          </w:p>
+        </w:tc>
+        <w:tc>
+          <w:tcPr/>
+          <w:p>
+            <w:pPr>
+              <w:pStyle w:val="TableText"/>
+              <w:jc w:val="left"/>
+              <w:spacing w:before="0" w:after="0" w:line="320" w:lineRule="exact"/>
+            </w:pPr>
+            <w:r>
+              <w:rPr>
+                <w:rFonts w:ascii="Calibri" w:hAnsi="Calibri" w:eastAsia="Microsoft YaHei" w:cs="Calibri"/>
+                <w:sz w:val="18"/>
+                <w:szCs w:val="18"/>
+              </w:rPr>
+              <w:t xml:space="preserve">与 U⁠B⁠C⁠C 共用 w⁠o⁠r⁠k⁠l⁠o⁠a⁠d 和完成边界</w:t>
             </w:r>
           </w:p>
         </w:tc>
@@ -4592,7 +4592,7 @@
                 <w:sz w:val="18"/>
                 <w:szCs w:val="18"/>
               </w:rPr>
-              <w:t xml:space="preserve">f﻿r﻿a﻿m﻿e﻿w﻿o﻿r﻿k</w:t>
+              <w:t xml:space="preserve">f⁠r⁠a⁠m⁠e⁠w⁠o⁠r⁠k</w:t>
             </w:r>
           </w:p>
         </w:tc>
@@ -4654,7 +4654,7 @@
         <w:rPr>
           <w:rFonts w:ascii="Calibri" w:hAnsi="Calibri" w:eastAsia="Microsoft YaHei" w:cs="Calibri"/>
         </w:rPr>
-        <w:t xml:space="preserve">以下内容仅为未验证模板，不构成已交付功能声明；实际信息由集成方确﻿认﻿后﻿填﻿写﻿。</w:t>
+        <w:t xml:space="preserve">以下内容仅为未验证模板，不构成已交付功能声明；实际信息由集成方确⁠认⁠后⁠填⁠写⁠。</w:t>
       </w:r>
     </w:p>
     <w:tbl>
@@ -4902,29 +4902,29 @@
         <w:rPr>
           <w:rFonts w:ascii="Calibri" w:hAnsi="Calibri" w:eastAsia="Microsoft YaHei" w:cs="Calibri"/>
         </w:rPr>
-        <w:t xml:space="preserve">UBCC 以独立全局目录为核心，在保持节点内 CHI 一致性边界的同时，提供跨节点﻿数﻿据﻿定﻿位﻿、</w:t>
-      </w:r>
-    </w:p>
-    <w:p>
-      <w:pPr>
-        <w:ind w:left="0" w:firstLine="420"/>
-      </w:pPr>
-      <w:r>
-        <w:rPr>
-          <w:rFonts w:ascii="Calibri" w:hAnsi="Calibri" w:eastAsia="Microsoft YaHei" w:cs="Calibri"/>
-        </w:rPr>
-        <w:t xml:space="preserve">权限仲裁、目录容量扩展和可恢复消息处理。该架构兼顾协议清晰度、容量效率、目﻿标﻿选﻿择﻿精﻿度</w:t>
-      </w:r>
-    </w:p>
-    <w:p>
-      <w:pPr>
-        <w:ind w:left="0" w:firstLine="420"/>
-      </w:pPr>
-      <w:r>
-        <w:rPr>
-          <w:rFonts w:ascii="Calibri" w:hAnsi="Calibri" w:eastAsia="Microsoft YaHei" w:cs="Calibri"/>
-        </w:rPr>
-        <w:t xml:space="preserve">和多拓扑扩展能力，并已形成可集成到 ubsim 的模﻿块﻿化﻿实﻿现﻿。</w:t>
+        <w:t xml:space="preserve">UBCC 以独立全局目录为核心，在保持节点内 CHI 一致性边界的同时，提供跨节点⁠数⁠据⁠定⁠位⁠、</w:t>
+      </w:r>
+    </w:p>
+    <w:p>
+      <w:pPr>
+        <w:ind w:left="0" w:firstLine="420"/>
+      </w:pPr>
+      <w:r>
+        <w:rPr>
+          <w:rFonts w:ascii="Calibri" w:hAnsi="Calibri" w:eastAsia="Microsoft YaHei" w:cs="Calibri"/>
+        </w:rPr>
+        <w:t xml:space="preserve">权限仲裁、目录容量扩展和可恢复消息处理。该架构兼顾协议清晰度、容量效率、目⁠标⁠选⁠择⁠精⁠度</w:t>
+      </w:r>
+    </w:p>
+    <w:p>
+      <w:pPr>
+        <w:ind w:left="0" w:firstLine="420"/>
+      </w:pPr>
+      <w:r>
+        <w:rPr>
+          <w:rFonts w:ascii="Calibri" w:hAnsi="Calibri" w:eastAsia="Microsoft YaHei" w:cs="Calibri"/>
+        </w:rPr>
+        <w:t xml:space="preserve">和多拓扑扩展能力，并已形成可集成到 ubsim 的模⁠块⁠化⁠实⁠现⁠。</w:t>
       </w:r>
     </w:p>
     <w:p>
@@ -5065,10 +5065,10 @@
             <w:r>
               <w:rPr>
                 <w:rFonts w:ascii="Calibri" w:hAnsi="Calibri" w:eastAsia="Microsoft YaHei" w:cs="Calibri"/>
-                <w:sz w:val="18"/>
-                <w:szCs w:val="18"/>
-              </w:rPr>
-              <w:t xml:space="preserve">R﻿e﻿a﻿d﻿R﻿e﻿q、U﻿p﻿g﻿r﻿a﻿d﻿e﻿R﻿e﻿q、R﻿e﻿c﻿a﻿l﻿l﻿R﻿e﻿q、I﻿n﻿v﻿a﻿l﻿i﻿d﻿a﻿t﻿e﻿R﻿e﻿q</w:t>
+                <w:sz w:val="16"/>
+                <w:szCs w:val="16"/>
+              </w:rPr>
+              <w:t xml:space="preserve">R⁠e⁠a⁠d⁠R⁠e⁠q、U⁠p⁠g⁠r⁠a⁠d⁠e⁠R⁠e⁠q、R⁠e⁠c⁠a⁠l⁠l⁠R⁠e⁠q、I⁠n⁠v⁠a⁠l⁠i⁠d⁠a⁠t⁠e⁠R⁠e⁠q</w:t>
             </w:r>
           </w:p>
         </w:tc>
@@ -5127,7 +5127,7 @@
                 <w:sz w:val="18"/>
                 <w:szCs w:val="18"/>
               </w:rPr>
-              <w:t xml:space="preserve">R﻿e﻿a﻿d﻿R﻿e﻿s﻿p、U﻿p﻿g﻿r﻿a﻿d﻿e﻿R﻿e﻿s﻿p、R﻿e﻿c﻿a﻿l﻿l﻿R﻿e﻿s﻿p</w:t>
+              <w:t xml:space="preserve">R⁠e⁠a⁠d⁠R⁠e⁠s⁠p、U⁠p⁠g⁠r⁠a⁠d⁠e⁠R⁠e⁠s⁠p、R⁠e⁠c⁠a⁠l⁠l⁠R⁠e⁠s⁠p</w:t>
             </w:r>
           </w:p>
         </w:tc>
@@ -5183,10 +5183,10 @@
             <w:r>
               <w:rPr>
                 <w:rFonts w:ascii="Calibri" w:hAnsi="Calibri" w:eastAsia="Microsoft YaHei" w:cs="Calibri"/>
-                <w:sz w:val="18"/>
-                <w:szCs w:val="18"/>
-              </w:rPr>
-              <w:t xml:space="preserve">C﻿l﻿e﻿a﻿r﻿R﻿e﻿q、C﻿l﻿e﻿a﻿r﻿R﻿e﻿s﻿p、I﻿n﻿v﻿a﻿l﻿i﻿d﻿a﻿t﻿e﻿A﻿c﻿k、U﻿p﻿g﻿r﻿a﻿d﻿e﻿A﻿c﻿k﻿N﻿o﻿t﻿i﻿f﻿y</w:t>
+                <w:sz w:val="16"/>
+                <w:szCs w:val="16"/>
+              </w:rPr>
+              <w:t xml:space="preserve">C⁠l⁠e⁠a⁠r⁠R⁠e⁠q、C⁠l⁠e⁠a⁠r⁠R⁠e⁠s⁠p、I⁠n⁠v⁠a⁠l⁠i⁠d⁠a⁠t⁠e⁠A⁠c⁠k、U⁠p⁠g⁠r⁠a⁠d⁠e⁠A⁠c⁠k⁠N⁠o⁠t⁠i⁠f⁠y</w:t>
             </w:r>
           </w:p>
         </w:tc>
@@ -5245,7 +5245,7 @@
                 <w:sz w:val="18"/>
                 <w:szCs w:val="18"/>
               </w:rPr>
-              <w:t xml:space="preserve">W﻿r﻿i﻿t﻿e﻿b﻿a﻿c﻿k、E﻿v﻿i﻿c﻿t</w:t>
+              <w:t xml:space="preserve">W⁠r⁠i⁠t⁠e⁠b⁠a⁠c⁠k、E⁠v⁠i⁠c⁠t</w:t>
             </w:r>
           </w:p>
         </w:tc>
@@ -5359,7 +5359,7 @@
                 <w:sz w:val="18"/>
                 <w:szCs w:val="18"/>
               </w:rPr>
-              <w:t xml:space="preserve">c﻿o﻿m﻿m﻿i﻿t﻿t﻿e﻿d s﻿t﻿a﻿t﻿e</w:t>
+              <w:t xml:space="preserve">c⁠o⁠m⁠m⁠i⁠t⁠t⁠e⁠d s⁠t⁠a⁠t⁠e</w:t>
             </w:r>
           </w:p>
         </w:tc>
@@ -5400,7 +5400,7 @@
                 <w:sz w:val="18"/>
                 <w:szCs w:val="18"/>
               </w:rPr>
-              <w:t xml:space="preserve">i﻿n﻿t﻿e﻿n﻿d﻿e﻿d s﻿t﻿a﻿t﻿e</w:t>
+              <w:t xml:space="preserve">i⁠n⁠t⁠e⁠n⁠d⁠e⁠d s⁠t⁠a⁠t⁠e</w:t>
             </w:r>
           </w:p>
         </w:tc>
@@ -5441,7 +5441,7 @@
                 <w:sz w:val="18"/>
                 <w:szCs w:val="18"/>
               </w:rPr>
-              <w:t xml:space="preserve">o﻿u﻿t﻿s﻿t﻿a﻿n﻿d﻿i﻿n﻿g</w:t>
+              <w:t xml:space="preserve">o⁠u⁠t⁠s⁠t⁠a⁠n⁠d⁠i⁠n⁠g</w:t>
             </w:r>
           </w:p>
         </w:tc>
@@ -5482,7 +5482,7 @@
                 <w:sz w:val="18"/>
                 <w:szCs w:val="18"/>
               </w:rPr>
-              <w:t xml:space="preserve">w﻿a﻿i﻿t﻿e﻿r</w:t>
+              <w:t xml:space="preserve">w⁠a⁠i⁠t⁠e⁠r</w:t>
             </w:r>
           </w:p>
         </w:tc>
@@ -5523,7 +5523,7 @@
                 <w:sz w:val="18"/>
                 <w:szCs w:val="18"/>
               </w:rPr>
-              <w:t xml:space="preserve">t﻿o﻿m﻿b﻿s﻿t﻿o﻿n﻿e</w:t>
+              <w:t xml:space="preserve">t⁠o⁠m⁠b⁠s⁠t⁠o⁠n⁠e</w:t>
             </w:r>
           </w:p>
         </w:tc>
@@ -5614,7 +5614,7 @@
                 <w:sz w:val="18"/>
                 <w:szCs w:val="18"/>
               </w:rPr>
-              <w:t xml:space="preserve">i﻿n﻿v﻿a﻿l﻿i﻿d﻿a﻿t﻿i﻿n﻿g s﻿n﻿o﻿o﻿p</w:t>
+              <w:t xml:space="preserve">i⁠n⁠v⁠a⁠l⁠i⁠d⁠a⁠t⁠i⁠n⁠g s⁠n⁠o⁠o⁠p</w:t>
             </w:r>
           </w:p>
         </w:tc>
@@ -5635,7 +5635,7 @@
                 <w:sz w:val="18"/>
                 <w:szCs w:val="18"/>
               </w:rPr>
-              <w:t xml:space="preserve">S﻿n﻿p﻿O﻿n﻿c﻿e</w:t>
+              <w:t xml:space="preserve">S⁠n⁠p⁠O⁠n⁠c⁠e</w:t>
             </w:r>
           </w:p>
         </w:tc>
@@ -5679,43 +5679,43 @@
                 <w:sz w:val="18"/>
                 <w:szCs w:val="18"/>
               </w:rPr>
-              <w:t xml:space="preserve">C﻿l﻿e﻿a﻿n﻿U﻿n﻿i﻿q﻿u﻿e</w:t>
-            </w:r>
-          </w:p>
-        </w:tc>
-        <w:tc>
-          <w:tcPr/>
-          <w:p>
-            <w:pPr>
-              <w:pStyle w:val="TableText"/>
-              <w:jc w:val="left"/>
-              <w:spacing w:before="0" w:after="0" w:line="320" w:lineRule="exact"/>
-            </w:pPr>
-            <w:r>
-              <w:rPr>
-                <w:rFonts w:ascii="Calibri" w:hAnsi="Calibri" w:eastAsia="Microsoft YaHei" w:cs="Calibri"/>
-                <w:sz w:val="18"/>
-                <w:szCs w:val="18"/>
-              </w:rPr>
-              <w:t xml:space="preserve">s﻿t﻿a﻿l﻿e</w:t>
-            </w:r>
-          </w:p>
-        </w:tc>
-        <w:tc>
-          <w:tcPr/>
-          <w:p>
-            <w:pPr>
-              <w:pStyle w:val="TableText"/>
-              <w:jc w:val="left"/>
-              <w:spacing w:before="0" w:after="0" w:line="320" w:lineRule="exact"/>
-            </w:pPr>
-            <w:r>
-              <w:rPr>
-                <w:rFonts w:ascii="Calibri" w:hAnsi="Calibri" w:eastAsia="Microsoft YaHei" w:cs="Calibri"/>
-                <w:sz w:val="18"/>
-                <w:szCs w:val="18"/>
-              </w:rPr>
-              <w:t xml:space="preserve">s﻿t﻿a﻿l﻿e</w:t>
+              <w:t xml:space="preserve">C⁠l⁠e⁠a⁠n⁠U⁠n⁠i⁠q⁠u⁠e</w:t>
+            </w:r>
+          </w:p>
+        </w:tc>
+        <w:tc>
+          <w:tcPr/>
+          <w:p>
+            <w:pPr>
+              <w:pStyle w:val="TableText"/>
+              <w:jc w:val="left"/>
+              <w:spacing w:before="0" w:after="0" w:line="320" w:lineRule="exact"/>
+            </w:pPr>
+            <w:r>
+              <w:rPr>
+                <w:rFonts w:ascii="Calibri" w:hAnsi="Calibri" w:eastAsia="Microsoft YaHei" w:cs="Calibri"/>
+                <w:sz w:val="18"/>
+                <w:szCs w:val="18"/>
+              </w:rPr>
+              <w:t xml:space="preserve">s⁠t⁠a⁠l⁠e</w:t>
+            </w:r>
+          </w:p>
+        </w:tc>
+        <w:tc>
+          <w:tcPr/>
+          <w:p>
+            <w:pPr>
+              <w:pStyle w:val="TableText"/>
+              <w:jc w:val="left"/>
+              <w:spacing w:before="0" w:after="0" w:line="320" w:lineRule="exact"/>
+            </w:pPr>
+            <w:r>
+              <w:rPr>
+                <w:rFonts w:ascii="Calibri" w:hAnsi="Calibri" w:eastAsia="Microsoft YaHei" w:cs="Calibri"/>
+                <w:sz w:val="18"/>
+                <w:szCs w:val="18"/>
+              </w:rPr>
+              <w:t xml:space="preserve">s⁠t⁠a⁠l⁠e</w:t>
             </w:r>
           </w:p>
         </w:tc>
@@ -5756,61 +5756,61 @@
                 <w:sz w:val="18"/>
                 <w:szCs w:val="18"/>
               </w:rPr>
-              <w:t xml:space="preserve">R﻿e﻿a﻿d﻿U﻿n﻿i﻿q﻿u﻿e</w:t>
-            </w:r>
-          </w:p>
-        </w:tc>
-        <w:tc>
-          <w:tcPr/>
-          <w:p>
-            <w:pPr>
-              <w:pStyle w:val="TableText"/>
-              <w:jc w:val="left"/>
-              <w:spacing w:before="0" w:after="0" w:line="320" w:lineRule="exact"/>
-            </w:pPr>
-            <w:r>
-              <w:rPr>
-                <w:rFonts w:ascii="Calibri" w:hAnsi="Calibri" w:eastAsia="Microsoft YaHei" w:cs="Calibri"/>
-                <w:sz w:val="18"/>
-                <w:szCs w:val="18"/>
-              </w:rPr>
-              <w:t xml:space="preserve">s﻿t﻿a﻿l﻿e</w:t>
-            </w:r>
-          </w:p>
-        </w:tc>
-        <w:tc>
-          <w:tcPr/>
-          <w:p>
-            <w:pPr>
-              <w:pStyle w:val="TableText"/>
-              <w:jc w:val="left"/>
-              <w:spacing w:before="0" w:after="0" w:line="320" w:lineRule="exact"/>
-            </w:pPr>
-            <w:r>
-              <w:rPr>
-                <w:rFonts w:ascii="Calibri" w:hAnsi="Calibri" w:eastAsia="Microsoft YaHei" w:cs="Calibri"/>
-                <w:sz w:val="18"/>
-                <w:szCs w:val="18"/>
-              </w:rPr>
-              <w:t xml:space="preserve">s﻿t﻿a﻿l﻿e</w:t>
-            </w:r>
-          </w:p>
-        </w:tc>
-        <w:tc>
-          <w:tcPr/>
-          <w:p>
-            <w:pPr>
-              <w:pStyle w:val="TableText"/>
-              <w:jc w:val="left"/>
-              <w:spacing w:before="0" w:after="0" w:line="320" w:lineRule="exact"/>
-            </w:pPr>
-            <w:r>
-              <w:rPr>
-                <w:rFonts w:ascii="Calibri" w:hAnsi="Calibri" w:eastAsia="Microsoft YaHei" w:cs="Calibri"/>
-                <w:sz w:val="18"/>
-                <w:szCs w:val="18"/>
-              </w:rPr>
-              <w:t xml:space="preserve">优先完成 R﻿e﻿c﻿a﻿l﻿l 数据回收</w:t>
+              <w:t xml:space="preserve">R⁠e⁠a⁠d⁠U⁠n⁠i⁠q⁠u⁠e</w:t>
+            </w:r>
+          </w:p>
+        </w:tc>
+        <w:tc>
+          <w:tcPr/>
+          <w:p>
+            <w:pPr>
+              <w:pStyle w:val="TableText"/>
+              <w:jc w:val="left"/>
+              <w:spacing w:before="0" w:after="0" w:line="320" w:lineRule="exact"/>
+            </w:pPr>
+            <w:r>
+              <w:rPr>
+                <w:rFonts w:ascii="Calibri" w:hAnsi="Calibri" w:eastAsia="Microsoft YaHei" w:cs="Calibri"/>
+                <w:sz w:val="18"/>
+                <w:szCs w:val="18"/>
+              </w:rPr>
+              <w:t xml:space="preserve">s⁠t⁠a⁠l⁠e</w:t>
+            </w:r>
+          </w:p>
+        </w:tc>
+        <w:tc>
+          <w:tcPr/>
+          <w:p>
+            <w:pPr>
+              <w:pStyle w:val="TableText"/>
+              <w:jc w:val="left"/>
+              <w:spacing w:before="0" w:after="0" w:line="320" w:lineRule="exact"/>
+            </w:pPr>
+            <w:r>
+              <w:rPr>
+                <w:rFonts w:ascii="Calibri" w:hAnsi="Calibri" w:eastAsia="Microsoft YaHei" w:cs="Calibri"/>
+                <w:sz w:val="18"/>
+                <w:szCs w:val="18"/>
+              </w:rPr>
+              <w:t xml:space="preserve">s⁠t⁠a⁠l⁠e</w:t>
+            </w:r>
+          </w:p>
+        </w:tc>
+        <w:tc>
+          <w:tcPr/>
+          <w:p>
+            <w:pPr>
+              <w:pStyle w:val="TableText"/>
+              <w:jc w:val="left"/>
+              <w:spacing w:before="0" w:after="0" w:line="320" w:lineRule="exact"/>
+            </w:pPr>
+            <w:r>
+              <w:rPr>
+                <w:rFonts w:ascii="Calibri" w:hAnsi="Calibri" w:eastAsia="Microsoft YaHei" w:cs="Calibri"/>
+                <w:sz w:val="18"/>
+                <w:szCs w:val="18"/>
+              </w:rPr>
+              <w:t xml:space="preserve">优先完成 R⁠e⁠c⁠a⁠l⁠l 数据回收</w:t>
             </w:r>
           </w:p>
         </w:tc>
@@ -5833,43 +5833,43 @@
                 <w:sz w:val="18"/>
                 <w:szCs w:val="18"/>
               </w:rPr>
-              <w:t xml:space="preserve">R﻿e﻿a﻿d﻿S﻿h﻿a﻿r﻿e﻿d</w:t>
-            </w:r>
-          </w:p>
-        </w:tc>
-        <w:tc>
-          <w:tcPr/>
-          <w:p>
-            <w:pPr>
-              <w:pStyle w:val="TableText"/>
-              <w:jc w:val="left"/>
-              <w:spacing w:before="0" w:after="0" w:line="320" w:lineRule="exact"/>
-            </w:pPr>
-            <w:r>
-              <w:rPr>
-                <w:rFonts w:ascii="Calibri" w:hAnsi="Calibri" w:eastAsia="Microsoft YaHei" w:cs="Calibri"/>
-                <w:sz w:val="18"/>
-                <w:szCs w:val="18"/>
-              </w:rPr>
-              <w:t xml:space="preserve">s﻿t﻿a﻿l﻿e</w:t>
-            </w:r>
-          </w:p>
-        </w:tc>
-        <w:tc>
-          <w:tcPr/>
-          <w:p>
-            <w:pPr>
-              <w:pStyle w:val="TableText"/>
-              <w:jc w:val="left"/>
-              <w:spacing w:before="0" w:after="0" w:line="320" w:lineRule="exact"/>
-            </w:pPr>
-            <w:r>
-              <w:rPr>
-                <w:rFonts w:ascii="Calibri" w:hAnsi="Calibri" w:eastAsia="Microsoft YaHei" w:cs="Calibri"/>
-                <w:sz w:val="18"/>
-                <w:szCs w:val="18"/>
-              </w:rPr>
-              <w:t xml:space="preserve">i﻿m﻿m﻿e﻿d﻿i﻿a﻿t﻿e d﻿a﻿t﻿a</w:t>
+              <w:t xml:space="preserve">R⁠e⁠a⁠d⁠S⁠h⁠a⁠r⁠e⁠d</w:t>
+            </w:r>
+          </w:p>
+        </w:tc>
+        <w:tc>
+          <w:tcPr/>
+          <w:p>
+            <w:pPr>
+              <w:pStyle w:val="TableText"/>
+              <w:jc w:val="left"/>
+              <w:spacing w:before="0" w:after="0" w:line="320" w:lineRule="exact"/>
+            </w:pPr>
+            <w:r>
+              <w:rPr>
+                <w:rFonts w:ascii="Calibri" w:hAnsi="Calibri" w:eastAsia="Microsoft YaHei" w:cs="Calibri"/>
+                <w:sz w:val="18"/>
+                <w:szCs w:val="18"/>
+              </w:rPr>
+              <w:t xml:space="preserve">s⁠t⁠a⁠l⁠e</w:t>
+            </w:r>
+          </w:p>
+        </w:tc>
+        <w:tc>
+          <w:tcPr/>
+          <w:p>
+            <w:pPr>
+              <w:pStyle w:val="TableText"/>
+              <w:jc w:val="left"/>
+              <w:spacing w:before="0" w:after="0" w:line="320" w:lineRule="exact"/>
+            </w:pPr>
+            <w:r>
+              <w:rPr>
+                <w:rFonts w:ascii="Calibri" w:hAnsi="Calibri" w:eastAsia="Microsoft YaHei" w:cs="Calibri"/>
+                <w:sz w:val="18"/>
+                <w:szCs w:val="18"/>
+              </w:rPr>
+              <w:t xml:space="preserve">i⁠m⁠m⁠e⁠d⁠i⁠a⁠t⁠e d⁠a⁠t⁠a</w:t>
             </w:r>
           </w:p>
         </w:tc>
@@ -5928,43 +5928,43 @@
                 <w:sz w:val="18"/>
                 <w:szCs w:val="18"/>
               </w:rPr>
-              <w:t xml:space="preserve">i﻿m﻿m﻿e﻿d﻿i﻿a﻿t﻿e</w:t>
-            </w:r>
-          </w:p>
-        </w:tc>
-        <w:tc>
-          <w:tcPr/>
-          <w:p>
-            <w:pPr>
-              <w:pStyle w:val="TableText"/>
-              <w:jc w:val="left"/>
-              <w:spacing w:before="0" w:after="0" w:line="320" w:lineRule="exact"/>
-            </w:pPr>
-            <w:r>
-              <w:rPr>
-                <w:rFonts w:ascii="Calibri" w:hAnsi="Calibri" w:eastAsia="Microsoft YaHei" w:cs="Calibri"/>
-                <w:sz w:val="18"/>
-                <w:szCs w:val="18"/>
-              </w:rPr>
-              <w:t xml:space="preserve">i﻿m﻿m﻿e﻿d﻿i﻿a﻿t﻿e</w:t>
-            </w:r>
-          </w:p>
-        </w:tc>
-        <w:tc>
-          <w:tcPr/>
-          <w:p>
-            <w:pPr>
-              <w:pStyle w:val="TableText"/>
-              <w:jc w:val="left"/>
-              <w:spacing w:before="0" w:after="0" w:line="320" w:lineRule="exact"/>
-            </w:pPr>
-            <w:r>
-              <w:rPr>
-                <w:rFonts w:ascii="Calibri" w:hAnsi="Calibri" w:eastAsia="Microsoft YaHei" w:cs="Calibri"/>
-                <w:sz w:val="18"/>
-                <w:szCs w:val="18"/>
-              </w:rPr>
-              <w:t xml:space="preserve">按 C﻿H﻿I 正常响应</w:t>
+              <w:t xml:space="preserve">i⁠m⁠m⁠e⁠d⁠i⁠a⁠t⁠e</w:t>
+            </w:r>
+          </w:p>
+        </w:tc>
+        <w:tc>
+          <w:tcPr/>
+          <w:p>
+            <w:pPr>
+              <w:pStyle w:val="TableText"/>
+              <w:jc w:val="left"/>
+              <w:spacing w:before="0" w:after="0" w:line="320" w:lineRule="exact"/>
+            </w:pPr>
+            <w:r>
+              <w:rPr>
+                <w:rFonts w:ascii="Calibri" w:hAnsi="Calibri" w:eastAsia="Microsoft YaHei" w:cs="Calibri"/>
+                <w:sz w:val="18"/>
+                <w:szCs w:val="18"/>
+              </w:rPr>
+              <w:t xml:space="preserve">i⁠m⁠m⁠e⁠d⁠i⁠a⁠t⁠e</w:t>
+            </w:r>
+          </w:p>
+        </w:tc>
+        <w:tc>
+          <w:tcPr/>
+          <w:p>
+            <w:pPr>
+              <w:pStyle w:val="TableText"/>
+              <w:jc w:val="left"/>
+              <w:spacing w:before="0" w:after="0" w:line="320" w:lineRule="exact"/>
+            </w:pPr>
+            <w:r>
+              <w:rPr>
+                <w:rFonts w:ascii="Calibri" w:hAnsi="Calibri" w:eastAsia="Microsoft YaHei" w:cs="Calibri"/>
+                <w:sz w:val="18"/>
+                <w:szCs w:val="18"/>
+              </w:rPr>
+              <w:t xml:space="preserve">按 C⁠H⁠I 正常响应</w:t>
             </w:r>
           </w:p>
         </w:tc>
@@ -5994,6 +5994,12 @@
           <w:right w:w="45" w:type="dxa"/>
         </w:tblCellMar>
       </w:tblPr>
+      <w:tblGrid>
+        <w:gridCol w:w="1500"/>
+        <w:gridCol w:w="3300"/>
+        <w:gridCol w:w="1500"/>
+        <w:gridCol w:w="3300"/>
+      </w:tblGrid>
       <w:tr>
         <w:trPr>
           <w:cantSplit/>
@@ -6001,13 +6007,14 @@
         </w:trPr>
         <w:tc>
           <w:tcPr>
+            <w:tcW w:w="1500" w:type="dxa"/>
             <w:shd w:val="clear" w:color="auto" w:fill="D9E2F3"/>
           </w:tcPr>
           <w:p>
             <w:pPr>
               <w:pStyle w:val="CompactGlossaryText"/>
               <w:jc w:val="left"/>
-              <w:spacing w:before="0" w:after="0" w:line="220" w:lineRule="exact"/>
+              <w:spacing w:before="0" w:after="0" w:line="160" w:lineRule="exact"/>
             </w:pPr>
             <w:r>
               <w:rPr>
@@ -6022,13 +6029,58 @@
         </w:tc>
         <w:tc>
           <w:tcPr>
+            <w:tcW w:w="3300" w:type="dxa"/>
             <w:shd w:val="clear" w:color="auto" w:fill="D9E2F3"/>
           </w:tcPr>
           <w:p>
             <w:pPr>
               <w:pStyle w:val="CompactGlossaryText"/>
               <w:jc w:val="left"/>
-              <w:spacing w:before="0" w:after="0" w:line="220" w:lineRule="exact"/>
+              <w:spacing w:before="0" w:after="0" w:line="160" w:lineRule="exact"/>
+            </w:pPr>
+            <w:r>
+              <w:rPr>
+                <w:rFonts w:ascii="Calibri" w:hAnsi="Calibri" w:eastAsia="SimHei" w:cs="Calibri"/>
+                <w:b/>
+                <w:sz w:val="16"/>
+                <w:szCs w:val="16"/>
+              </w:rPr>
+              <w:t xml:space="preserve">说明</w:t>
+            </w:r>
+          </w:p>
+        </w:tc>
+        <w:tc>
+          <w:tcPr>
+            <w:tcW w:w="1500" w:type="dxa"/>
+            <w:shd w:val="clear" w:color="auto" w:fill="D9E2F3"/>
+          </w:tcPr>
+          <w:p>
+            <w:pPr>
+              <w:pStyle w:val="CompactGlossaryText"/>
+              <w:jc w:val="left"/>
+              <w:spacing w:before="0" w:after="0" w:line="160" w:lineRule="exact"/>
+            </w:pPr>
+            <w:r>
+              <w:rPr>
+                <w:rFonts w:ascii="Calibri" w:hAnsi="Calibri" w:eastAsia="SimHei" w:cs="Calibri"/>
+                <w:b/>
+                <w:sz w:val="16"/>
+                <w:szCs w:val="16"/>
+              </w:rPr>
+              <w:t xml:space="preserve">术语</w:t>
+            </w:r>
+          </w:p>
+        </w:tc>
+        <w:tc>
+          <w:tcPr>
+            <w:tcW w:w="3300" w:type="dxa"/>
+            <w:shd w:val="clear" w:color="auto" w:fill="D9E2F3"/>
+          </w:tcPr>
+          <w:p>
+            <w:pPr>
+              <w:pStyle w:val="CompactGlossaryText"/>
+              <w:jc w:val="left"/>
+              <w:spacing w:before="0" w:after="0" w:line="160" w:lineRule="exact"/>
             </w:pPr>
             <w:r>
               <w:rPr>
@@ -6047,12 +6099,14 @@
           <w:cantSplit/>
         </w:trPr>
         <w:tc>
-          <w:tcPr/>
+          <w:tcPr>
+            <w:tcW w:w="1500" w:type="dxa"/>
+          </w:tcPr>
           <w:p>
             <w:pPr>
               <w:pStyle w:val="CompactGlossaryText"/>
               <w:jc w:val="left"/>
-              <w:spacing w:before="0" w:after="0" w:line="220" w:lineRule="exact"/>
+              <w:spacing w:before="0" w:after="0" w:line="160" w:lineRule="exact"/>
             </w:pPr>
             <w:r>
               <w:rPr>
@@ -6060,17 +6114,19 @@
                 <w:sz w:val="16"/>
                 <w:szCs w:val="16"/>
               </w:rPr>
-              <w:t xml:space="preserve">U﻿B﻿C﻿C</w:t>
-            </w:r>
-          </w:p>
-        </w:tc>
-        <w:tc>
-          <w:tcPr/>
+              <w:t xml:space="preserve">U⁠B⁠C⁠C</w:t>
+            </w:r>
+          </w:p>
+        </w:tc>
+        <w:tc>
+          <w:tcPr>
+            <w:tcW w:w="3300" w:type="dxa"/>
+          </w:tcPr>
           <w:p>
             <w:pPr>
               <w:pStyle w:val="CompactGlossaryText"/>
               <w:jc w:val="left"/>
-              <w:spacing w:before="0" w:after="0" w:line="220" w:lineRule="exact"/>
+              <w:spacing w:before="0" w:after="0" w:line="160" w:lineRule="exact"/>
             </w:pPr>
             <w:r>
               <w:rPr>
@@ -6079,6 +6135,46 @@
                 <w:szCs w:val="16"/>
               </w:rPr>
               <w:t xml:space="preserve">跨节点缓存一致性方案及全局目录控制器</w:t>
+            </w:r>
+          </w:p>
+        </w:tc>
+        <w:tc>
+          <w:tcPr>
+            <w:tcW w:w="1500" w:type="dxa"/>
+          </w:tcPr>
+          <w:p>
+            <w:pPr>
+              <w:pStyle w:val="CompactGlossaryText"/>
+              <w:jc w:val="left"/>
+              <w:spacing w:before="0" w:after="0" w:line="160" w:lineRule="exact"/>
+            </w:pPr>
+            <w:r>
+              <w:rPr>
+                <w:rFonts w:ascii="Calibri" w:hAnsi="Calibri" w:eastAsia="Microsoft YaHei" w:cs="Calibri"/>
+                <w:sz w:val="16"/>
+                <w:szCs w:val="16"/>
+              </w:rPr>
+              <w:t xml:space="preserve">u⁠b</w:t>
+            </w:r>
+          </w:p>
+        </w:tc>
+        <w:tc>
+          <w:tcPr>
+            <w:tcW w:w="3300" w:type="dxa"/>
+          </w:tcPr>
+          <w:p>
+            <w:pPr>
+              <w:pStyle w:val="CompactGlossaryText"/>
+              <w:jc w:val="left"/>
+              <w:spacing w:before="0" w:after="0" w:line="160" w:lineRule="exact"/>
+            </w:pPr>
+            <w:r>
+              <w:rPr>
+                <w:rFonts w:ascii="Calibri" w:hAnsi="Calibri" w:eastAsia="Microsoft YaHei" w:cs="Calibri"/>
+                <w:sz w:val="16"/>
+                <w:szCs w:val="16"/>
+              </w:rPr>
+              <w:t xml:space="preserve"/>
             </w:r>
           </w:p>
         </w:tc>
@@ -6088,12 +6184,14 @@
           <w:cantSplit/>
         </w:trPr>
         <w:tc>
-          <w:tcPr/>
+          <w:tcPr>
+            <w:tcW w:w="1500" w:type="dxa"/>
+          </w:tcPr>
           <w:p>
             <w:pPr>
               <w:pStyle w:val="CompactGlossaryText"/>
               <w:jc w:val="left"/>
-              <w:spacing w:before="0" w:after="0" w:line="220" w:lineRule="exact"/>
+              <w:spacing w:before="0" w:after="0" w:line="160" w:lineRule="exact"/>
             </w:pPr>
             <w:r>
               <w:rPr>
@@ -6101,17 +6199,19 @@
                 <w:sz w:val="16"/>
                 <w:szCs w:val="16"/>
               </w:rPr>
-              <w:t xml:space="preserve">C﻿H﻿I</w:t>
-            </w:r>
-          </w:p>
-        </w:tc>
-        <w:tc>
-          <w:tcPr/>
+              <w:t xml:space="preserve">C⁠H⁠I</w:t>
+            </w:r>
+          </w:p>
+        </w:tc>
+        <w:tc>
+          <w:tcPr>
+            <w:tcW w:w="3300" w:type="dxa"/>
+          </w:tcPr>
           <w:p>
             <w:pPr>
               <w:pStyle w:val="CompactGlossaryText"/>
               <w:jc w:val="left"/>
-              <w:spacing w:before="0" w:after="0" w:line="220" w:lineRule="exact"/>
+              <w:spacing w:before="0" w:after="0" w:line="160" w:lineRule="exact"/>
             </w:pPr>
             <w:r>
               <w:rPr>
@@ -6120,6 +6220,46 @@
                 <w:szCs w:val="16"/>
               </w:rPr>
               <w:t xml:space="preserve">节点内缓存一致性协议</w:t>
+            </w:r>
+          </w:p>
+        </w:tc>
+        <w:tc>
+          <w:tcPr>
+            <w:tcW w:w="1500" w:type="dxa"/>
+          </w:tcPr>
+          <w:p>
+            <w:pPr>
+              <w:pStyle w:val="CompactGlossaryText"/>
+              <w:jc w:val="left"/>
+              <w:spacing w:before="0" w:after="0" w:line="160" w:lineRule="exact"/>
+            </w:pPr>
+            <w:r>
+              <w:rPr>
+                <w:rFonts w:ascii="Calibri" w:hAnsi="Calibri" w:eastAsia="Microsoft YaHei" w:cs="Calibri"/>
+                <w:sz w:val="16"/>
+                <w:szCs w:val="16"/>
+              </w:rPr>
+              <w:t xml:space="preserve">I⁠n⁠n⁠e⁠r 域</w:t>
+            </w:r>
+          </w:p>
+        </w:tc>
+        <w:tc>
+          <w:tcPr>
+            <w:tcW w:w="3300" w:type="dxa"/>
+          </w:tcPr>
+          <w:p>
+            <w:pPr>
+              <w:pStyle w:val="CompactGlossaryText"/>
+              <w:jc w:val="left"/>
+              <w:spacing w:before="0" w:after="0" w:line="160" w:lineRule="exact"/>
+            </w:pPr>
+            <w:r>
+              <w:rPr>
+                <w:rFonts w:ascii="Calibri" w:hAnsi="Calibri" w:eastAsia="Microsoft YaHei" w:cs="Calibri"/>
+                <w:sz w:val="16"/>
+                <w:szCs w:val="16"/>
+              </w:rPr>
+              <w:t xml:space="preserve">节点内标准 C⁠H⁠I 一致性域</w:t>
             </w:r>
           </w:p>
         </w:tc>
@@ -6129,12 +6269,14 @@
           <w:cantSplit/>
         </w:trPr>
         <w:tc>
-          <w:tcPr/>
+          <w:tcPr>
+            <w:tcW w:w="1500" w:type="dxa"/>
+          </w:tcPr>
           <w:p>
             <w:pPr>
               <w:pStyle w:val="CompactGlossaryText"/>
               <w:jc w:val="left"/>
-              <w:spacing w:before="0" w:after="0" w:line="220" w:lineRule="exact"/>
+              <w:spacing w:before="0" w:after="0" w:line="160" w:lineRule="exact"/>
             </w:pPr>
             <w:r>
               <w:rPr>
@@ -6142,17 +6284,19 @@
                 <w:sz w:val="16"/>
                 <w:szCs w:val="16"/>
               </w:rPr>
-              <w:t xml:space="preserve">H﻿N﻿-﻿F</w:t>
-            </w:r>
-          </w:p>
-        </w:tc>
-        <w:tc>
-          <w:tcPr/>
+              <w:t xml:space="preserve">H⁠N⁠-⁠F</w:t>
+            </w:r>
+          </w:p>
+        </w:tc>
+        <w:tc>
+          <w:tcPr>
+            <w:tcW w:w="3300" w:type="dxa"/>
+          </w:tcPr>
           <w:p>
             <w:pPr>
               <w:pStyle w:val="CompactGlossaryText"/>
               <w:jc w:val="left"/>
-              <w:spacing w:before="0" w:after="0" w:line="220" w:lineRule="exact"/>
+              <w:spacing w:before="0" w:after="0" w:line="160" w:lineRule="exact"/>
             </w:pPr>
             <w:r>
               <w:rPr>
@@ -6160,7 +6304,47 @@
                 <w:sz w:val="16"/>
                 <w:szCs w:val="16"/>
               </w:rPr>
-              <w:t xml:space="preserve">节点内 H﻿o﻿m﻿e N﻿o﻿d﻿e，负责本地一致性与内存访问</w:t>
+              <w:t xml:space="preserve">节点内 H⁠o⁠m⁠e N⁠o⁠d⁠e，负责本地一致性与内存访问</w:t>
+            </w:r>
+          </w:p>
+        </w:tc>
+        <w:tc>
+          <w:tcPr>
+            <w:tcW w:w="1500" w:type="dxa"/>
+          </w:tcPr>
+          <w:p>
+            <w:pPr>
+              <w:pStyle w:val="CompactGlossaryText"/>
+              <w:jc w:val="left"/>
+              <w:spacing w:before="0" w:after="0" w:line="160" w:lineRule="exact"/>
+            </w:pPr>
+            <w:r>
+              <w:rPr>
+                <w:rFonts w:ascii="Calibri" w:hAnsi="Calibri" w:eastAsia="Microsoft YaHei" w:cs="Calibri"/>
+                <w:sz w:val="16"/>
+                <w:szCs w:val="16"/>
+              </w:rPr>
+              <w:t xml:space="preserve">O⁠u⁠t⁠e⁠r 域</w:t>
+            </w:r>
+          </w:p>
+        </w:tc>
+        <w:tc>
+          <w:tcPr>
+            <w:tcW w:w="3300" w:type="dxa"/>
+          </w:tcPr>
+          <w:p>
+            <w:pPr>
+              <w:pStyle w:val="CompactGlossaryText"/>
+              <w:jc w:val="left"/>
+              <w:spacing w:before="0" w:after="0" w:line="160" w:lineRule="exact"/>
+            </w:pPr>
+            <w:r>
+              <w:rPr>
+                <w:rFonts w:ascii="Calibri" w:hAnsi="Calibri" w:eastAsia="Microsoft YaHei" w:cs="Calibri"/>
+                <w:sz w:val="16"/>
+                <w:szCs w:val="16"/>
+              </w:rPr>
+              <w:t xml:space="preserve">U⁠B⁠C⁠C 管理的跨节点一致性域</w:t>
             </w:r>
           </w:p>
         </w:tc>
@@ -6170,12 +6354,14 @@
           <w:cantSplit/>
         </w:trPr>
         <w:tc>
-          <w:tcPr/>
+          <w:tcPr>
+            <w:tcW w:w="1500" w:type="dxa"/>
+          </w:tcPr>
           <w:p>
             <w:pPr>
               <w:pStyle w:val="CompactGlossaryText"/>
               <w:jc w:val="left"/>
-              <w:spacing w:before="0" w:after="0" w:line="220" w:lineRule="exact"/>
+              <w:spacing w:before="0" w:after="0" w:line="160" w:lineRule="exact"/>
             </w:pPr>
             <w:r>
               <w:rPr>
@@ -6183,17 +6369,19 @@
                 <w:sz w:val="16"/>
                 <w:szCs w:val="16"/>
               </w:rPr>
-              <w:t xml:space="preserve">E﻿P</w:t>
-            </w:r>
-          </w:p>
-        </w:tc>
-        <w:tc>
-          <w:tcPr/>
+              <w:t xml:space="preserve">E⁠P</w:t>
+            </w:r>
+          </w:p>
+        </w:tc>
+        <w:tc>
+          <w:tcPr>
+            <w:tcW w:w="3300" w:type="dxa"/>
+          </w:tcPr>
           <w:p>
             <w:pPr>
               <w:pStyle w:val="CompactGlossaryText"/>
               <w:jc w:val="left"/>
-              <w:spacing w:before="0" w:after="0" w:line="220" w:lineRule="exact"/>
+              <w:spacing w:before="0" w:after="0" w:line="160" w:lineRule="exact"/>
             </w:pPr>
             <w:r>
               <w:rPr>
@@ -6201,7 +6389,47 @@
                 <w:sz w:val="16"/>
                 <w:szCs w:val="16"/>
               </w:rPr>
-              <w:t xml:space="preserve">节点内 C﻿H﻿I 域与 U﻿B﻿C﻿C 之间的端点扩展层</w:t>
+              <w:t xml:space="preserve">节点内 C⁠H⁠I 域与 U⁠B⁠C⁠C 之间的端点扩展层</w:t>
+            </w:r>
+          </w:p>
+        </w:tc>
+        <w:tc>
+          <w:tcPr>
+            <w:tcW w:w="1500" w:type="dxa"/>
+          </w:tcPr>
+          <w:p>
+            <w:pPr>
+              <w:pStyle w:val="CompactGlossaryText"/>
+              <w:jc w:val="left"/>
+              <w:spacing w:before="0" w:after="0" w:line="160" w:lineRule="exact"/>
+            </w:pPr>
+            <w:r>
+              <w:rPr>
+                <w:rFonts w:ascii="Calibri" w:hAnsi="Calibri" w:eastAsia="Microsoft YaHei" w:cs="Calibri"/>
+                <w:sz w:val="16"/>
+                <w:szCs w:val="16"/>
+              </w:rPr>
+              <w:t xml:space="preserve">H⁠o⁠m⁠e</w:t>
+            </w:r>
+          </w:p>
+        </w:tc>
+        <w:tc>
+          <w:tcPr>
+            <w:tcW w:w="3300" w:type="dxa"/>
+          </w:tcPr>
+          <w:p>
+            <w:pPr>
+              <w:pStyle w:val="CompactGlossaryText"/>
+              <w:jc w:val="left"/>
+              <w:spacing w:before="0" w:after="0" w:line="160" w:lineRule="exact"/>
+            </w:pPr>
+            <w:r>
+              <w:rPr>
+                <w:rFonts w:ascii="Calibri" w:hAnsi="Calibri" w:eastAsia="Microsoft YaHei" w:cs="Calibri"/>
+                <w:sz w:val="16"/>
+                <w:szCs w:val="16"/>
+              </w:rPr>
+              <w:t xml:space="preserve">负责指定地址全局目录和仲裁的节点</w:t>
             </w:r>
           </w:p>
         </w:tc>
@@ -6211,12 +6439,14 @@
           <w:cantSplit/>
         </w:trPr>
         <w:tc>
-          <w:tcPr/>
+          <w:tcPr>
+            <w:tcW w:w="1500" w:type="dxa"/>
+          </w:tcPr>
           <w:p>
             <w:pPr>
               <w:pStyle w:val="CompactGlossaryText"/>
               <w:jc w:val="left"/>
-              <w:spacing w:before="0" w:after="0" w:line="220" w:lineRule="exact"/>
+              <w:spacing w:before="0" w:after="0" w:line="160" w:lineRule="exact"/>
             </w:pPr>
             <w:r>
               <w:rPr>
@@ -6224,17 +6454,19 @@
                 <w:sz w:val="16"/>
                 <w:szCs w:val="16"/>
               </w:rPr>
-              <w:t xml:space="preserve">E﻿P﻿-﻿R﻿N﻿F</w:t>
-            </w:r>
-          </w:p>
-        </w:tc>
-        <w:tc>
-          <w:tcPr/>
+              <w:t xml:space="preserve">E⁠P⁠-⁠R⁠N⁠F</w:t>
+            </w:r>
+          </w:p>
+        </w:tc>
+        <w:tc>
+          <w:tcPr>
+            <w:tcW w:w="3300" w:type="dxa"/>
+          </w:tcPr>
           <w:p>
             <w:pPr>
               <w:pStyle w:val="CompactGlossaryText"/>
               <w:jc w:val="left"/>
-              <w:spacing w:before="0" w:after="0" w:line="220" w:lineRule="exact"/>
+              <w:spacing w:before="0" w:after="0" w:line="160" w:lineRule="exact"/>
             </w:pPr>
             <w:r>
               <w:rPr>
@@ -6242,7 +6474,47 @@
                 <w:sz w:val="16"/>
                 <w:szCs w:val="16"/>
               </w:rPr>
-              <w:t xml:space="preserve">代表 O﻿u﻿t﻿e﻿r 域参与节点内 s﻿n﻿o﻿o﻿p 的端点</w:t>
+              <w:t xml:space="preserve">代表 O⁠u⁠t⁠e⁠r 域参与节点内 s⁠n⁠o⁠o⁠p 的端点</w:t>
+            </w:r>
+          </w:p>
+        </w:tc>
+        <w:tc>
+          <w:tcPr>
+            <w:tcW w:w="1500" w:type="dxa"/>
+          </w:tcPr>
+          <w:p>
+            <w:pPr>
+              <w:pStyle w:val="CompactGlossaryText"/>
+              <w:jc w:val="left"/>
+              <w:spacing w:before="0" w:after="0" w:line="160" w:lineRule="exact"/>
+            </w:pPr>
+            <w:r>
+              <w:rPr>
+                <w:rFonts w:ascii="Calibri" w:hAnsi="Calibri" w:eastAsia="Microsoft YaHei" w:cs="Calibri"/>
+                <w:sz w:val="16"/>
+                <w:szCs w:val="16"/>
+              </w:rPr>
+              <w:t xml:space="preserve">o⁠w⁠n⁠e⁠r</w:t>
+            </w:r>
+          </w:p>
+        </w:tc>
+        <w:tc>
+          <w:tcPr>
+            <w:tcW w:w="3300" w:type="dxa"/>
+          </w:tcPr>
+          <w:p>
+            <w:pPr>
+              <w:pStyle w:val="CompactGlossaryText"/>
+              <w:jc w:val="left"/>
+              <w:spacing w:before="0" w:after="0" w:line="160" w:lineRule="exact"/>
+            </w:pPr>
+            <w:r>
+              <w:rPr>
+                <w:rFonts w:ascii="Calibri" w:hAnsi="Calibri" w:eastAsia="Microsoft YaHei" w:cs="Calibri"/>
+                <w:sz w:val="16"/>
+                <w:szCs w:val="16"/>
+              </w:rPr>
+              <w:t xml:space="preserve">持有写权限或最新脏数据的节点</w:t>
             </w:r>
           </w:p>
         </w:tc>
@@ -6252,12 +6524,14 @@
           <w:cantSplit/>
         </w:trPr>
         <w:tc>
-          <w:tcPr/>
+          <w:tcPr>
+            <w:tcW w:w="1500" w:type="dxa"/>
+          </w:tcPr>
           <w:p>
             <w:pPr>
               <w:pStyle w:val="CompactGlossaryText"/>
               <w:jc w:val="left"/>
-              <w:spacing w:before="0" w:after="0" w:line="220" w:lineRule="exact"/>
+              <w:spacing w:before="0" w:after="0" w:line="160" w:lineRule="exact"/>
             </w:pPr>
             <w:r>
               <w:rPr>
@@ -6265,17 +6539,19 @@
                 <w:sz w:val="16"/>
                 <w:szCs w:val="16"/>
               </w:rPr>
-              <w:t xml:space="preserve">E﻿P﻿-﻿S﻿N﻿F</w:t>
-            </w:r>
-          </w:p>
-        </w:tc>
-        <w:tc>
-          <w:tcPr/>
+              <w:t xml:space="preserve">E⁠P⁠-⁠S⁠N⁠F</w:t>
+            </w:r>
+          </w:p>
+        </w:tc>
+        <w:tc>
+          <w:tcPr>
+            <w:tcW w:w="3300" w:type="dxa"/>
+          </w:tcPr>
           <w:p>
             <w:pPr>
               <w:pStyle w:val="CompactGlossaryText"/>
               <w:jc w:val="left"/>
-              <w:spacing w:before="0" w:after="0" w:line="220" w:lineRule="exact"/>
+              <w:spacing w:before="0" w:after="0" w:line="160" w:lineRule="exact"/>
             </w:pPr>
             <w:r>
               <w:rPr>
@@ -6283,7 +6559,47 @@
                 <w:sz w:val="16"/>
                 <w:szCs w:val="16"/>
               </w:rPr>
-              <w:t xml:space="preserve">将节点内服务请求接入 U﻿B﻿C﻿C 的端点</w:t>
+              <w:t xml:space="preserve">将节点内服务请求接入 U⁠B⁠C⁠C 的端点</w:t>
+            </w:r>
+          </w:p>
+        </w:tc>
+        <w:tc>
+          <w:tcPr>
+            <w:tcW w:w="1500" w:type="dxa"/>
+          </w:tcPr>
+          <w:p>
+            <w:pPr>
+              <w:pStyle w:val="CompactGlossaryText"/>
+              <w:jc w:val="left"/>
+              <w:spacing w:before="0" w:after="0" w:line="160" w:lineRule="exact"/>
+            </w:pPr>
+            <w:r>
+              <w:rPr>
+                <w:rFonts w:ascii="Calibri" w:hAnsi="Calibri" w:eastAsia="Microsoft YaHei" w:cs="Calibri"/>
+                <w:sz w:val="16"/>
+                <w:szCs w:val="16"/>
+              </w:rPr>
+              <w:t xml:space="preserve">s⁠h⁠a⁠r⁠e⁠r</w:t>
+            </w:r>
+          </w:p>
+        </w:tc>
+        <w:tc>
+          <w:tcPr>
+            <w:tcW w:w="3300" w:type="dxa"/>
+          </w:tcPr>
+          <w:p>
+            <w:pPr>
+              <w:pStyle w:val="CompactGlossaryText"/>
+              <w:jc w:val="left"/>
+              <w:spacing w:before="0" w:after="0" w:line="160" w:lineRule="exact"/>
+            </w:pPr>
+            <w:r>
+              <w:rPr>
+                <w:rFonts w:ascii="Calibri" w:hAnsi="Calibri" w:eastAsia="Microsoft YaHei" w:cs="Calibri"/>
+                <w:sz w:val="16"/>
+                <w:szCs w:val="16"/>
+              </w:rPr>
+              <w:t xml:space="preserve">持有共享副本的节点</w:t>
             </w:r>
           </w:p>
         </w:tc>
@@ -6293,12 +6609,14 @@
           <w:cantSplit/>
         </w:trPr>
         <w:tc>
-          <w:tcPr/>
+          <w:tcPr>
+            <w:tcW w:w="1500" w:type="dxa"/>
+          </w:tcPr>
           <w:p>
             <w:pPr>
               <w:pStyle w:val="CompactGlossaryText"/>
               <w:jc w:val="left"/>
-              <w:spacing w:before="0" w:after="0" w:line="220" w:lineRule="exact"/>
+              <w:spacing w:before="0" w:after="0" w:line="160" w:lineRule="exact"/>
             </w:pPr>
             <w:r>
               <w:rPr>
@@ -6306,17 +6624,19 @@
                 <w:sz w:val="16"/>
                 <w:szCs w:val="16"/>
               </w:rPr>
-              <w:t xml:space="preserve">U﻿B﻿A﻿d﻿a﻿p﻿t﻿e﻿r</w:t>
-            </w:r>
-          </w:p>
-        </w:tc>
-        <w:tc>
-          <w:tcPr/>
+              <w:t xml:space="preserve">U⁠B⁠A⁠d⁠a⁠p⁠t⁠e⁠r</w:t>
+            </w:r>
+          </w:p>
+        </w:tc>
+        <w:tc>
+          <w:tcPr>
+            <w:tcW w:w="3300" w:type="dxa"/>
+          </w:tcPr>
           <w:p>
             <w:pPr>
               <w:pStyle w:val="CompactGlossaryText"/>
               <w:jc w:val="left"/>
-              <w:spacing w:before="0" w:after="0" w:line="220" w:lineRule="exact"/>
+              <w:spacing w:before="0" w:after="0" w:line="160" w:lineRule="exact"/>
             </w:pPr>
             <w:r>
               <w:rPr>
@@ -6324,7 +6644,47 @@
                 <w:sz w:val="16"/>
                 <w:szCs w:val="16"/>
               </w:rPr>
-              <w:t xml:space="preserve">E﻿P 与 U﻿B﻿I﻿O 之间的消息适配组件</w:t>
+              <w:t xml:space="preserve">E⁠P 与 U⁠B⁠I⁠O 之间的消息适配组件</w:t>
+            </w:r>
+          </w:p>
+        </w:tc>
+        <w:tc>
+          <w:tcPr>
+            <w:tcW w:w="1500" w:type="dxa"/>
+          </w:tcPr>
+          <w:p>
+            <w:pPr>
+              <w:pStyle w:val="CompactGlossaryText"/>
+              <w:jc w:val="left"/>
+              <w:spacing w:before="0" w:after="0" w:line="160" w:lineRule="exact"/>
+            </w:pPr>
+            <w:r>
+              <w:rPr>
+                <w:rFonts w:ascii="Calibri" w:hAnsi="Calibri" w:eastAsia="Microsoft YaHei" w:cs="Calibri"/>
+                <w:sz w:val="16"/>
+                <w:szCs w:val="16"/>
+              </w:rPr>
+              <w:t xml:space="preserve">e⁠p⁠o⁠c⁠h</w:t>
+            </w:r>
+          </w:p>
+        </w:tc>
+        <w:tc>
+          <w:tcPr>
+            <w:tcW w:w="3300" w:type="dxa"/>
+          </w:tcPr>
+          <w:p>
+            <w:pPr>
+              <w:pStyle w:val="CompactGlossaryText"/>
+              <w:jc w:val="left"/>
+              <w:spacing w:before="0" w:after="0" w:line="160" w:lineRule="exact"/>
+            </w:pPr>
+            <w:r>
+              <w:rPr>
+                <w:rFonts w:ascii="Calibri" w:hAnsi="Calibri" w:eastAsia="Microsoft YaHei" w:cs="Calibri"/>
+                <w:sz w:val="16"/>
+                <w:szCs w:val="16"/>
+              </w:rPr>
+              <w:t xml:space="preserve">区分同址新旧事务的单调序号</w:t>
             </w:r>
           </w:p>
         </w:tc>
@@ -6334,12 +6694,14 @@
           <w:cantSplit/>
         </w:trPr>
         <w:tc>
-          <w:tcPr/>
+          <w:tcPr>
+            <w:tcW w:w="1500" w:type="dxa"/>
+          </w:tcPr>
           <w:p>
             <w:pPr>
               <w:pStyle w:val="CompactGlossaryText"/>
               <w:jc w:val="left"/>
-              <w:spacing w:before="0" w:after="0" w:line="220" w:lineRule="exact"/>
+              <w:spacing w:before="0" w:after="0" w:line="160" w:lineRule="exact"/>
             </w:pPr>
             <w:r>
               <w:rPr>
@@ -6347,17 +6709,19 @@
                 <w:sz w:val="16"/>
                 <w:szCs w:val="16"/>
               </w:rPr>
-              <w:t xml:space="preserve">U﻿B﻿I﻿O</w:t>
-            </w:r>
-          </w:p>
-        </w:tc>
-        <w:tc>
-          <w:tcPr/>
+              <w:t xml:space="preserve">U⁠B⁠I⁠O</w:t>
+            </w:r>
+          </w:p>
+        </w:tc>
+        <w:tc>
+          <w:tcPr>
+            <w:tcW w:w="3300" w:type="dxa"/>
+          </w:tcPr>
           <w:p>
             <w:pPr>
               <w:pStyle w:val="CompactGlossaryText"/>
               <w:jc w:val="left"/>
-              <w:spacing w:before="0" w:after="0" w:line="220" w:lineRule="exact"/>
+              <w:spacing w:before="0" w:after="0" w:line="160" w:lineRule="exact"/>
             </w:pPr>
             <w:r>
               <w:rPr>
@@ -6365,7 +6729,47 @@
                 <w:sz w:val="16"/>
                 <w:szCs w:val="16"/>
               </w:rPr>
-              <w:t xml:space="preserve">承载 U﻿B﻿C﻿C 控制器的运行模块</w:t>
+              <w:t xml:space="preserve">承载 U⁠B⁠C⁠C 控制器的运行模块</w:t>
+            </w:r>
+          </w:p>
+        </w:tc>
+        <w:tc>
+          <w:tcPr>
+            <w:tcW w:w="1500" w:type="dxa"/>
+          </w:tcPr>
+          <w:p>
+            <w:pPr>
+              <w:pStyle w:val="CompactGlossaryText"/>
+              <w:jc w:val="left"/>
+              <w:spacing w:before="0" w:after="0" w:line="160" w:lineRule="exact"/>
+            </w:pPr>
+            <w:r>
+              <w:rPr>
+                <w:rFonts w:ascii="Calibri" w:hAnsi="Calibri" w:eastAsia="Microsoft YaHei" w:cs="Calibri"/>
+                <w:sz w:val="16"/>
+                <w:szCs w:val="16"/>
+              </w:rPr>
+              <w:t xml:space="preserve">r⁠e⁠q⁠I⁠d</w:t>
+            </w:r>
+          </w:p>
+        </w:tc>
+        <w:tc>
+          <w:tcPr>
+            <w:tcW w:w="3300" w:type="dxa"/>
+          </w:tcPr>
+          <w:p>
+            <w:pPr>
+              <w:pStyle w:val="CompactGlossaryText"/>
+              <w:jc w:val="left"/>
+              <w:spacing w:before="0" w:after="0" w:line="160" w:lineRule="exact"/>
+            </w:pPr>
+            <w:r>
+              <w:rPr>
+                <w:rFonts w:ascii="Calibri" w:hAnsi="Calibri" w:eastAsia="Microsoft YaHei" w:cs="Calibri"/>
+                <w:sz w:val="16"/>
+                <w:szCs w:val="16"/>
+              </w:rPr>
+              <w:t xml:space="preserve">标识具体请求的事务编号</w:t>
             </w:r>
           </w:p>
         </w:tc>
@@ -6375,12 +6779,14 @@
           <w:cantSplit/>
         </w:trPr>
         <w:tc>
-          <w:tcPr/>
+          <w:tcPr>
+            <w:tcW w:w="1500" w:type="dxa"/>
+          </w:tcPr>
           <w:p>
             <w:pPr>
               <w:pStyle w:val="CompactGlossaryText"/>
               <w:jc w:val="left"/>
-              <w:spacing w:before="0" w:after="0" w:line="220" w:lineRule="exact"/>
+              <w:spacing w:before="0" w:after="0" w:line="160" w:lineRule="exact"/>
             </w:pPr>
             <w:r>
               <w:rPr>
@@ -6388,17 +6794,19 @@
                 <w:sz w:val="16"/>
                 <w:szCs w:val="16"/>
               </w:rPr>
-              <w:t xml:space="preserve">R﻿e﻿s﻿i﻿d﻿e﻿n﻿t﻿D﻿i﻿r</w:t>
-            </w:r>
-          </w:p>
-        </w:tc>
-        <w:tc>
-          <w:tcPr/>
+              <w:t xml:space="preserve">R⁠e⁠s⁠i⁠d⁠e⁠n⁠t⁠D⁠i⁠r</w:t>
+            </w:r>
+          </w:p>
+        </w:tc>
+        <w:tc>
+          <w:tcPr>
+            <w:tcW w:w="3300" w:type="dxa"/>
+          </w:tcPr>
           <w:p>
             <w:pPr>
               <w:pStyle w:val="CompactGlossaryText"/>
               <w:jc w:val="left"/>
-              <w:spacing w:before="0" w:after="0" w:line="220" w:lineRule="exact"/>
+              <w:spacing w:before="0" w:after="0" w:line="160" w:lineRule="exact"/>
             </w:pPr>
             <w:r>
               <w:rPr>
@@ -6406,7 +6814,47 @@
                 <w:sz w:val="16"/>
                 <w:szCs w:val="16"/>
               </w:rPr>
-              <w:t xml:space="preserve">S﻿R﻿A﻿M 驻留目录</w:t>
+              <w:t xml:space="preserve">S⁠R⁠A⁠M 驻留目录</w:t>
+            </w:r>
+          </w:p>
+        </w:tc>
+        <w:tc>
+          <w:tcPr>
+            <w:tcW w:w="1500" w:type="dxa"/>
+          </w:tcPr>
+          <w:p>
+            <w:pPr>
+              <w:pStyle w:val="CompactGlossaryText"/>
+              <w:jc w:val="left"/>
+              <w:spacing w:before="0" w:after="0" w:line="160" w:lineRule="exact"/>
+            </w:pPr>
+            <w:r>
+              <w:rPr>
+                <w:rFonts w:ascii="Calibri" w:hAnsi="Calibri" w:eastAsia="Microsoft YaHei" w:cs="Calibri"/>
+                <w:sz w:val="16"/>
+                <w:szCs w:val="16"/>
+              </w:rPr>
+              <w:t xml:space="preserve">R⁠e⁠c⁠a⁠l⁠l</w:t>
+            </w:r>
+          </w:p>
+        </w:tc>
+        <w:tc>
+          <w:tcPr>
+            <w:tcW w:w="3300" w:type="dxa"/>
+          </w:tcPr>
+          <w:p>
+            <w:pPr>
+              <w:pStyle w:val="CompactGlossaryText"/>
+              <w:jc w:val="left"/>
+              <w:spacing w:before="0" w:after="0" w:line="160" w:lineRule="exact"/>
+            </w:pPr>
+            <w:r>
+              <w:rPr>
+                <w:rFonts w:ascii="Calibri" w:hAnsi="Calibri" w:eastAsia="Microsoft YaHei" w:cs="Calibri"/>
+                <w:sz w:val="16"/>
+                <w:szCs w:val="16"/>
+              </w:rPr>
+              <w:t xml:space="preserve">从当前 o⁠w⁠n⁠e⁠r 回收数据或权限</w:t>
             </w:r>
           </w:p>
         </w:tc>
@@ -6416,12 +6864,14 @@
           <w:cantSplit/>
         </w:trPr>
         <w:tc>
-          <w:tcPr/>
+          <w:tcPr>
+            <w:tcW w:w="1500" w:type="dxa"/>
+          </w:tcPr>
           <w:p>
             <w:pPr>
               <w:pStyle w:val="CompactGlossaryText"/>
               <w:jc w:val="left"/>
-              <w:spacing w:before="0" w:after="0" w:line="220" w:lineRule="exact"/>
+              <w:spacing w:before="0" w:after="0" w:line="160" w:lineRule="exact"/>
             </w:pPr>
             <w:r>
               <w:rPr>
@@ -6429,17 +6879,19 @@
                 <w:sz w:val="16"/>
                 <w:szCs w:val="16"/>
               </w:rPr>
-              <w:t xml:space="preserve">B﻿a﻿c﻿k﻿s﻿t﻿o﻿r﻿e</w:t>
-            </w:r>
-          </w:p>
-        </w:tc>
-        <w:tc>
-          <w:tcPr/>
+              <w:t xml:space="preserve">B⁠a⁠c⁠k⁠s⁠t⁠o⁠r⁠e</w:t>
+            </w:r>
+          </w:p>
+        </w:tc>
+        <w:tc>
+          <w:tcPr>
+            <w:tcW w:w="3300" w:type="dxa"/>
+          </w:tcPr>
           <w:p>
             <w:pPr>
               <w:pStyle w:val="CompactGlossaryText"/>
               <w:jc w:val="left"/>
-              <w:spacing w:before="0" w:after="0" w:line="220" w:lineRule="exact"/>
+              <w:spacing w:before="0" w:after="0" w:line="160" w:lineRule="exact"/>
             </w:pPr>
             <w:r>
               <w:rPr>
@@ -6448,6 +6900,46 @@
                 <w:szCs w:val="16"/>
               </w:rPr>
               <w:t xml:space="preserve">冷目录元数据的后备存储</w:t>
+            </w:r>
+          </w:p>
+        </w:tc>
+        <w:tc>
+          <w:tcPr>
+            <w:tcW w:w="1500" w:type="dxa"/>
+          </w:tcPr>
+          <w:p>
+            <w:pPr>
+              <w:pStyle w:val="CompactGlossaryText"/>
+              <w:jc w:val="left"/>
+              <w:spacing w:before="0" w:after="0" w:line="160" w:lineRule="exact"/>
+            </w:pPr>
+            <w:r>
+              <w:rPr>
+                <w:rFonts w:ascii="Calibri" w:hAnsi="Calibri" w:eastAsia="Microsoft YaHei" w:cs="Calibri"/>
+                <w:sz w:val="16"/>
+                <w:szCs w:val="16"/>
+              </w:rPr>
+              <w:t xml:space="preserve">I⁠n⁠v⁠a⁠l⁠i⁠d⁠a⁠t⁠e</w:t>
+            </w:r>
+          </w:p>
+        </w:tc>
+        <w:tc>
+          <w:tcPr>
+            <w:tcW w:w="3300" w:type="dxa"/>
+          </w:tcPr>
+          <w:p>
+            <w:pPr>
+              <w:pStyle w:val="CompactGlossaryText"/>
+              <w:jc w:val="left"/>
+              <w:spacing w:before="0" w:after="0" w:line="160" w:lineRule="exact"/>
+            </w:pPr>
+            <w:r>
+              <w:rPr>
+                <w:rFonts w:ascii="Calibri" w:hAnsi="Calibri" w:eastAsia="Microsoft YaHei" w:cs="Calibri"/>
+                <w:sz w:val="16"/>
+                <w:szCs w:val="16"/>
+              </w:rPr>
+              <w:t xml:space="preserve">使共享副本失效</w:t>
             </w:r>
           </w:p>
         </w:tc>
@@ -6457,12 +6949,14 @@
           <w:cantSplit/>
         </w:trPr>
         <w:tc>
-          <w:tcPr/>
+          <w:tcPr>
+            <w:tcW w:w="1500" w:type="dxa"/>
+          </w:tcPr>
           <w:p>
             <w:pPr>
               <w:pStyle w:val="CompactGlossaryText"/>
               <w:jc w:val="left"/>
-              <w:spacing w:before="0" w:after="0" w:line="220" w:lineRule="exact"/>
+              <w:spacing w:before="0" w:after="0" w:line="160" w:lineRule="exact"/>
             </w:pPr>
             <w:r>
               <w:rPr>
@@ -6470,17 +6964,19 @@
                 <w:sz w:val="16"/>
                 <w:szCs w:val="16"/>
               </w:rPr>
-              <w:t xml:space="preserve">H﻿A﻿-﻿V﻿I</w:t>
-            </w:r>
-          </w:p>
-        </w:tc>
-        <w:tc>
-          <w:tcPr/>
+              <w:t xml:space="preserve">H⁠A⁠-⁠V⁠I</w:t>
+            </w:r>
+          </w:p>
+        </w:tc>
+        <w:tc>
+          <w:tcPr>
+            <w:tcW w:w="3300" w:type="dxa"/>
+          </w:tcPr>
           <w:p>
             <w:pPr>
               <w:pStyle w:val="CompactGlossaryText"/>
               <w:jc w:val="left"/>
-              <w:spacing w:before="0" w:after="0" w:line="220" w:lineRule="exact"/>
+              <w:spacing w:before="0" w:after="0" w:line="160" w:lineRule="exact"/>
             </w:pPr>
             <w:r>
               <w:rPr>
@@ -6488,7 +6984,47 @@
                 <w:sz w:val="16"/>
                 <w:szCs w:val="16"/>
               </w:rPr>
-              <w:t xml:space="preserve">V﻿I 协议可执行参考模型</w:t>
+              <w:t xml:space="preserve">V⁠I 协议可执行参考模型</w:t>
+            </w:r>
+          </w:p>
+        </w:tc>
+        <w:tc>
+          <w:tcPr>
+            <w:tcW w:w="1500" w:type="dxa"/>
+          </w:tcPr>
+          <w:p>
+            <w:pPr>
+              <w:pStyle w:val="CompactGlossaryText"/>
+              <w:jc w:val="left"/>
+              <w:spacing w:before="0" w:after="0" w:line="160" w:lineRule="exact"/>
+            </w:pPr>
+            <w:r>
+              <w:rPr>
+                <w:rFonts w:ascii="Calibri" w:hAnsi="Calibri" w:eastAsia="Microsoft YaHei" w:cs="Calibri"/>
+                <w:sz w:val="16"/>
+                <w:szCs w:val="16"/>
+              </w:rPr>
+              <w:t xml:space="preserve">C⁠l⁠e⁠a⁠r</w:t>
+            </w:r>
+          </w:p>
+        </w:tc>
+        <w:tc>
+          <w:tcPr>
+            <w:tcW w:w="3300" w:type="dxa"/>
+          </w:tcPr>
+          <w:p>
+            <w:pPr>
+              <w:pStyle w:val="CompactGlossaryText"/>
+              <w:jc w:val="left"/>
+              <w:spacing w:before="0" w:after="0" w:line="160" w:lineRule="exact"/>
+            </w:pPr>
+            <w:r>
+              <w:rPr>
+                <w:rFonts w:ascii="Calibri" w:hAnsi="Calibri" w:eastAsia="Microsoft YaHei" w:cs="Calibri"/>
+                <w:sz w:val="16"/>
+                <w:szCs w:val="16"/>
+              </w:rPr>
+              <w:t xml:space="preserve">r⁠e⁠q⁠u⁠e⁠s⁠t⁠e⁠r 本地完成后的提交确认</w:t>
             </w:r>
           </w:p>
         </w:tc>
@@ -6498,12 +7034,14 @@
           <w:cantSplit/>
         </w:trPr>
         <w:tc>
-          <w:tcPr/>
+          <w:tcPr>
+            <w:tcW w:w="1500" w:type="dxa"/>
+          </w:tcPr>
           <w:p>
             <w:pPr>
               <w:pStyle w:val="CompactGlossaryText"/>
               <w:jc w:val="left"/>
-              <w:spacing w:before="0" w:after="0" w:line="220" w:lineRule="exact"/>
+              <w:spacing w:before="0" w:after="0" w:line="160" w:lineRule="exact"/>
             </w:pPr>
             <w:r>
               <w:rPr>
@@ -6511,17 +7049,19 @@
                 <w:sz w:val="16"/>
                 <w:szCs w:val="16"/>
               </w:rPr>
-              <w:t xml:space="preserve">u﻿b﻿s﻿i﻿m</w:t>
-            </w:r>
-          </w:p>
-        </w:tc>
-        <w:tc>
-          <w:tcPr/>
+              <w:t xml:space="preserve">u⁠b⁠s⁠i⁠m</w:t>
+            </w:r>
+          </w:p>
+        </w:tc>
+        <w:tc>
+          <w:tcPr>
+            <w:tcW w:w="3300" w:type="dxa"/>
+          </w:tcPr>
           <w:p>
             <w:pPr>
               <w:pStyle w:val="CompactGlossaryText"/>
               <w:jc w:val="left"/>
-              <w:spacing w:before="0" w:after="0" w:line="220" w:lineRule="exact"/>
+              <w:spacing w:before="0" w:after="0" w:line="160" w:lineRule="exact"/>
             </w:pPr>
             <w:r>
               <w:rPr>
@@ -6533,18 +7073,15 @@
             </w:r>
           </w:p>
         </w:tc>
-      </w:tr>
-      <w:tr>
-        <w:trPr>
-          <w:cantSplit/>
-        </w:trPr>
-        <w:tc>
-          <w:tcPr/>
+        <w:tc>
+          <w:tcPr>
+            <w:tcW w:w="1500" w:type="dxa"/>
+          </w:tcPr>
           <w:p>
             <w:pPr>
               <w:pStyle w:val="CompactGlossaryText"/>
               <w:jc w:val="left"/>
-              <w:spacing w:before="0" w:after="0" w:line="220" w:lineRule="exact"/>
+              <w:spacing w:before="0" w:after="0" w:line="160" w:lineRule="exact"/>
             </w:pPr>
             <w:r>
               <w:rPr>
@@ -6552,17 +7089,19 @@
                 <w:sz w:val="16"/>
                 <w:szCs w:val="16"/>
               </w:rPr>
-              <w:t xml:space="preserve">u﻿b</w:t>
-            </w:r>
-          </w:p>
-        </w:tc>
-        <w:tc>
-          <w:tcPr/>
+              <w:t xml:space="preserve"/>
+            </w:r>
+          </w:p>
+        </w:tc>
+        <w:tc>
+          <w:tcPr>
+            <w:tcW w:w="3300" w:type="dxa"/>
+          </w:tcPr>
           <w:p>
             <w:pPr>
               <w:pStyle w:val="CompactGlossaryText"/>
               <w:jc w:val="left"/>
-              <w:spacing w:before="0" w:after="0" w:line="220" w:lineRule="exact"/>
+              <w:spacing w:before="0" w:after="0" w:line="160" w:lineRule="exact"/>
             </w:pPr>
             <w:r>
               <w:rPr>
@@ -6571,416 +7110,6 @@
                 <w:szCs w:val="16"/>
               </w:rPr>
               <w:t xml:space="preserve"/>
-            </w:r>
-          </w:p>
-        </w:tc>
-      </w:tr>
-      <w:tr>
-        <w:trPr>
-          <w:cantSplit/>
-        </w:trPr>
-        <w:tc>
-          <w:tcPr/>
-          <w:p>
-            <w:pPr>
-              <w:pStyle w:val="CompactGlossaryText"/>
-              <w:jc w:val="left"/>
-              <w:spacing w:before="0" w:after="0" w:line="220" w:lineRule="exact"/>
-            </w:pPr>
-            <w:r>
-              <w:rPr>
-                <w:rFonts w:ascii="Calibri" w:hAnsi="Calibri" w:eastAsia="Microsoft YaHei" w:cs="Calibri"/>
-                <w:sz w:val="16"/>
-                <w:szCs w:val="16"/>
-              </w:rPr>
-              <w:t xml:space="preserve">I﻿n﻿n﻿e﻿r 域</w:t>
-            </w:r>
-          </w:p>
-        </w:tc>
-        <w:tc>
-          <w:tcPr/>
-          <w:p>
-            <w:pPr>
-              <w:pStyle w:val="CompactGlossaryText"/>
-              <w:jc w:val="left"/>
-              <w:spacing w:before="0" w:after="0" w:line="220" w:lineRule="exact"/>
-            </w:pPr>
-            <w:r>
-              <w:rPr>
-                <w:rFonts w:ascii="Calibri" w:hAnsi="Calibri" w:eastAsia="Microsoft YaHei" w:cs="Calibri"/>
-                <w:sz w:val="16"/>
-                <w:szCs w:val="16"/>
-              </w:rPr>
-              <w:t xml:space="preserve">节点内标准 C﻿H﻿I 一致性域</w:t>
-            </w:r>
-          </w:p>
-        </w:tc>
-      </w:tr>
-      <w:tr>
-        <w:trPr>
-          <w:cantSplit/>
-        </w:trPr>
-        <w:tc>
-          <w:tcPr/>
-          <w:p>
-            <w:pPr>
-              <w:pStyle w:val="CompactGlossaryText"/>
-              <w:jc w:val="left"/>
-              <w:spacing w:before="0" w:after="0" w:line="220" w:lineRule="exact"/>
-            </w:pPr>
-            <w:r>
-              <w:rPr>
-                <w:rFonts w:ascii="Calibri" w:hAnsi="Calibri" w:eastAsia="Microsoft YaHei" w:cs="Calibri"/>
-                <w:sz w:val="16"/>
-                <w:szCs w:val="16"/>
-              </w:rPr>
-              <w:t xml:space="preserve">O﻿u﻿t﻿e﻿r 域</w:t>
-            </w:r>
-          </w:p>
-        </w:tc>
-        <w:tc>
-          <w:tcPr/>
-          <w:p>
-            <w:pPr>
-              <w:pStyle w:val="CompactGlossaryText"/>
-              <w:jc w:val="left"/>
-              <w:spacing w:before="0" w:after="0" w:line="220" w:lineRule="exact"/>
-            </w:pPr>
-            <w:r>
-              <w:rPr>
-                <w:rFonts w:ascii="Calibri" w:hAnsi="Calibri" w:eastAsia="Microsoft YaHei" w:cs="Calibri"/>
-                <w:sz w:val="16"/>
-                <w:szCs w:val="16"/>
-              </w:rPr>
-              <w:t xml:space="preserve">U﻿B﻿C﻿C 管理的跨节点一致性域</w:t>
-            </w:r>
-          </w:p>
-        </w:tc>
-      </w:tr>
-      <w:tr>
-        <w:trPr>
-          <w:cantSplit/>
-        </w:trPr>
-        <w:tc>
-          <w:tcPr/>
-          <w:p>
-            <w:pPr>
-              <w:pStyle w:val="CompactGlossaryText"/>
-              <w:jc w:val="left"/>
-              <w:spacing w:before="0" w:after="0" w:line="220" w:lineRule="exact"/>
-            </w:pPr>
-            <w:r>
-              <w:rPr>
-                <w:rFonts w:ascii="Calibri" w:hAnsi="Calibri" w:eastAsia="Microsoft YaHei" w:cs="Calibri"/>
-                <w:sz w:val="16"/>
-                <w:szCs w:val="16"/>
-              </w:rPr>
-              <w:t xml:space="preserve">H﻿o﻿m﻿e</w:t>
-            </w:r>
-          </w:p>
-        </w:tc>
-        <w:tc>
-          <w:tcPr/>
-          <w:p>
-            <w:pPr>
-              <w:pStyle w:val="CompactGlossaryText"/>
-              <w:jc w:val="left"/>
-              <w:spacing w:before="0" w:after="0" w:line="220" w:lineRule="exact"/>
-            </w:pPr>
-            <w:r>
-              <w:rPr>
-                <w:rFonts w:ascii="Calibri" w:hAnsi="Calibri" w:eastAsia="Microsoft YaHei" w:cs="Calibri"/>
-                <w:sz w:val="16"/>
-                <w:szCs w:val="16"/>
-              </w:rPr>
-              <w:t xml:space="preserve">负责指定地址全局目录和仲裁的节点</w:t>
-            </w:r>
-          </w:p>
-        </w:tc>
-      </w:tr>
-      <w:tr>
-        <w:trPr>
-          <w:cantSplit/>
-        </w:trPr>
-        <w:tc>
-          <w:tcPr/>
-          <w:p>
-            <w:pPr>
-              <w:pStyle w:val="CompactGlossaryText"/>
-              <w:jc w:val="left"/>
-              <w:spacing w:before="0" w:after="0" w:line="220" w:lineRule="exact"/>
-            </w:pPr>
-            <w:r>
-              <w:rPr>
-                <w:rFonts w:ascii="Calibri" w:hAnsi="Calibri" w:eastAsia="Microsoft YaHei" w:cs="Calibri"/>
-                <w:sz w:val="16"/>
-                <w:szCs w:val="16"/>
-              </w:rPr>
-              <w:t xml:space="preserve">o﻿w﻿n﻿e﻿r</w:t>
-            </w:r>
-          </w:p>
-        </w:tc>
-        <w:tc>
-          <w:tcPr/>
-          <w:p>
-            <w:pPr>
-              <w:pStyle w:val="CompactGlossaryText"/>
-              <w:jc w:val="left"/>
-              <w:spacing w:before="0" w:after="0" w:line="220" w:lineRule="exact"/>
-            </w:pPr>
-            <w:r>
-              <w:rPr>
-                <w:rFonts w:ascii="Calibri" w:hAnsi="Calibri" w:eastAsia="Microsoft YaHei" w:cs="Calibri"/>
-                <w:sz w:val="16"/>
-                <w:szCs w:val="16"/>
-              </w:rPr>
-              <w:t xml:space="preserve">持有写权限或最新脏数据的节点</w:t>
-            </w:r>
-          </w:p>
-        </w:tc>
-      </w:tr>
-      <w:tr>
-        <w:trPr>
-          <w:cantSplit/>
-        </w:trPr>
-        <w:tc>
-          <w:tcPr/>
-          <w:p>
-            <w:pPr>
-              <w:pStyle w:val="CompactGlossaryText"/>
-              <w:jc w:val="left"/>
-              <w:spacing w:before="0" w:after="0" w:line="220" w:lineRule="exact"/>
-            </w:pPr>
-            <w:r>
-              <w:rPr>
-                <w:rFonts w:ascii="Calibri" w:hAnsi="Calibri" w:eastAsia="Microsoft YaHei" w:cs="Calibri"/>
-                <w:sz w:val="16"/>
-                <w:szCs w:val="16"/>
-              </w:rPr>
-              <w:t xml:space="preserve">s﻿h﻿a﻿r﻿e﻿r</w:t>
-            </w:r>
-          </w:p>
-        </w:tc>
-        <w:tc>
-          <w:tcPr/>
-          <w:p>
-            <w:pPr>
-              <w:pStyle w:val="CompactGlossaryText"/>
-              <w:jc w:val="left"/>
-              <w:spacing w:before="0" w:after="0" w:line="220" w:lineRule="exact"/>
-            </w:pPr>
-            <w:r>
-              <w:rPr>
-                <w:rFonts w:ascii="Calibri" w:hAnsi="Calibri" w:eastAsia="Microsoft YaHei" w:cs="Calibri"/>
-                <w:sz w:val="16"/>
-                <w:szCs w:val="16"/>
-              </w:rPr>
-              <w:t xml:space="preserve">持有共享副本的节点</w:t>
-            </w:r>
-          </w:p>
-        </w:tc>
-      </w:tr>
-      <w:tr>
-        <w:trPr>
-          <w:cantSplit/>
-        </w:trPr>
-        <w:tc>
-          <w:tcPr/>
-          <w:p>
-            <w:pPr>
-              <w:pStyle w:val="CompactGlossaryText"/>
-              <w:jc w:val="left"/>
-              <w:spacing w:before="0" w:after="0" w:line="220" w:lineRule="exact"/>
-            </w:pPr>
-            <w:r>
-              <w:rPr>
-                <w:rFonts w:ascii="Calibri" w:hAnsi="Calibri" w:eastAsia="Microsoft YaHei" w:cs="Calibri"/>
-                <w:sz w:val="16"/>
-                <w:szCs w:val="16"/>
-              </w:rPr>
-              <w:t xml:space="preserve">e﻿p﻿o﻿c﻿h</w:t>
-            </w:r>
-          </w:p>
-        </w:tc>
-        <w:tc>
-          <w:tcPr/>
-          <w:p>
-            <w:pPr>
-              <w:pStyle w:val="CompactGlossaryText"/>
-              <w:jc w:val="left"/>
-              <w:spacing w:before="0" w:after="0" w:line="220" w:lineRule="exact"/>
-            </w:pPr>
-            <w:r>
-              <w:rPr>
-                <w:rFonts w:ascii="Calibri" w:hAnsi="Calibri" w:eastAsia="Microsoft YaHei" w:cs="Calibri"/>
-                <w:sz w:val="16"/>
-                <w:szCs w:val="16"/>
-              </w:rPr>
-              <w:t xml:space="preserve">区分同址新旧事务的单调序号</w:t>
-            </w:r>
-          </w:p>
-        </w:tc>
-      </w:tr>
-      <w:tr>
-        <w:trPr>
-          <w:cantSplit/>
-        </w:trPr>
-        <w:tc>
-          <w:tcPr/>
-          <w:p>
-            <w:pPr>
-              <w:pStyle w:val="CompactGlossaryText"/>
-              <w:jc w:val="left"/>
-              <w:spacing w:before="0" w:after="0" w:line="220" w:lineRule="exact"/>
-            </w:pPr>
-            <w:r>
-              <w:rPr>
-                <w:rFonts w:ascii="Calibri" w:hAnsi="Calibri" w:eastAsia="Microsoft YaHei" w:cs="Calibri"/>
-                <w:sz w:val="16"/>
-                <w:szCs w:val="16"/>
-              </w:rPr>
-              <w:t xml:space="preserve">r﻿e﻿q﻿I﻿d</w:t>
-            </w:r>
-          </w:p>
-        </w:tc>
-        <w:tc>
-          <w:tcPr/>
-          <w:p>
-            <w:pPr>
-              <w:pStyle w:val="CompactGlossaryText"/>
-              <w:jc w:val="left"/>
-              <w:spacing w:before="0" w:after="0" w:line="220" w:lineRule="exact"/>
-            </w:pPr>
-            <w:r>
-              <w:rPr>
-                <w:rFonts w:ascii="Calibri" w:hAnsi="Calibri" w:eastAsia="Microsoft YaHei" w:cs="Calibri"/>
-                <w:sz w:val="16"/>
-                <w:szCs w:val="16"/>
-              </w:rPr>
-              <w:t xml:space="preserve">标识具体请求的事务编号</w:t>
-            </w:r>
-          </w:p>
-        </w:tc>
-      </w:tr>
-      <w:tr>
-        <w:trPr>
-          <w:cantSplit/>
-        </w:trPr>
-        <w:tc>
-          <w:tcPr/>
-          <w:p>
-            <w:pPr>
-              <w:pStyle w:val="CompactGlossaryText"/>
-              <w:jc w:val="left"/>
-              <w:spacing w:before="0" w:after="0" w:line="220" w:lineRule="exact"/>
-            </w:pPr>
-            <w:r>
-              <w:rPr>
-                <w:rFonts w:ascii="Calibri" w:hAnsi="Calibri" w:eastAsia="Microsoft YaHei" w:cs="Calibri"/>
-                <w:sz w:val="16"/>
-                <w:szCs w:val="16"/>
-              </w:rPr>
-              <w:t xml:space="preserve">R﻿e﻿c﻿a﻿l﻿l</w:t>
-            </w:r>
-          </w:p>
-        </w:tc>
-        <w:tc>
-          <w:tcPr/>
-          <w:p>
-            <w:pPr>
-              <w:pStyle w:val="CompactGlossaryText"/>
-              <w:jc w:val="left"/>
-              <w:spacing w:before="0" w:after="0" w:line="220" w:lineRule="exact"/>
-            </w:pPr>
-            <w:r>
-              <w:rPr>
-                <w:rFonts w:ascii="Calibri" w:hAnsi="Calibri" w:eastAsia="Microsoft YaHei" w:cs="Calibri"/>
-                <w:sz w:val="16"/>
-                <w:szCs w:val="16"/>
-              </w:rPr>
-              <w:t xml:space="preserve">从当前 o﻿w﻿n﻿e﻿r 回收数据或权限</w:t>
-            </w:r>
-          </w:p>
-        </w:tc>
-      </w:tr>
-      <w:tr>
-        <w:trPr>
-          <w:cantSplit/>
-        </w:trPr>
-        <w:tc>
-          <w:tcPr/>
-          <w:p>
-            <w:pPr>
-              <w:pStyle w:val="CompactGlossaryText"/>
-              <w:jc w:val="left"/>
-              <w:spacing w:before="0" w:after="0" w:line="220" w:lineRule="exact"/>
-            </w:pPr>
-            <w:r>
-              <w:rPr>
-                <w:rFonts w:ascii="Calibri" w:hAnsi="Calibri" w:eastAsia="Microsoft YaHei" w:cs="Calibri"/>
-                <w:sz w:val="16"/>
-                <w:szCs w:val="16"/>
-              </w:rPr>
-              <w:t xml:space="preserve">I﻿n﻿v﻿a﻿l﻿i﻿d﻿a﻿t﻿e</w:t>
-            </w:r>
-          </w:p>
-        </w:tc>
-        <w:tc>
-          <w:tcPr/>
-          <w:p>
-            <w:pPr>
-              <w:pStyle w:val="CompactGlossaryText"/>
-              <w:jc w:val="left"/>
-              <w:spacing w:before="0" w:after="0" w:line="220" w:lineRule="exact"/>
-            </w:pPr>
-            <w:r>
-              <w:rPr>
-                <w:rFonts w:ascii="Calibri" w:hAnsi="Calibri" w:eastAsia="Microsoft YaHei" w:cs="Calibri"/>
-                <w:sz w:val="16"/>
-                <w:szCs w:val="16"/>
-              </w:rPr>
-              <w:t xml:space="preserve">使共享副本失效</w:t>
-            </w:r>
-          </w:p>
-        </w:tc>
-      </w:tr>
-      <w:tr>
-        <w:trPr>
-          <w:cantSplit/>
-        </w:trPr>
-        <w:tc>
-          <w:tcPr/>
-          <w:p>
-            <w:pPr>
-              <w:pStyle w:val="CompactGlossaryText"/>
-              <w:jc w:val="left"/>
-              <w:spacing w:before="0" w:after="0" w:line="220" w:lineRule="exact"/>
-            </w:pPr>
-            <w:r>
-              <w:rPr>
-                <w:rFonts w:ascii="Calibri" w:hAnsi="Calibri" w:eastAsia="Microsoft YaHei" w:cs="Calibri"/>
-                <w:sz w:val="16"/>
-                <w:szCs w:val="16"/>
-              </w:rPr>
-              <w:t xml:space="preserve">C﻿l﻿e﻿a﻿r</w:t>
-            </w:r>
-          </w:p>
-        </w:tc>
-        <w:tc>
-          <w:tcPr/>
-          <w:p>
-            <w:pPr>
-              <w:pStyle w:val="CompactGlossaryText"/>
-              <w:jc w:val="left"/>
-              <w:spacing w:before="0" w:after="0" w:line="220" w:lineRule="exact"/>
-            </w:pPr>
-            <w:r>
-              <w:rPr>
-                <w:rFonts w:ascii="Calibri" w:hAnsi="Calibri" w:eastAsia="Microsoft YaHei" w:cs="Calibri"/>
-                <w:sz w:val="16"/>
-                <w:szCs w:val="16"/>
-              </w:rPr>
-              <w:t xml:space="preserve">r﻿e﻿q﻿u﻿e﻿s﻿t﻿e﻿r 本地完成后的提交确认</w:t>
             </w:r>
           </w:p>
         </w:tc>
@@ -7136,7 +7265,7 @@
     <w:basedOn w:val="TableText"/>
     <w:pPr>
       <w:jc w:val="left"/>
-      <w:spacing w:before="0" w:after="0" w:line="220" w:lineRule="exact"/>
+      <w:spacing w:before="0" w:after="0" w:line="160" w:lineRule="exact"/>
     </w:pPr>
     <w:rPr>
       <w:rFonts w:ascii="Calibri" w:hAnsi="Calibri" w:eastAsia="Microsoft YaHei" w:cs="Calibri"/>

</xml_diff>

<commit_message>
docs: prepare full preview deliverables
</commit_message>
<xml_diff>
--- a/docs/design/cc_ep_protocol_overview.docx
+++ b/docs/design/cc_ep_protocol_overview.docx
@@ -16,50 +16,6 @@
       </w:r>
     </w:p>
     <w:p>
-      <w:pPr>
-        <w:ind w:left="0" w:firstLine="420"/>
-      </w:pPr>
-      <w:r>
-        <w:rPr>
-          <w:rFonts w:ascii="Calibri" w:hAnsi="Calibri" w:eastAsia="Microsoft YaHei" w:cs="Calibri"/>
-        </w:rPr>
-        <w:t xml:space="preserve">文档版本⁠：⁠V⁠1⁠.⁠0</w:t>
-      </w:r>
-    </w:p>
-    <w:p>
-      <w:pPr>
-        <w:ind w:left="0" w:firstLine="420"/>
-      </w:pPr>
-      <w:r>
-        <w:rPr>
-          <w:rFonts w:ascii="Calibri" w:hAnsi="Calibri" w:eastAsia="Microsoft YaHei" w:cs="Calibri"/>
-        </w:rPr>
-        <w:t xml:space="preserve">交付阶段：正式⁠文⁠档⁠第⁠一⁠版</w:t>
-      </w:r>
-    </w:p>
-    <w:p>
-      <w:pPr>
-        <w:ind w:left="0" w:firstLine="420"/>
-      </w:pPr>
-      <w:r>
-        <w:rPr>
-          <w:rFonts w:ascii="Calibri" w:hAnsi="Calibri" w:eastAsia="Microsoft YaHei" w:cs="Calibri"/>
-        </w:rPr>
-        <w:t xml:space="preserve">项目名称：&lt;XXX&gt;</w:t>
-      </w:r>
-    </w:p>
-    <w:p>
-      <w:pPr>
-        <w:ind w:left="0" w:firstLine="420"/>
-      </w:pPr>
-      <w:r>
-        <w:rPr>
-          <w:rFonts w:ascii="Calibri" w:hAnsi="Calibri" w:eastAsia="Microsoft YaHei" w:cs="Calibri"/>
-        </w:rPr>
-        <w:t xml:space="preserve">甲方单位：&lt;XXX&gt;</w:t>
-      </w:r>
-    </w:p>
-    <w:p>
       <w:r>
         <w:br w:type="page"/>
       </w:r>
@@ -475,7 +431,7 @@
       <w:tblPr>
         <w:tblStyle w:val="TableGrid"/>
         <w:tblW w:w="5000" w:type="pct"/>
-        <w:tblLayout w:type="autofit"/>
+        <w:tblLayout w:type="fixed"/>
         <w:tblCellMar>
           <w:top w:w="60" w:type="dxa"/>
           <w:left w:w="90" w:type="dxa"/>
@@ -483,6 +439,11 @@
           <w:right w:w="90" w:type="dxa"/>
         </w:tblCellMar>
       </w:tblPr>
+      <w:tblGrid>
+        <w:gridCol w:w="1367"/>
+        <w:gridCol w:w="3877"/>
+        <w:gridCol w:w="4355"/>
+      </w:tblGrid>
       <w:tr>
         <w:trPr>
           <w:cantSplit/>
@@ -490,6 +451,7 @@
         </w:trPr>
         <w:tc>
           <w:tcPr>
+            <w:tcW w:w="1367" w:type="dxa"/>
             <w:shd w:val="clear" w:color="auto" w:fill="D9E2F3"/>
           </w:tcPr>
           <w:p>
@@ -512,6 +474,7 @@
         </w:tc>
         <w:tc>
           <w:tcPr>
+            <w:tcW w:w="3877" w:type="dxa"/>
             <w:shd w:val="clear" w:color="auto" w:fill="D9E2F3"/>
           </w:tcPr>
           <w:p>
@@ -534,6 +497,7 @@
         </w:tc>
         <w:tc>
           <w:tcPr>
+            <w:tcW w:w="4355" w:type="dxa"/>
             <w:shd w:val="clear" w:color="auto" w:fill="D9E2F3"/>
           </w:tcPr>
           <w:p>
@@ -560,7 +524,9 @@
           <w:cantSplit/>
         </w:trPr>
         <w:tc>
-          <w:tcPr/>
+          <w:tcPr>
+            <w:tcW w:w="1367" w:type="dxa"/>
+          </w:tcPr>
           <w:p>
             <w:pPr>
               <w:pStyle w:val="TableText"/>
@@ -579,7 +545,9 @@
           </w:p>
         </w:tc>
         <w:tc>
-          <w:tcPr/>
+          <w:tcPr>
+            <w:tcW w:w="3877" w:type="dxa"/>
+          </w:tcPr>
           <w:p>
             <w:pPr>
               <w:pStyle w:val="TableText"/>
@@ -598,7 +566,9 @@
           </w:p>
         </w:tc>
         <w:tc>
-          <w:tcPr/>
+          <w:tcPr>
+            <w:tcW w:w="4355" w:type="dxa"/>
+          </w:tcPr>
           <w:p>
             <w:pPr>
               <w:pStyle w:val="TableText"/>
@@ -622,7 +592,9 @@
           <w:cantSplit/>
         </w:trPr>
         <w:tc>
-          <w:tcPr/>
+          <w:tcPr>
+            <w:tcW w:w="1367" w:type="dxa"/>
+          </w:tcPr>
           <w:p>
             <w:pPr>
               <w:pStyle w:val="TableText"/>
@@ -641,7 +613,9 @@
           </w:p>
         </w:tc>
         <w:tc>
-          <w:tcPr/>
+          <w:tcPr>
+            <w:tcW w:w="3877" w:type="dxa"/>
+          </w:tcPr>
           <w:p>
             <w:pPr>
               <w:pStyle w:val="TableText"/>
@@ -660,7 +634,9 @@
           </w:p>
         </w:tc>
         <w:tc>
-          <w:tcPr/>
+          <w:tcPr>
+            <w:tcW w:w="4355" w:type="dxa"/>
+          </w:tcPr>
           <w:p>
             <w:pPr>
               <w:pStyle w:val="TableText"/>
@@ -684,7 +660,9 @@
           <w:cantSplit/>
         </w:trPr>
         <w:tc>
-          <w:tcPr/>
+          <w:tcPr>
+            <w:tcW w:w="1367" w:type="dxa"/>
+          </w:tcPr>
           <w:p>
             <w:pPr>
               <w:pStyle w:val="TableText"/>
@@ -703,7 +681,9 @@
           </w:p>
         </w:tc>
         <w:tc>
-          <w:tcPr/>
+          <w:tcPr>
+            <w:tcW w:w="3877" w:type="dxa"/>
+          </w:tcPr>
           <w:p>
             <w:pPr>
               <w:pStyle w:val="TableText"/>
@@ -722,7 +702,9 @@
           </w:p>
         </w:tc>
         <w:tc>
-          <w:tcPr/>
+          <w:tcPr>
+            <w:tcW w:w="4355" w:type="dxa"/>
+          </w:tcPr>
           <w:p>
             <w:pPr>
               <w:pStyle w:val="TableText"/>
@@ -746,7 +728,9 @@
           <w:cantSplit/>
         </w:trPr>
         <w:tc>
-          <w:tcPr/>
+          <w:tcPr>
+            <w:tcW w:w="1367" w:type="dxa"/>
+          </w:tcPr>
           <w:p>
             <w:pPr>
               <w:pStyle w:val="TableText"/>
@@ -765,7 +749,9 @@
           </w:p>
         </w:tc>
         <w:tc>
-          <w:tcPr/>
+          <w:tcPr>
+            <w:tcW w:w="3877" w:type="dxa"/>
+          </w:tcPr>
           <w:p>
             <w:pPr>
               <w:pStyle w:val="TableText"/>
@@ -784,7 +770,9 @@
           </w:p>
         </w:tc>
         <w:tc>
-          <w:tcPr/>
+          <w:tcPr>
+            <w:tcW w:w="4355" w:type="dxa"/>
+          </w:tcPr>
           <w:p>
             <w:pPr>
               <w:pStyle w:val="TableText"/>
@@ -902,7 +890,7 @@
       <w:r>
         <w:drawing>
           <wp:inline distT="0" distB="0" distL="0" distR="0">
-            <wp:extent cx="5580000" cy="2359097"/>
+            <wp:extent cx="4680000" cy="2007361"/>
             <wp:effectExtent l="0" t="0" r="0" b="0"/>
             <wp:docPr id="1" name="图 2-1 UBCC 跨节点缓存一致性总体架构" descr="图 2-1 UBCC 跨节点缓存一致性总体架构"/>
             <wp:cNvGraphicFramePr>
@@ -924,7 +912,7 @@
                   <pic:spPr>
                     <a:xfrm>
                       <a:off x="0" y="0"/>
-                      <a:ext cx="5580000" cy="2359097"/>
+                      <a:ext cx="4680000" cy="2007361"/>
                     </a:xfrm>
                     <a:prstGeom prst="rect">
                       <a:avLst/>
@@ -1043,7 +1031,7 @@
       <w:tblPr>
         <w:tblStyle w:val="TableGrid"/>
         <w:tblW w:w="5000" w:type="pct"/>
-        <w:tblLayout w:type="autofit"/>
+        <w:tblLayout w:type="fixed"/>
         <w:tblCellMar>
           <w:top w:w="60" w:type="dxa"/>
           <w:left w:w="90" w:type="dxa"/>
@@ -1051,6 +1039,11 @@
           <w:right w:w="90" w:type="dxa"/>
         </w:tblCellMar>
       </w:tblPr>
+      <w:tblGrid>
+        <w:gridCol w:w="2875"/>
+        <w:gridCol w:w="1623"/>
+        <w:gridCol w:w="5100"/>
+      </w:tblGrid>
       <w:tr>
         <w:trPr>
           <w:cantSplit/>
@@ -1058,6 +1051,7 @@
         </w:trPr>
         <w:tc>
           <w:tcPr>
+            <w:tcW w:w="2875" w:type="dxa"/>
             <w:shd w:val="clear" w:color="auto" w:fill="D9E2F3"/>
           </w:tcPr>
           <w:p>
@@ -1080,6 +1074,7 @@
         </w:tc>
         <w:tc>
           <w:tcPr>
+            <w:tcW w:w="1623" w:type="dxa"/>
             <w:shd w:val="clear" w:color="auto" w:fill="D9E2F3"/>
           </w:tcPr>
           <w:p>
@@ -1102,6 +1097,7 @@
         </w:tc>
         <w:tc>
           <w:tcPr>
+            <w:tcW w:w="5100" w:type="dxa"/>
             <w:shd w:val="clear" w:color="auto" w:fill="D9E2F3"/>
           </w:tcPr>
           <w:p>
@@ -1128,7 +1124,9 @@
           <w:cantSplit/>
         </w:trPr>
         <w:tc>
-          <w:tcPr/>
+          <w:tcPr>
+            <w:tcW w:w="2875" w:type="dxa"/>
+          </w:tcPr>
           <w:p>
             <w:pPr>
               <w:pStyle w:val="TableText"/>
@@ -1147,7 +1145,9 @@
           </w:p>
         </w:tc>
         <w:tc>
-          <w:tcPr/>
+          <w:tcPr>
+            <w:tcW w:w="1623" w:type="dxa"/>
+          </w:tcPr>
           <w:p>
             <w:pPr>
               <w:pStyle w:val="TableText"/>
@@ -1166,7 +1166,9 @@
           </w:p>
         </w:tc>
         <w:tc>
-          <w:tcPr/>
+          <w:tcPr>
+            <w:tcW w:w="5100" w:type="dxa"/>
+          </w:tcPr>
           <w:p>
             <w:pPr>
               <w:pStyle w:val="TableText"/>
@@ -1190,7 +1192,9 @@
           <w:cantSplit/>
         </w:trPr>
         <w:tc>
-          <w:tcPr/>
+          <w:tcPr>
+            <w:tcW w:w="2875" w:type="dxa"/>
+          </w:tcPr>
           <w:p>
             <w:pPr>
               <w:pStyle w:val="TableText"/>
@@ -1209,7 +1213,9 @@
           </w:p>
         </w:tc>
         <w:tc>
-          <w:tcPr/>
+          <w:tcPr>
+            <w:tcW w:w="1623" w:type="dxa"/>
+          </w:tcPr>
           <w:p>
             <w:pPr>
               <w:pStyle w:val="TableText"/>
@@ -1228,7 +1234,9 @@
           </w:p>
         </w:tc>
         <w:tc>
-          <w:tcPr/>
+          <w:tcPr>
+            <w:tcW w:w="5100" w:type="dxa"/>
+          </w:tcPr>
           <w:p>
             <w:pPr>
               <w:pStyle w:val="TableText"/>
@@ -1252,7 +1260,9 @@
           <w:cantSplit/>
         </w:trPr>
         <w:tc>
-          <w:tcPr/>
+          <w:tcPr>
+            <w:tcW w:w="2875" w:type="dxa"/>
+          </w:tcPr>
           <w:p>
             <w:pPr>
               <w:pStyle w:val="TableText"/>
@@ -1271,7 +1281,9 @@
           </w:p>
         </w:tc>
         <w:tc>
-          <w:tcPr/>
+          <w:tcPr>
+            <w:tcW w:w="1623" w:type="dxa"/>
+          </w:tcPr>
           <w:p>
             <w:pPr>
               <w:pStyle w:val="TableText"/>
@@ -1290,7 +1302,9 @@
           </w:p>
         </w:tc>
         <w:tc>
-          <w:tcPr/>
+          <w:tcPr>
+            <w:tcW w:w="5100" w:type="dxa"/>
+          </w:tcPr>
           <w:p>
             <w:pPr>
               <w:pStyle w:val="TableText"/>
@@ -1314,7 +1328,9 @@
           <w:cantSplit/>
         </w:trPr>
         <w:tc>
-          <w:tcPr/>
+          <w:tcPr>
+            <w:tcW w:w="2875" w:type="dxa"/>
+          </w:tcPr>
           <w:p>
             <w:pPr>
               <w:pStyle w:val="TableText"/>
@@ -1333,7 +1349,9 @@
           </w:p>
         </w:tc>
         <w:tc>
-          <w:tcPr/>
+          <w:tcPr>
+            <w:tcW w:w="1623" w:type="dxa"/>
+          </w:tcPr>
           <w:p>
             <w:pPr>
               <w:pStyle w:val="TableText"/>
@@ -1352,7 +1370,9 @@
           </w:p>
         </w:tc>
         <w:tc>
-          <w:tcPr/>
+          <w:tcPr>
+            <w:tcW w:w="5100" w:type="dxa"/>
+          </w:tcPr>
           <w:p>
             <w:pPr>
               <w:pStyle w:val="TableText"/>
@@ -1376,7 +1396,9 @@
           <w:cantSplit/>
         </w:trPr>
         <w:tc>
-          <w:tcPr/>
+          <w:tcPr>
+            <w:tcW w:w="2875" w:type="dxa"/>
+          </w:tcPr>
           <w:p>
             <w:pPr>
               <w:pStyle w:val="TableText"/>
@@ -1395,7 +1417,9 @@
           </w:p>
         </w:tc>
         <w:tc>
-          <w:tcPr/>
+          <w:tcPr>
+            <w:tcW w:w="1623" w:type="dxa"/>
+          </w:tcPr>
           <w:p>
             <w:pPr>
               <w:pStyle w:val="TableText"/>
@@ -1414,7 +1438,9 @@
           </w:p>
         </w:tc>
         <w:tc>
-          <w:tcPr/>
+          <w:tcPr>
+            <w:tcW w:w="5100" w:type="dxa"/>
+          </w:tcPr>
           <w:p>
             <w:pPr>
               <w:pStyle w:val="TableText"/>
@@ -1438,7 +1464,9 @@
           <w:cantSplit/>
         </w:trPr>
         <w:tc>
-          <w:tcPr/>
+          <w:tcPr>
+            <w:tcW w:w="2875" w:type="dxa"/>
+          </w:tcPr>
           <w:p>
             <w:pPr>
               <w:pStyle w:val="TableText"/>
@@ -1457,7 +1485,9 @@
           </w:p>
         </w:tc>
         <w:tc>
-          <w:tcPr/>
+          <w:tcPr>
+            <w:tcW w:w="1623" w:type="dxa"/>
+          </w:tcPr>
           <w:p>
             <w:pPr>
               <w:pStyle w:val="TableText"/>
@@ -1476,7 +1506,9 @@
           </w:p>
         </w:tc>
         <w:tc>
-          <w:tcPr/>
+          <w:tcPr>
+            <w:tcW w:w="5100" w:type="dxa"/>
+          </w:tcPr>
           <w:p>
             <w:pPr>
               <w:pStyle w:val="TableText"/>
@@ -1500,7 +1532,9 @@
           <w:cantSplit/>
         </w:trPr>
         <w:tc>
-          <w:tcPr/>
+          <w:tcPr>
+            <w:tcW w:w="2875" w:type="dxa"/>
+          </w:tcPr>
           <w:p>
             <w:pPr>
               <w:pStyle w:val="TableText"/>
@@ -1519,7 +1553,9 @@
           </w:p>
         </w:tc>
         <w:tc>
-          <w:tcPr/>
+          <w:tcPr>
+            <w:tcW w:w="1623" w:type="dxa"/>
+          </w:tcPr>
           <w:p>
             <w:pPr>
               <w:pStyle w:val="TableText"/>
@@ -1538,7 +1574,9 @@
           </w:p>
         </w:tc>
         <w:tc>
-          <w:tcPr/>
+          <w:tcPr>
+            <w:tcW w:w="5100" w:type="dxa"/>
+          </w:tcPr>
           <w:p>
             <w:pPr>
               <w:pStyle w:val="TableText"/>
@@ -2382,7 +2420,7 @@
       <w:r>
         <w:drawing>
           <wp:inline distT="0" distB="0" distL="0" distR="0">
-            <wp:extent cx="5580000" cy="1908352"/>
+            <wp:extent cx="4680000" cy="1610033"/>
             <wp:effectExtent l="0" t="0" r="0" b="0"/>
             <wp:docPr id="3" name="图 5-1 UBCC 三类核心协议路径" descr="图 5-1 UBCC 三类核心协议路径"/>
             <wp:cNvGraphicFramePr>
@@ -2404,7 +2442,7 @@
                   <pic:spPr>
                     <a:xfrm>
                       <a:off x="0" y="0"/>
-                      <a:ext cx="5580000" cy="1908352"/>
+                      <a:ext cx="4680000" cy="1610033"/>
                     </a:xfrm>
                     <a:prstGeom prst="rect">
                       <a:avLst/>
@@ -3198,7 +3236,7 @@
       <w:tblPr>
         <w:tblStyle w:val="TableGrid"/>
         <w:tblW w:w="5000" w:type="pct"/>
-        <w:tblLayout w:type="autofit"/>
+        <w:tblLayout w:type="fixed"/>
         <w:tblCellMar>
           <w:top w:w="60" w:type="dxa"/>
           <w:left w:w="90" w:type="dxa"/>
@@ -3206,6 +3244,11 @@
           <w:right w:w="90" w:type="dxa"/>
         </w:tblCellMar>
       </w:tblPr>
+      <w:tblGrid>
+        <w:gridCol w:w="1867"/>
+        <w:gridCol w:w="4648"/>
+        <w:gridCol w:w="3084"/>
+      </w:tblGrid>
       <w:tr>
         <w:trPr>
           <w:cantSplit/>
@@ -3213,6 +3256,7 @@
         </w:trPr>
         <w:tc>
           <w:tcPr>
+            <w:tcW w:w="1867" w:type="dxa"/>
             <w:shd w:val="clear" w:color="auto" w:fill="D9E2F3"/>
           </w:tcPr>
           <w:p>
@@ -3235,6 +3279,7 @@
         </w:tc>
         <w:tc>
           <w:tcPr>
+            <w:tcW w:w="4648" w:type="dxa"/>
             <w:shd w:val="clear" w:color="auto" w:fill="D9E2F3"/>
           </w:tcPr>
           <w:p>
@@ -3257,6 +3302,7 @@
         </w:tc>
         <w:tc>
           <w:tcPr>
+            <w:tcW w:w="3084" w:type="dxa"/>
             <w:shd w:val="clear" w:color="auto" w:fill="D9E2F3"/>
           </w:tcPr>
           <w:p>
@@ -3283,7 +3329,9 @@
           <w:cantSplit/>
         </w:trPr>
         <w:tc>
-          <w:tcPr/>
+          <w:tcPr>
+            <w:tcW w:w="1867" w:type="dxa"/>
+          </w:tcPr>
           <w:p>
             <w:pPr>
               <w:pStyle w:val="TableText"/>
@@ -3302,7 +3350,9 @@
           </w:p>
         </w:tc>
         <w:tc>
-          <w:tcPr/>
+          <w:tcPr>
+            <w:tcW w:w="4648" w:type="dxa"/>
+          </w:tcPr>
           <w:p>
             <w:pPr>
               <w:pStyle w:val="TableText"/>
@@ -3321,7 +3371,9 @@
           </w:p>
         </w:tc>
         <w:tc>
-          <w:tcPr/>
+          <w:tcPr>
+            <w:tcW w:w="3084" w:type="dxa"/>
+          </w:tcPr>
           <w:p>
             <w:pPr>
               <w:pStyle w:val="TableText"/>
@@ -3345,7 +3397,9 @@
           <w:cantSplit/>
         </w:trPr>
         <w:tc>
-          <w:tcPr/>
+          <w:tcPr>
+            <w:tcW w:w="1867" w:type="dxa"/>
+          </w:tcPr>
           <w:p>
             <w:pPr>
               <w:pStyle w:val="TableText"/>
@@ -3364,7 +3418,9 @@
           </w:p>
         </w:tc>
         <w:tc>
-          <w:tcPr/>
+          <w:tcPr>
+            <w:tcW w:w="4648" w:type="dxa"/>
+          </w:tcPr>
           <w:p>
             <w:pPr>
               <w:pStyle w:val="TableText"/>
@@ -3383,7 +3439,9 @@
           </w:p>
         </w:tc>
         <w:tc>
-          <w:tcPr/>
+          <w:tcPr>
+            <w:tcW w:w="3084" w:type="dxa"/>
+          </w:tcPr>
           <w:p>
             <w:pPr>
               <w:pStyle w:val="TableText"/>
@@ -3407,7 +3465,9 @@
           <w:cantSplit/>
         </w:trPr>
         <w:tc>
-          <w:tcPr/>
+          <w:tcPr>
+            <w:tcW w:w="1867" w:type="dxa"/>
+          </w:tcPr>
           <w:p>
             <w:pPr>
               <w:pStyle w:val="TableText"/>
@@ -3426,7 +3486,9 @@
           </w:p>
         </w:tc>
         <w:tc>
-          <w:tcPr/>
+          <w:tcPr>
+            <w:tcW w:w="4648" w:type="dxa"/>
+          </w:tcPr>
           <w:p>
             <w:pPr>
               <w:pStyle w:val="TableText"/>
@@ -3445,7 +3507,9 @@
           </w:p>
         </w:tc>
         <w:tc>
-          <w:tcPr/>
+          <w:tcPr>
+            <w:tcW w:w="3084" w:type="dxa"/>
+          </w:tcPr>
           <w:p>
             <w:pPr>
               <w:pStyle w:val="TableText"/>
@@ -3469,7 +3533,9 @@
           <w:cantSplit/>
         </w:trPr>
         <w:tc>
-          <w:tcPr/>
+          <w:tcPr>
+            <w:tcW w:w="1867" w:type="dxa"/>
+          </w:tcPr>
           <w:p>
             <w:pPr>
               <w:pStyle w:val="TableText"/>
@@ -3488,7 +3554,9 @@
           </w:p>
         </w:tc>
         <w:tc>
-          <w:tcPr/>
+          <w:tcPr>
+            <w:tcW w:w="4648" w:type="dxa"/>
+          </w:tcPr>
           <w:p>
             <w:pPr>
               <w:pStyle w:val="TableText"/>
@@ -3507,7 +3575,9 @@
           </w:p>
         </w:tc>
         <w:tc>
-          <w:tcPr/>
+          <w:tcPr>
+            <w:tcW w:w="3084" w:type="dxa"/>
+          </w:tcPr>
           <w:p>
             <w:pPr>
               <w:pStyle w:val="TableText"/>
@@ -3531,7 +3601,9 @@
           <w:cantSplit/>
         </w:trPr>
         <w:tc>
-          <w:tcPr/>
+          <w:tcPr>
+            <w:tcW w:w="1867" w:type="dxa"/>
+          </w:tcPr>
           <w:p>
             <w:pPr>
               <w:pStyle w:val="TableText"/>
@@ -3550,7 +3622,9 @@
           </w:p>
         </w:tc>
         <w:tc>
-          <w:tcPr/>
+          <w:tcPr>
+            <w:tcW w:w="4648" w:type="dxa"/>
+          </w:tcPr>
           <w:p>
             <w:pPr>
               <w:pStyle w:val="TableText"/>
@@ -3569,7 +3643,9 @@
           </w:p>
         </w:tc>
         <w:tc>
-          <w:tcPr/>
+          <w:tcPr>
+            <w:tcW w:w="3084" w:type="dxa"/>
+          </w:tcPr>
           <w:p>
             <w:pPr>
               <w:pStyle w:val="TableText"/>
@@ -3616,7 +3692,7 @@
       <w:tblPr>
         <w:tblStyle w:val="TableGrid"/>
         <w:tblW w:w="5000" w:type="pct"/>
-        <w:tblLayout w:type="autofit"/>
+        <w:tblLayout w:type="fixed"/>
         <w:tblCellMar>
           <w:top w:w="60" w:type="dxa"/>
           <w:left w:w="90" w:type="dxa"/>
@@ -3624,6 +3700,11 @@
           <w:right w:w="90" w:type="dxa"/>
         </w:tblCellMar>
       </w:tblPr>
+      <w:tblGrid>
+        <w:gridCol w:w="2795"/>
+        <w:gridCol w:w="3168"/>
+        <w:gridCol w:w="3635"/>
+      </w:tblGrid>
       <w:tr>
         <w:trPr>
           <w:cantSplit/>
@@ -3631,6 +3712,7 @@
         </w:trPr>
         <w:tc>
           <w:tcPr>
+            <w:tcW w:w="2795" w:type="dxa"/>
             <w:shd w:val="clear" w:color="auto" w:fill="D9E2F3"/>
           </w:tcPr>
           <w:p>
@@ -3653,6 +3735,7 @@
         </w:tc>
         <w:tc>
           <w:tcPr>
+            <w:tcW w:w="3168" w:type="dxa"/>
             <w:shd w:val="clear" w:color="auto" w:fill="D9E2F3"/>
           </w:tcPr>
           <w:p>
@@ -3675,6 +3758,7 @@
         </w:tc>
         <w:tc>
           <w:tcPr>
+            <w:tcW w:w="3635" w:type="dxa"/>
             <w:shd w:val="clear" w:color="auto" w:fill="D9E2F3"/>
           </w:tcPr>
           <w:p>
@@ -3701,7 +3785,9 @@
           <w:cantSplit/>
         </w:trPr>
         <w:tc>
-          <w:tcPr/>
+          <w:tcPr>
+            <w:tcW w:w="2795" w:type="dxa"/>
+          </w:tcPr>
           <w:p>
             <w:pPr>
               <w:pStyle w:val="TableText"/>
@@ -3720,7 +3806,9 @@
           </w:p>
         </w:tc>
         <w:tc>
-          <w:tcPr/>
+          <w:tcPr>
+            <w:tcW w:w="3168" w:type="dxa"/>
+          </w:tcPr>
           <w:p>
             <w:pPr>
               <w:pStyle w:val="TableText"/>
@@ -3739,7 +3827,9 @@
           </w:p>
         </w:tc>
         <w:tc>
-          <w:tcPr/>
+          <w:tcPr>
+            <w:tcW w:w="3635" w:type="dxa"/>
+          </w:tcPr>
           <w:p>
             <w:pPr>
               <w:pStyle w:val="TableText"/>
@@ -3763,7 +3853,9 @@
           <w:cantSplit/>
         </w:trPr>
         <w:tc>
-          <w:tcPr/>
+          <w:tcPr>
+            <w:tcW w:w="2795" w:type="dxa"/>
+          </w:tcPr>
           <w:p>
             <w:pPr>
               <w:pStyle w:val="TableText"/>
@@ -3782,7 +3874,9 @@
           </w:p>
         </w:tc>
         <w:tc>
-          <w:tcPr/>
+          <w:tcPr>
+            <w:tcW w:w="3168" w:type="dxa"/>
+          </w:tcPr>
           <w:p>
             <w:pPr>
               <w:pStyle w:val="TableText"/>
@@ -3801,7 +3895,9 @@
           </w:p>
         </w:tc>
         <w:tc>
-          <w:tcPr/>
+          <w:tcPr>
+            <w:tcW w:w="3635" w:type="dxa"/>
+          </w:tcPr>
           <w:p>
             <w:pPr>
               <w:pStyle w:val="TableText"/>
@@ -3825,7 +3921,9 @@
           <w:cantSplit/>
         </w:trPr>
         <w:tc>
-          <w:tcPr/>
+          <w:tcPr>
+            <w:tcW w:w="2795" w:type="dxa"/>
+          </w:tcPr>
           <w:p>
             <w:pPr>
               <w:pStyle w:val="TableText"/>
@@ -3844,7 +3942,9 @@
           </w:p>
         </w:tc>
         <w:tc>
-          <w:tcPr/>
+          <w:tcPr>
+            <w:tcW w:w="3168" w:type="dxa"/>
+          </w:tcPr>
           <w:p>
             <w:pPr>
               <w:pStyle w:val="TableText"/>
@@ -3863,7 +3963,9 @@
           </w:p>
         </w:tc>
         <w:tc>
-          <w:tcPr/>
+          <w:tcPr>
+            <w:tcW w:w="3635" w:type="dxa"/>
+          </w:tcPr>
           <w:p>
             <w:pPr>
               <w:pStyle w:val="TableText"/>
@@ -3932,7 +4034,7 @@
       <w:tblPr>
         <w:tblStyle w:val="TableGrid"/>
         <w:tblW w:w="5000" w:type="pct"/>
-        <w:tblLayout w:type="autofit"/>
+        <w:tblLayout w:type="fixed"/>
         <w:tblCellMar>
           <w:top w:w="60" w:type="dxa"/>
           <w:left w:w="90" w:type="dxa"/>
@@ -3940,6 +4042,12 @@
           <w:right w:w="90" w:type="dxa"/>
         </w:tblCellMar>
       </w:tblPr>
+      <w:tblGrid>
+        <w:gridCol w:w="1087"/>
+        <w:gridCol w:w="2983"/>
+        <w:gridCol w:w="2545"/>
+        <w:gridCol w:w="2983"/>
+      </w:tblGrid>
       <w:tr>
         <w:trPr>
           <w:cantSplit/>
@@ -3947,6 +4055,7 @@
         </w:trPr>
         <w:tc>
           <w:tcPr>
+            <w:tcW w:w="1087" w:type="dxa"/>
             <w:shd w:val="clear" w:color="auto" w:fill="D9E2F3"/>
           </w:tcPr>
           <w:p>
@@ -3969,6 +4078,7 @@
         </w:tc>
         <w:tc>
           <w:tcPr>
+            <w:tcW w:w="2983" w:type="dxa"/>
             <w:shd w:val="clear" w:color="auto" w:fill="D9E2F3"/>
           </w:tcPr>
           <w:p>
@@ -3991,6 +4101,7 @@
         </w:tc>
         <w:tc>
           <w:tcPr>
+            <w:tcW w:w="2545" w:type="dxa"/>
             <w:shd w:val="clear" w:color="auto" w:fill="D9E2F3"/>
           </w:tcPr>
           <w:p>
@@ -4013,6 +4124,7 @@
         </w:tc>
         <w:tc>
           <w:tcPr>
+            <w:tcW w:w="2983" w:type="dxa"/>
             <w:shd w:val="clear" w:color="auto" w:fill="D9E2F3"/>
           </w:tcPr>
           <w:p>
@@ -4039,7 +4151,9 @@
           <w:cantSplit/>
         </w:trPr>
         <w:tc>
-          <w:tcPr/>
+          <w:tcPr>
+            <w:tcW w:w="1087" w:type="dxa"/>
+          </w:tcPr>
           <w:p>
             <w:pPr>
               <w:pStyle w:val="TableText"/>
@@ -4058,7 +4172,9 @@
           </w:p>
         </w:tc>
         <w:tc>
-          <w:tcPr/>
+          <w:tcPr>
+            <w:tcW w:w="2983" w:type="dxa"/>
+          </w:tcPr>
           <w:p>
             <w:pPr>
               <w:pStyle w:val="TableText"/>
@@ -4077,7 +4193,9 @@
           </w:p>
         </w:tc>
         <w:tc>
-          <w:tcPr/>
+          <w:tcPr>
+            <w:tcW w:w="2545" w:type="dxa"/>
+          </w:tcPr>
           <w:p>
             <w:pPr>
               <w:pStyle w:val="TableText"/>
@@ -4096,7 +4214,9 @@
           </w:p>
         </w:tc>
         <w:tc>
-          <w:tcPr/>
+          <w:tcPr>
+            <w:tcW w:w="2983" w:type="dxa"/>
+          </w:tcPr>
           <w:p>
             <w:pPr>
               <w:pStyle w:val="TableText"/>
@@ -4120,7 +4240,9 @@
           <w:cantSplit/>
         </w:trPr>
         <w:tc>
-          <w:tcPr/>
+          <w:tcPr>
+            <w:tcW w:w="1087" w:type="dxa"/>
+          </w:tcPr>
           <w:p>
             <w:pPr>
               <w:pStyle w:val="TableText"/>
@@ -4139,7 +4261,9 @@
           </w:p>
         </w:tc>
         <w:tc>
-          <w:tcPr/>
+          <w:tcPr>
+            <w:tcW w:w="2983" w:type="dxa"/>
+          </w:tcPr>
           <w:p>
             <w:pPr>
               <w:pStyle w:val="TableText"/>
@@ -4158,7 +4282,9 @@
           </w:p>
         </w:tc>
         <w:tc>
-          <w:tcPr/>
+          <w:tcPr>
+            <w:tcW w:w="2545" w:type="dxa"/>
+          </w:tcPr>
           <w:p>
             <w:pPr>
               <w:pStyle w:val="TableText"/>
@@ -4177,7 +4303,9 @@
           </w:p>
         </w:tc>
         <w:tc>
-          <w:tcPr/>
+          <w:tcPr>
+            <w:tcW w:w="2983" w:type="dxa"/>
+          </w:tcPr>
           <w:p>
             <w:pPr>
               <w:pStyle w:val="TableText"/>
@@ -4201,7 +4329,9 @@
           <w:cantSplit/>
         </w:trPr>
         <w:tc>
-          <w:tcPr/>
+          <w:tcPr>
+            <w:tcW w:w="1087" w:type="dxa"/>
+          </w:tcPr>
           <w:p>
             <w:pPr>
               <w:pStyle w:val="TableText"/>
@@ -4220,7 +4350,9 @@
           </w:p>
         </w:tc>
         <w:tc>
-          <w:tcPr/>
+          <w:tcPr>
+            <w:tcW w:w="2983" w:type="dxa"/>
+          </w:tcPr>
           <w:p>
             <w:pPr>
               <w:pStyle w:val="TableText"/>
@@ -4239,7 +4371,9 @@
           </w:p>
         </w:tc>
         <w:tc>
-          <w:tcPr/>
+          <w:tcPr>
+            <w:tcW w:w="2545" w:type="dxa"/>
+          </w:tcPr>
           <w:p>
             <w:pPr>
               <w:pStyle w:val="TableText"/>
@@ -4258,7 +4392,9 @@
           </w:p>
         </w:tc>
         <w:tc>
-          <w:tcPr/>
+          <w:tcPr>
+            <w:tcW w:w="2983" w:type="dxa"/>
+          </w:tcPr>
           <w:p>
             <w:pPr>
               <w:pStyle w:val="TableText"/>
@@ -4282,7 +4418,9 @@
           <w:cantSplit/>
         </w:trPr>
         <w:tc>
-          <w:tcPr/>
+          <w:tcPr>
+            <w:tcW w:w="1087" w:type="dxa"/>
+          </w:tcPr>
           <w:p>
             <w:pPr>
               <w:pStyle w:val="TableText"/>
@@ -4301,7 +4439,9 @@
           </w:p>
         </w:tc>
         <w:tc>
-          <w:tcPr/>
+          <w:tcPr>
+            <w:tcW w:w="2983" w:type="dxa"/>
+          </w:tcPr>
           <w:p>
             <w:pPr>
               <w:pStyle w:val="TableText"/>
@@ -4320,7 +4460,9 @@
           </w:p>
         </w:tc>
         <w:tc>
-          <w:tcPr/>
+          <w:tcPr>
+            <w:tcW w:w="2545" w:type="dxa"/>
+          </w:tcPr>
           <w:p>
             <w:pPr>
               <w:pStyle w:val="TableText"/>
@@ -4339,7 +4481,9 @@
           </w:p>
         </w:tc>
         <w:tc>
-          <w:tcPr/>
+          <w:tcPr>
+            <w:tcW w:w="2983" w:type="dxa"/>
+          </w:tcPr>
           <w:p>
             <w:pPr>
               <w:pStyle w:val="TableText"/>
@@ -4409,7 +4553,7 @@
       <w:tblPr>
         <w:tblStyle w:val="TableGrid"/>
         <w:tblW w:w="5000" w:type="pct"/>
-        <w:tblLayout w:type="autofit"/>
+        <w:tblLayout w:type="fixed"/>
         <w:tblCellMar>
           <w:top w:w="60" w:type="dxa"/>
           <w:left w:w="90" w:type="dxa"/>
@@ -4417,6 +4561,11 @@
           <w:right w:w="90" w:type="dxa"/>
         </w:tblCellMar>
       </w:tblPr>
+      <w:tblGrid>
+        <w:gridCol w:w="1709"/>
+        <w:gridCol w:w="4416"/>
+        <w:gridCol w:w="3474"/>
+      </w:tblGrid>
       <w:tr>
         <w:trPr>
           <w:cantSplit/>
@@ -4424,6 +4573,7 @@
         </w:trPr>
         <w:tc>
           <w:tcPr>
+            <w:tcW w:w="1709" w:type="dxa"/>
             <w:shd w:val="clear" w:color="auto" w:fill="D9E2F3"/>
           </w:tcPr>
           <w:p>
@@ -4446,6 +4596,7 @@
         </w:tc>
         <w:tc>
           <w:tcPr>
+            <w:tcW w:w="4416" w:type="dxa"/>
             <w:shd w:val="clear" w:color="auto" w:fill="D9E2F3"/>
           </w:tcPr>
           <w:p>
@@ -4468,6 +4619,7 @@
         </w:tc>
         <w:tc>
           <w:tcPr>
+            <w:tcW w:w="3474" w:type="dxa"/>
             <w:shd w:val="clear" w:color="auto" w:fill="D9E2F3"/>
           </w:tcPr>
           <w:p>
@@ -4494,7 +4646,9 @@
           <w:cantSplit/>
         </w:trPr>
         <w:tc>
-          <w:tcPr/>
+          <w:tcPr>
+            <w:tcW w:w="1709" w:type="dxa"/>
+          </w:tcPr>
           <w:p>
             <w:pPr>
               <w:pStyle w:val="TableText"/>
@@ -4513,7 +4667,9 @@
           </w:p>
         </w:tc>
         <w:tc>
-          <w:tcPr/>
+          <w:tcPr>
+            <w:tcW w:w="4416" w:type="dxa"/>
+          </w:tcPr>
           <w:p>
             <w:pPr>
               <w:pStyle w:val="TableText"/>
@@ -4532,7 +4688,9 @@
           </w:p>
         </w:tc>
         <w:tc>
-          <w:tcPr/>
+          <w:tcPr>
+            <w:tcW w:w="3474" w:type="dxa"/>
+          </w:tcPr>
           <w:p>
             <w:pPr>
               <w:pStyle w:val="TableText"/>
@@ -4556,7 +4714,9 @@
           <w:cantSplit/>
         </w:trPr>
         <w:tc>
-          <w:tcPr/>
+          <w:tcPr>
+            <w:tcW w:w="1709" w:type="dxa"/>
+          </w:tcPr>
           <w:p>
             <w:pPr>
               <w:pStyle w:val="TableText"/>
@@ -4575,7 +4735,9 @@
           </w:p>
         </w:tc>
         <w:tc>
-          <w:tcPr/>
+          <w:tcPr>
+            <w:tcW w:w="4416" w:type="dxa"/>
+          </w:tcPr>
           <w:p>
             <w:pPr>
               <w:pStyle w:val="TableText"/>
@@ -4594,7 +4756,9 @@
           </w:p>
         </w:tc>
         <w:tc>
-          <w:tcPr/>
+          <w:tcPr>
+            <w:tcW w:w="3474" w:type="dxa"/>
+          </w:tcPr>
           <w:p>
             <w:pPr>
               <w:pStyle w:val="TableText"/>
@@ -4618,7 +4782,9 @@
           <w:cantSplit/>
         </w:trPr>
         <w:tc>
-          <w:tcPr/>
+          <w:tcPr>
+            <w:tcW w:w="1709" w:type="dxa"/>
+          </w:tcPr>
           <w:p>
             <w:pPr>
               <w:pStyle w:val="TableText"/>
@@ -4637,7 +4803,9 @@
           </w:p>
         </w:tc>
         <w:tc>
-          <w:tcPr/>
+          <w:tcPr>
+            <w:tcW w:w="4416" w:type="dxa"/>
+          </w:tcPr>
           <w:p>
             <w:pPr>
               <w:pStyle w:val="TableText"/>
@@ -4656,7 +4824,9 @@
           </w:p>
         </w:tc>
         <w:tc>
-          <w:tcPr/>
+          <w:tcPr>
+            <w:tcW w:w="3474" w:type="dxa"/>
+          </w:tcPr>
           <w:p>
             <w:pPr>
               <w:pStyle w:val="TableText"/>
@@ -4680,7 +4850,9 @@
           <w:cantSplit/>
         </w:trPr>
         <w:tc>
-          <w:tcPr/>
+          <w:tcPr>
+            <w:tcW w:w="1709" w:type="dxa"/>
+          </w:tcPr>
           <w:p>
             <w:pPr>
               <w:pStyle w:val="TableText"/>
@@ -4699,7 +4871,9 @@
           </w:p>
         </w:tc>
         <w:tc>
-          <w:tcPr/>
+          <w:tcPr>
+            <w:tcW w:w="4416" w:type="dxa"/>
+          </w:tcPr>
           <w:p>
             <w:pPr>
               <w:pStyle w:val="TableText"/>
@@ -4718,7 +4892,9 @@
           </w:p>
         </w:tc>
         <w:tc>
-          <w:tcPr/>
+          <w:tcPr>
+            <w:tcW w:w="3474" w:type="dxa"/>
+          </w:tcPr>
           <w:p>
             <w:pPr>
               <w:pStyle w:val="TableText"/>
@@ -4758,14 +4934,14 @@
         <w:rPr>
           <w:rFonts w:ascii="Calibri" w:hAnsi="Calibri" w:eastAsia="Microsoft YaHei" w:cs="Calibri"/>
         </w:rPr>
-        <w:t xml:space="preserve">以下内容仅为未验证模板，不构成已交付功能声明；实际信息由集成方确⁠认⁠后⁠填⁠写⁠。</w:t>
+        <w:t xml:space="preserve">以下内容仅为未验证模板，不构成已交付功能声明；实际信息在集成⁠阶⁠段⁠填⁠写⁠。</w:t>
       </w:r>
     </w:p>
     <w:tbl>
       <w:tblPr>
         <w:tblStyle w:val="TableGrid"/>
         <w:tblW w:w="5000" w:type="pct"/>
-        <w:tblLayout w:type="autofit"/>
+        <w:tblLayout w:type="fixed"/>
         <w:tblCellMar>
           <w:top w:w="60" w:type="dxa"/>
           <w:left w:w="90" w:type="dxa"/>
@@ -4773,6 +4949,10 @@
           <w:right w:w="90" w:type="dxa"/>
         </w:tblCellMar>
       </w:tblPr>
+      <w:tblGrid>
+        <w:gridCol w:w="5630"/>
+        <w:gridCol w:w="3970"/>
+      </w:tblGrid>
       <w:tr>
         <w:trPr>
           <w:cantSplit/>
@@ -4780,6 +4960,7 @@
         </w:trPr>
         <w:tc>
           <w:tcPr>
+            <w:tcW w:w="5630" w:type="dxa"/>
             <w:shd w:val="clear" w:color="auto" w:fill="D9E2F3"/>
           </w:tcPr>
           <w:p>
@@ -4802,6 +4983,7 @@
         </w:tc>
         <w:tc>
           <w:tcPr>
+            <w:tcW w:w="3970" w:type="dxa"/>
             <w:shd w:val="clear" w:color="auto" w:fill="D9E2F3"/>
           </w:tcPr>
           <w:p>
@@ -4828,7 +5010,9 @@
           <w:cantSplit/>
         </w:trPr>
         <w:tc>
-          <w:tcPr/>
+          <w:tcPr>
+            <w:tcW w:w="5630" w:type="dxa"/>
+          </w:tcPr>
           <w:p>
             <w:pPr>
               <w:pStyle w:val="TableText"/>
@@ -4847,21 +5031,23 @@
           </w:p>
         </w:tc>
         <w:tc>
-          <w:tcPr/>
-          <w:p>
-            <w:pPr>
-              <w:pStyle w:val="TableText"/>
-              <w:jc w:val="left"/>
-              <w:wordWrap w:val="0"/>
-              <w:spacing w:before="0" w:after="0" w:line="320" w:lineRule="exact"/>
-            </w:pPr>
-            <w:r>
-              <w:rPr>
-                <w:rFonts w:ascii="Calibri" w:hAnsi="Calibri" w:eastAsia="Microsoft YaHei" w:cs="Calibri"/>
-                <w:sz w:val="18"/>
-                <w:szCs w:val="18"/>
-              </w:rPr>
-              <w:t xml:space="preserve">〔待确认〕</w:t>
+          <w:tcPr>
+            <w:tcW w:w="3970" w:type="dxa"/>
+          </w:tcPr>
+          <w:p>
+            <w:pPr>
+              <w:pStyle w:val="TableText"/>
+              <w:jc w:val="left"/>
+              <w:wordWrap w:val="0"/>
+              <w:spacing w:before="0" w:after="0" w:line="320" w:lineRule="exact"/>
+            </w:pPr>
+            <w:r>
+              <w:rPr>
+                <w:rFonts w:ascii="Calibri" w:hAnsi="Calibri" w:eastAsia="Microsoft YaHei" w:cs="Calibri"/>
+                <w:sz w:val="18"/>
+                <w:szCs w:val="18"/>
+              </w:rPr>
+              <w:t xml:space="preserve">〔待填写〕</w:t>
             </w:r>
           </w:p>
         </w:tc>
@@ -4871,7 +5057,9 @@
           <w:cantSplit/>
         </w:trPr>
         <w:tc>
-          <w:tcPr/>
+          <w:tcPr>
+            <w:tcW w:w="5630" w:type="dxa"/>
+          </w:tcPr>
           <w:p>
             <w:pPr>
               <w:pStyle w:val="TableText"/>
@@ -4890,21 +5078,23 @@
           </w:p>
         </w:tc>
         <w:tc>
-          <w:tcPr/>
-          <w:p>
-            <w:pPr>
-              <w:pStyle w:val="TableText"/>
-              <w:jc w:val="left"/>
-              <w:wordWrap w:val="0"/>
-              <w:spacing w:before="0" w:after="0" w:line="320" w:lineRule="exact"/>
-            </w:pPr>
-            <w:r>
-              <w:rPr>
-                <w:rFonts w:ascii="Calibri" w:hAnsi="Calibri" w:eastAsia="Microsoft YaHei" w:cs="Calibri"/>
-                <w:sz w:val="18"/>
-                <w:szCs w:val="18"/>
-              </w:rPr>
-              <w:t xml:space="preserve">〔待确认〕</w:t>
+          <w:tcPr>
+            <w:tcW w:w="3970" w:type="dxa"/>
+          </w:tcPr>
+          <w:p>
+            <w:pPr>
+              <w:pStyle w:val="TableText"/>
+              <w:jc w:val="left"/>
+              <w:wordWrap w:val="0"/>
+              <w:spacing w:before="0" w:after="0" w:line="320" w:lineRule="exact"/>
+            </w:pPr>
+            <w:r>
+              <w:rPr>
+                <w:rFonts w:ascii="Calibri" w:hAnsi="Calibri" w:eastAsia="Microsoft YaHei" w:cs="Calibri"/>
+                <w:sz w:val="18"/>
+                <w:szCs w:val="18"/>
+              </w:rPr>
+              <w:t xml:space="preserve">〔待填写〕</w:t>
             </w:r>
           </w:p>
         </w:tc>
@@ -4914,7 +5104,9 @@
           <w:cantSplit/>
         </w:trPr>
         <w:tc>
-          <w:tcPr/>
+          <w:tcPr>
+            <w:tcW w:w="5630" w:type="dxa"/>
+          </w:tcPr>
           <w:p>
             <w:pPr>
               <w:pStyle w:val="TableText"/>
@@ -4933,21 +5125,23 @@
           </w:p>
         </w:tc>
         <w:tc>
-          <w:tcPr/>
-          <w:p>
-            <w:pPr>
-              <w:pStyle w:val="TableText"/>
-              <w:jc w:val="left"/>
-              <w:wordWrap w:val="0"/>
-              <w:spacing w:before="0" w:after="0" w:line="320" w:lineRule="exact"/>
-            </w:pPr>
-            <w:r>
-              <w:rPr>
-                <w:rFonts w:ascii="Calibri" w:hAnsi="Calibri" w:eastAsia="Microsoft YaHei" w:cs="Calibri"/>
-                <w:sz w:val="18"/>
-                <w:szCs w:val="18"/>
-              </w:rPr>
-              <w:t xml:space="preserve">〔待确认〕</w:t>
+          <w:tcPr>
+            <w:tcW w:w="3970" w:type="dxa"/>
+          </w:tcPr>
+          <w:p>
+            <w:pPr>
+              <w:pStyle w:val="TableText"/>
+              <w:jc w:val="left"/>
+              <w:wordWrap w:val="0"/>
+              <w:spacing w:before="0" w:after="0" w:line="320" w:lineRule="exact"/>
+            </w:pPr>
+            <w:r>
+              <w:rPr>
+                <w:rFonts w:ascii="Calibri" w:hAnsi="Calibri" w:eastAsia="Microsoft YaHei" w:cs="Calibri"/>
+                <w:sz w:val="18"/>
+                <w:szCs w:val="18"/>
+              </w:rPr>
+              <w:t xml:space="preserve">〔待填写〕</w:t>
             </w:r>
           </w:p>
         </w:tc>
@@ -4957,7 +5151,9 @@
           <w:cantSplit/>
         </w:trPr>
         <w:tc>
-          <w:tcPr/>
+          <w:tcPr>
+            <w:tcW w:w="5630" w:type="dxa"/>
+          </w:tcPr>
           <w:p>
             <w:pPr>
               <w:pStyle w:val="TableText"/>
@@ -4976,21 +5172,23 @@
           </w:p>
         </w:tc>
         <w:tc>
-          <w:tcPr/>
-          <w:p>
-            <w:pPr>
-              <w:pStyle w:val="TableText"/>
-              <w:jc w:val="left"/>
-              <w:wordWrap w:val="0"/>
-              <w:spacing w:before="0" w:after="0" w:line="320" w:lineRule="exact"/>
-            </w:pPr>
-            <w:r>
-              <w:rPr>
-                <w:rFonts w:ascii="Calibri" w:hAnsi="Calibri" w:eastAsia="Microsoft YaHei" w:cs="Calibri"/>
-                <w:sz w:val="18"/>
-                <w:szCs w:val="18"/>
-              </w:rPr>
-              <w:t xml:space="preserve">〔待确认〕</w:t>
+          <w:tcPr>
+            <w:tcW w:w="3970" w:type="dxa"/>
+          </w:tcPr>
+          <w:p>
+            <w:pPr>
+              <w:pStyle w:val="TableText"/>
+              <w:jc w:val="left"/>
+              <w:wordWrap w:val="0"/>
+              <w:spacing w:before="0" w:after="0" w:line="320" w:lineRule="exact"/>
+            </w:pPr>
+            <w:r>
+              <w:rPr>
+                <w:rFonts w:ascii="Calibri" w:hAnsi="Calibri" w:eastAsia="Microsoft YaHei" w:cs="Calibri"/>
+                <w:sz w:val="18"/>
+                <w:szCs w:val="18"/>
+              </w:rPr>
+              <w:t xml:space="preserve">〔待填写〕</w:t>
             </w:r>
           </w:p>
         </w:tc>
@@ -5069,7 +5267,7 @@
       <w:tblPr>
         <w:tblStyle w:val="TableGrid"/>
         <w:tblW w:w="5000" w:type="pct"/>
-        <w:tblLayout w:type="autofit"/>
+        <w:tblLayout w:type="fixed"/>
         <w:tblCellMar>
           <w:top w:w="60" w:type="dxa"/>
           <w:left w:w="90" w:type="dxa"/>
@@ -5077,6 +5275,11 @@
           <w:right w:w="90" w:type="dxa"/>
         </w:tblCellMar>
       </w:tblPr>
+      <w:tblGrid>
+        <w:gridCol w:w="1532"/>
+        <w:gridCol w:w="5357"/>
+        <w:gridCol w:w="2709"/>
+      </w:tblGrid>
       <w:tr>
         <w:trPr>
           <w:cantSplit/>
@@ -5084,6 +5287,7 @@
         </w:trPr>
         <w:tc>
           <w:tcPr>
+            <w:tcW w:w="1532" w:type="dxa"/>
             <w:shd w:val="clear" w:color="auto" w:fill="D9E2F3"/>
           </w:tcPr>
           <w:p>
@@ -5106,6 +5310,7 @@
         </w:tc>
         <w:tc>
           <w:tcPr>
+            <w:tcW w:w="5357" w:type="dxa"/>
             <w:shd w:val="clear" w:color="auto" w:fill="D9E2F3"/>
           </w:tcPr>
           <w:p>
@@ -5128,6 +5333,7 @@
         </w:tc>
         <w:tc>
           <w:tcPr>
+            <w:tcW w:w="2709" w:type="dxa"/>
             <w:shd w:val="clear" w:color="auto" w:fill="D9E2F3"/>
           </w:tcPr>
           <w:p>
@@ -5154,7 +5360,9 @@
           <w:cantSplit/>
         </w:trPr>
         <w:tc>
-          <w:tcPr/>
+          <w:tcPr>
+            <w:tcW w:w="1532" w:type="dxa"/>
+          </w:tcPr>
           <w:p>
             <w:pPr>
               <w:pStyle w:val="TableText"/>
@@ -5173,7 +5381,9 @@
           </w:p>
         </w:tc>
         <w:tc>
-          <w:tcPr/>
+          <w:tcPr>
+            <w:tcW w:w="5357" w:type="dxa"/>
+          </w:tcPr>
           <w:p>
             <w:pPr>
               <w:pStyle w:val="TableText"/>
@@ -5192,7 +5402,9 @@
           </w:p>
         </w:tc>
         <w:tc>
-          <w:tcPr/>
+          <w:tcPr>
+            <w:tcW w:w="2709" w:type="dxa"/>
+          </w:tcPr>
           <w:p>
             <w:pPr>
               <w:pStyle w:val="TableText"/>
@@ -5216,7 +5428,9 @@
           <w:cantSplit/>
         </w:trPr>
         <w:tc>
-          <w:tcPr/>
+          <w:tcPr>
+            <w:tcW w:w="1532" w:type="dxa"/>
+          </w:tcPr>
           <w:p>
             <w:pPr>
               <w:pStyle w:val="TableText"/>
@@ -5235,7 +5449,9 @@
           </w:p>
         </w:tc>
         <w:tc>
-          <w:tcPr/>
+          <w:tcPr>
+            <w:tcW w:w="5357" w:type="dxa"/>
+          </w:tcPr>
           <w:p>
             <w:pPr>
               <w:pStyle w:val="TableText"/>
@@ -5254,7 +5470,9 @@
           </w:p>
         </w:tc>
         <w:tc>
-          <w:tcPr/>
+          <w:tcPr>
+            <w:tcW w:w="2709" w:type="dxa"/>
+          </w:tcPr>
           <w:p>
             <w:pPr>
               <w:pStyle w:val="TableText"/>
@@ -5278,7 +5496,9 @@
           <w:cantSplit/>
         </w:trPr>
         <w:tc>
-          <w:tcPr/>
+          <w:tcPr>
+            <w:tcW w:w="1532" w:type="dxa"/>
+          </w:tcPr>
           <w:p>
             <w:pPr>
               <w:pStyle w:val="TableText"/>
@@ -5297,7 +5517,9 @@
           </w:p>
         </w:tc>
         <w:tc>
-          <w:tcPr/>
+          <w:tcPr>
+            <w:tcW w:w="5357" w:type="dxa"/>
+          </w:tcPr>
           <w:p>
             <w:pPr>
               <w:pStyle w:val="TableText"/>
@@ -5316,7 +5538,9 @@
           </w:p>
         </w:tc>
         <w:tc>
-          <w:tcPr/>
+          <w:tcPr>
+            <w:tcW w:w="2709" w:type="dxa"/>
+          </w:tcPr>
           <w:p>
             <w:pPr>
               <w:pStyle w:val="TableText"/>
@@ -5340,7 +5564,9 @@
           <w:cantSplit/>
         </w:trPr>
         <w:tc>
-          <w:tcPr/>
+          <w:tcPr>
+            <w:tcW w:w="1532" w:type="dxa"/>
+          </w:tcPr>
           <w:p>
             <w:pPr>
               <w:pStyle w:val="TableText"/>
@@ -5359,7 +5585,9 @@
           </w:p>
         </w:tc>
         <w:tc>
-          <w:tcPr/>
+          <w:tcPr>
+            <w:tcW w:w="5357" w:type="dxa"/>
+          </w:tcPr>
           <w:p>
             <w:pPr>
               <w:pStyle w:val="TableText"/>
@@ -5378,7 +5606,9 @@
           </w:p>
         </w:tc>
         <w:tc>
-          <w:tcPr/>
+          <w:tcPr>
+            <w:tcW w:w="2709" w:type="dxa"/>
+          </w:tcPr>
           <w:p>
             <w:pPr>
               <w:pStyle w:val="TableText"/>
@@ -5414,7 +5644,7 @@
       <w:tblPr>
         <w:tblStyle w:val="TableGrid"/>
         <w:tblW w:w="5000" w:type="pct"/>
-        <w:tblLayout w:type="autofit"/>
+        <w:tblLayout w:type="fixed"/>
         <w:tblCellMar>
           <w:top w:w="60" w:type="dxa"/>
           <w:left w:w="90" w:type="dxa"/>
@@ -5422,6 +5652,10 @@
           <w:right w:w="90" w:type="dxa"/>
         </w:tblCellMar>
       </w:tblPr>
+      <w:tblGrid>
+        <w:gridCol w:w="4666"/>
+        <w:gridCol w:w="4933"/>
+      </w:tblGrid>
       <w:tr>
         <w:trPr>
           <w:cantSplit/>
@@ -5429,6 +5663,7 @@
         </w:trPr>
         <w:tc>
           <w:tcPr>
+            <w:tcW w:w="4666" w:type="dxa"/>
             <w:shd w:val="clear" w:color="auto" w:fill="D9E2F3"/>
           </w:tcPr>
           <w:p>
@@ -5451,6 +5686,7 @@
         </w:tc>
         <w:tc>
           <w:tcPr>
+            <w:tcW w:w="4933" w:type="dxa"/>
             <w:shd w:val="clear" w:color="auto" w:fill="D9E2F3"/>
           </w:tcPr>
           <w:p>
@@ -5477,7 +5713,9 @@
           <w:cantSplit/>
         </w:trPr>
         <w:tc>
-          <w:tcPr/>
+          <w:tcPr>
+            <w:tcW w:w="4666" w:type="dxa"/>
+          </w:tcPr>
           <w:p>
             <w:pPr>
               <w:pStyle w:val="TableText"/>
@@ -5496,7 +5734,9 @@
           </w:p>
         </w:tc>
         <w:tc>
-          <w:tcPr/>
+          <w:tcPr>
+            <w:tcW w:w="4933" w:type="dxa"/>
+          </w:tcPr>
           <w:p>
             <w:pPr>
               <w:pStyle w:val="TableText"/>
@@ -5520,7 +5760,9 @@
           <w:cantSplit/>
         </w:trPr>
         <w:tc>
-          <w:tcPr/>
+          <w:tcPr>
+            <w:tcW w:w="4666" w:type="dxa"/>
+          </w:tcPr>
           <w:p>
             <w:pPr>
               <w:pStyle w:val="TableText"/>
@@ -5539,7 +5781,9 @@
           </w:p>
         </w:tc>
         <w:tc>
-          <w:tcPr/>
+          <w:tcPr>
+            <w:tcW w:w="4933" w:type="dxa"/>
+          </w:tcPr>
           <w:p>
             <w:pPr>
               <w:pStyle w:val="TableText"/>
@@ -5563,7 +5807,9 @@
           <w:cantSplit/>
         </w:trPr>
         <w:tc>
-          <w:tcPr/>
+          <w:tcPr>
+            <w:tcW w:w="4666" w:type="dxa"/>
+          </w:tcPr>
           <w:p>
             <w:pPr>
               <w:pStyle w:val="TableText"/>
@@ -5582,7 +5828,9 @@
           </w:p>
         </w:tc>
         <w:tc>
-          <w:tcPr/>
+          <w:tcPr>
+            <w:tcW w:w="4933" w:type="dxa"/>
+          </w:tcPr>
           <w:p>
             <w:pPr>
               <w:pStyle w:val="TableText"/>
@@ -5606,7 +5854,9 @@
           <w:cantSplit/>
         </w:trPr>
         <w:tc>
-          <w:tcPr/>
+          <w:tcPr>
+            <w:tcW w:w="4666" w:type="dxa"/>
+          </w:tcPr>
           <w:p>
             <w:pPr>
               <w:pStyle w:val="TableText"/>
@@ -5625,7 +5875,9 @@
           </w:p>
         </w:tc>
         <w:tc>
-          <w:tcPr/>
+          <w:tcPr>
+            <w:tcW w:w="4933" w:type="dxa"/>
+          </w:tcPr>
           <w:p>
             <w:pPr>
               <w:pStyle w:val="TableText"/>
@@ -5649,7 +5901,9 @@
           <w:cantSplit/>
         </w:trPr>
         <w:tc>
-          <w:tcPr/>
+          <w:tcPr>
+            <w:tcW w:w="4666" w:type="dxa"/>
+          </w:tcPr>
           <w:p>
             <w:pPr>
               <w:pStyle w:val="TableText"/>
@@ -5668,7 +5922,9 @@
           </w:p>
         </w:tc>
         <w:tc>
-          <w:tcPr/>
+          <w:tcPr>
+            <w:tcW w:w="4933" w:type="dxa"/>
+          </w:tcPr>
           <w:p>
             <w:pPr>
               <w:pStyle w:val="TableText"/>
@@ -5704,7 +5960,7 @@
       <w:tblPr>
         <w:tblStyle w:val="TableGrid"/>
         <w:tblW w:w="5000" w:type="pct"/>
-        <w:tblLayout w:type="autofit"/>
+        <w:tblLayout w:type="fixed"/>
         <w:tblCellMar>
           <w:top w:w="60" w:type="dxa"/>
           <w:left w:w="90" w:type="dxa"/>
@@ -5712,6 +5968,12 @@
           <w:right w:w="90" w:type="dxa"/>
         </w:tblCellMar>
       </w:tblPr>
+      <w:tblGrid>
+        <w:gridCol w:w="1955"/>
+        <w:gridCol w:w="2785"/>
+        <w:gridCol w:w="2311"/>
+        <w:gridCol w:w="2548"/>
+      </w:tblGrid>
       <w:tr>
         <w:trPr>
           <w:cantSplit/>
@@ -5719,6 +5981,7 @@
         </w:trPr>
         <w:tc>
           <w:tcPr>
+            <w:tcW w:w="1955" w:type="dxa"/>
             <w:shd w:val="clear" w:color="auto" w:fill="D9E2F3"/>
           </w:tcPr>
           <w:p>
@@ -5741,6 +6004,7 @@
         </w:tc>
         <w:tc>
           <w:tcPr>
+            <w:tcW w:w="2785" w:type="dxa"/>
             <w:shd w:val="clear" w:color="auto" w:fill="D9E2F3"/>
           </w:tcPr>
           <w:p>
@@ -5763,6 +6027,7 @@
         </w:tc>
         <w:tc>
           <w:tcPr>
+            <w:tcW w:w="2311" w:type="dxa"/>
             <w:shd w:val="clear" w:color="auto" w:fill="D9E2F3"/>
           </w:tcPr>
           <w:p>
@@ -5785,6 +6050,7 @@
         </w:tc>
         <w:tc>
           <w:tcPr>
+            <w:tcW w:w="2548" w:type="dxa"/>
             <w:shd w:val="clear" w:color="auto" w:fill="D9E2F3"/>
           </w:tcPr>
           <w:p>
@@ -5811,7 +6077,9 @@
           <w:cantSplit/>
         </w:trPr>
         <w:tc>
-          <w:tcPr/>
+          <w:tcPr>
+            <w:tcW w:w="1955" w:type="dxa"/>
+          </w:tcPr>
           <w:p>
             <w:pPr>
               <w:pStyle w:val="TableText"/>
@@ -5830,7 +6098,9 @@
           </w:p>
         </w:tc>
         <w:tc>
-          <w:tcPr/>
+          <w:tcPr>
+            <w:tcW w:w="2785" w:type="dxa"/>
+          </w:tcPr>
           <w:p>
             <w:pPr>
               <w:pStyle w:val="TableText"/>
@@ -5849,7 +6119,9 @@
           </w:p>
         </w:tc>
         <w:tc>
-          <w:tcPr/>
+          <w:tcPr>
+            <w:tcW w:w="2311" w:type="dxa"/>
+          </w:tcPr>
           <w:p>
             <w:pPr>
               <w:pStyle w:val="TableText"/>
@@ -5868,7 +6140,9 @@
           </w:p>
         </w:tc>
         <w:tc>
-          <w:tcPr/>
+          <w:tcPr>
+            <w:tcW w:w="2548" w:type="dxa"/>
+          </w:tcPr>
           <w:p>
             <w:pPr>
               <w:pStyle w:val="TableText"/>
@@ -5892,7 +6166,9 @@
           <w:cantSplit/>
         </w:trPr>
         <w:tc>
-          <w:tcPr/>
+          <w:tcPr>
+            <w:tcW w:w="1955" w:type="dxa"/>
+          </w:tcPr>
           <w:p>
             <w:pPr>
               <w:pStyle w:val="TableText"/>
@@ -5911,7 +6187,9 @@
           </w:p>
         </w:tc>
         <w:tc>
-          <w:tcPr/>
+          <w:tcPr>
+            <w:tcW w:w="2785" w:type="dxa"/>
+          </w:tcPr>
           <w:p>
             <w:pPr>
               <w:pStyle w:val="TableText"/>
@@ -5930,7 +6208,9 @@
           </w:p>
         </w:tc>
         <w:tc>
-          <w:tcPr/>
+          <w:tcPr>
+            <w:tcW w:w="2311" w:type="dxa"/>
+          </w:tcPr>
           <w:p>
             <w:pPr>
               <w:pStyle w:val="TableText"/>
@@ -5949,7 +6229,9 @@
           </w:p>
         </w:tc>
         <w:tc>
-          <w:tcPr/>
+          <w:tcPr>
+            <w:tcW w:w="2548" w:type="dxa"/>
+          </w:tcPr>
           <w:p>
             <w:pPr>
               <w:pStyle w:val="TableText"/>
@@ -5973,7 +6255,9 @@
           <w:cantSplit/>
         </w:trPr>
         <w:tc>
-          <w:tcPr/>
+          <w:tcPr>
+            <w:tcW w:w="1955" w:type="dxa"/>
+          </w:tcPr>
           <w:p>
             <w:pPr>
               <w:pStyle w:val="TableText"/>
@@ -5992,7 +6276,9 @@
           </w:p>
         </w:tc>
         <w:tc>
-          <w:tcPr/>
+          <w:tcPr>
+            <w:tcW w:w="2785" w:type="dxa"/>
+          </w:tcPr>
           <w:p>
             <w:pPr>
               <w:pStyle w:val="TableText"/>
@@ -6011,7 +6297,9 @@
           </w:p>
         </w:tc>
         <w:tc>
-          <w:tcPr/>
+          <w:tcPr>
+            <w:tcW w:w="2311" w:type="dxa"/>
+          </w:tcPr>
           <w:p>
             <w:pPr>
               <w:pStyle w:val="TableText"/>
@@ -6030,7 +6318,9 @@
           </w:p>
         </w:tc>
         <w:tc>
-          <w:tcPr/>
+          <w:tcPr>
+            <w:tcW w:w="2548" w:type="dxa"/>
+          </w:tcPr>
           <w:p>
             <w:pPr>
               <w:pStyle w:val="TableText"/>
@@ -6054,7 +6344,9 @@
           <w:cantSplit/>
         </w:trPr>
         <w:tc>
-          <w:tcPr/>
+          <w:tcPr>
+            <w:tcW w:w="1955" w:type="dxa"/>
+          </w:tcPr>
           <w:p>
             <w:pPr>
               <w:pStyle w:val="TableText"/>
@@ -6073,7 +6365,9 @@
           </w:p>
         </w:tc>
         <w:tc>
-          <w:tcPr/>
+          <w:tcPr>
+            <w:tcW w:w="2785" w:type="dxa"/>
+          </w:tcPr>
           <w:p>
             <w:pPr>
               <w:pStyle w:val="TableText"/>
@@ -6092,7 +6386,9 @@
           </w:p>
         </w:tc>
         <w:tc>
-          <w:tcPr/>
+          <w:tcPr>
+            <w:tcW w:w="2311" w:type="dxa"/>
+          </w:tcPr>
           <w:p>
             <w:pPr>
               <w:pStyle w:val="TableText"/>
@@ -6111,7 +6407,9 @@
           </w:p>
         </w:tc>
         <w:tc>
-          <w:tcPr/>
+          <w:tcPr>
+            <w:tcW w:w="2548" w:type="dxa"/>
+          </w:tcPr>
           <w:p>
             <w:pPr>
               <w:pStyle w:val="TableText"/>
@@ -6147,11 +6445,11 @@
       <w:tblPr>
         <w:tblStyle w:val="TableGrid"/>
         <w:tblW w:w="5000" w:type="pct"/>
-        <w:tblLayout w:type="autofit"/>
+        <w:tblLayout w:type="fixed"/>
         <w:tblCellMar>
-          <w:top w:w="0" w:type="dxa"/>
+          <w:top w:w="70" w:type="dxa"/>
           <w:left w:w="45" w:type="dxa"/>
-          <w:bottom w:w="0" w:type="dxa"/>
+          <w:bottom w:w="70" w:type="dxa"/>
           <w:right w:w="45" w:type="dxa"/>
         </w:tblCellMar>
       </w:tblPr>
@@ -6176,14 +6474,14 @@
               <w:pStyle w:val="CompactGlossaryText"/>
               <w:jc w:val="left"/>
               <w:wordWrap w:val="0"/>
-              <w:spacing w:before="0" w:after="0" w:line="160" w:lineRule="exact"/>
+              <w:spacing w:before="0" w:after="0" w:line="310" w:lineRule="exact"/>
             </w:pPr>
             <w:r>
               <w:rPr>
                 <w:rFonts w:ascii="Calibri" w:hAnsi="Calibri" w:eastAsia="SimHei" w:cs="Calibri"/>
                 <w:b/>
-                <w:sz w:val="16"/>
-                <w:szCs w:val="16"/>
+                <w:sz w:val="18"/>
+                <w:szCs w:val="18"/>
               </w:rPr>
               <w:t xml:space="preserve">术语</w:t>
             </w:r>
@@ -6199,14 +6497,14 @@
               <w:pStyle w:val="CompactGlossaryText"/>
               <w:jc w:val="left"/>
               <w:wordWrap w:val="0"/>
-              <w:spacing w:before="0" w:after="0" w:line="160" w:lineRule="exact"/>
+              <w:spacing w:before="0" w:after="0" w:line="310" w:lineRule="exact"/>
             </w:pPr>
             <w:r>
               <w:rPr>
                 <w:rFonts w:ascii="Calibri" w:hAnsi="Calibri" w:eastAsia="SimHei" w:cs="Calibri"/>
                 <w:b/>
-                <w:sz w:val="16"/>
-                <w:szCs w:val="16"/>
+                <w:sz w:val="18"/>
+                <w:szCs w:val="18"/>
               </w:rPr>
               <w:t xml:space="preserve">说明</w:t>
             </w:r>
@@ -6222,14 +6520,14 @@
               <w:pStyle w:val="CompactGlossaryText"/>
               <w:jc w:val="left"/>
               <w:wordWrap w:val="0"/>
-              <w:spacing w:before="0" w:after="0" w:line="160" w:lineRule="exact"/>
+              <w:spacing w:before="0" w:after="0" w:line="310" w:lineRule="exact"/>
             </w:pPr>
             <w:r>
               <w:rPr>
                 <w:rFonts w:ascii="Calibri" w:hAnsi="Calibri" w:eastAsia="SimHei" w:cs="Calibri"/>
                 <w:b/>
-                <w:sz w:val="16"/>
-                <w:szCs w:val="16"/>
+                <w:sz w:val="18"/>
+                <w:szCs w:val="18"/>
               </w:rPr>
               <w:t xml:space="preserve">术语</w:t>
             </w:r>
@@ -6245,14 +6543,14 @@
               <w:pStyle w:val="CompactGlossaryText"/>
               <w:jc w:val="left"/>
               <w:wordWrap w:val="0"/>
-              <w:spacing w:before="0" w:after="0" w:line="160" w:lineRule="exact"/>
+              <w:spacing w:before="0" w:after="0" w:line="310" w:lineRule="exact"/>
             </w:pPr>
             <w:r>
               <w:rPr>
                 <w:rFonts w:ascii="Calibri" w:hAnsi="Calibri" w:eastAsia="SimHei" w:cs="Calibri"/>
                 <w:b/>
-                <w:sz w:val="16"/>
-                <w:szCs w:val="16"/>
+                <w:sz w:val="18"/>
+                <w:szCs w:val="18"/>
               </w:rPr>
               <w:t xml:space="preserve">说明</w:t>
             </w:r>
@@ -6272,13 +6570,13 @@
               <w:pStyle w:val="CompactGlossaryText"/>
               <w:jc w:val="left"/>
               <w:wordWrap w:val="0"/>
-              <w:spacing w:before="0" w:after="0" w:line="160" w:lineRule="exact"/>
-            </w:pPr>
-            <w:r>
-              <w:rPr>
-                <w:rFonts w:ascii="Calibri" w:hAnsi="Calibri" w:eastAsia="Microsoft YaHei" w:cs="Calibri"/>
-                <w:sz w:val="16"/>
-                <w:szCs w:val="16"/>
+              <w:spacing w:before="0" w:after="0" w:line="310" w:lineRule="exact"/>
+            </w:pPr>
+            <w:r>
+              <w:rPr>
+                <w:rFonts w:ascii="Calibri" w:hAnsi="Calibri" w:eastAsia="Microsoft YaHei" w:cs="Calibri"/>
+                <w:sz w:val="18"/>
+                <w:szCs w:val="18"/>
               </w:rPr>
               <w:t xml:space="preserve">U⁠B⁠C⁠C</w:t>
             </w:r>
@@ -6293,13 +6591,13 @@
               <w:pStyle w:val="CompactGlossaryText"/>
               <w:jc w:val="left"/>
               <w:wordWrap w:val="0"/>
-              <w:spacing w:before="0" w:after="0" w:line="160" w:lineRule="exact"/>
-            </w:pPr>
-            <w:r>
-              <w:rPr>
-                <w:rFonts w:ascii="Calibri" w:hAnsi="Calibri" w:eastAsia="Microsoft YaHei" w:cs="Calibri"/>
-                <w:sz w:val="16"/>
-                <w:szCs w:val="16"/>
+              <w:spacing w:before="0" w:after="0" w:line="310" w:lineRule="exact"/>
+            </w:pPr>
+            <w:r>
+              <w:rPr>
+                <w:rFonts w:ascii="Calibri" w:hAnsi="Calibri" w:eastAsia="Microsoft YaHei" w:cs="Calibri"/>
+                <w:sz w:val="18"/>
+                <w:szCs w:val="18"/>
               </w:rPr>
               <w:t xml:space="preserve">跨节点缓存一致性方案及全局目录控制器</w:t>
             </w:r>
@@ -6314,13 +6612,13 @@
               <w:pStyle w:val="CompactGlossaryText"/>
               <w:jc w:val="left"/>
               <w:wordWrap w:val="0"/>
-              <w:spacing w:before="0" w:after="0" w:line="160" w:lineRule="exact"/>
-            </w:pPr>
-            <w:r>
-              <w:rPr>
-                <w:rFonts w:ascii="Calibri" w:hAnsi="Calibri" w:eastAsia="Microsoft YaHei" w:cs="Calibri"/>
-                <w:sz w:val="16"/>
-                <w:szCs w:val="16"/>
+              <w:spacing w:before="0" w:after="0" w:line="310" w:lineRule="exact"/>
+            </w:pPr>
+            <w:r>
+              <w:rPr>
+                <w:rFonts w:ascii="Calibri" w:hAnsi="Calibri" w:eastAsia="Microsoft YaHei" w:cs="Calibri"/>
+                <w:sz w:val="18"/>
+                <w:szCs w:val="18"/>
               </w:rPr>
               <w:t xml:space="preserve">u⁠b</w:t>
             </w:r>
@@ -6335,13 +6633,13 @@
               <w:pStyle w:val="CompactGlossaryText"/>
               <w:jc w:val="left"/>
               <w:wordWrap w:val="0"/>
-              <w:spacing w:before="0" w:after="0" w:line="160" w:lineRule="exact"/>
-            </w:pPr>
-            <w:r>
-              <w:rPr>
-                <w:rFonts w:ascii="Calibri" w:hAnsi="Calibri" w:eastAsia="Microsoft YaHei" w:cs="Calibri"/>
-                <w:sz w:val="16"/>
-                <w:szCs w:val="16"/>
+              <w:spacing w:before="0" w:after="0" w:line="310" w:lineRule="exact"/>
+            </w:pPr>
+            <w:r>
+              <w:rPr>
+                <w:rFonts w:ascii="Calibri" w:hAnsi="Calibri" w:eastAsia="Microsoft YaHei" w:cs="Calibri"/>
+                <w:sz w:val="18"/>
+                <w:szCs w:val="18"/>
               </w:rPr>
               <w:t xml:space="preserve"/>
             </w:r>
@@ -6361,13 +6659,13 @@
               <w:pStyle w:val="CompactGlossaryText"/>
               <w:jc w:val="left"/>
               <w:wordWrap w:val="0"/>
-              <w:spacing w:before="0" w:after="0" w:line="160" w:lineRule="exact"/>
-            </w:pPr>
-            <w:r>
-              <w:rPr>
-                <w:rFonts w:ascii="Calibri" w:hAnsi="Calibri" w:eastAsia="Microsoft YaHei" w:cs="Calibri"/>
-                <w:sz w:val="16"/>
-                <w:szCs w:val="16"/>
+              <w:spacing w:before="0" w:after="0" w:line="310" w:lineRule="exact"/>
+            </w:pPr>
+            <w:r>
+              <w:rPr>
+                <w:rFonts w:ascii="Calibri" w:hAnsi="Calibri" w:eastAsia="Microsoft YaHei" w:cs="Calibri"/>
+                <w:sz w:val="18"/>
+                <w:szCs w:val="18"/>
               </w:rPr>
               <w:t xml:space="preserve">C⁠H⁠I</w:t>
             </w:r>
@@ -6382,13 +6680,13 @@
               <w:pStyle w:val="CompactGlossaryText"/>
               <w:jc w:val="left"/>
               <w:wordWrap w:val="0"/>
-              <w:spacing w:before="0" w:after="0" w:line="160" w:lineRule="exact"/>
-            </w:pPr>
-            <w:r>
-              <w:rPr>
-                <w:rFonts w:ascii="Calibri" w:hAnsi="Calibri" w:eastAsia="Microsoft YaHei" w:cs="Calibri"/>
-                <w:sz w:val="16"/>
-                <w:szCs w:val="16"/>
+              <w:spacing w:before="0" w:after="0" w:line="310" w:lineRule="exact"/>
+            </w:pPr>
+            <w:r>
+              <w:rPr>
+                <w:rFonts w:ascii="Calibri" w:hAnsi="Calibri" w:eastAsia="Microsoft YaHei" w:cs="Calibri"/>
+                <w:sz w:val="18"/>
+                <w:szCs w:val="18"/>
               </w:rPr>
               <w:t xml:space="preserve">节点内缓存一致性协议</w:t>
             </w:r>
@@ -6403,13 +6701,13 @@
               <w:pStyle w:val="CompactGlossaryText"/>
               <w:jc w:val="left"/>
               <w:wordWrap w:val="0"/>
-              <w:spacing w:before="0" w:after="0" w:line="160" w:lineRule="exact"/>
-            </w:pPr>
-            <w:r>
-              <w:rPr>
-                <w:rFonts w:ascii="Calibri" w:hAnsi="Calibri" w:eastAsia="Microsoft YaHei" w:cs="Calibri"/>
-                <w:sz w:val="16"/>
-                <w:szCs w:val="16"/>
+              <w:spacing w:before="0" w:after="0" w:line="310" w:lineRule="exact"/>
+            </w:pPr>
+            <w:r>
+              <w:rPr>
+                <w:rFonts w:ascii="Calibri" w:hAnsi="Calibri" w:eastAsia="Microsoft YaHei" w:cs="Calibri"/>
+                <w:sz w:val="18"/>
+                <w:szCs w:val="18"/>
               </w:rPr>
               <w:t xml:space="preserve">I⁠n⁠n⁠e⁠r 域</w:t>
             </w:r>
@@ -6424,13 +6722,13 @@
               <w:pStyle w:val="CompactGlossaryText"/>
               <w:jc w:val="left"/>
               <w:wordWrap w:val="0"/>
-              <w:spacing w:before="0" w:after="0" w:line="160" w:lineRule="exact"/>
-            </w:pPr>
-            <w:r>
-              <w:rPr>
-                <w:rFonts w:ascii="Calibri" w:hAnsi="Calibri" w:eastAsia="Microsoft YaHei" w:cs="Calibri"/>
-                <w:sz w:val="16"/>
-                <w:szCs w:val="16"/>
+              <w:spacing w:before="0" w:after="0" w:line="310" w:lineRule="exact"/>
+            </w:pPr>
+            <w:r>
+              <w:rPr>
+                <w:rFonts w:ascii="Calibri" w:hAnsi="Calibri" w:eastAsia="Microsoft YaHei" w:cs="Calibri"/>
+                <w:sz w:val="18"/>
+                <w:szCs w:val="18"/>
               </w:rPr>
               <w:t xml:space="preserve">节点内标准 C⁠H⁠I 一致性域</w:t>
             </w:r>
@@ -6450,13 +6748,13 @@
               <w:pStyle w:val="CompactGlossaryText"/>
               <w:jc w:val="left"/>
               <w:wordWrap w:val="0"/>
-              <w:spacing w:before="0" w:after="0" w:line="160" w:lineRule="exact"/>
-            </w:pPr>
-            <w:r>
-              <w:rPr>
-                <w:rFonts w:ascii="Calibri" w:hAnsi="Calibri" w:eastAsia="Microsoft YaHei" w:cs="Calibri"/>
-                <w:sz w:val="16"/>
-                <w:szCs w:val="16"/>
+              <w:spacing w:before="0" w:after="0" w:line="310" w:lineRule="exact"/>
+            </w:pPr>
+            <w:r>
+              <w:rPr>
+                <w:rFonts w:ascii="Calibri" w:hAnsi="Calibri" w:eastAsia="Microsoft YaHei" w:cs="Calibri"/>
+                <w:sz w:val="18"/>
+                <w:szCs w:val="18"/>
               </w:rPr>
               <w:t xml:space="preserve">H⁠N⁠-⁠F</w:t>
             </w:r>
@@ -6471,13 +6769,13 @@
               <w:pStyle w:val="CompactGlossaryText"/>
               <w:jc w:val="left"/>
               <w:wordWrap w:val="0"/>
-              <w:spacing w:before="0" w:after="0" w:line="160" w:lineRule="exact"/>
-            </w:pPr>
-            <w:r>
-              <w:rPr>
-                <w:rFonts w:ascii="Calibri" w:hAnsi="Calibri" w:eastAsia="Microsoft YaHei" w:cs="Calibri"/>
-                <w:sz w:val="16"/>
-                <w:szCs w:val="16"/>
+              <w:spacing w:before="0" w:after="0" w:line="310" w:lineRule="exact"/>
+            </w:pPr>
+            <w:r>
+              <w:rPr>
+                <w:rFonts w:ascii="Calibri" w:hAnsi="Calibri" w:eastAsia="Microsoft YaHei" w:cs="Calibri"/>
+                <w:sz w:val="18"/>
+                <w:szCs w:val="18"/>
               </w:rPr>
               <w:t xml:space="preserve">节点内 H⁠o⁠m⁠e N⁠o⁠d⁠e，负责本地一致性与内存访问</w:t>
             </w:r>
@@ -6492,13 +6790,13 @@
               <w:pStyle w:val="CompactGlossaryText"/>
               <w:jc w:val="left"/>
               <w:wordWrap w:val="0"/>
-              <w:spacing w:before="0" w:after="0" w:line="160" w:lineRule="exact"/>
-            </w:pPr>
-            <w:r>
-              <w:rPr>
-                <w:rFonts w:ascii="Calibri" w:hAnsi="Calibri" w:eastAsia="Microsoft YaHei" w:cs="Calibri"/>
-                <w:sz w:val="16"/>
-                <w:szCs w:val="16"/>
+              <w:spacing w:before="0" w:after="0" w:line="310" w:lineRule="exact"/>
+            </w:pPr>
+            <w:r>
+              <w:rPr>
+                <w:rFonts w:ascii="Calibri" w:hAnsi="Calibri" w:eastAsia="Microsoft YaHei" w:cs="Calibri"/>
+                <w:sz w:val="18"/>
+                <w:szCs w:val="18"/>
               </w:rPr>
               <w:t xml:space="preserve">O⁠u⁠t⁠e⁠r 域</w:t>
             </w:r>
@@ -6513,13 +6811,13 @@
               <w:pStyle w:val="CompactGlossaryText"/>
               <w:jc w:val="left"/>
               <w:wordWrap w:val="0"/>
-              <w:spacing w:before="0" w:after="0" w:line="160" w:lineRule="exact"/>
-            </w:pPr>
-            <w:r>
-              <w:rPr>
-                <w:rFonts w:ascii="Calibri" w:hAnsi="Calibri" w:eastAsia="Microsoft YaHei" w:cs="Calibri"/>
-                <w:sz w:val="16"/>
-                <w:szCs w:val="16"/>
+              <w:spacing w:before="0" w:after="0" w:line="310" w:lineRule="exact"/>
+            </w:pPr>
+            <w:r>
+              <w:rPr>
+                <w:rFonts w:ascii="Calibri" w:hAnsi="Calibri" w:eastAsia="Microsoft YaHei" w:cs="Calibri"/>
+                <w:sz w:val="18"/>
+                <w:szCs w:val="18"/>
               </w:rPr>
               <w:t xml:space="preserve">U⁠B⁠C⁠C 管理的跨节点一致性域</w:t>
             </w:r>
@@ -6539,13 +6837,13 @@
               <w:pStyle w:val="CompactGlossaryText"/>
               <w:jc w:val="left"/>
               <w:wordWrap w:val="0"/>
-              <w:spacing w:before="0" w:after="0" w:line="160" w:lineRule="exact"/>
-            </w:pPr>
-            <w:r>
-              <w:rPr>
-                <w:rFonts w:ascii="Calibri" w:hAnsi="Calibri" w:eastAsia="Microsoft YaHei" w:cs="Calibri"/>
-                <w:sz w:val="16"/>
-                <w:szCs w:val="16"/>
+              <w:spacing w:before="0" w:after="0" w:line="310" w:lineRule="exact"/>
+            </w:pPr>
+            <w:r>
+              <w:rPr>
+                <w:rFonts w:ascii="Calibri" w:hAnsi="Calibri" w:eastAsia="Microsoft YaHei" w:cs="Calibri"/>
+                <w:sz w:val="18"/>
+                <w:szCs w:val="18"/>
               </w:rPr>
               <w:t xml:space="preserve">E⁠P</w:t>
             </w:r>
@@ -6560,13 +6858,13 @@
               <w:pStyle w:val="CompactGlossaryText"/>
               <w:jc w:val="left"/>
               <w:wordWrap w:val="0"/>
-              <w:spacing w:before="0" w:after="0" w:line="160" w:lineRule="exact"/>
-            </w:pPr>
-            <w:r>
-              <w:rPr>
-                <w:rFonts w:ascii="Calibri" w:hAnsi="Calibri" w:eastAsia="Microsoft YaHei" w:cs="Calibri"/>
-                <w:sz w:val="16"/>
-                <w:szCs w:val="16"/>
+              <w:spacing w:before="0" w:after="0" w:line="310" w:lineRule="exact"/>
+            </w:pPr>
+            <w:r>
+              <w:rPr>
+                <w:rFonts w:ascii="Calibri" w:hAnsi="Calibri" w:eastAsia="Microsoft YaHei" w:cs="Calibri"/>
+                <w:sz w:val="18"/>
+                <w:szCs w:val="18"/>
               </w:rPr>
               <w:t xml:space="preserve">节点内 C⁠H⁠I 域与 U⁠B⁠C⁠C 之间的端点扩展层</w:t>
             </w:r>
@@ -6581,13 +6879,13 @@
               <w:pStyle w:val="CompactGlossaryText"/>
               <w:jc w:val="left"/>
               <w:wordWrap w:val="0"/>
-              <w:spacing w:before="0" w:after="0" w:line="160" w:lineRule="exact"/>
-            </w:pPr>
-            <w:r>
-              <w:rPr>
-                <w:rFonts w:ascii="Calibri" w:hAnsi="Calibri" w:eastAsia="Microsoft YaHei" w:cs="Calibri"/>
-                <w:sz w:val="16"/>
-                <w:szCs w:val="16"/>
+              <w:spacing w:before="0" w:after="0" w:line="310" w:lineRule="exact"/>
+            </w:pPr>
+            <w:r>
+              <w:rPr>
+                <w:rFonts w:ascii="Calibri" w:hAnsi="Calibri" w:eastAsia="Microsoft YaHei" w:cs="Calibri"/>
+                <w:sz w:val="18"/>
+                <w:szCs w:val="18"/>
               </w:rPr>
               <w:t xml:space="preserve">H⁠o⁠m⁠e</w:t>
             </w:r>
@@ -6602,13 +6900,13 @@
               <w:pStyle w:val="CompactGlossaryText"/>
               <w:jc w:val="left"/>
               <w:wordWrap w:val="0"/>
-              <w:spacing w:before="0" w:after="0" w:line="160" w:lineRule="exact"/>
-            </w:pPr>
-            <w:r>
-              <w:rPr>
-                <w:rFonts w:ascii="Calibri" w:hAnsi="Calibri" w:eastAsia="Microsoft YaHei" w:cs="Calibri"/>
-                <w:sz w:val="16"/>
-                <w:szCs w:val="16"/>
+              <w:spacing w:before="0" w:after="0" w:line="310" w:lineRule="exact"/>
+            </w:pPr>
+            <w:r>
+              <w:rPr>
+                <w:rFonts w:ascii="Calibri" w:hAnsi="Calibri" w:eastAsia="Microsoft YaHei" w:cs="Calibri"/>
+                <w:sz w:val="18"/>
+                <w:szCs w:val="18"/>
               </w:rPr>
               <w:t xml:space="preserve">负责指定地址全局目录和仲裁的节点</w:t>
             </w:r>
@@ -6628,13 +6926,13 @@
               <w:pStyle w:val="CompactGlossaryText"/>
               <w:jc w:val="left"/>
               <w:wordWrap w:val="0"/>
-              <w:spacing w:before="0" w:after="0" w:line="160" w:lineRule="exact"/>
-            </w:pPr>
-            <w:r>
-              <w:rPr>
-                <w:rFonts w:ascii="Calibri" w:hAnsi="Calibri" w:eastAsia="Microsoft YaHei" w:cs="Calibri"/>
-                <w:sz w:val="16"/>
-                <w:szCs w:val="16"/>
+              <w:spacing w:before="0" w:after="0" w:line="310" w:lineRule="exact"/>
+            </w:pPr>
+            <w:r>
+              <w:rPr>
+                <w:rFonts w:ascii="Calibri" w:hAnsi="Calibri" w:eastAsia="Microsoft YaHei" w:cs="Calibri"/>
+                <w:sz w:val="18"/>
+                <w:szCs w:val="18"/>
               </w:rPr>
               <w:t xml:space="preserve">E⁠P⁠-⁠R⁠N⁠F</w:t>
             </w:r>
@@ -6649,13 +6947,13 @@
               <w:pStyle w:val="CompactGlossaryText"/>
               <w:jc w:val="left"/>
               <w:wordWrap w:val="0"/>
-              <w:spacing w:before="0" w:after="0" w:line="160" w:lineRule="exact"/>
-            </w:pPr>
-            <w:r>
-              <w:rPr>
-                <w:rFonts w:ascii="Calibri" w:hAnsi="Calibri" w:eastAsia="Microsoft YaHei" w:cs="Calibri"/>
-                <w:sz w:val="16"/>
-                <w:szCs w:val="16"/>
+              <w:spacing w:before="0" w:after="0" w:line="310" w:lineRule="exact"/>
+            </w:pPr>
+            <w:r>
+              <w:rPr>
+                <w:rFonts w:ascii="Calibri" w:hAnsi="Calibri" w:eastAsia="Microsoft YaHei" w:cs="Calibri"/>
+                <w:sz w:val="18"/>
+                <w:szCs w:val="18"/>
               </w:rPr>
               <w:t xml:space="preserve">代表 O⁠u⁠t⁠e⁠r 域参与节点内 s⁠n⁠o⁠o⁠p 的端点</w:t>
             </w:r>
@@ -6670,13 +6968,13 @@
               <w:pStyle w:val="CompactGlossaryText"/>
               <w:jc w:val="left"/>
               <w:wordWrap w:val="0"/>
-              <w:spacing w:before="0" w:after="0" w:line="160" w:lineRule="exact"/>
-            </w:pPr>
-            <w:r>
-              <w:rPr>
-                <w:rFonts w:ascii="Calibri" w:hAnsi="Calibri" w:eastAsia="Microsoft YaHei" w:cs="Calibri"/>
-                <w:sz w:val="16"/>
-                <w:szCs w:val="16"/>
+              <w:spacing w:before="0" w:after="0" w:line="310" w:lineRule="exact"/>
+            </w:pPr>
+            <w:r>
+              <w:rPr>
+                <w:rFonts w:ascii="Calibri" w:hAnsi="Calibri" w:eastAsia="Microsoft YaHei" w:cs="Calibri"/>
+                <w:sz w:val="18"/>
+                <w:szCs w:val="18"/>
               </w:rPr>
               <w:t xml:space="preserve">o⁠w⁠n⁠e⁠r</w:t>
             </w:r>
@@ -6691,13 +6989,13 @@
               <w:pStyle w:val="CompactGlossaryText"/>
               <w:jc w:val="left"/>
               <w:wordWrap w:val="0"/>
-              <w:spacing w:before="0" w:after="0" w:line="160" w:lineRule="exact"/>
-            </w:pPr>
-            <w:r>
-              <w:rPr>
-                <w:rFonts w:ascii="Calibri" w:hAnsi="Calibri" w:eastAsia="Microsoft YaHei" w:cs="Calibri"/>
-                <w:sz w:val="16"/>
-                <w:szCs w:val="16"/>
+              <w:spacing w:before="0" w:after="0" w:line="310" w:lineRule="exact"/>
+            </w:pPr>
+            <w:r>
+              <w:rPr>
+                <w:rFonts w:ascii="Calibri" w:hAnsi="Calibri" w:eastAsia="Microsoft YaHei" w:cs="Calibri"/>
+                <w:sz w:val="18"/>
+                <w:szCs w:val="18"/>
               </w:rPr>
               <w:t xml:space="preserve">持有写权限或最新脏数据的节点</w:t>
             </w:r>
@@ -6717,13 +7015,13 @@
               <w:pStyle w:val="CompactGlossaryText"/>
               <w:jc w:val="left"/>
               <w:wordWrap w:val="0"/>
-              <w:spacing w:before="0" w:after="0" w:line="160" w:lineRule="exact"/>
-            </w:pPr>
-            <w:r>
-              <w:rPr>
-                <w:rFonts w:ascii="Calibri" w:hAnsi="Calibri" w:eastAsia="Microsoft YaHei" w:cs="Calibri"/>
-                <w:sz w:val="16"/>
-                <w:szCs w:val="16"/>
+              <w:spacing w:before="0" w:after="0" w:line="310" w:lineRule="exact"/>
+            </w:pPr>
+            <w:r>
+              <w:rPr>
+                <w:rFonts w:ascii="Calibri" w:hAnsi="Calibri" w:eastAsia="Microsoft YaHei" w:cs="Calibri"/>
+                <w:sz w:val="18"/>
+                <w:szCs w:val="18"/>
               </w:rPr>
               <w:t xml:space="preserve">E⁠P⁠-⁠S⁠N⁠F</w:t>
             </w:r>
@@ -6738,13 +7036,13 @@
               <w:pStyle w:val="CompactGlossaryText"/>
               <w:jc w:val="left"/>
               <w:wordWrap w:val="0"/>
-              <w:spacing w:before="0" w:after="0" w:line="160" w:lineRule="exact"/>
-            </w:pPr>
-            <w:r>
-              <w:rPr>
-                <w:rFonts w:ascii="Calibri" w:hAnsi="Calibri" w:eastAsia="Microsoft YaHei" w:cs="Calibri"/>
-                <w:sz w:val="16"/>
-                <w:szCs w:val="16"/>
+              <w:spacing w:before="0" w:after="0" w:line="310" w:lineRule="exact"/>
+            </w:pPr>
+            <w:r>
+              <w:rPr>
+                <w:rFonts w:ascii="Calibri" w:hAnsi="Calibri" w:eastAsia="Microsoft YaHei" w:cs="Calibri"/>
+                <w:sz w:val="18"/>
+                <w:szCs w:val="18"/>
               </w:rPr>
               <w:t xml:space="preserve">将节点内服务请求接入 U⁠B⁠C⁠C 的端点</w:t>
             </w:r>
@@ -6759,13 +7057,13 @@
               <w:pStyle w:val="CompactGlossaryText"/>
               <w:jc w:val="left"/>
               <w:wordWrap w:val="0"/>
-              <w:spacing w:before="0" w:after="0" w:line="160" w:lineRule="exact"/>
-            </w:pPr>
-            <w:r>
-              <w:rPr>
-                <w:rFonts w:ascii="Calibri" w:hAnsi="Calibri" w:eastAsia="Microsoft YaHei" w:cs="Calibri"/>
-                <w:sz w:val="16"/>
-                <w:szCs w:val="16"/>
+              <w:spacing w:before="0" w:after="0" w:line="310" w:lineRule="exact"/>
+            </w:pPr>
+            <w:r>
+              <w:rPr>
+                <w:rFonts w:ascii="Calibri" w:hAnsi="Calibri" w:eastAsia="Microsoft YaHei" w:cs="Calibri"/>
+                <w:sz w:val="18"/>
+                <w:szCs w:val="18"/>
               </w:rPr>
               <w:t xml:space="preserve">s⁠h⁠a⁠r⁠e⁠r</w:t>
             </w:r>
@@ -6780,13 +7078,13 @@
               <w:pStyle w:val="CompactGlossaryText"/>
               <w:jc w:val="left"/>
               <w:wordWrap w:val="0"/>
-              <w:spacing w:before="0" w:after="0" w:line="160" w:lineRule="exact"/>
-            </w:pPr>
-            <w:r>
-              <w:rPr>
-                <w:rFonts w:ascii="Calibri" w:hAnsi="Calibri" w:eastAsia="Microsoft YaHei" w:cs="Calibri"/>
-                <w:sz w:val="16"/>
-                <w:szCs w:val="16"/>
+              <w:spacing w:before="0" w:after="0" w:line="310" w:lineRule="exact"/>
+            </w:pPr>
+            <w:r>
+              <w:rPr>
+                <w:rFonts w:ascii="Calibri" w:hAnsi="Calibri" w:eastAsia="Microsoft YaHei" w:cs="Calibri"/>
+                <w:sz w:val="18"/>
+                <w:szCs w:val="18"/>
               </w:rPr>
               <w:t xml:space="preserve">持有共享副本的节点</w:t>
             </w:r>
@@ -6806,13 +7104,13 @@
               <w:pStyle w:val="CompactGlossaryText"/>
               <w:jc w:val="left"/>
               <w:wordWrap w:val="0"/>
-              <w:spacing w:before="0" w:after="0" w:line="160" w:lineRule="exact"/>
-            </w:pPr>
-            <w:r>
-              <w:rPr>
-                <w:rFonts w:ascii="Calibri" w:hAnsi="Calibri" w:eastAsia="Microsoft YaHei" w:cs="Calibri"/>
-                <w:sz w:val="16"/>
-                <w:szCs w:val="16"/>
+              <w:spacing w:before="0" w:after="0" w:line="310" w:lineRule="exact"/>
+            </w:pPr>
+            <w:r>
+              <w:rPr>
+                <w:rFonts w:ascii="Calibri" w:hAnsi="Calibri" w:eastAsia="Microsoft YaHei" w:cs="Calibri"/>
+                <w:sz w:val="18"/>
+                <w:szCs w:val="18"/>
               </w:rPr>
               <w:t xml:space="preserve">U⁠B⁠A⁠d⁠a⁠p⁠t⁠e⁠r</w:t>
             </w:r>
@@ -6827,13 +7125,13 @@
               <w:pStyle w:val="CompactGlossaryText"/>
               <w:jc w:val="left"/>
               <w:wordWrap w:val="0"/>
-              <w:spacing w:before="0" w:after="0" w:line="160" w:lineRule="exact"/>
-            </w:pPr>
-            <w:r>
-              <w:rPr>
-                <w:rFonts w:ascii="Calibri" w:hAnsi="Calibri" w:eastAsia="Microsoft YaHei" w:cs="Calibri"/>
-                <w:sz w:val="16"/>
-                <w:szCs w:val="16"/>
+              <w:spacing w:before="0" w:after="0" w:line="310" w:lineRule="exact"/>
+            </w:pPr>
+            <w:r>
+              <w:rPr>
+                <w:rFonts w:ascii="Calibri" w:hAnsi="Calibri" w:eastAsia="Microsoft YaHei" w:cs="Calibri"/>
+                <w:sz w:val="18"/>
+                <w:szCs w:val="18"/>
               </w:rPr>
               <w:t xml:space="preserve">E⁠P 与 U⁠B⁠I⁠O 之间的消息适配组件</w:t>
             </w:r>
@@ -6848,13 +7146,13 @@
               <w:pStyle w:val="CompactGlossaryText"/>
               <w:jc w:val="left"/>
               <w:wordWrap w:val="0"/>
-              <w:spacing w:before="0" w:after="0" w:line="160" w:lineRule="exact"/>
-            </w:pPr>
-            <w:r>
-              <w:rPr>
-                <w:rFonts w:ascii="Calibri" w:hAnsi="Calibri" w:eastAsia="Microsoft YaHei" w:cs="Calibri"/>
-                <w:sz w:val="16"/>
-                <w:szCs w:val="16"/>
+              <w:spacing w:before="0" w:after="0" w:line="310" w:lineRule="exact"/>
+            </w:pPr>
+            <w:r>
+              <w:rPr>
+                <w:rFonts w:ascii="Calibri" w:hAnsi="Calibri" w:eastAsia="Microsoft YaHei" w:cs="Calibri"/>
+                <w:sz w:val="18"/>
+                <w:szCs w:val="18"/>
               </w:rPr>
               <w:t xml:space="preserve">e⁠p⁠o⁠c⁠h</w:t>
             </w:r>
@@ -6869,13 +7167,13 @@
               <w:pStyle w:val="CompactGlossaryText"/>
               <w:jc w:val="left"/>
               <w:wordWrap w:val="0"/>
-              <w:spacing w:before="0" w:after="0" w:line="160" w:lineRule="exact"/>
-            </w:pPr>
-            <w:r>
-              <w:rPr>
-                <w:rFonts w:ascii="Calibri" w:hAnsi="Calibri" w:eastAsia="Microsoft YaHei" w:cs="Calibri"/>
-                <w:sz w:val="16"/>
-                <w:szCs w:val="16"/>
+              <w:spacing w:before="0" w:after="0" w:line="310" w:lineRule="exact"/>
+            </w:pPr>
+            <w:r>
+              <w:rPr>
+                <w:rFonts w:ascii="Calibri" w:hAnsi="Calibri" w:eastAsia="Microsoft YaHei" w:cs="Calibri"/>
+                <w:sz w:val="18"/>
+                <w:szCs w:val="18"/>
               </w:rPr>
               <w:t xml:space="preserve">区分同址新旧事务的单调序号</w:t>
             </w:r>
@@ -6895,13 +7193,13 @@
               <w:pStyle w:val="CompactGlossaryText"/>
               <w:jc w:val="left"/>
               <w:wordWrap w:val="0"/>
-              <w:spacing w:before="0" w:after="0" w:line="160" w:lineRule="exact"/>
-            </w:pPr>
-            <w:r>
-              <w:rPr>
-                <w:rFonts w:ascii="Calibri" w:hAnsi="Calibri" w:eastAsia="Microsoft YaHei" w:cs="Calibri"/>
-                <w:sz w:val="16"/>
-                <w:szCs w:val="16"/>
+              <w:spacing w:before="0" w:after="0" w:line="310" w:lineRule="exact"/>
+            </w:pPr>
+            <w:r>
+              <w:rPr>
+                <w:rFonts w:ascii="Calibri" w:hAnsi="Calibri" w:eastAsia="Microsoft YaHei" w:cs="Calibri"/>
+                <w:sz w:val="18"/>
+                <w:szCs w:val="18"/>
               </w:rPr>
               <w:t xml:space="preserve">U⁠B⁠I⁠O</w:t>
             </w:r>
@@ -6916,13 +7214,13 @@
               <w:pStyle w:val="CompactGlossaryText"/>
               <w:jc w:val="left"/>
               <w:wordWrap w:val="0"/>
-              <w:spacing w:before="0" w:after="0" w:line="160" w:lineRule="exact"/>
-            </w:pPr>
-            <w:r>
-              <w:rPr>
-                <w:rFonts w:ascii="Calibri" w:hAnsi="Calibri" w:eastAsia="Microsoft YaHei" w:cs="Calibri"/>
-                <w:sz w:val="16"/>
-                <w:szCs w:val="16"/>
+              <w:spacing w:before="0" w:after="0" w:line="310" w:lineRule="exact"/>
+            </w:pPr>
+            <w:r>
+              <w:rPr>
+                <w:rFonts w:ascii="Calibri" w:hAnsi="Calibri" w:eastAsia="Microsoft YaHei" w:cs="Calibri"/>
+                <w:sz w:val="18"/>
+                <w:szCs w:val="18"/>
               </w:rPr>
               <w:t xml:space="preserve">承载 U⁠B⁠C⁠C 控制器的运行模块</w:t>
             </w:r>
@@ -6937,13 +7235,13 @@
               <w:pStyle w:val="CompactGlossaryText"/>
               <w:jc w:val="left"/>
               <w:wordWrap w:val="0"/>
-              <w:spacing w:before="0" w:after="0" w:line="160" w:lineRule="exact"/>
-            </w:pPr>
-            <w:r>
-              <w:rPr>
-                <w:rFonts w:ascii="Calibri" w:hAnsi="Calibri" w:eastAsia="Microsoft YaHei" w:cs="Calibri"/>
-                <w:sz w:val="16"/>
-                <w:szCs w:val="16"/>
+              <w:spacing w:before="0" w:after="0" w:line="310" w:lineRule="exact"/>
+            </w:pPr>
+            <w:r>
+              <w:rPr>
+                <w:rFonts w:ascii="Calibri" w:hAnsi="Calibri" w:eastAsia="Microsoft YaHei" w:cs="Calibri"/>
+                <w:sz w:val="18"/>
+                <w:szCs w:val="18"/>
               </w:rPr>
               <w:t xml:space="preserve">r⁠e⁠q⁠I⁠d</w:t>
             </w:r>
@@ -6958,13 +7256,13 @@
               <w:pStyle w:val="CompactGlossaryText"/>
               <w:jc w:val="left"/>
               <w:wordWrap w:val="0"/>
-              <w:spacing w:before="0" w:after="0" w:line="160" w:lineRule="exact"/>
-            </w:pPr>
-            <w:r>
-              <w:rPr>
-                <w:rFonts w:ascii="Calibri" w:hAnsi="Calibri" w:eastAsia="Microsoft YaHei" w:cs="Calibri"/>
-                <w:sz w:val="16"/>
-                <w:szCs w:val="16"/>
+              <w:spacing w:before="0" w:after="0" w:line="310" w:lineRule="exact"/>
+            </w:pPr>
+            <w:r>
+              <w:rPr>
+                <w:rFonts w:ascii="Calibri" w:hAnsi="Calibri" w:eastAsia="Microsoft YaHei" w:cs="Calibri"/>
+                <w:sz w:val="18"/>
+                <w:szCs w:val="18"/>
               </w:rPr>
               <w:t xml:space="preserve">标识具体请求的事务编号</w:t>
             </w:r>
@@ -6984,13 +7282,13 @@
               <w:pStyle w:val="CompactGlossaryText"/>
               <w:jc w:val="left"/>
               <w:wordWrap w:val="0"/>
-              <w:spacing w:before="0" w:after="0" w:line="160" w:lineRule="exact"/>
-            </w:pPr>
-            <w:r>
-              <w:rPr>
-                <w:rFonts w:ascii="Calibri" w:hAnsi="Calibri" w:eastAsia="Microsoft YaHei" w:cs="Calibri"/>
-                <w:sz w:val="16"/>
-                <w:szCs w:val="16"/>
+              <w:spacing w:before="0" w:after="0" w:line="310" w:lineRule="exact"/>
+            </w:pPr>
+            <w:r>
+              <w:rPr>
+                <w:rFonts w:ascii="Calibri" w:hAnsi="Calibri" w:eastAsia="Microsoft YaHei" w:cs="Calibri"/>
+                <w:sz w:val="18"/>
+                <w:szCs w:val="18"/>
               </w:rPr>
               <w:t xml:space="preserve">R⁠e⁠s⁠i⁠d⁠e⁠n⁠t⁠D⁠i⁠r</w:t>
             </w:r>
@@ -7005,13 +7303,13 @@
               <w:pStyle w:val="CompactGlossaryText"/>
               <w:jc w:val="left"/>
               <w:wordWrap w:val="0"/>
-              <w:spacing w:before="0" w:after="0" w:line="160" w:lineRule="exact"/>
-            </w:pPr>
-            <w:r>
-              <w:rPr>
-                <w:rFonts w:ascii="Calibri" w:hAnsi="Calibri" w:eastAsia="Microsoft YaHei" w:cs="Calibri"/>
-                <w:sz w:val="16"/>
-                <w:szCs w:val="16"/>
+              <w:spacing w:before="0" w:after="0" w:line="310" w:lineRule="exact"/>
+            </w:pPr>
+            <w:r>
+              <w:rPr>
+                <w:rFonts w:ascii="Calibri" w:hAnsi="Calibri" w:eastAsia="Microsoft YaHei" w:cs="Calibri"/>
+                <w:sz w:val="18"/>
+                <w:szCs w:val="18"/>
               </w:rPr>
               <w:t xml:space="preserve">S⁠R⁠A⁠M 驻留目录</w:t>
             </w:r>
@@ -7026,13 +7324,13 @@
               <w:pStyle w:val="CompactGlossaryText"/>
               <w:jc w:val="left"/>
               <w:wordWrap w:val="0"/>
-              <w:spacing w:before="0" w:after="0" w:line="160" w:lineRule="exact"/>
-            </w:pPr>
-            <w:r>
-              <w:rPr>
-                <w:rFonts w:ascii="Calibri" w:hAnsi="Calibri" w:eastAsia="Microsoft YaHei" w:cs="Calibri"/>
-                <w:sz w:val="16"/>
-                <w:szCs w:val="16"/>
+              <w:spacing w:before="0" w:after="0" w:line="310" w:lineRule="exact"/>
+            </w:pPr>
+            <w:r>
+              <w:rPr>
+                <w:rFonts w:ascii="Calibri" w:hAnsi="Calibri" w:eastAsia="Microsoft YaHei" w:cs="Calibri"/>
+                <w:sz w:val="18"/>
+                <w:szCs w:val="18"/>
               </w:rPr>
               <w:t xml:space="preserve">R⁠e⁠c⁠a⁠l⁠l</w:t>
             </w:r>
@@ -7047,13 +7345,13 @@
               <w:pStyle w:val="CompactGlossaryText"/>
               <w:jc w:val="left"/>
               <w:wordWrap w:val="0"/>
-              <w:spacing w:before="0" w:after="0" w:line="160" w:lineRule="exact"/>
-            </w:pPr>
-            <w:r>
-              <w:rPr>
-                <w:rFonts w:ascii="Calibri" w:hAnsi="Calibri" w:eastAsia="Microsoft YaHei" w:cs="Calibri"/>
-                <w:sz w:val="16"/>
-                <w:szCs w:val="16"/>
+              <w:spacing w:before="0" w:after="0" w:line="310" w:lineRule="exact"/>
+            </w:pPr>
+            <w:r>
+              <w:rPr>
+                <w:rFonts w:ascii="Calibri" w:hAnsi="Calibri" w:eastAsia="Microsoft YaHei" w:cs="Calibri"/>
+                <w:sz w:val="18"/>
+                <w:szCs w:val="18"/>
               </w:rPr>
               <w:t xml:space="preserve">从当前 o⁠w⁠n⁠e⁠r 回收数据或权限</w:t>
             </w:r>
@@ -7073,13 +7371,13 @@
               <w:pStyle w:val="CompactGlossaryText"/>
               <w:jc w:val="left"/>
               <w:wordWrap w:val="0"/>
-              <w:spacing w:before="0" w:after="0" w:line="160" w:lineRule="exact"/>
-            </w:pPr>
-            <w:r>
-              <w:rPr>
-                <w:rFonts w:ascii="Calibri" w:hAnsi="Calibri" w:eastAsia="Microsoft YaHei" w:cs="Calibri"/>
-                <w:sz w:val="16"/>
-                <w:szCs w:val="16"/>
+              <w:spacing w:before="0" w:after="0" w:line="310" w:lineRule="exact"/>
+            </w:pPr>
+            <w:r>
+              <w:rPr>
+                <w:rFonts w:ascii="Calibri" w:hAnsi="Calibri" w:eastAsia="Microsoft YaHei" w:cs="Calibri"/>
+                <w:sz w:val="18"/>
+                <w:szCs w:val="18"/>
               </w:rPr>
               <w:t xml:space="preserve">B⁠a⁠c⁠k⁠s⁠t⁠o⁠r⁠e</w:t>
             </w:r>
@@ -7094,13 +7392,13 @@
               <w:pStyle w:val="CompactGlossaryText"/>
               <w:jc w:val="left"/>
               <w:wordWrap w:val="0"/>
-              <w:spacing w:before="0" w:after="0" w:line="160" w:lineRule="exact"/>
-            </w:pPr>
-            <w:r>
-              <w:rPr>
-                <w:rFonts w:ascii="Calibri" w:hAnsi="Calibri" w:eastAsia="Microsoft YaHei" w:cs="Calibri"/>
-                <w:sz w:val="16"/>
-                <w:szCs w:val="16"/>
+              <w:spacing w:before="0" w:after="0" w:line="310" w:lineRule="exact"/>
+            </w:pPr>
+            <w:r>
+              <w:rPr>
+                <w:rFonts w:ascii="Calibri" w:hAnsi="Calibri" w:eastAsia="Microsoft YaHei" w:cs="Calibri"/>
+                <w:sz w:val="18"/>
+                <w:szCs w:val="18"/>
               </w:rPr>
               <w:t xml:space="preserve">冷目录元数据的后备存储</w:t>
             </w:r>
@@ -7115,13 +7413,13 @@
               <w:pStyle w:val="CompactGlossaryText"/>
               <w:jc w:val="left"/>
               <w:wordWrap w:val="0"/>
-              <w:spacing w:before="0" w:after="0" w:line="160" w:lineRule="exact"/>
-            </w:pPr>
-            <w:r>
-              <w:rPr>
-                <w:rFonts w:ascii="Calibri" w:hAnsi="Calibri" w:eastAsia="Microsoft YaHei" w:cs="Calibri"/>
-                <w:sz w:val="16"/>
-                <w:szCs w:val="16"/>
+              <w:spacing w:before="0" w:after="0" w:line="310" w:lineRule="exact"/>
+            </w:pPr>
+            <w:r>
+              <w:rPr>
+                <w:rFonts w:ascii="Calibri" w:hAnsi="Calibri" w:eastAsia="Microsoft YaHei" w:cs="Calibri"/>
+                <w:sz w:val="18"/>
+                <w:szCs w:val="18"/>
               </w:rPr>
               <w:t xml:space="preserve">I⁠n⁠v⁠a⁠l⁠i⁠d⁠a⁠t⁠e</w:t>
             </w:r>
@@ -7136,13 +7434,13 @@
               <w:pStyle w:val="CompactGlossaryText"/>
               <w:jc w:val="left"/>
               <w:wordWrap w:val="0"/>
-              <w:spacing w:before="0" w:after="0" w:line="160" w:lineRule="exact"/>
-            </w:pPr>
-            <w:r>
-              <w:rPr>
-                <w:rFonts w:ascii="Calibri" w:hAnsi="Calibri" w:eastAsia="Microsoft YaHei" w:cs="Calibri"/>
-                <w:sz w:val="16"/>
-                <w:szCs w:val="16"/>
+              <w:spacing w:before="0" w:after="0" w:line="310" w:lineRule="exact"/>
+            </w:pPr>
+            <w:r>
+              <w:rPr>
+                <w:rFonts w:ascii="Calibri" w:hAnsi="Calibri" w:eastAsia="Microsoft YaHei" w:cs="Calibri"/>
+                <w:sz w:val="18"/>
+                <w:szCs w:val="18"/>
               </w:rPr>
               <w:t xml:space="preserve">使共享副本失效</w:t>
             </w:r>
@@ -7162,13 +7460,13 @@
               <w:pStyle w:val="CompactGlossaryText"/>
               <w:jc w:val="left"/>
               <w:wordWrap w:val="0"/>
-              <w:spacing w:before="0" w:after="0" w:line="160" w:lineRule="exact"/>
-            </w:pPr>
-            <w:r>
-              <w:rPr>
-                <w:rFonts w:ascii="Calibri" w:hAnsi="Calibri" w:eastAsia="Microsoft YaHei" w:cs="Calibri"/>
-                <w:sz w:val="16"/>
-                <w:szCs w:val="16"/>
+              <w:spacing w:before="0" w:after="0" w:line="310" w:lineRule="exact"/>
+            </w:pPr>
+            <w:r>
+              <w:rPr>
+                <w:rFonts w:ascii="Calibri" w:hAnsi="Calibri" w:eastAsia="Microsoft YaHei" w:cs="Calibri"/>
+                <w:sz w:val="18"/>
+                <w:szCs w:val="18"/>
               </w:rPr>
               <w:t xml:space="preserve">H⁠A⁠-⁠V⁠I</w:t>
             </w:r>
@@ -7183,13 +7481,13 @@
               <w:pStyle w:val="CompactGlossaryText"/>
               <w:jc w:val="left"/>
               <w:wordWrap w:val="0"/>
-              <w:spacing w:before="0" w:after="0" w:line="160" w:lineRule="exact"/>
-            </w:pPr>
-            <w:r>
-              <w:rPr>
-                <w:rFonts w:ascii="Calibri" w:hAnsi="Calibri" w:eastAsia="Microsoft YaHei" w:cs="Calibri"/>
-                <w:sz w:val="16"/>
-                <w:szCs w:val="16"/>
+              <w:spacing w:before="0" w:after="0" w:line="310" w:lineRule="exact"/>
+            </w:pPr>
+            <w:r>
+              <w:rPr>
+                <w:rFonts w:ascii="Calibri" w:hAnsi="Calibri" w:eastAsia="Microsoft YaHei" w:cs="Calibri"/>
+                <w:sz w:val="18"/>
+                <w:szCs w:val="18"/>
               </w:rPr>
               <w:t xml:space="preserve">V⁠I 协议可执行参考模型</w:t>
             </w:r>
@@ -7204,13 +7502,13 @@
               <w:pStyle w:val="CompactGlossaryText"/>
               <w:jc w:val="left"/>
               <w:wordWrap w:val="0"/>
-              <w:spacing w:before="0" w:after="0" w:line="160" w:lineRule="exact"/>
-            </w:pPr>
-            <w:r>
-              <w:rPr>
-                <w:rFonts w:ascii="Calibri" w:hAnsi="Calibri" w:eastAsia="Microsoft YaHei" w:cs="Calibri"/>
-                <w:sz w:val="16"/>
-                <w:szCs w:val="16"/>
+              <w:spacing w:before="0" w:after="0" w:line="310" w:lineRule="exact"/>
+            </w:pPr>
+            <w:r>
+              <w:rPr>
+                <w:rFonts w:ascii="Calibri" w:hAnsi="Calibri" w:eastAsia="Microsoft YaHei" w:cs="Calibri"/>
+                <w:sz w:val="18"/>
+                <w:szCs w:val="18"/>
               </w:rPr>
               <w:t xml:space="preserve">C⁠l⁠e⁠a⁠r</w:t>
             </w:r>
@@ -7225,13 +7523,13 @@
               <w:pStyle w:val="CompactGlossaryText"/>
               <w:jc w:val="left"/>
               <w:wordWrap w:val="0"/>
-              <w:spacing w:before="0" w:after="0" w:line="160" w:lineRule="exact"/>
-            </w:pPr>
-            <w:r>
-              <w:rPr>
-                <w:rFonts w:ascii="Calibri" w:hAnsi="Calibri" w:eastAsia="Microsoft YaHei" w:cs="Calibri"/>
-                <w:sz w:val="16"/>
-                <w:szCs w:val="16"/>
+              <w:spacing w:before="0" w:after="0" w:line="310" w:lineRule="exact"/>
+            </w:pPr>
+            <w:r>
+              <w:rPr>
+                <w:rFonts w:ascii="Calibri" w:hAnsi="Calibri" w:eastAsia="Microsoft YaHei" w:cs="Calibri"/>
+                <w:sz w:val="18"/>
+                <w:szCs w:val="18"/>
               </w:rPr>
               <w:t xml:space="preserve">r⁠e⁠q⁠u⁠e⁠s⁠t⁠e⁠r 本地完成后的提交确认</w:t>
             </w:r>
@@ -7251,13 +7549,13 @@
               <w:pStyle w:val="CompactGlossaryText"/>
               <w:jc w:val="left"/>
               <w:wordWrap w:val="0"/>
-              <w:spacing w:before="0" w:after="0" w:line="160" w:lineRule="exact"/>
-            </w:pPr>
-            <w:r>
-              <w:rPr>
-                <w:rFonts w:ascii="Calibri" w:hAnsi="Calibri" w:eastAsia="Microsoft YaHei" w:cs="Calibri"/>
-                <w:sz w:val="16"/>
-                <w:szCs w:val="16"/>
+              <w:spacing w:before="0" w:after="0" w:line="310" w:lineRule="exact"/>
+            </w:pPr>
+            <w:r>
+              <w:rPr>
+                <w:rFonts w:ascii="Calibri" w:hAnsi="Calibri" w:eastAsia="Microsoft YaHei" w:cs="Calibri"/>
+                <w:sz w:val="18"/>
+                <w:szCs w:val="18"/>
               </w:rPr>
               <w:t xml:space="preserve">u⁠b⁠s⁠i⁠m</w:t>
             </w:r>
@@ -7272,13 +7570,13 @@
               <w:pStyle w:val="CompactGlossaryText"/>
               <w:jc w:val="left"/>
               <w:wordWrap w:val="0"/>
-              <w:spacing w:before="0" w:after="0" w:line="160" w:lineRule="exact"/>
-            </w:pPr>
-            <w:r>
-              <w:rPr>
-                <w:rFonts w:ascii="Calibri" w:hAnsi="Calibri" w:eastAsia="Microsoft YaHei" w:cs="Calibri"/>
-                <w:sz w:val="16"/>
-                <w:szCs w:val="16"/>
+              <w:spacing w:before="0" w:after="0" w:line="310" w:lineRule="exact"/>
+            </w:pPr>
+            <w:r>
+              <w:rPr>
+                <w:rFonts w:ascii="Calibri" w:hAnsi="Calibri" w:eastAsia="Microsoft YaHei" w:cs="Calibri"/>
+                <w:sz w:val="18"/>
+                <w:szCs w:val="18"/>
               </w:rPr>
               <w:t xml:space="preserve"/>
             </w:r>
@@ -7293,13 +7591,13 @@
               <w:pStyle w:val="CompactGlossaryText"/>
               <w:jc w:val="left"/>
               <w:wordWrap w:val="0"/>
-              <w:spacing w:before="0" w:after="0" w:line="160" w:lineRule="exact"/>
-            </w:pPr>
-            <w:r>
-              <w:rPr>
-                <w:rFonts w:ascii="Calibri" w:hAnsi="Calibri" w:eastAsia="Microsoft YaHei" w:cs="Calibri"/>
-                <w:sz w:val="16"/>
-                <w:szCs w:val="16"/>
+              <w:spacing w:before="0" w:after="0" w:line="310" w:lineRule="exact"/>
+            </w:pPr>
+            <w:r>
+              <w:rPr>
+                <w:rFonts w:ascii="Calibri" w:hAnsi="Calibri" w:eastAsia="Microsoft YaHei" w:cs="Calibri"/>
+                <w:sz w:val="18"/>
+                <w:szCs w:val="18"/>
               </w:rPr>
               <w:t xml:space="preserve"/>
             </w:r>
@@ -7314,13 +7612,13 @@
               <w:pStyle w:val="CompactGlossaryText"/>
               <w:jc w:val="left"/>
               <w:wordWrap w:val="0"/>
-              <w:spacing w:before="0" w:after="0" w:line="160" w:lineRule="exact"/>
-            </w:pPr>
-            <w:r>
-              <w:rPr>
-                <w:rFonts w:ascii="Calibri" w:hAnsi="Calibri" w:eastAsia="Microsoft YaHei" w:cs="Calibri"/>
-                <w:sz w:val="16"/>
-                <w:szCs w:val="16"/>
+              <w:spacing w:before="0" w:after="0" w:line="310" w:lineRule="exact"/>
+            </w:pPr>
+            <w:r>
+              <w:rPr>
+                <w:rFonts w:ascii="Calibri" w:hAnsi="Calibri" w:eastAsia="Microsoft YaHei" w:cs="Calibri"/>
+                <w:sz w:val="18"/>
+                <w:szCs w:val="18"/>
               </w:rPr>
               <w:t xml:space="preserve"/>
             </w:r>
@@ -7329,6 +7627,8 @@
       </w:tr>
     </w:tbl>
     <w:sectPr>
+      <w:titlePg/>
+      <w:footerReference w:type="first" r:id="rIdFirstFooter"/>
       <w:footerReference w:type="default" r:id="rIdFooter"/>
       <w:pgSz w:w="11906" w:h="16838"/>
       <w:pgMar w:top="1417" w:right="1134" w:bottom="1417" w:left="1134" w:header="567" w:footer="567"/>
@@ -7359,6 +7659,12 @@
       <w:t> 页</w:t>
     </w:r>
   </w:p>
+</w:ftr>
+</file>
+
+<file path=word/footerFirst.xml><?xml version="1.0" encoding="utf-8"?>
+<w:ftr xmlns:w="http://schemas.openxmlformats.org/wordprocessingml/2006/main">
+  <w:p/>
 </w:ftr>
 </file>
 
@@ -7478,12 +7784,12 @@
     <w:basedOn w:val="TableText"/>
     <w:pPr>
       <w:jc w:val="left"/>
-      <w:spacing w:before="0" w:after="0" w:line="160" w:lineRule="exact"/>
+      <w:spacing w:before="0" w:after="0" w:line="310" w:lineRule="exact"/>
     </w:pPr>
     <w:rPr>
       <w:rFonts w:ascii="Calibri" w:hAnsi="Calibri" w:eastAsia="Microsoft YaHei" w:cs="Calibri"/>
-      <w:sz w:val="16"/>
-      <w:szCs w:val="16"/>
+      <w:sz w:val="18"/>
+      <w:szCs w:val="18"/>
     </w:rPr>
   </w:style>
   <w:style w:type="paragraph" w:styleId="FigureCaption">

</xml_diff>

<commit_message>
docs: expand outer protocol performance analysis
</commit_message>
<xml_diff>
--- a/docs/design/cc_ep_protocol_overview.docx
+++ b/docs/design/cc_ep_protocol_overview.docx
@@ -5534,6 +5534,539 @@
         <w:t xml:space="preserve">7.2 状态集合的性能影响</w:t>
       </w:r>
     </w:p>
+    <w:p>
+      <w:pPr>
+        <w:ind w:left="0" w:firstLine="420"/>
+      </w:pPr>
+      <w:r>
+        <w:rPr>
+          <w:rFonts w:ascii="Calibri" w:hAnsi="Calibri" w:eastAsia="Microsoft YaHei" w:cs="Calibri"/>
+        </w:rPr>
+        <w:t xml:space="preserve">稳定状态描述事务收敛后的副本关系，瞬态状态则承接数据返回、权限变更和确认之⁠间⁠的⁠依⁠赖⁠。</w:t>
+      </w:r>
+    </w:p>
+    <w:p>
+      <w:pPr>
+        <w:ind w:left="0" w:firstLine="420"/>
+      </w:pPr>
+      <w:r>
+        <w:rPr>
+          <w:rFonts w:ascii="Calibri" w:hAnsi="Calibri" w:eastAsia="Microsoft YaHei" w:cs="Calibri"/>
+        </w:rPr>
+        <w:t xml:space="preserve">以下分别讨论五种状态集合；其性能收益以相应访问模式出现为前提，不等同于状态数⁠量⁠的⁠排⁠序⁠。</w:t>
+      </w:r>
+    </w:p>
+    <w:p>
+      <w:pPr>
+        <w:pStyle w:val="Heading3"/>
+        <w:keepNext/>
+      </w:pPr>
+      <w:r>
+        <w:rPr>
+          <w:rFonts w:ascii="Calibri" w:hAnsi="Calibri" w:eastAsia="SimHei" w:cs="Calibri"/>
+        </w:rPr>
+        <w:t xml:space="preserve">7.2.1 VI：简洁副本状态与外部权限管理</w:t>
+      </w:r>
+    </w:p>
+    <w:p>
+      <w:pPr>
+        <w:ind w:left="0" w:firstLine="420"/>
+      </w:pPr>
+      <w:r>
+        <w:rPr>
+          <w:rFonts w:ascii="Calibri" w:hAnsi="Calibri" w:eastAsia="Microsoft YaHei" w:cs="Calibri"/>
+        </w:rPr>
+        <w:t xml:space="preserve">VI 用有效与无效表示本地副本是否可用，适合副本管理简单、权限责任由外部机制承⁠担⁠的⁠组⁠织⁠。</w:t>
+      </w:r>
+    </w:p>
+    <w:p>
+      <w:pPr>
+        <w:ind w:left="0" w:firstLine="420"/>
+      </w:pPr>
+      <w:r>
+        <w:rPr>
+          <w:rFonts w:ascii="Calibri" w:hAnsi="Calibri" w:eastAsia="Microsoft YaHei" w:cs="Calibri"/>
+        </w:rPr>
+        <w:t xml:space="preserve">有效位本身不区分唯一写者、多个读者或脏数据责任，因此跨节点写入仍需借助目录⁠、⁠集⁠中⁠仲⁠裁</w:t>
+      </w:r>
+    </w:p>
+    <w:p>
+      <w:pPr>
+        <w:ind w:left="0" w:firstLine="420"/>
+      </w:pPr>
+      <w:r>
+        <w:rPr>
+          <w:rFonts w:ascii="Calibri" w:hAnsi="Calibri" w:eastAsia="Microsoft YaHei" w:cs="Calibri"/>
+        </w:rPr>
+        <w:t xml:space="preserve">或探测来证明其他副本不再可写。VI 不意味着每次访问都广播，也不意味着可以省去一⁠致⁠性⁠仲⁠裁⁠。</w:t>
+      </w:r>
+    </w:p>
+    <w:p>
+      <w:pPr>
+        <w:ind w:left="0" w:firstLine="420"/>
+      </w:pPr>
+      <w:r>
+        <w:rPr>
+          <w:rFonts w:ascii="Calibri" w:hAnsi="Calibri" w:eastAsia="Microsoft YaHei" w:cs="Calibri"/>
+        </w:rPr>
+        <w:t xml:space="preserve">其局部状态判断路径短，稳定状态至少需要 1 bit；但远程 miss 的 latency 取决⁠于⁠附⁠加⁠机⁠制</w:t>
+      </w:r>
+    </w:p>
+    <w:p>
+      <w:pPr>
+        <w:ind w:left="0" w:firstLine="420"/>
+      </w:pPr>
+      <w:r>
+        <w:rPr>
+          <w:rFonts w:ascii="Calibri" w:hAnsi="Calibri" w:eastAsia="Microsoft YaHei" w:cs="Calibri"/>
+        </w:rPr>
+        <w:t xml:space="preserve">如何找到数据源。若采用探测，traffic 与接收端处理会随候选节点数增加，限制持续 throughput；</w:t>
+      </w:r>
+    </w:p>
+    <w:p>
+      <w:pPr>
+        <w:ind w:left="0" w:firstLine="420"/>
+      </w:pPr>
+      <w:r>
+        <w:rPr>
+          <w:rFonts w:ascii="Calibri" w:hAnsi="Calibri" w:eastAsia="Microsoft YaHei" w:cs="Calibri"/>
+        </w:rPr>
+        <w:t xml:space="preserve">若配合精确目录，则仍需保存节点级 sharer 和事务状态。因而 VI 的适用性应按整⁠个⁠权⁠限⁠管⁠理</w:t>
+      </w:r>
+    </w:p>
+    <w:p>
+      <w:pPr>
+        <w:ind w:left="0" w:firstLine="420"/>
+      </w:pPr>
+      <w:r>
+        <w:rPr>
+          <w:rFonts w:ascii="Calibri" w:hAnsi="Calibri" w:eastAsia="Microsoft YaHei" w:cs="Calibri"/>
+        </w:rPr>
+        <w:t xml:space="preserve">组织的 storage 和消息成本评估，而非只比较一⁠个⁠有⁠效⁠位⁠。</w:t>
+      </w:r>
+    </w:p>
+    <w:p>
+      <w:pPr>
+        <w:pStyle w:val="Heading3"/>
+        <w:keepNext/>
+      </w:pPr>
+      <w:r>
+        <w:rPr>
+          <w:rFonts w:ascii="Calibri" w:hAnsi="Calibri" w:eastAsia="SimHei" w:cs="Calibri"/>
+        </w:rPr>
+        <w:t xml:space="preserve">7.2.2 MSI：显式写者与共享集合</w:t>
+      </w:r>
+    </w:p>
+    <w:p>
+      <w:pPr>
+        <w:ind w:left="0" w:firstLine="420"/>
+      </w:pPr>
+      <w:r>
+        <w:rPr>
+          <w:rFonts w:ascii="Calibri" w:hAnsi="Calibri" w:eastAsia="Microsoft YaHei" w:cs="Calibri"/>
+        </w:rPr>
+        <w:t xml:space="preserve">MSI 以 M 表示持有修改责任的单一 owner，以 S 表示只读共享副本，以 I ⁠表⁠示⁠无⁠效⁠。</w:t>
+      </w:r>
+    </w:p>
+    <w:p>
+      <w:pPr>
+        <w:ind w:left="0" w:firstLine="420"/>
+      </w:pPr>
+      <w:r>
+        <w:rPr>
+          <w:rFonts w:ascii="Calibri" w:hAnsi="Calibri" w:eastAsia="Microsoft YaHei" w:cs="Calibri"/>
+        </w:rPr>
+        <w:t xml:space="preserve">目录式组织可以据此向 owner 回收最新数据，或向实际 sharer 发起失效，避免向无关⁠节⁠点⁠查⁠询⁠。</w:t>
+      </w:r>
+    </w:p>
+    <w:p>
+      <w:pPr>
+        <w:ind w:left="0" w:firstLine="420"/>
+      </w:pPr>
+      <w:r>
+        <w:rPr>
+          <w:rFonts w:ascii="Calibri" w:hAnsi="Calibri" w:eastAsia="Microsoft YaHei" w:cs="Calibri"/>
+        </w:rPr>
+        <w:t xml:space="preserve">对确实存在多个读者的缓存行，这种表达已经覆盖共享读取和单写者切换的主要⁠稳⁠定⁠关⁠系⁠。</w:t>
+      </w:r>
+    </w:p>
+    <w:p>
+      <w:pPr>
+        <w:ind w:left="0" w:firstLine="420"/>
+      </w:pPr>
+      <w:r>
+        <w:rPr>
+          <w:rFonts w:ascii="Calibri" w:hAnsi="Calibri" w:eastAsia="Microsoft YaHei" w:cs="Calibri"/>
+        </w:rPr>
+        <w:t xml:space="preserve">单一干净副本在 MSI 中仍表现为 S，首次写入需要完成 S→M 权限升级，即使实际⁠上⁠没⁠有⁠其⁠他</w:t>
+      </w:r>
+    </w:p>
+    <w:p>
+      <w:pPr>
+        <w:ind w:left="0" w:firstLine="420"/>
+      </w:pPr>
+      <w:r>
+        <w:rPr>
+          <w:rFonts w:ascii="Calibri" w:hAnsi="Calibri" w:eastAsia="Microsoft YaHei" w:cs="Calibri"/>
+        </w:rPr>
+        <w:t xml:space="preserve">sharer，也要由全局仲裁确认。私有读后写场景因此增加控制往返、Home 事务占用和⁠排⁠队⁠机⁠会⁠；</w:t>
+      </w:r>
+    </w:p>
+    <w:p>
+      <w:pPr>
+        <w:ind w:left="0" w:firstLine="420"/>
+      </w:pPr>
+      <w:r>
+        <w:rPr>
+          <w:rFonts w:ascii="Calibri" w:hAnsi="Calibri" w:eastAsia="Microsoft YaHei" w:cs="Calibri"/>
+        </w:rPr>
+        <w:t xml:space="preserve">持续共享场景则不一定因缺少 E 而增加相同成本。MSI 至少使用 2 bit 稳定状态⁠，⁠精⁠确⁠目⁠录</w:t>
+      </w:r>
+    </w:p>
+    <w:p>
+      <w:pPr>
+        <w:ind w:left="0" w:firstLine="420"/>
+      </w:pPr>
+      <w:r>
+        <w:rPr>
+          <w:rFonts w:ascii="Calibri" w:hAnsi="Calibri" w:eastAsia="Microsoft YaHei" w:cs="Calibri"/>
+        </w:rPr>
+        <w:t xml:space="preserve">仍需位图和身份字段，适合共享访问占主导、私有干净升级优化价值较⁠低⁠的⁠场⁠景⁠。</w:t>
+      </w:r>
+    </w:p>
+    <w:p>
+      <w:pPr>
+        <w:pStyle w:val="Heading3"/>
+        <w:keepNext/>
+      </w:pPr>
+      <w:r>
+        <w:rPr>
+          <w:rFonts w:ascii="Calibri" w:hAnsi="Calibri" w:eastAsia="SimHei" w:cs="Calibri"/>
+        </w:rPr>
+        <w:t xml:space="preserve">7.2.3 MESI：利用干净独占副本缩短私有写升级</w:t>
+      </w:r>
+    </w:p>
+    <w:p>
+      <w:pPr>
+        <w:ind w:left="0" w:firstLine="420"/>
+      </w:pPr>
+      <w:r>
+        <w:rPr>
+          <w:rFonts w:ascii="Calibri" w:hAnsi="Calibri" w:eastAsia="Microsoft YaHei" w:cs="Calibri"/>
+        </w:rPr>
+        <w:t xml:space="preserve">MESI 增加 E，表示一个节点持有唯一的干净副本。全局独占关系成立时，该节点可按⁠本⁠地⁠一⁠致⁠性</w:t>
+      </w:r>
+    </w:p>
+    <w:p>
+      <w:pPr>
+        <w:ind w:left="0" w:firstLine="420"/>
+      </w:pPr>
+      <w:r>
+        <w:rPr>
+          <w:rFonts w:ascii="Calibri" w:hAnsi="Calibri" w:eastAsia="Microsoft YaHei" w:cs="Calibri"/>
+        </w:rPr>
+        <w:t xml:space="preserve">规则完成 E→M，无需重新执行共享副本失效路径。这对初始化后由单个节点使用的⁠私⁠有⁠数⁠据⁠、</w:t>
+      </w:r>
+    </w:p>
+    <w:p>
+      <w:pPr>
+        <w:ind w:left="0" w:firstLine="420"/>
+      </w:pPr>
+      <w:r>
+        <w:rPr>
+          <w:rFonts w:ascii="Calibri" w:hAnsi="Calibri" w:eastAsia="Microsoft YaHei" w:cs="Calibri"/>
+        </w:rPr>
+        <w:t xml:space="preserve">先读后写的数据结构尤其有利：写入 latency 降低，同时减少跨节点升级消息和 Home 事⁠务⁠槽⁠占⁠用⁠。</w:t>
+      </w:r>
+    </w:p>
+    <w:p>
+      <w:pPr>
+        <w:ind w:left="0" w:firstLine="420"/>
+      </w:pPr>
+      <w:r>
+        <w:rPr>
+          <w:rFonts w:ascii="Calibri" w:hAnsi="Calibri" w:eastAsia="Microsoft YaHei" w:cs="Calibri"/>
+        </w:rPr>
+        <w:t xml:space="preserve">E 的收益来自“已知唯一”，而不是绕过全局权限管理。其他节点请求该缓存行⁠时⁠，⁠仍⁠需⁠由</w:t>
+      </w:r>
+    </w:p>
+    <w:p>
+      <w:pPr>
+        <w:ind w:left="0" w:firstLine="420"/>
+      </w:pPr>
+      <w:r>
+        <w:rPr>
+          <w:rFonts w:ascii="Calibri" w:hAnsi="Calibri" w:eastAsia="Microsoft YaHei" w:cs="Calibri"/>
+        </w:rPr>
+        <w:t xml:space="preserve">Home UBCC 控制器协调降级或迁移；高共享度下 E 停留时间较短，其 throughput 收益也⁠随⁠之⁠减⁠少⁠。</w:t>
+      </w:r>
+    </w:p>
+    <w:p>
+      <w:pPr>
+        <w:ind w:left="0" w:firstLine="420"/>
+      </w:pPr>
+      <w:r>
+        <w:rPr>
+          <w:rFonts w:ascii="Calibri" w:hAnsi="Calibri" w:eastAsia="Microsoft YaHei" w:cs="Calibri"/>
+        </w:rPr>
+        <w:t xml:space="preserve">MESI 与 MSI 均可用 2 bit 编码，新增成本主要是 E 相关转换和本地写升级的⁠状⁠态⁠衔⁠接⁠，</w:t>
+      </w:r>
+    </w:p>
+    <w:p>
+      <w:pPr>
+        <w:ind w:left="0" w:firstLine="420"/>
+      </w:pPr>
+      <w:r>
+        <w:rPr>
+          <w:rFonts w:ascii="Calibri" w:hAnsi="Calibri" w:eastAsia="Microsoft YaHei" w:cs="Calibri"/>
+        </w:rPr>
+        <w:t xml:space="preserve">而非稳定状态位宽。当前 UBCC 的 MESI 类全局目录采用这一权限表达，并由第 4 ⁠章⁠的⁠授⁠权⁠与</w:t>
+      </w:r>
+    </w:p>
+    <w:p>
+      <w:pPr>
+        <w:ind w:left="0" w:firstLine="420"/>
+      </w:pPr>
+      <w:r>
+        <w:rPr>
+          <w:rFonts w:ascii="Calibri" w:hAnsi="Calibri" w:eastAsia="Microsoft YaHei" w:cs="Calibri"/>
+        </w:rPr>
+        <w:t xml:space="preserve">提交机制维护⁠全⁠局⁠关⁠系⁠。</w:t>
+      </w:r>
+    </w:p>
+    <w:p>
+      <w:pPr>
+        <w:pStyle w:val="Heading3"/>
+        <w:keepNext/>
+      </w:pPr>
+      <w:r>
+        <w:rPr>
+          <w:rFonts w:ascii="Calibri" w:hAnsi="Calibri" w:eastAsia="SimHei" w:cs="Calibri"/>
+        </w:rPr>
+        <w:t xml:space="preserve">7.2.4 MOESI：保留脏共享数据责任</w:t>
+      </w:r>
+    </w:p>
+    <w:p>
+      <w:pPr>
+        <w:ind w:left="0" w:firstLine="420"/>
+      </w:pPr>
+      <w:r>
+        <w:rPr>
+          <w:rFonts w:ascii="Calibri" w:hAnsi="Calibri" w:eastAsia="Microsoft YaHei" w:cs="Calibri"/>
+        </w:rPr>
+        <w:t xml:space="preserve">MOESI 增加 O，使一个节点在其他节点持有只读副本时继续承担脏数据责任。对于一⁠个⁠节⁠点⁠产⁠生</w:t>
+      </w:r>
+    </w:p>
+    <w:p>
+      <w:pPr>
+        <w:ind w:left="0" w:firstLine="420"/>
+      </w:pPr>
+      <w:r>
+        <w:rPr>
+          <w:rFonts w:ascii="Calibri" w:hAnsi="Calibri" w:eastAsia="Microsoft YaHei" w:cs="Calibri"/>
+        </w:rPr>
+        <w:t xml:space="preserve">数据、多个节点随后读取的模式，O 持有者可以作为后续读取的数据源，不必先使 Home memory</w:t>
+      </w:r>
+    </w:p>
+    <w:p>
+      <w:pPr>
+        <w:ind w:left="0" w:firstLine="420"/>
+      </w:pPr>
+      <w:r>
+        <w:rPr>
+          <w:rFonts w:ascii="Calibri" w:hAnsi="Calibri" w:eastAsia="Microsoft YaHei" w:cs="Calibri"/>
+        </w:rPr>
+        <w:t xml:space="preserve">成为最新副本再服务每个读者。收益集中在可避免的写回和内存访问，而非所有⁠远⁠程⁠读⁠取⁠。</w:t>
+      </w:r>
+    </w:p>
+    <w:p>
+      <w:pPr>
+        <w:ind w:left="0" w:firstLine="420"/>
+      </w:pPr>
+      <w:r>
+        <w:rPr>
+          <w:rFonts w:ascii="Calibri" w:hAnsi="Calibri" w:eastAsia="Microsoft YaHei" w:cs="Calibri"/>
+        </w:rPr>
+        <w:t xml:space="preserve">O 不规定数据必须直接到 requester：Home 中转仍会占用两段数据带宽，直接转发才⁠可⁠能⁠进⁠一⁠步</w:t>
+      </w:r>
+    </w:p>
+    <w:p>
+      <w:pPr>
+        <w:ind w:left="0" w:firstLine="420"/>
+      </w:pPr>
+      <w:r>
+        <w:rPr>
+          <w:rFonts w:ascii="Calibri" w:hAnsi="Calibri" w:eastAsia="Microsoft YaHei" w:cs="Calibri"/>
+        </w:rPr>
+        <w:t xml:space="preserve">减少数据遍历。长期保留 O 可以降低 Home memory traffic，但也会使供数节点承担⁠热⁠点⁠带⁠宽⁠；</w:t>
+      </w:r>
+    </w:p>
+    <w:p>
+      <w:pPr>
+        <w:ind w:left="0" w:firstLine="420"/>
+      </w:pPr>
+      <w:r>
+        <w:rPr>
+          <w:rFonts w:ascii="Calibri" w:hAnsi="Calibri" w:eastAsia="Microsoft YaHei" w:cs="Calibri"/>
+        </w:rPr>
+        <w:t xml:space="preserve">O 逐出、责任迁移和共享转写者都需要额外协调，可能增加事务占用和尾延迟。稳⁠定⁠状⁠态⁠至⁠少</w:t>
+      </w:r>
+    </w:p>
+    <w:p>
+      <w:pPr>
+        <w:ind w:left="0" w:firstLine="420"/>
+      </w:pPr>
+      <w:r>
+        <w:rPr>
+          <w:rFonts w:ascii="Calibri" w:hAnsi="Calibri" w:eastAsia="Microsoft YaHei" w:cs="Calibri"/>
+        </w:rPr>
+        <w:t xml:space="preserve">需要 3 bit，瞬态 storage 还要表达脏共享责任的释放与接续。该状态集合适合脏共享⁠复⁠用⁠充⁠分⁠的</w:t>
+      </w:r>
+    </w:p>
+    <w:p>
+      <w:pPr>
+        <w:ind w:left="0" w:firstLine="420"/>
+      </w:pPr>
+      <w:r>
+        <w:rPr>
+          <w:rFonts w:ascii="Calibri" w:hAnsi="Calibri" w:eastAsia="Microsoft YaHei" w:cs="Calibri"/>
+        </w:rPr>
+        <w:t xml:space="preserve">访问模式，在本章作为架构比较选项，当前 UBCC 全局目录采用 MESI⁠ ⁠类⁠状⁠态⁠。</w:t>
+      </w:r>
+    </w:p>
+    <w:p>
+      <w:pPr>
+        <w:pStyle w:val="Heading3"/>
+        <w:keepNext/>
+      </w:pPr>
+      <w:r>
+        <w:rPr>
+          <w:rFonts w:ascii="Calibri" w:hAnsi="Calibri" w:eastAsia="SimHei" w:cs="Calibri"/>
+        </w:rPr>
+        <w:t xml:space="preserve">7.2.5 MESIF：为干净共享读取指定响应者</w:t>
+      </w:r>
+    </w:p>
+    <w:p>
+      <w:pPr>
+        <w:ind w:left="0" w:firstLine="420"/>
+      </w:pPr>
+      <w:r>
+        <w:rPr>
+          <w:rFonts w:ascii="Calibri" w:hAnsi="Calibri" w:eastAsia="Microsoft YaHei" w:cs="Calibri"/>
+        </w:rPr>
+        <w:t xml:space="preserve">MESIF 增加 F，在多个干净共享副本中指定一个转发响应者。新读者到达时，目录⁠和⁠消⁠息⁠规⁠则</w:t>
+      </w:r>
+    </w:p>
+    <w:p>
+      <w:pPr>
+        <w:ind w:left="0" w:firstLine="420"/>
+      </w:pPr>
+      <w:r>
+        <w:rPr>
+          <w:rFonts w:ascii="Calibri" w:hAnsi="Calibri" w:eastAsia="Microsoft YaHei" w:cs="Calibri"/>
+        </w:rPr>
+        <w:t xml:space="preserve">可以选择该响应者供数，减少多个副本同时响应或重新选择数据源的工作。与 O 不同⁠，⁠F⁠ ⁠表⁠达</w:t>
+      </w:r>
+    </w:p>
+    <w:p>
+      <w:pPr>
+        <w:ind w:left="0" w:firstLine="420"/>
+      </w:pPr>
+      <w:r>
+        <w:rPr>
+          <w:rFonts w:ascii="Calibri" w:hAnsi="Calibri" w:eastAsia="Microsoft YaHei" w:cs="Calibri"/>
+        </w:rPr>
+        <w:t xml:space="preserve">响应责任而非脏数据责任，适合读多写少、共享副本能够持续复⁠用⁠的⁠数⁠据⁠。</w:t>
+      </w:r>
+    </w:p>
+    <w:p>
+      <w:pPr>
+        <w:ind w:left="0" w:firstLine="420"/>
+      </w:pPr>
+      <w:r>
+        <w:rPr>
+          <w:rFonts w:ascii="Calibri" w:hAnsi="Calibri" w:eastAsia="Microsoft YaHei" w:cs="Calibri"/>
+        </w:rPr>
+        <w:t xml:space="preserve">若 cache-to-cache 路径优于 Home memory 路径，F 可降低读 latency 和内存 traffic⁠；⁠若⁠响⁠应⁠者</w:t>
+      </w:r>
+    </w:p>
+    <w:p>
+      <w:pPr>
+        <w:ind w:left="0" w:firstLine="420"/>
+      </w:pPr>
+      <w:r>
+        <w:rPr>
+          <w:rFonts w:ascii="Calibri" w:hAnsi="Calibri" w:eastAsia="Microsoft YaHei" w:cs="Calibri"/>
+        </w:rPr>
+        <w:t xml:space="preserve">较远或已饱和，指定 F 并不自动改善 throughput。F 逐出、迁移或被失效时，需要⁠保⁠持⁠响⁠应⁠者</w:t>
+      </w:r>
+    </w:p>
+    <w:p>
+      <w:pPr>
+        <w:ind w:left="0" w:firstLine="420"/>
+      </w:pPr>
+      <w:r>
+        <w:rPr>
+          <w:rFonts w:ascii="Calibri" w:hAnsi="Calibri" w:eastAsia="Microsoft YaHei" w:cs="Calibri"/>
+        </w:rPr>
+        <w:t xml:space="preserve">身份与目录一致，写密集模式会反复支付这些维护消息。至少 3 bit 的稳定状态只是 storage</w:t>
+      </w:r>
+    </w:p>
+    <w:p>
+      <w:pPr>
+        <w:ind w:left="0" w:firstLine="420"/>
+      </w:pPr>
+      <w:r>
+        <w:rPr>
+          <w:rFonts w:ascii="Calibri" w:hAnsi="Calibri" w:eastAsia="Microsoft YaHei" w:cs="Calibri"/>
+        </w:rPr>
+        <w:t xml:space="preserve">增量的一部分，还需相应瞬态和完成跟踪。MESIF 同样是本章的比较选项，不能由节点⁠内⁠ ⁠C⁠H⁠I</w:t>
+      </w:r>
+    </w:p>
+    <w:p>
+      <w:pPr>
+        <w:ind w:left="0" w:firstLine="420"/>
+      </w:pPr>
+      <w:r>
+        <w:rPr>
+          <w:rFonts w:ascii="Calibri" w:hAnsi="Calibri" w:eastAsia="Microsoft YaHei" w:cs="Calibri"/>
+        </w:rPr>
+        <w:t xml:space="preserve">供数能力推导为当前 Outer 已具备 ⁠F⁠ ⁠语⁠义⁠。</w:t>
+      </w:r>
+    </w:p>
+    <w:p>
+      <w:pPr>
+        <w:ind w:left="0" w:firstLine="420"/>
+      </w:pPr>
+      <w:r>
+        <w:rPr>
+          <w:rFonts w:ascii="Calibri" w:hAnsi="Calibri" w:eastAsia="Microsoft YaHei" w:cs="Calibri"/>
+        </w:rPr>
+        <w:t xml:space="preserve">状态位本身通常不是目录存储的主要部分。精确目录还需要 sharer 位图、tag、epoch ⁠和⁠控⁠制⁠位⁠；</w:t>
+      </w:r>
+    </w:p>
+    <w:p>
+      <w:pPr>
+        <w:ind w:left="0" w:firstLine="420"/>
+      </w:pPr>
+      <w:r>
+        <w:rPr>
+          <w:rFonts w:ascii="Calibri" w:hAnsi="Calibri" w:eastAsia="Microsoft YaHei" w:cs="Calibri"/>
+        </w:rPr>
+        <w:t xml:space="preserve">事务执行期间还需要 requester、目标位图、Ack 位图和可选的 64 B 数据缓冲。下表⁠归⁠纳⁠各⁠状⁠态</w:t>
+      </w:r>
+    </w:p>
+    <w:p>
+      <w:pPr>
+        <w:ind w:left="0" w:firstLine="420"/>
+      </w:pPr>
+      <w:r>
+        <w:rPr>
+          <w:rFonts w:ascii="Calibri" w:hAnsi="Calibri" w:eastAsia="Microsoft YaHei" w:cs="Calibri"/>
+        </w:rPr>
+        <w:t xml:space="preserve">集合的主要取舍，实际资源应结合第 7.7 节的目录与瞬态⁠开⁠销⁠评⁠估⁠。</w:t>
+      </w:r>
+    </w:p>
     <w:tbl>
       <w:tblPr>
         <w:tblStyle w:val="TableGrid"/>
@@ -6098,50 +6631,6 @@
     </w:tbl>
     <w:p>
       <w:pPr>
-        <w:ind w:left="0" w:firstLine="420"/>
-      </w:pPr>
-      <w:r>
-        <w:rPr>
-          <w:rFonts w:ascii="Calibri" w:hAnsi="Calibri" w:eastAsia="Microsoft YaHei" w:cs="Calibri"/>
-        </w:rPr>
-        <w:t xml:space="preserve">状态位本身通常不是目录存储的主要部分。精确目录还需要 sharer 位图、tag、epoch ⁠和⁠控⁠制⁠位⁠；</w:t>
-      </w:r>
-    </w:p>
-    <w:p>
-      <w:pPr>
-        <w:ind w:left="0" w:firstLine="420"/>
-      </w:pPr>
-      <w:r>
-        <w:rPr>
-          <w:rFonts w:ascii="Calibri" w:hAnsi="Calibri" w:eastAsia="Microsoft YaHei" w:cs="Calibri"/>
-        </w:rPr>
-        <w:t xml:space="preserve">事务执行期间还需要 requester、目标位图、Ack 位图和可选的 64 B 数据缓冲。状态⁠集⁠合⁠的⁠收⁠益</w:t>
-      </w:r>
-    </w:p>
-    <w:p>
-      <w:pPr>
-        <w:ind w:left="0" w:firstLine="420"/>
-      </w:pPr>
-      <w:r>
-        <w:rPr>
-          <w:rFonts w:ascii="Calibri" w:hAnsi="Calibri" w:eastAsia="Microsoft YaHei" w:cs="Calibri"/>
-        </w:rPr>
-        <w:t xml:space="preserve">主要来自减少特定路径的消息和数据移动，代价主要来自新增瞬态分支和生命周期管理⁠。⁠当⁠前⁠交⁠付</w:t>
-      </w:r>
-    </w:p>
-    <w:p>
-      <w:pPr>
-        <w:ind w:left="0" w:firstLine="420"/>
-      </w:pPr>
-      <w:r>
-        <w:rPr>
-          <w:rFonts w:ascii="Calibri" w:hAnsi="Calibri" w:eastAsia="Microsoft YaHei" w:cs="Calibri"/>
-        </w:rPr>
-        <w:t xml:space="preserve">实现采用 MESI 类全局目录语义；MOESI Owned 和 MESIF Forward 是可组合的状态⁠扩⁠展⁠方⁠向⁠。</w:t>
-      </w:r>
-    </w:p>
-    <w:p>
-      <w:pPr>
         <w:pStyle w:val="Heading3"/>
         <w:keepNext/>
       </w:pPr>
@@ -6150,6 +6639,450 @@
           <w:rFonts w:ascii="Calibri" w:hAnsi="Calibri" w:eastAsia="SimHei" w:cs="Calibri"/>
         </w:rPr>
         <w:t xml:space="preserve">7.3 Outer 组织方式</w:t>
+      </w:r>
+    </w:p>
+    <w:p>
+      <w:pPr>
+        <w:ind w:left="0" w:firstLine="420"/>
+      </w:pPr>
+      <w:r>
+        <w:rPr>
+          <w:rFonts w:ascii="Calibri" w:hAnsi="Calibri" w:eastAsia="Microsoft YaHei" w:cs="Calibri"/>
+        </w:rPr>
+        <w:t xml:space="preserve">Outer 组织决定消息如何到达仲裁点、数据如何跨节点移动，以及压力由哪些端口与事务⁠资⁠源⁠承⁠担⁠。</w:t>
+      </w:r>
+    </w:p>
+    <w:p>
+      <w:pPr>
+        <w:ind w:left="0" w:firstLine="420"/>
+      </w:pPr>
+      <w:r>
+        <w:rPr>
+          <w:rFonts w:ascii="Calibri" w:hAnsi="Calibri" w:eastAsia="Microsoft YaHei" w:cs="Calibri"/>
+        </w:rPr>
+        <w:t xml:space="preserve">这一比较轴独立于第 7.2 节的状态集合，图 7-1 展示了两者与全局权⁠威⁠的⁠关⁠系⁠。</w:t>
+      </w:r>
+    </w:p>
+    <w:p>
+      <w:pPr>
+        <w:pStyle w:val="Heading3"/>
+        <w:keepNext/>
+      </w:pPr>
+      <w:r>
+        <w:rPr>
+          <w:rFonts w:ascii="Calibri" w:hAnsi="Calibri" w:eastAsia="SimHei" w:cs="Calibri"/>
+        </w:rPr>
+        <w:t xml:space="preserve">7.3.1 专用 Home-directory 与 Home 数据中转</w:t>
+      </w:r>
+    </w:p>
+    <w:p>
+      <w:pPr>
+        <w:ind w:left="0" w:firstLine="420"/>
+      </w:pPr>
+      <w:r>
+        <w:rPr>
+          <w:rFonts w:ascii="Calibri" w:hAnsi="Calibri" w:eastAsia="Microsoft YaHei" w:cs="Calibri"/>
+        </w:rPr>
+        <w:t xml:space="preserve">每条地址由唯一 Home UBCC 控制器管理目录和提交。远程 owner 返回最新数据后，Ho⁠m⁠e⁠ ⁠再⁠将</w:t>
+      </w:r>
+    </w:p>
+    <w:p>
+      <w:pPr>
+        <w:ind w:left="0" w:firstLine="420"/>
+      </w:pPr>
+      <w:r>
+        <w:rPr>
+          <w:rFonts w:ascii="Calibri" w:hAnsi="Calibri" w:eastAsia="Microsoft YaHei" w:cs="Calibri"/>
+        </w:rPr>
+        <w:t xml:space="preserve">数据与授权组织为面向 requester 的响应，使数据回收和权限推进在同一事务上下⁠文⁠内⁠关⁠联⁠。</w:t>
+      </w:r>
+    </w:p>
+    <w:p>
+      <w:pPr>
+        <w:ind w:left="0" w:firstLine="420"/>
+      </w:pPr>
+      <w:r>
+        <w:rPr>
+          <w:rFonts w:ascii="Calibri" w:hAnsi="Calibri" w:eastAsia="Microsoft YaHei" w:cs="Calibri"/>
+        </w:rPr>
+        <w:t xml:space="preserve">这也是当前 UBCC 的 Outer 组织，节点内 CHI 继续负责本地缓存层级⁠的⁠一⁠致⁠性⁠。</w:t>
+      </w:r>
+    </w:p>
+    <w:p>
+      <w:pPr>
+        <w:ind w:left="0" w:firstLine="420"/>
+      </w:pPr>
+      <w:r>
+        <w:rPr>
+          <w:rFonts w:ascii="Calibri" w:hAnsi="Calibri" w:eastAsia="Microsoft YaHei" w:cs="Calibri"/>
+        </w:rPr>
+        <w:t xml:space="preserve">该方式适合需要独立全局目录资源、精确目标选择和分层元数据容量的系统。Home memory</w:t>
+      </w:r>
+    </w:p>
+    <w:p>
+      <w:pPr>
+        <w:ind w:left="0" w:firstLine="420"/>
+      </w:pPr>
+      <w:r>
+        <w:rPr>
+          <w:rFonts w:ascii="Calibri" w:hAnsi="Calibri" w:eastAsia="Microsoft YaHei" w:cs="Calibri"/>
+        </w:rPr>
+        <w:t xml:space="preserve">本身为最新数据源时，数据可以直接从 Home 返回；远程 owner 为最新数据源时⁠，⁠中⁠转⁠增⁠加</w:t>
+      </w:r>
+    </w:p>
+    <w:p>
+      <w:pPr>
+        <w:ind w:left="0" w:firstLine="420"/>
+      </w:pPr>
+      <w:r>
+        <w:rPr>
+          <w:rFonts w:ascii="Calibri" w:hAnsi="Calibri" w:eastAsia="Microsoft YaHei" w:cs="Calibri"/>
+        </w:rPr>
+        <w:t xml:space="preserve">完整数据线的链路遍历和 Home 数据端口负载。吞吐因此同时受目录并行度、事⁠务⁠槽⁠占⁠用⁠及</w:t>
+      </w:r>
+    </w:p>
+    <w:p>
+      <w:pPr>
+        <w:ind w:left="0" w:firstLine="420"/>
+      </w:pPr>
+      <w:r>
+        <w:rPr>
+          <w:rFonts w:ascii="Calibri" w:hAnsi="Calibri" w:eastAsia="Microsoft YaHei" w:cs="Calibri"/>
+        </w:rPr>
+        <w:t xml:space="preserve">数据带宽制约。storage 除稳定目录外还包括 Recall 数据缓冲和等待状态，第 3.1⁠ ⁠节⁠给⁠出⁠了</w:t>
+      </w:r>
+    </w:p>
+    <w:p>
+      <w:pPr>
+        <w:ind w:left="0" w:firstLine="420"/>
+      </w:pPr>
+      <w:r>
+        <w:rPr>
+          <w:rFonts w:ascii="Calibri" w:hAnsi="Calibri" w:eastAsia="Microsoft YaHei" w:cs="Calibri"/>
+        </w:rPr>
+        <w:t xml:space="preserve">当前配置的资源规模，不能只按目录条目数衡量整⁠个⁠控⁠制⁠器⁠。</w:t>
+      </w:r>
+    </w:p>
+    <w:p>
+      <w:pPr>
+        <w:pStyle w:val="Heading3"/>
+        <w:keepNext/>
+      </w:pPr>
+      <w:r>
+        <w:rPr>
+          <w:rFonts w:ascii="Calibri" w:hAnsi="Calibri" w:eastAsia="SimHei" w:cs="Calibri"/>
+        </w:rPr>
+        <w:t xml:space="preserve">7.3.2 专用 Home-directory 与直接数据转发</w:t>
+      </w:r>
+    </w:p>
+    <w:p>
+      <w:pPr>
+        <w:ind w:left="0" w:firstLine="420"/>
+      </w:pPr>
+      <w:r>
+        <w:rPr>
+          <w:rFonts w:ascii="Calibri" w:hAnsi="Calibri" w:eastAsia="Microsoft YaHei" w:cs="Calibri"/>
+        </w:rPr>
+        <w:t xml:space="preserve">直接数据转发保留 Home 的权限判定和提交职责，只改变经授权的数据分支：Home⁠ ⁠指⁠定⁠合⁠法</w:t>
+      </w:r>
+    </w:p>
+    <w:p>
+      <w:pPr>
+        <w:ind w:left="0" w:firstLine="420"/>
+      </w:pPr>
+      <w:r>
+        <w:rPr>
+          <w:rFonts w:ascii="Calibri" w:hAnsi="Calibri" w:eastAsia="Microsoft YaHei" w:cs="Calibri"/>
+        </w:rPr>
+        <w:t xml:space="preserve">source 与 target 后，owner 将数据直接发给 requester。对 Home、owner 和 requeste⁠r⁠ ⁠分⁠离⁠的</w:t>
+      </w:r>
+    </w:p>
+    <w:p>
+      <w:pPr>
+        <w:ind w:left="0" w:firstLine="420"/>
+      </w:pPr>
+      <w:r>
+        <w:rPr>
+          <w:rFonts w:ascii="Calibri" w:hAnsi="Calibri" w:eastAsia="Microsoft YaHei" w:cs="Calibri"/>
+        </w:rPr>
+        <w:t xml:space="preserve">远程供数场景，这可省去一次完整数据线中转，降低 Home 数据带宽压力，并缩短⁠数⁠据⁠分⁠支⁠。</w:t>
+      </w:r>
+    </w:p>
+    <w:p>
+      <w:pPr>
+        <w:ind w:left="0" w:firstLine="420"/>
+      </w:pPr>
+      <w:r>
+        <w:rPr>
+          <w:rFonts w:ascii="Calibri" w:hAnsi="Calibri" w:eastAsia="Microsoft YaHei" w:cs="Calibri"/>
+        </w:rPr>
+        <w:t xml:space="preserve">requester 仍需同时取得数据与有效权限，旧 owner 的释放及失效确认也仍属于⁠完⁠成⁠条⁠件⁠。</w:t>
+      </w:r>
+    </w:p>
+    <w:p>
+      <w:pPr>
+        <w:ind w:left="0" w:firstLine="420"/>
+      </w:pPr>
+      <w:r>
+        <w:rPr>
+          <w:rFonts w:ascii="Calibri" w:hAnsi="Calibri" w:eastAsia="Microsoft YaHei" w:cs="Calibri"/>
+        </w:rPr>
+        <w:t xml:space="preserve">因此改善 latency 的幅度取决于权限分支是否更慢；对 Home memory 直接供数的⁠访⁠问⁠则⁠没⁠有</w:t>
+      </w:r>
+    </w:p>
+    <w:p>
+      <w:pPr>
+        <w:ind w:left="0" w:firstLine="420"/>
+      </w:pPr>
+      <w:r>
+        <w:rPr>
+          <w:rFonts w:ascii="Calibri" w:hAnsi="Calibri" w:eastAsia="Microsoft YaHei" w:cs="Calibri"/>
+        </w:rPr>
+        <w:t xml:space="preserve">相同收益。throughput 的瓶颈可能从 Home 转移至供数节点或互连出口。事务 stora⁠g⁠e⁠ ⁠需⁠要</w:t>
+      </w:r>
+    </w:p>
+    <w:p>
+      <w:pPr>
+        <w:ind w:left="0" w:firstLine="420"/>
+      </w:pPr>
+      <w:r>
+        <w:rPr>
+          <w:rFonts w:ascii="Calibri" w:hAnsi="Calibri" w:eastAsia="Microsoft YaHei" w:cs="Calibri"/>
+        </w:rPr>
+        <w:t xml:space="preserve">关联授权、source/target 和数据完成，处理两个分支不同的到达次序。这种组织适合远程 owner</w:t>
+      </w:r>
+    </w:p>
+    <w:p>
+      <w:pPr>
+        <w:ind w:left="0" w:firstLine="420"/>
+      </w:pPr>
+      <w:r>
+        <w:rPr>
+          <w:rFonts w:ascii="Calibri" w:hAnsi="Calibri" w:eastAsia="Microsoft YaHei" w:cs="Calibri"/>
+        </w:rPr>
+        <w:t xml:space="preserve">数据流量成为主要约束的系统，是与当前 Home 中转组织相区分的⁠架⁠构⁠选⁠项⁠。</w:t>
+      </w:r>
+    </w:p>
+    <w:p>
+      <w:pPr>
+        <w:pStyle w:val="Heading3"/>
+        <w:keepNext/>
+      </w:pPr>
+      <w:r>
+        <w:rPr>
+          <w:rFonts w:ascii="Calibri" w:hAnsi="Calibri" w:eastAsia="SimHei" w:cs="Calibri"/>
+        </w:rPr>
+        <w:t xml:space="preserve">7.3.3 Outer CHI：标准事务承载与跨域衔接</w:t>
+      </w:r>
+    </w:p>
+    <w:p>
+      <w:pPr>
+        <w:ind w:left="0" w:firstLine="420"/>
+      </w:pPr>
+      <w:r>
+        <w:rPr>
+          <w:rFonts w:ascii="Calibri" w:hAnsi="Calibri" w:eastAsia="Microsoft YaHei" w:cs="Calibri"/>
+        </w:rPr>
+        <w:t xml:space="preserve">Outer CHI 将跨节点事务组织为 CHI 的 RN/HN/SN 角色以及 Req/Rsp/Snp/Dat 通道⁠，⁠由⁠相⁠应⁠的</w:t>
+      </w:r>
+    </w:p>
+    <w:p>
+      <w:pPr>
+        <w:ind w:left="0" w:firstLine="420"/>
+      </w:pPr>
+      <w:r>
+        <w:rPr>
+          <w:rFonts w:ascii="Calibri" w:hAnsi="Calibri" w:eastAsia="Microsoft YaHei" w:cs="Calibri"/>
+        </w:rPr>
+        <w:t xml:space="preserve">全局 Home 和目录规则管理一致性。对已有跨 die/Socket CHI fabric 或第三方 agent ⁠互⁠操⁠作⁠需⁠求</w:t>
+      </w:r>
+    </w:p>
+    <w:p>
+      <w:pPr>
+        <w:ind w:left="0" w:firstLine="420"/>
+      </w:pPr>
+      <w:r>
+        <w:rPr>
+          <w:rFonts w:ascii="Calibri" w:hAnsi="Calibri" w:eastAsia="Microsoft YaHei" w:cs="Calibri"/>
+        </w:rPr>
+        <w:t xml:space="preserve">的系统，标准事务、数据路径和 credit 流控可以复用既有互连能力；具体 DMT/DCT 路⁠径⁠仍⁠取⁠决⁠于</w:t>
+      </w:r>
+    </w:p>
+    <w:p>
+      <w:pPr>
+        <w:ind w:left="0" w:firstLine="420"/>
+      </w:pPr>
+      <w:r>
+        <w:rPr>
+          <w:rFonts w:ascii="Calibri" w:hAnsi="Calibri" w:eastAsia="Microsoft YaHei" w:cs="Calibri"/>
+        </w:rPr>
+        <w:t xml:space="preserve">所选配置和 agent 支持，协议名称本身不保证每条事务都采用最短⁠数⁠据⁠路⁠径⁠。</w:t>
+      </w:r>
+    </w:p>
+    <w:p>
+      <w:pPr>
+        <w:ind w:left="0" w:firstLine="420"/>
+      </w:pPr>
+      <w:r>
+        <w:rPr>
+          <w:rFonts w:ascii="Calibri" w:hAnsi="Calibri" w:eastAsia="Microsoft YaHei" w:cs="Calibri"/>
+        </w:rPr>
+        <w:t xml:space="preserve">独立通道和流控有助于组织并行事务，但 credit 等待、ID 占用和 bridge 背压仍会增加 latency</w:t>
+      </w:r>
+    </w:p>
+    <w:p>
+      <w:pPr>
+        <w:ind w:left="0" w:firstLine="420"/>
+      </w:pPr>
+      <w:r>
+        <w:rPr>
+          <w:rFonts w:ascii="Calibri" w:hAnsi="Calibri" w:eastAsia="Microsoft YaHei" w:cs="Calibri"/>
+        </w:rPr>
+        <w:t xml:space="preserve">并限制 throughput。traffic 由 snoop 目标和实际数据路由决定，不能仅以采用 CHI ⁠推⁠断⁠其⁠低⁠于</w:t>
+      </w:r>
+    </w:p>
+    <w:p>
+      <w:pPr>
+        <w:ind w:left="0" w:firstLine="420"/>
+      </w:pPr>
+      <w:r>
+        <w:rPr>
+          <w:rFonts w:ascii="Calibri" w:hAnsi="Calibri" w:eastAsia="Microsoft YaHei" w:cs="Calibri"/>
+        </w:rPr>
+        <w:t xml:space="preserve">专用目录消息。storage 需计入 agent 状态、TxnID/DBID 关联、通道缓冲及完成关系。当前⁠ ⁠U⁠B⁠C⁠C</w:t>
+      </w:r>
+    </w:p>
+    <w:p>
+      <w:pPr>
+        <w:ind w:left="0" w:firstLine="420"/>
+      </w:pPr>
+      <w:r>
+        <w:rPr>
+          <w:rFonts w:ascii="Calibri" w:hAnsi="Calibri" w:eastAsia="Microsoft YaHei" w:cs="Calibri"/>
+        </w:rPr>
+        <w:t xml:space="preserve">在节点内复用 gem5 CHI，Outer 使用专用目录消息；图 7-4 对比的是这一边界与 Outer CHI</w:t>
+      </w:r>
+    </w:p>
+    <w:p>
+      <w:pPr>
+        <w:ind w:left="0" w:firstLine="420"/>
+      </w:pPr>
+      <w:r>
+        <w:rPr>
+          <w:rFonts w:ascii="Calibri" w:hAnsi="Calibri" w:eastAsia="Microsoft YaHei" w:cs="Calibri"/>
+        </w:rPr>
+        <w:t xml:space="preserve">组织所需资源，而非将节点内能力等同于跨⁠节⁠点⁠实⁠现⁠。</w:t>
+      </w:r>
+    </w:p>
+    <w:p>
+      <w:pPr>
+        <w:pStyle w:val="Heading3"/>
+        <w:keepNext/>
+      </w:pPr>
+      <w:r>
+        <w:rPr>
+          <w:rFonts w:ascii="Calibri" w:hAnsi="Calibri" w:eastAsia="SimHei" w:cs="Calibri"/>
+        </w:rPr>
+        <w:t xml:space="preserve">7.3.4 广播或探测式 Outer：以接收端工作换取较小目录</w:t>
+      </w:r>
+    </w:p>
+    <w:p>
+      <w:pPr>
+        <w:ind w:left="0" w:firstLine="420"/>
+      </w:pPr>
+      <w:r>
+        <w:rPr>
+          <w:rFonts w:ascii="Calibri" w:hAnsi="Calibri" w:eastAsia="Microsoft YaHei" w:cs="Calibri"/>
+        </w:rPr>
+        <w:t xml:space="preserve">在不保存完整精确 sharer 或只保存有限提示时，请求可以向候选节点广播或探测，⁠再⁠根⁠据⁠响⁠应</w:t>
+      </w:r>
+    </w:p>
+    <w:p>
+      <w:pPr>
+        <w:ind w:left="0" w:firstLine="420"/>
+      </w:pPr>
+      <w:r>
+        <w:rPr>
+          <w:rFonts w:ascii="Calibri" w:hAnsi="Calibri" w:eastAsia="Microsoft YaHei" w:cs="Calibri"/>
+        </w:rPr>
+        <w:t xml:space="preserve">确定数据源和权限关系。这降低稳定目录位图的存储要求，适合节点数较少、探⁠测⁠域⁠受⁠控⁠或</w:t>
+      </w:r>
+    </w:p>
+    <w:p>
+      <w:pPr>
+        <w:ind w:left="0" w:firstLine="420"/>
+      </w:pPr>
+      <w:r>
+        <w:rPr>
+          <w:rFonts w:ascii="Calibri" w:hAnsi="Calibri" w:eastAsia="Microsoft YaHei" w:cs="Calibri"/>
+        </w:rPr>
+        <w:t xml:space="preserve">目录 SRAM 预算极紧的组织。有限提示还可以缩小候选范围，但需要相应规则保⁠证⁠遗⁠漏⁠节⁠点</w:t>
+      </w:r>
+    </w:p>
+    <w:p>
+      <w:pPr>
+        <w:ind w:left="0" w:firstLine="420"/>
+      </w:pPr>
+      <w:r>
+        <w:rPr>
+          <w:rFonts w:ascii="Calibri" w:hAnsi="Calibri" w:eastAsia="Microsoft YaHei" w:cs="Calibri"/>
+        </w:rPr>
+        <w:t xml:space="preserve">不会保留⁠冲⁠突⁠权⁠限⁠。</w:t>
+      </w:r>
+    </w:p>
+    <w:p>
+      <w:pPr>
+        <w:ind w:left="0" w:firstLine="420"/>
+      </w:pPr>
+      <w:r>
+        <w:rPr>
+          <w:rFonts w:ascii="Calibri" w:hAnsi="Calibri" w:eastAsia="Microsoft YaHei" w:cs="Calibri"/>
+        </w:rPr>
+        <w:t xml:space="preserve">并行发送使探测段数不必随节点数线性增长，然而 traffic、接收端过滤和响应收敛工⁠作⁠会⁠增⁠长⁠。</w:t>
+      </w:r>
+    </w:p>
+    <w:p>
+      <w:pPr>
+        <w:ind w:left="0" w:firstLine="420"/>
+      </w:pPr>
+      <w:r>
+        <w:rPr>
+          <w:rFonts w:ascii="Calibri" w:hAnsi="Calibri" w:eastAsia="Microsoft YaHei" w:cs="Calibri"/>
+        </w:rPr>
+        <w:t xml:space="preserve">在共享稀疏时，许多节点处理的是与自身无关的请求；在高负载时，这些工作增加⁠链⁠路⁠和⁠队⁠列</w:t>
+      </w:r>
+    </w:p>
+    <w:p>
+      <w:pPr>
+        <w:ind w:left="0" w:firstLine="420"/>
+      </w:pPr>
+      <w:r>
+        <w:rPr>
+          <w:rFonts w:ascii="Calibri" w:hAnsi="Calibri" w:eastAsia="Microsoft YaHei" w:cs="Calibri"/>
+        </w:rPr>
+        <w:t xml:space="preserve">竞争，抬高 latency 尾部并压低有效 throughput。省下的稳定 storage 还应与网络⁠缓⁠冲⁠、⁠响⁠应</w:t>
+      </w:r>
+    </w:p>
+    <w:p>
+      <w:pPr>
+        <w:ind w:left="0" w:firstLine="420"/>
+      </w:pPr>
+      <w:r>
+        <w:rPr>
+          <w:rFonts w:ascii="Calibri" w:hAnsi="Calibri" w:eastAsia="Microsoft YaHei" w:cs="Calibri"/>
+        </w:rPr>
+        <w:t xml:space="preserve">集合及接收端瞬态资源一起计算，尤其不能把广播包的单次注入等同于全网只有一份⁠传⁠输⁠成⁠本⁠。</w:t>
+      </w:r>
+    </w:p>
+    <w:p>
+      <w:pPr>
+        <w:ind w:left="0" w:firstLine="420"/>
+      </w:pPr>
+      <w:r>
+        <w:rPr>
+          <w:rFonts w:ascii="Calibri" w:hAnsi="Calibri" w:eastAsia="Microsoft YaHei" w:cs="Calibri"/>
+        </w:rPr>
+        <w:t xml:space="preserve">下表将数据组织与权威位置分开归纳；采用何种稳定状态均需配套完整的授权和⁠完⁠成⁠规⁠则⁠。</w:t>
       </w:r>
     </w:p>
     <w:tbl>
@@ -6627,39 +7560,6 @@
     </w:tbl>
     <w:p>
       <w:pPr>
-        <w:ind w:left="0" w:firstLine="420"/>
-      </w:pPr>
-      <w:r>
-        <w:rPr>
-          <w:rFonts w:ascii="Calibri" w:hAnsi="Calibri" w:eastAsia="Microsoft YaHei" w:cs="Calibri"/>
-        </w:rPr>
-        <w:t xml:space="preserve">CHI 定义 RN/HN/SN 角色、Req/Rsp/Snp/Dat 通道、事务标识和流控。当前方案在⁠节⁠点⁠内⁠复⁠用</w:t>
-      </w:r>
-    </w:p>
-    <w:p>
-      <w:pPr>
-        <w:ind w:left="0" w:firstLine="420"/>
-      </w:pPr>
-      <w:r>
-        <w:rPr>
-          <w:rFonts w:ascii="Calibri" w:hAnsi="Calibri" w:eastAsia="Microsoft YaHei" w:cs="Calibri"/>
-        </w:rPr>
-        <w:t xml:space="preserve">gem5 CHI，在 Outer 层使用专用目录消息和 Home UBCC 控制器；两类组织可以与不⁠同⁠状⁠态⁠集⁠合</w:t>
-      </w:r>
-    </w:p>
-    <w:p>
-      <w:pPr>
-        <w:ind w:left="0" w:firstLine="420"/>
-      </w:pPr>
-      <w:r>
-        <w:rPr>
-          <w:rFonts w:ascii="Calibri" w:hAnsi="Calibri" w:eastAsia="Microsoft YaHei" w:cs="Calibri"/>
-        </w:rPr>
-        <w:t xml:space="preserve">独立组合。</w:t>
-      </w:r>
-    </w:p>
-    <w:p>
-      <w:pPr>
         <w:pStyle w:val="Heading3"/>
         <w:keepNext/>
       </w:pPr>
@@ -6678,306 +7578,661 @@
         <w:rPr>
           <w:rFonts w:ascii="Calibri" w:hAnsi="Calibri" w:eastAsia="Microsoft YaHei" w:cs="Calibri"/>
         </w:rPr>
-        <w:t xml:space="preserve">比较数据路径前需要区分目录权威、数据位置和⁠提⁠交⁠权⁠威⁠：</w:t>
-      </w:r>
-    </w:p>
-    <w:tbl>
-      <w:tblPr>
-        <w:tblStyle w:val="TableGrid"/>
-        <w:tblW w:w="5000" w:type="pct"/>
-        <w:tblLayout w:type="fixed"/>
-        <w:tblCellMar>
-          <w:top w:w="60" w:type="dxa"/>
-          <w:left w:w="90" w:type="dxa"/>
-          <w:bottom w:w="60" w:type="dxa"/>
-          <w:right w:w="90" w:type="dxa"/>
-        </w:tblCellMar>
-      </w:tblPr>
-      <w:tblGrid>
-        <w:gridCol w:w="3091"/>
-        <w:gridCol w:w="3254"/>
-        <w:gridCol w:w="3254"/>
-      </w:tblGrid>
-      <w:tr>
-        <w:trPr>
-          <w:cantSplit/>
-          <w:tblHeader/>
-        </w:trPr>
-        <w:tc>
-          <w:tcPr>
-            <w:tcW w:w="3091" w:type="dxa"/>
-            <w:shd w:val="clear" w:color="auto" w:fill="D9E2F3"/>
-          </w:tcPr>
-          <w:p>
-            <w:pPr>
-              <w:pStyle w:val="TableText"/>
-              <w:jc w:val="left"/>
-              <w:wordWrap w:val="0"/>
-              <w:spacing w:before="0" w:after="0" w:line="320" w:lineRule="exact"/>
-            </w:pPr>
-            <w:r>
-              <w:rPr>
-                <w:rFonts w:ascii="Calibri" w:hAnsi="Calibri" w:eastAsia="SimHei" w:cs="Calibri"/>
-                <w:b/>
-                <w:sz w:val="18"/>
-                <w:szCs w:val="18"/>
-              </w:rPr>
-              <w:t xml:space="preserve">概念</w:t>
-            </w:r>
-          </w:p>
-        </w:tc>
-        <w:tc>
-          <w:tcPr>
-            <w:tcW w:w="3254" w:type="dxa"/>
-            <w:shd w:val="clear" w:color="auto" w:fill="D9E2F3"/>
-          </w:tcPr>
-          <w:p>
-            <w:pPr>
-              <w:pStyle w:val="TableText"/>
-              <w:jc w:val="left"/>
-              <w:wordWrap w:val="0"/>
-              <w:spacing w:before="0" w:after="0" w:line="320" w:lineRule="exact"/>
-            </w:pPr>
-            <w:r>
-              <w:rPr>
-                <w:rFonts w:ascii="Calibri" w:hAnsi="Calibri" w:eastAsia="SimHei" w:cs="Calibri"/>
-                <w:b/>
-                <w:sz w:val="18"/>
-                <w:szCs w:val="18"/>
-              </w:rPr>
-              <w:t xml:space="preserve">回答的问题</w:t>
-            </w:r>
-          </w:p>
-        </w:tc>
-        <w:tc>
-          <w:tcPr>
-            <w:tcW w:w="3254" w:type="dxa"/>
-            <w:shd w:val="clear" w:color="auto" w:fill="D9E2F3"/>
-          </w:tcPr>
-          <w:p>
-            <w:pPr>
-              <w:pStyle w:val="TableText"/>
-              <w:jc w:val="left"/>
-              <w:wordWrap w:val="0"/>
-              <w:spacing w:before="0" w:after="0" w:line="320" w:lineRule="exact"/>
-            </w:pPr>
-            <w:r>
-              <w:rPr>
-                <w:rFonts w:ascii="Calibri" w:hAnsi="Calibri" w:eastAsia="SimHei" w:cs="Calibri"/>
-                <w:b/>
-                <w:sz w:val="18"/>
-                <w:szCs w:val="18"/>
-              </w:rPr>
-              <w:t xml:space="preserve">当前 U⁠B⁠C⁠C 中的位置</w:t>
-            </w:r>
-          </w:p>
-        </w:tc>
-      </w:tr>
-      <w:tr>
-        <w:trPr>
-          <w:cantSplit/>
-        </w:trPr>
-        <w:tc>
-          <w:tcPr>
-            <w:tcW w:w="3091" w:type="dxa"/>
-          </w:tcPr>
-          <w:p>
-            <w:pPr>
-              <w:pStyle w:val="TableText"/>
-              <w:jc w:val="left"/>
-              <w:wordWrap w:val="0"/>
-              <w:spacing w:before="0" w:after="0" w:line="320" w:lineRule="exact"/>
-            </w:pPr>
-            <w:r>
-              <w:rPr>
-                <w:rFonts w:ascii="Calibri" w:hAnsi="Calibri" w:eastAsia="Microsoft YaHei" w:cs="Calibri"/>
-                <w:sz w:val="18"/>
-                <w:szCs w:val="18"/>
-              </w:rPr>
-              <w:t xml:space="preserve">c⁠o⁠h⁠e⁠r⁠e⁠n⁠c⁠e a⁠u⁠t⁠h⁠o⁠r⁠i⁠t⁠y</w:t>
-            </w:r>
-          </w:p>
-        </w:tc>
-        <w:tc>
-          <w:tcPr>
-            <w:tcW w:w="3254" w:type="dxa"/>
-          </w:tcPr>
-          <w:p>
-            <w:pPr>
-              <w:pStyle w:val="TableText"/>
-              <w:jc w:val="left"/>
-              <w:wordWrap w:val="0"/>
-              <w:spacing w:before="0" w:after="0" w:line="320" w:lineRule="exact"/>
-            </w:pPr>
-            <w:r>
-              <w:rPr>
-                <w:rFonts w:ascii="Calibri" w:hAnsi="Calibri" w:eastAsia="Microsoft YaHei" w:cs="Calibri"/>
-                <w:sz w:val="18"/>
-                <w:szCs w:val="18"/>
-              </w:rPr>
-              <w:t xml:space="preserve">谁能判定当前 o⁠w⁠n⁠e⁠r、s⁠h⁠a⁠r⁠e⁠r 与可授予权限？</w:t>
-            </w:r>
-          </w:p>
-        </w:tc>
-        <w:tc>
-          <w:tcPr>
-            <w:tcW w:w="3254" w:type="dxa"/>
-          </w:tcPr>
-          <w:p>
-            <w:pPr>
-              <w:pStyle w:val="TableText"/>
-              <w:jc w:val="left"/>
-              <w:wordWrap w:val="0"/>
-              <w:spacing w:before="0" w:after="0" w:line="320" w:lineRule="exact"/>
-            </w:pPr>
-            <w:r>
-              <w:rPr>
-                <w:rFonts w:ascii="Calibri" w:hAnsi="Calibri" w:eastAsia="Microsoft YaHei" w:cs="Calibri"/>
-                <w:sz w:val="18"/>
-                <w:szCs w:val="18"/>
-              </w:rPr>
-              <w:t xml:space="preserve">地址 H⁠o⁠m⁠e U⁠B⁠C⁠C 控制器的 c⁠o⁠m⁠m⁠i⁠t⁠t⁠e⁠d d⁠i⁠r⁠e⁠c⁠t⁠o⁠r⁠y</w:t>
-            </w:r>
-          </w:p>
-        </w:tc>
-      </w:tr>
-      <w:tr>
-        <w:trPr>
-          <w:cantSplit/>
-        </w:trPr>
-        <w:tc>
-          <w:tcPr>
-            <w:tcW w:w="3091" w:type="dxa"/>
-          </w:tcPr>
-          <w:p>
-            <w:pPr>
-              <w:pStyle w:val="TableText"/>
-              <w:jc w:val="left"/>
-              <w:wordWrap w:val="0"/>
-              <w:spacing w:before="0" w:after="0" w:line="320" w:lineRule="exact"/>
-            </w:pPr>
-            <w:r>
-              <w:rPr>
-                <w:rFonts w:ascii="Calibri" w:hAnsi="Calibri" w:eastAsia="Microsoft YaHei" w:cs="Calibri"/>
-                <w:sz w:val="18"/>
-                <w:szCs w:val="18"/>
-              </w:rPr>
-              <w:t xml:space="preserve">d⁠a⁠t⁠a l⁠o⁠c⁠a⁠t⁠i⁠o⁠n</w:t>
-            </w:r>
-          </w:p>
-        </w:tc>
-        <w:tc>
-          <w:tcPr>
-            <w:tcW w:w="3254" w:type="dxa"/>
-          </w:tcPr>
-          <w:p>
-            <w:pPr>
-              <w:pStyle w:val="TableText"/>
-              <w:jc w:val="left"/>
-              <w:wordWrap w:val="0"/>
-              <w:spacing w:before="0" w:after="0" w:line="320" w:lineRule="exact"/>
-            </w:pPr>
-            <w:r>
-              <w:rPr>
-                <w:rFonts w:ascii="Calibri" w:hAnsi="Calibri" w:eastAsia="Microsoft YaHei" w:cs="Calibri"/>
-                <w:sz w:val="18"/>
-                <w:szCs w:val="18"/>
-              </w:rPr>
-              <w:t xml:space="preserve">最新 64 B 数据此刻在哪里？</w:t>
-            </w:r>
-          </w:p>
-        </w:tc>
-        <w:tc>
-          <w:tcPr>
-            <w:tcW w:w="3254" w:type="dxa"/>
-          </w:tcPr>
-          <w:p>
-            <w:pPr>
-              <w:pStyle w:val="TableText"/>
-              <w:jc w:val="left"/>
-              <w:wordWrap w:val="0"/>
-              <w:spacing w:before="0" w:after="0" w:line="320" w:lineRule="exact"/>
-            </w:pPr>
-            <w:r>
-              <w:rPr>
-                <w:rFonts w:ascii="Calibri" w:hAnsi="Calibri" w:eastAsia="Microsoft YaHei" w:cs="Calibri"/>
-                <w:sz w:val="18"/>
-                <w:szCs w:val="18"/>
-              </w:rPr>
-              <w:t xml:space="preserve">H⁠o⁠m⁠e m⁠e⁠m⁠o⁠r⁠y、远程 o⁠w⁠n⁠e⁠r 或事务数据缓冲；可随 R⁠e⁠c⁠a⁠l⁠l/写回变化</w:t>
-            </w:r>
-          </w:p>
-        </w:tc>
-      </w:tr>
-      <w:tr>
-        <w:trPr>
-          <w:cantSplit/>
-        </w:trPr>
-        <w:tc>
-          <w:tcPr>
-            <w:tcW w:w="3091" w:type="dxa"/>
-          </w:tcPr>
-          <w:p>
-            <w:pPr>
-              <w:pStyle w:val="TableText"/>
-              <w:jc w:val="left"/>
-              <w:wordWrap w:val="0"/>
-              <w:spacing w:before="0" w:after="0" w:line="320" w:lineRule="exact"/>
-            </w:pPr>
-            <w:r>
-              <w:rPr>
-                <w:rFonts w:ascii="Calibri" w:hAnsi="Calibri" w:eastAsia="Microsoft YaHei" w:cs="Calibri"/>
-                <w:sz w:val="18"/>
-                <w:szCs w:val="18"/>
-              </w:rPr>
-              <w:t xml:space="preserve">s⁠e⁠r⁠i⁠a⁠l⁠i⁠z⁠a⁠t⁠i⁠o⁠n/c⁠o⁠m⁠m⁠i⁠t a⁠u⁠t⁠h⁠o⁠r⁠i⁠t⁠y</w:t>
-            </w:r>
-          </w:p>
-        </w:tc>
-        <w:tc>
-          <w:tcPr>
-            <w:tcW w:w="3254" w:type="dxa"/>
-          </w:tcPr>
-          <w:p>
-            <w:pPr>
-              <w:pStyle w:val="TableText"/>
-              <w:jc w:val="left"/>
-              <w:wordWrap w:val="0"/>
-              <w:spacing w:before="0" w:after="0" w:line="320" w:lineRule="exact"/>
-            </w:pPr>
-            <w:r>
-              <w:rPr>
-                <w:rFonts w:ascii="Calibri" w:hAnsi="Calibri" w:eastAsia="Microsoft YaHei" w:cs="Calibri"/>
-                <w:sz w:val="18"/>
-                <w:szCs w:val="18"/>
-              </w:rPr>
-              <w:t xml:space="preserve">谁为同址冲突定序并使 i⁠n⁠t⁠e⁠n⁠d⁠e⁠d s⁠t⁠a⁠t⁠e 对后续请求可见？</w:t>
-            </w:r>
-          </w:p>
-        </w:tc>
-        <w:tc>
-          <w:tcPr>
-            <w:tcW w:w="3254" w:type="dxa"/>
-          </w:tcPr>
-          <w:p>
-            <w:pPr>
-              <w:pStyle w:val="TableText"/>
-              <w:jc w:val="left"/>
-              <w:wordWrap w:val="0"/>
-              <w:spacing w:before="0" w:after="0" w:line="320" w:lineRule="exact"/>
-            </w:pPr>
-            <w:r>
-              <w:rPr>
-                <w:rFonts w:ascii="Calibri" w:hAnsi="Calibri" w:eastAsia="Microsoft YaHei" w:cs="Calibri"/>
-                <w:sz w:val="18"/>
-                <w:szCs w:val="18"/>
-              </w:rPr>
-              <w:t xml:space="preserve">H⁠o⁠m⁠e U⁠B⁠C⁠C 控制器的主事务；匹配 C⁠l⁠e⁠a⁠r 后提交</w:t>
-            </w:r>
-          </w:p>
-        </w:tc>
-      </w:tr>
-    </w:tbl>
+        <w:t xml:space="preserve">比较数据路径前需要区分目录权威、数据位置和提交权威，再按最新数据所在位置⁠分⁠析⁠路⁠径⁠。</w:t>
+      </w:r>
+    </w:p>
+    <w:p>
+      <w:pPr>
+        <w:ind w:left="0" w:firstLine="420"/>
+      </w:pPr>
+      <w:r>
+        <w:rPr>
+          <w:rFonts w:ascii="Calibri" w:hAnsi="Calibri" w:eastAsia="Microsoft YaHei" w:cs="Calibri"/>
+        </w:rPr>
+        <w:t xml:space="preserve">以下路径计数沿用第 7.1 节的 K 与 D，用于表示依赖与遍历，不包含所有实现细⁠节⁠或⁠重⁠试⁠。</w:t>
+      </w:r>
+    </w:p>
+    <w:p>
+      <w:pPr>
+        <w:pStyle w:val="Heading3"/>
+        <w:keepNext/>
+      </w:pPr>
+      <w:r>
+        <w:rPr>
+          <w:rFonts w:ascii="Calibri" w:hAnsi="Calibri" w:eastAsia="SimHei" w:cs="Calibri"/>
+        </w:rPr>
+        <w:t xml:space="preserve">7.4.1 Coherence authority：决定合法权限与目标</w:t>
+      </w:r>
+    </w:p>
+    <w:p>
+      <w:pPr>
+        <w:ind w:left="0" w:firstLine="420"/>
+      </w:pPr>
+      <w:r>
+        <w:rPr>
+          <w:rFonts w:ascii="Calibri" w:hAnsi="Calibri" w:eastAsia="Microsoft YaHei" w:cs="Calibri"/>
+        </w:rPr>
+        <w:t xml:space="preserve">Home UBCC 控制器依据 committed directory 判定当前 owner、节点级 sharer 和可⁠授⁠予⁠权⁠限⁠。</w:t>
+      </w:r>
+    </w:p>
+    <w:p>
+      <w:pPr>
+        <w:ind w:left="0" w:firstLine="420"/>
+      </w:pPr>
+      <w:r>
+        <w:rPr>
+          <w:rFonts w:ascii="Calibri" w:hAnsi="Calibri" w:eastAsia="Microsoft YaHei" w:cs="Calibri"/>
+        </w:rPr>
+        <w:t xml:space="preserve">即使某个节点已经持有可供读取的数据，也需要这一判定来确保供数身份和新副本⁠权⁠限⁠有⁠效⁠。</w:t>
+      </w:r>
+    </w:p>
+    <w:p>
+      <w:pPr>
+        <w:ind w:left="0" w:firstLine="420"/>
+      </w:pPr>
+      <w:r>
+        <w:rPr>
+          <w:rFonts w:ascii="Calibri" w:hAnsi="Calibri" w:eastAsia="Microsoft YaHei" w:cs="Calibri"/>
+        </w:rPr>
+        <w:t xml:space="preserve">对远程读，这决定向谁 Recall；对写请求，这决定必须收敛哪些⁠共⁠享⁠副⁠本⁠。</w:t>
+      </w:r>
+    </w:p>
+    <w:p>
+      <w:pPr>
+        <w:ind w:left="0" w:firstLine="420"/>
+      </w:pPr>
+      <w:r>
+        <w:rPr>
+          <w:rFonts w:ascii="Calibri" w:hAnsi="Calibri" w:eastAsia="Microsoft YaHei" w:cs="Calibri"/>
+        </w:rPr>
+        <w:t xml:space="preserve">目录命中和目标选择位于权限关键路径，因此 ResidentDir 命中率影响 latency，⁠查⁠询⁠端⁠口⁠和</w:t>
+      </w:r>
+    </w:p>
+    <w:p>
+      <w:pPr>
+        <w:ind w:left="0" w:firstLine="420"/>
+      </w:pPr>
+      <w:r>
+        <w:rPr>
+          <w:rFonts w:ascii="Calibri" w:hAnsi="Calibri" w:eastAsia="Microsoft YaHei" w:cs="Calibri"/>
+        </w:rPr>
+        <w:t xml:space="preserve">并发事务资源影响 throughput。精确节点级位图用稳定 storage 换取较少的无关探测 traffic；</w:t>
+      </w:r>
+    </w:p>
+    <w:p>
+      <w:pPr>
+        <w:ind w:left="0" w:firstLine="420"/>
+      </w:pPr>
+      <w:r>
+        <w:rPr>
+          <w:rFonts w:ascii="Calibri" w:hAnsi="Calibri" w:eastAsia="Microsoft YaHei" w:cs="Calibri"/>
+        </w:rPr>
+        <w:t xml:space="preserve">Socket 用于 requester 身份与节点内路由，并不扩大 sharer 数。这一权威职责⁠与⁠数⁠据⁠是⁠否</w:t>
+      </w:r>
+    </w:p>
+    <w:p>
+      <w:pPr>
+        <w:ind w:left="0" w:firstLine="420"/>
+      </w:pPr>
+      <w:r>
+        <w:rPr>
+          <w:rFonts w:ascii="Calibri" w:hAnsi="Calibri" w:eastAsia="Microsoft YaHei" w:cs="Calibri"/>
+        </w:rPr>
+        <w:t xml:space="preserve">经过 Home 无关，直接转发同样需要有效的⁠目⁠录⁠判⁠定⁠。</w:t>
+      </w:r>
+    </w:p>
+    <w:p>
+      <w:pPr>
+        <w:pStyle w:val="Heading3"/>
+        <w:keepNext/>
+      </w:pPr>
+      <w:r>
+        <w:rPr>
+          <w:rFonts w:ascii="Calibri" w:hAnsi="Calibri" w:eastAsia="SimHei" w:cs="Calibri"/>
+        </w:rPr>
+        <w:t xml:space="preserve">7.4.2 Data location：决定完整数据线的移动成本</w:t>
+      </w:r>
+    </w:p>
+    <w:p>
+      <w:pPr>
+        <w:ind w:left="0" w:firstLine="420"/>
+      </w:pPr>
+      <w:r>
+        <w:rPr>
+          <w:rFonts w:ascii="Calibri" w:hAnsi="Calibri" w:eastAsia="Microsoft YaHei" w:cs="Calibri"/>
+        </w:rPr>
+        <w:t xml:space="preserve">最新 64 B 数据可能位于 Home memory、远程 owner 或事务数据缓冲。Recall 与写⁠回⁠可⁠以⁠改⁠变</w:t>
+      </w:r>
+    </w:p>
+    <w:p>
+      <w:pPr>
+        <w:ind w:left="0" w:firstLine="420"/>
+      </w:pPr>
+      <w:r>
+        <w:rPr>
+          <w:rFonts w:ascii="Calibri" w:hAnsi="Calibri" w:eastAsia="Microsoft YaHei" w:cs="Calibri"/>
+        </w:rPr>
+        <w:t xml:space="preserve">数据位置，但不会把全局目录权威随数据一起移交。区分这两个概念后，才能判⁠断⁠一⁠次⁠优⁠化</w:t>
+      </w:r>
+    </w:p>
+    <w:p>
+      <w:pPr>
+        <w:ind w:left="0" w:firstLine="420"/>
+      </w:pPr>
+      <w:r>
+        <w:rPr>
+          <w:rFonts w:ascii="Calibri" w:hAnsi="Calibri" w:eastAsia="Microsoft YaHei" w:cs="Calibri"/>
+        </w:rPr>
+        <w:t xml:space="preserve">是在减少内存访问、缩短互连路径，还是只改变控制消⁠息⁠的⁠组⁠织⁠。</w:t>
+      </w:r>
+    </w:p>
+    <w:p>
+      <w:pPr>
+        <w:ind w:left="0" w:firstLine="420"/>
+      </w:pPr>
+      <w:r>
+        <w:rPr>
+          <w:rFonts w:ascii="Calibri" w:hAnsi="Calibri" w:eastAsia="Microsoft YaHei" w:cs="Calibri"/>
+        </w:rPr>
+        <w:t xml:space="preserve">数据位置直接影响 D、供数 latency 与端口 traffic；热点 owner 的出口和 Home⁠ ⁠中⁠转⁠端⁠口</w:t>
+      </w:r>
+    </w:p>
+    <w:p>
+      <w:pPr>
+        <w:ind w:left="0" w:firstLine="420"/>
+      </w:pPr>
+      <w:r>
+        <w:rPr>
+          <w:rFonts w:ascii="Calibri" w:hAnsi="Calibri" w:eastAsia="Microsoft YaHei" w:cs="Calibri"/>
+        </w:rPr>
+        <w:t xml:space="preserve">都可能成为 throughput 限制。事务缓冲还需要保存回收中的数据，直到对应权限步骤⁠能⁠够⁠推⁠进⁠。</w:t>
+      </w:r>
+    </w:p>
+    <w:p>
+      <w:pPr>
+        <w:ind w:left="0" w:firstLine="420"/>
+      </w:pPr>
+      <w:r>
+        <w:rPr>
+          <w:rFonts w:ascii="Calibri" w:hAnsi="Calibri" w:eastAsia="Microsoft YaHei" w:cs="Calibri"/>
+        </w:rPr>
+        <w:t xml:space="preserve">因此 storage 分析应将目录元数据与 64 B 数据缓冲分开：H64 保存冷目录元数据⁠，⁠不⁠是⁠保⁠存</w:t>
+      </w:r>
+    </w:p>
+    <w:p>
+      <w:pPr>
+        <w:ind w:left="0" w:firstLine="420"/>
+      </w:pPr>
+      <w:r>
+        <w:rPr>
+          <w:rFonts w:ascii="Calibri" w:hAnsi="Calibri" w:eastAsia="Microsoft YaHei" w:cs="Calibri"/>
+        </w:rPr>
+        <w:t xml:space="preserve">这些缓存行数据的另一层⁠数⁠据⁠缓⁠存⁠。</w:t>
+      </w:r>
+    </w:p>
+    <w:p>
+      <w:pPr>
+        <w:pStyle w:val="Heading3"/>
+        <w:keepNext/>
+      </w:pPr>
+      <w:r>
+        <w:rPr>
+          <w:rFonts w:ascii="Calibri" w:hAnsi="Calibri" w:eastAsia="SimHei" w:cs="Calibri"/>
+        </w:rPr>
+        <w:t xml:space="preserve">7.4.3 Serialization/commit authority：决定同址可见顺序</w:t>
+      </w:r>
+    </w:p>
+    <w:p>
+      <w:pPr>
+        <w:ind w:left="0" w:firstLine="420"/>
+      </w:pPr>
+      <w:r>
+        <w:rPr>
+          <w:rFonts w:ascii="Calibri" w:hAnsi="Calibri" w:eastAsia="Microsoft YaHei" w:cs="Calibri"/>
+        </w:rPr>
+        <w:t xml:space="preserve">Home UBCC 控制器以同址主事务协调冲突请求，将 intended state 与 committed stat⁠e⁠ ⁠分⁠开⁠。</w:t>
+      </w:r>
+    </w:p>
+    <w:p>
+      <w:pPr>
+        <w:ind w:left="0" w:firstLine="420"/>
+      </w:pPr>
+      <w:r>
+        <w:rPr>
+          <w:rFonts w:ascii="Calibri" w:hAnsi="Calibri" w:eastAsia="Microsoft YaHei" w:cs="Calibri"/>
+        </w:rPr>
+        <w:t xml:space="preserve">Grant 保留权限，匹配的 Clear 到达后提交新目录状态；数据提前抵达并不使下一⁠笔⁠冲⁠突⁠请⁠求</w:t>
+      </w:r>
+    </w:p>
+    <w:p>
+      <w:pPr>
+        <w:ind w:left="0" w:firstLine="420"/>
+      </w:pPr>
+      <w:r>
+        <w:rPr>
+          <w:rFonts w:ascii="Calibri" w:hAnsi="Calibri" w:eastAsia="Microsoft YaHei" w:cs="Calibri"/>
+        </w:rPr>
+        <w:t xml:space="preserve">自动获得新的权限。该机制把供数完成与全局关系更新联系起来，同时保持两者的⁠职⁠责⁠独⁠立⁠。</w:t>
+      </w:r>
+    </w:p>
+    <w:p>
+      <w:pPr>
+        <w:ind w:left="0" w:firstLine="420"/>
+      </w:pPr>
+      <w:r>
+        <w:rPr>
+          <w:rFonts w:ascii="Calibri" w:hAnsi="Calibri" w:eastAsia="Microsoft YaHei" w:cs="Calibri"/>
+        </w:rPr>
+        <w:t xml:space="preserve">同址热点的 throughput 受主事务占用时间限制，不同地址则可利用多个事务槽⁠并⁠行⁠推⁠进⁠。</w:t>
+      </w:r>
+    </w:p>
+    <w:p>
+      <w:pPr>
+        <w:ind w:left="0" w:firstLine="420"/>
+      </w:pPr>
+      <w:r>
+        <w:rPr>
+          <w:rFonts w:ascii="Calibri" w:hAnsi="Calibri" w:eastAsia="Microsoft YaHei" w:cs="Calibri"/>
+        </w:rPr>
+        <w:t xml:space="preserve">等待请求和完成记录增加瞬态 storage，Clear 等控制消息增加 traffic，但提⁠供⁠了⁠明⁠确⁠的</w:t>
+      </w:r>
+    </w:p>
+    <w:p>
+      <w:pPr>
+        <w:ind w:left="0" w:firstLine="420"/>
+      </w:pPr>
+      <w:r>
+        <w:rPr>
+          <w:rFonts w:ascii="Calibri" w:hAnsi="Calibri" w:eastAsia="Microsoft YaHei" w:cs="Calibri"/>
+        </w:rPr>
+        <w:t xml:space="preserve">提交顺序和幂等完成依据。第 7.1 节的 requester 可见 latency 与事务退役时间应⁠分⁠别⁠观⁠察⁠：</w:t>
+      </w:r>
+    </w:p>
+    <w:p>
+      <w:pPr>
+        <w:ind w:left="0" w:firstLine="420"/>
+      </w:pPr>
+      <w:r>
+        <w:rPr>
+          <w:rFonts w:ascii="Calibri" w:hAnsi="Calibri" w:eastAsia="Microsoft YaHei" w:cs="Calibri"/>
+        </w:rPr>
+        <w:t xml:space="preserve">数据分支变短可以加快读者取得数据，却未必同比缩短同址排队和控制器⁠资⁠源⁠占⁠用⁠。</w:t>
+      </w:r>
+    </w:p>
+    <w:p>
+      <w:pPr>
+        <w:pStyle w:val="Heading3"/>
+        <w:keepNext/>
+      </w:pPr>
+      <w:r>
+        <w:rPr>
+          <w:rFonts w:ascii="Calibri" w:hAnsi="Calibri" w:eastAsia="SimHei" w:cs="Calibri"/>
+        </w:rPr>
+        <w:t xml:space="preserve">7.4.4 Home memory 最新：直接由 Home 供数</w:t>
+      </w:r>
+    </w:p>
+    <w:p>
+      <w:pPr>
+        <w:ind w:left="0" w:firstLine="420"/>
+      </w:pPr>
+      <w:r>
+        <w:rPr>
+          <w:rFonts w:ascii="Calibri" w:hAnsi="Calibri" w:eastAsia="Microsoft YaHei" w:cs="Calibri"/>
+        </w:rPr>
+        <w:t xml:space="preserve">当 Home memory 是权威数据源时，请求与数据返回形成 requester→Home→request⁠e⁠r⁠，⁠约⁠为</w:t>
+      </w:r>
+    </w:p>
+    <w:p>
+      <w:pPr>
+        <w:ind w:left="0" w:firstLine="420"/>
+      </w:pPr>
+      <w:r>
+        <w:rPr>
+          <w:rFonts w:ascii="Calibri" w:hAnsi="Calibri" w:eastAsia="Microsoft YaHei" w:cs="Calibri"/>
+        </w:rPr>
+        <w:t xml:space="preserve">K≈2, D=1。这里的数据起点已经是 Home，增加远程转发角色不会再减少一次⁠数⁠据⁠中⁠转⁠。</w:t>
+      </w:r>
+    </w:p>
+    <w:p>
+      <w:pPr>
+        <w:ind w:left="0" w:firstLine="420"/>
+      </w:pPr>
+      <w:r>
+        <w:rPr>
+          <w:rFonts w:ascii="Calibri" w:hAnsi="Calibri" w:eastAsia="Microsoft YaHei" w:cs="Calibri"/>
+        </w:rPr>
+        <w:t xml:space="preserve">E、O、F 影响副本责任表达，但不凭空改变本次数⁠据⁠的⁠位⁠置⁠。</w:t>
+      </w:r>
+    </w:p>
+    <w:p>
+      <w:pPr>
+        <w:ind w:left="0" w:firstLine="420"/>
+      </w:pPr>
+      <w:r>
+        <w:rPr>
+          <w:rFonts w:ascii="Calibri" w:hAnsi="Calibri" w:eastAsia="Microsoft YaHei" w:cs="Calibri"/>
+        </w:rPr>
+        <w:t xml:space="preserve">这一场景的 latency 主要由请求往返、目录和内存访问决定；throughput 取决于 Home memory</w:t>
+      </w:r>
+    </w:p>
+    <w:p>
+      <w:pPr>
+        <w:ind w:left="0" w:firstLine="420"/>
+      </w:pPr>
+      <w:r>
+        <w:rPr>
+          <w:rFonts w:ascii="Calibri" w:hAnsi="Calibri" w:eastAsia="Microsoft YaHei" w:cs="Calibri"/>
+        </w:rPr>
+        <w:t xml:space="preserve">与返回链路的服务能力。数据 traffic 为一次完整数据线遍历，事务仍需授权与⁠完⁠成⁠状⁠态⁠，</w:t>
+      </w:r>
+    </w:p>
+    <w:p>
+      <w:pPr>
+        <w:ind w:left="0" w:firstLine="420"/>
+      </w:pPr>
+      <w:r>
+        <w:rPr>
+          <w:rFonts w:ascii="Calibri" w:hAnsi="Calibri" w:eastAsia="Microsoft YaHei" w:cs="Calibri"/>
+        </w:rPr>
+        <w:t xml:space="preserve">但不需要为远程 owner Recall 额外建立供数分支。它适合作为比较远程供数组织的⁠基⁠准⁠场⁠景⁠，</w:t>
+      </w:r>
+    </w:p>
+    <w:p>
+      <w:pPr>
+        <w:ind w:left="0" w:firstLine="420"/>
+      </w:pPr>
+      <w:r>
+        <w:rPr>
+          <w:rFonts w:ascii="Calibri" w:hAnsi="Calibri" w:eastAsia="Microsoft YaHei" w:cs="Calibri"/>
+        </w:rPr>
+        <w:t xml:space="preserve">尤其应与 owner 最新场景分开统计，避免把直接转发收益套用到所有远程 miss。</w:t>
+      </w:r>
+    </w:p>
+    <w:p>
+      <w:pPr>
+        <w:pStyle w:val="Heading3"/>
+        <w:keepNext/>
+      </w:pPr>
+      <w:r>
+        <w:rPr>
+          <w:rFonts w:ascii="Calibri" w:hAnsi="Calibri" w:eastAsia="SimHei" w:cs="Calibri"/>
+        </w:rPr>
+        <w:t xml:space="preserve">7.4.5 远程 clean holder/F 供数：路径与响应责任共同决定收益</w:t>
+      </w:r>
+    </w:p>
+    <w:p>
+      <w:pPr>
+        <w:ind w:left="0" w:firstLine="420"/>
+      </w:pPr>
+      <w:r>
+        <w:rPr>
+          <w:rFonts w:ascii="Calibri" w:hAnsi="Calibri" w:eastAsia="Microsoft YaHei" w:cs="Calibri"/>
+        </w:rPr>
+        <w:t xml:space="preserve">若组织允许并选择远程干净持有者供数，Home 中转路径是 requester→Home→holder→Home→</w:t>
+      </w:r>
+    </w:p>
+    <w:p>
+      <w:pPr>
+        <w:ind w:left="0" w:firstLine="420"/>
+      </w:pPr>
+      <w:r>
+        <w:rPr>
+          <w:rFonts w:ascii="Calibri" w:hAnsi="Calibri" w:eastAsia="Microsoft YaHei" w:cs="Calibri"/>
+        </w:rPr>
+        <w:t xml:space="preserve">requester，约为 K≈4, D=2；Home 授权后直接供数的数据分支约为 K≈3, D=1。</w:t>
+      </w:r>
+    </w:p>
+    <w:p>
+      <w:pPr>
+        <w:ind w:left="0" w:firstLine="420"/>
+      </w:pPr>
+      <w:r>
+        <w:rPr>
+          <w:rFonts w:ascii="Calibri" w:hAnsi="Calibri" w:eastAsia="Microsoft YaHei" w:cs="Calibri"/>
+        </w:rPr>
+        <w:t xml:space="preserve">MESIF 的 F 可指定唯一干净响应者，其他状态集合若采用 clean holder 供数也⁠需⁠要⁠明⁠确⁠的</w:t>
+      </w:r>
+    </w:p>
+    <w:p>
+      <w:pPr>
+        <w:ind w:left="0" w:firstLine="420"/>
+      </w:pPr>
+      <w:r>
+        <w:rPr>
+          <w:rFonts w:ascii="Calibri" w:hAnsi="Calibri" w:eastAsia="Microsoft YaHei" w:cs="Calibri"/>
+        </w:rPr>
+        <w:t xml:space="preserve">数据源选择规则。该路径是组织方式比较，不表示当前 UBCC 已采用 F 或任意干净⁠副⁠本⁠转⁠发⁠。</w:t>
+      </w:r>
+    </w:p>
+    <w:p>
+      <w:pPr>
+        <w:ind w:left="0" w:firstLine="420"/>
+      </w:pPr>
+      <w:r>
+        <w:rPr>
+          <w:rFonts w:ascii="Calibri" w:hAnsi="Calibri" w:eastAsia="Microsoft YaHei" w:cs="Calibri"/>
+        </w:rPr>
+        <w:t xml:space="preserve">当远程缓存访问与链路的组合成本低于 Home memory 访问时，cache-to-cache 可改善 latency；</w:t>
+      </w:r>
+    </w:p>
+    <w:p>
+      <w:pPr>
+        <w:ind w:left="0" w:firstLine="420"/>
+      </w:pPr>
+      <w:r>
+        <w:rPr>
+          <w:rFonts w:ascii="Calibri" w:hAnsi="Calibri" w:eastAsia="Microsoft YaHei" w:cs="Calibri"/>
+        </w:rPr>
+        <w:t xml:space="preserve">若 holder 较远或繁忙，目录选择和额外节点访问也可能抵消收益。直接供数降低 Ho⁠m⁠e⁠ ⁠数⁠据</w:t>
+      </w:r>
+    </w:p>
+    <w:p>
+      <w:pPr>
+        <w:ind w:left="0" w:firstLine="420"/>
+      </w:pPr>
+      <w:r>
+        <w:rPr>
+          <w:rFonts w:ascii="Calibri" w:hAnsi="Calibri" w:eastAsia="Microsoft YaHei" w:cs="Calibri"/>
+        </w:rPr>
+        <w:t xml:space="preserve">traffic，却把服务压力转移到 holder，throughput 应连同该节点出口一起评估。storag⁠e⁠ ⁠方⁠面⁠，</w:t>
+      </w:r>
+    </w:p>
+    <w:p>
+      <w:pPr>
+        <w:ind w:left="0" w:firstLine="420"/>
+      </w:pPr>
+      <w:r>
+        <w:rPr>
+          <w:rFonts w:ascii="Calibri" w:hAnsi="Calibri" w:eastAsia="Microsoft YaHei" w:cs="Calibri"/>
+        </w:rPr>
+        <w:t xml:space="preserve">F 责任维护与直接传输完成跟踪是两类独立成本，不能把前者视为自动⁠提⁠供⁠后⁠者⁠。</w:t>
+      </w:r>
+    </w:p>
+    <w:p>
+      <w:pPr>
+        <w:pStyle w:val="Heading3"/>
+        <w:keepNext/>
+      </w:pPr>
+      <w:r>
+        <w:rPr>
+          <w:rFonts w:ascii="Calibri" w:hAnsi="Calibri" w:eastAsia="SimHei" w:cs="Calibri"/>
+        </w:rPr>
+        <w:t xml:space="preserve">7.4.6 远程 dirty owner 最新：先满足数据与权限依赖</w:t>
+      </w:r>
+    </w:p>
+    <w:p>
+      <w:pPr>
+        <w:ind w:left="0" w:firstLine="420"/>
+      </w:pPr>
+      <w:r>
+        <w:rPr>
+          <w:rFonts w:ascii="Calibri" w:hAnsi="Calibri" w:eastAsia="Microsoft YaHei" w:cs="Calibri"/>
+        </w:rPr>
+        <w:t xml:space="preserve">远程 owner 持有最新脏数据时，Home memory 不能替代该数据源。当前 Home⁠ ⁠中⁠转⁠通⁠过</w:t>
+      </w:r>
+    </w:p>
+    <w:p>
+      <w:pPr>
+        <w:ind w:left="0" w:firstLine="420"/>
+      </w:pPr>
+      <w:r>
+        <w:rPr>
+          <w:rFonts w:ascii="Calibri" w:hAnsi="Calibri" w:eastAsia="Microsoft YaHei" w:cs="Calibri"/>
+        </w:rPr>
+        <w:t xml:space="preserve">requester→Home→owner→Home→requester 回收并返回数据，约为 K≈4, D=2。直⁠接⁠转⁠发⁠组⁠织</w:t>
+      </w:r>
+    </w:p>
+    <w:p>
+      <w:pPr>
+        <w:ind w:left="0" w:firstLine="420"/>
+      </w:pPr>
+      <w:r>
+        <w:rPr>
+          <w:rFonts w:ascii="Calibri" w:hAnsi="Calibri" w:eastAsia="Microsoft YaHei" w:cs="Calibri"/>
+        </w:rPr>
+        <w:t xml:space="preserve">在 Home Recall/授权后由 owner 向 requester 供数，数据分支约为 K≈3, D=1。</w:t>
+      </w:r>
+    </w:p>
+    <w:p>
+      <w:pPr>
+        <w:ind w:left="0" w:firstLine="420"/>
+      </w:pPr>
+      <w:r>
+        <w:rPr>
+          <w:rFonts w:ascii="Calibri" w:hAnsi="Calibri" w:eastAsia="Microsoft YaHei" w:cs="Calibri"/>
+        </w:rPr>
+        <w:t xml:space="preserve">MOESI 的 O 可以在只读共享形成后保留脏数据责任，而 MESI 类目录按其降级规则完成⁠共⁠享⁠转⁠换⁠。</w:t>
+      </w:r>
+    </w:p>
+    <w:p>
+      <w:pPr>
+        <w:ind w:left="0" w:firstLine="420"/>
+      </w:pPr>
+      <w:r>
+        <w:rPr>
+          <w:rFonts w:ascii="Calibri" w:hAnsi="Calibri" w:eastAsia="Microsoft YaHei" w:cs="Calibri"/>
+        </w:rPr>
+        <w:t xml:space="preserve">所有权迁移还要求旧 owner 释放权限、其他有效副本完成必要失效。数据可能先⁠到⁠，⁠权⁠限⁠也</w:t>
+      </w:r>
+    </w:p>
+    <w:p>
+      <w:pPr>
+        <w:ind w:left="0" w:firstLine="420"/>
+      </w:pPr>
+      <w:r>
+        <w:rPr>
+          <w:rFonts w:ascii="Calibri" w:hAnsi="Calibri" w:eastAsia="Microsoft YaHei" w:cs="Calibri"/>
+        </w:rPr>
+        <w:t xml:space="preserve">可能先就绪，requester 可见完成受较慢⁠分⁠支⁠约⁠束⁠：</w:t>
+      </w:r>
+    </w:p>
+    <w:p>
+      <w:pPr>
+        <w:ind w:left="0" w:firstLine="420"/>
+      </w:pPr>
+      <w:r>
+        <w:rPr>
+          <w:rFonts w:ascii="STIX Two Math" w:hAnsi="STIX Two Math" w:eastAsia="STIX Two Math" w:cs="STIX Two Math"/>
+        </w:rPr>
+        <w:t xml:space="preserve">T</w:t>
+      </w:r>
+      <w:r>
+        <w:rPr>
+          <w:rFonts w:ascii="STIX Two Math" w:hAnsi="STIX Two Math" w:eastAsia="STIX Two Math" w:cs="STIX Two Math"/>
+          <w:vertAlign w:val="subscript"/>
+          <w:sz w:val="28"/>
+          <w:szCs w:val="28"/>
+        </w:rPr>
+        <w:t xml:space="preserve">visible</w:t>
+      </w:r>
+      <w:r>
+        <w:rPr>
+          <w:rFonts w:ascii="STIX Two Math" w:hAnsi="STIX Two Math" w:eastAsia="STIX Two Math" w:cs="STIX Two Math"/>
+        </w:rPr>
+        <w:t xml:space="preserve"> = max(T</w:t>
+      </w:r>
+      <w:r>
+        <w:rPr>
+          <w:rFonts w:ascii="STIX Two Math" w:hAnsi="STIX Two Math" w:eastAsia="STIX Two Math" w:cs="STIX Two Math"/>
+          <w:vertAlign w:val="subscript"/>
+          <w:sz w:val="28"/>
+          <w:szCs w:val="28"/>
+        </w:rPr>
+        <w:t xml:space="preserve">data</w:t>
+      </w:r>
+      <w:r>
+        <w:rPr>
+          <w:rFonts w:ascii="STIX Two Math" w:hAnsi="STIX Two Math" w:eastAsia="STIX Two Math" w:cs="STIX Two Math"/>
+        </w:rPr>
+        <w:t xml:space="preserve">, T</w:t>
+      </w:r>
+      <w:r>
+        <w:rPr>
+          <w:rFonts w:ascii="STIX Two Math" w:hAnsi="STIX Two Math" w:eastAsia="STIX Two Math" w:cs="STIX Two Math"/>
+          <w:vertAlign w:val="subscript"/>
+          <w:sz w:val="28"/>
+          <w:szCs w:val="28"/>
+        </w:rPr>
+        <w:t xml:space="preserve">authority</w:t>
+      </w:r>
+      <w:r>
+        <w:rPr>
+          <w:rFonts w:ascii="STIX Two Math" w:hAnsi="STIX Two Math" w:eastAsia="STIX Two Math" w:cs="STIX Two Math"/>
+        </w:rPr>
+        <w:t xml:space="preserve">)</w:t>
+      </w:r>
+      <w:r>
+        <w:rPr>
+          <w:rFonts w:ascii="Calibri" w:hAnsi="Calibri" w:eastAsia="Microsoft YaHei" w:cs="Calibri"/>
+        </w:rPr>
+        <w:t xml:space="preserve">。这解释了为什⁠么⁠减⁠少⁠数⁠据</w:t>
+      </w:r>
+    </w:p>
+    <w:p>
+      <w:pPr>
+        <w:ind w:left="0" w:firstLine="420"/>
+      </w:pPr>
+      <w:r>
+        <w:rPr>
+          <w:rFonts w:ascii="Calibri" w:hAnsi="Calibri" w:eastAsia="Microsoft YaHei" w:cs="Calibri"/>
+        </w:rPr>
+        <w:t xml:space="preserve">遍历能够降低 traffic，却不一定同比降低写迁移 latency。热点 owner 供数、⁠失⁠效⁠尾⁠部⁠和</w:t>
+      </w:r>
+    </w:p>
+    <w:p>
+      <w:pPr>
+        <w:ind w:left="0" w:firstLine="420"/>
+      </w:pPr>
+      <w:r>
+        <w:rPr>
+          <w:rFonts w:ascii="Calibri" w:hAnsi="Calibri" w:eastAsia="Microsoft YaHei" w:cs="Calibri"/>
+        </w:rPr>
+        <w:t xml:space="preserve">主事务占用共同决定 throughput；Recall 数据缓冲、目标集合及两个分支的完⁠成⁠关⁠联⁠构⁠成</w:t>
+      </w:r>
+    </w:p>
+    <w:p>
+      <w:pPr>
+        <w:ind w:left="0" w:firstLine="420"/>
+      </w:pPr>
+      <w:r>
+        <w:rPr>
+          <w:rFonts w:ascii="Calibri" w:hAnsi="Calibri" w:eastAsia="Microsoft YaHei" w:cs="Calibri"/>
+        </w:rPr>
+        <w:t xml:space="preserve">瞬态 storage。该场景最能体现数据路径优化的价值，也最需要保持权限依赖的⁠完⁠整⁠分⁠析⁠。</w:t>
+      </w:r>
+    </w:p>
+    <w:p>
+      <w:pPr>
+        <w:pStyle w:val="FigureCaption"/>
+        <w:jc w:val="center"/>
+      </w:pPr>
+      <w:r>
+        <w:rPr>
+          <w:rFonts w:ascii="Calibri" w:hAnsi="Calibri" w:eastAsia="Microsoft YaHei" w:cs="Calibri"/>
+        </w:rPr>
+        <w:t xml:space="preserve">图 7-2 对比上述 Home 中转和直接转发的数据分支；下列两表分别总结职责与路径。</w:t>
+      </w:r>
+    </w:p>
     <w:p>
       <w:pPr>
         <w:jc w:val="center"/>
@@ -7046,6 +8301,303 @@
         </w:tblCellMar>
       </w:tblPr>
       <w:tblGrid>
+        <w:gridCol w:w="3318"/>
+        <w:gridCol w:w="2784"/>
+        <w:gridCol w:w="3496"/>
+      </w:tblGrid>
+      <w:tr>
+        <w:trPr>
+          <w:cantSplit/>
+          <w:tblHeader/>
+        </w:trPr>
+        <w:tc>
+          <w:tcPr>
+            <w:tcW w:w="3318" w:type="dxa"/>
+            <w:shd w:val="clear" w:color="auto" w:fill="D9E2F3"/>
+          </w:tcPr>
+          <w:p>
+            <w:pPr>
+              <w:pStyle w:val="TableText"/>
+              <w:jc w:val="left"/>
+              <w:wordWrap w:val="0"/>
+              <w:spacing w:before="0" w:after="0" w:line="320" w:lineRule="exact"/>
+            </w:pPr>
+            <w:r>
+              <w:rPr>
+                <w:rFonts w:ascii="Calibri" w:hAnsi="Calibri" w:eastAsia="SimHei" w:cs="Calibri"/>
+                <w:b/>
+                <w:sz w:val="18"/>
+                <w:szCs w:val="18"/>
+              </w:rPr>
+              <w:t xml:space="preserve">概念</w:t>
+            </w:r>
+          </w:p>
+        </w:tc>
+        <w:tc>
+          <w:tcPr>
+            <w:tcW w:w="2784" w:type="dxa"/>
+            <w:shd w:val="clear" w:color="auto" w:fill="D9E2F3"/>
+          </w:tcPr>
+          <w:p>
+            <w:pPr>
+              <w:pStyle w:val="TableText"/>
+              <w:jc w:val="left"/>
+              <w:wordWrap w:val="0"/>
+              <w:spacing w:before="0" w:after="0" w:line="320" w:lineRule="exact"/>
+            </w:pPr>
+            <w:r>
+              <w:rPr>
+                <w:rFonts w:ascii="Calibri" w:hAnsi="Calibri" w:eastAsia="SimHei" w:cs="Calibri"/>
+                <w:b/>
+                <w:sz w:val="18"/>
+                <w:szCs w:val="18"/>
+              </w:rPr>
+              <w:t xml:space="preserve">回答的问题</w:t>
+            </w:r>
+          </w:p>
+        </w:tc>
+        <w:tc>
+          <w:tcPr>
+            <w:tcW w:w="3496" w:type="dxa"/>
+            <w:shd w:val="clear" w:color="auto" w:fill="D9E2F3"/>
+          </w:tcPr>
+          <w:p>
+            <w:pPr>
+              <w:pStyle w:val="TableText"/>
+              <w:jc w:val="left"/>
+              <w:wordWrap w:val="0"/>
+              <w:spacing w:before="0" w:after="0" w:line="320" w:lineRule="exact"/>
+            </w:pPr>
+            <w:r>
+              <w:rPr>
+                <w:rFonts w:ascii="Calibri" w:hAnsi="Calibri" w:eastAsia="SimHei" w:cs="Calibri"/>
+                <w:b/>
+                <w:sz w:val="18"/>
+                <w:szCs w:val="18"/>
+              </w:rPr>
+              <w:t xml:space="preserve">当前 U⁠B⁠C⁠C 中的位置</w:t>
+            </w:r>
+          </w:p>
+        </w:tc>
+      </w:tr>
+      <w:tr>
+        <w:trPr>
+          <w:cantSplit/>
+        </w:trPr>
+        <w:tc>
+          <w:tcPr>
+            <w:tcW w:w="3318" w:type="dxa"/>
+          </w:tcPr>
+          <w:p>
+            <w:pPr>
+              <w:pStyle w:val="TableText"/>
+              <w:jc w:val="left"/>
+              <w:wordWrap w:val="0"/>
+              <w:spacing w:before="0" w:after="0" w:line="320" w:lineRule="exact"/>
+            </w:pPr>
+            <w:r>
+              <w:rPr>
+                <w:rFonts w:ascii="Calibri" w:hAnsi="Calibri" w:eastAsia="Microsoft YaHei" w:cs="Calibri"/>
+                <w:sz w:val="18"/>
+                <w:szCs w:val="18"/>
+              </w:rPr>
+              <w:t xml:space="preserve">c⁠o⁠h⁠e⁠r⁠e⁠n⁠c⁠e a⁠u⁠t⁠h⁠o⁠r⁠i⁠t⁠y</w:t>
+            </w:r>
+          </w:p>
+        </w:tc>
+        <w:tc>
+          <w:tcPr>
+            <w:tcW w:w="2784" w:type="dxa"/>
+          </w:tcPr>
+          <w:p>
+            <w:pPr>
+              <w:pStyle w:val="TableText"/>
+              <w:jc w:val="left"/>
+              <w:wordWrap w:val="0"/>
+              <w:spacing w:before="0" w:after="0" w:line="320" w:lineRule="exact"/>
+            </w:pPr>
+            <w:r>
+              <w:rPr>
+                <w:rFonts w:ascii="Calibri" w:hAnsi="Calibri" w:eastAsia="Microsoft YaHei" w:cs="Calibri"/>
+                <w:sz w:val="18"/>
+                <w:szCs w:val="18"/>
+              </w:rPr>
+              <w:t xml:space="preserve">谁判定 o⁠w⁠n⁠e⁠r、s⁠h⁠a⁠r⁠e⁠r 与可授予权限？</w:t>
+            </w:r>
+          </w:p>
+        </w:tc>
+        <w:tc>
+          <w:tcPr>
+            <w:tcW w:w="3496" w:type="dxa"/>
+          </w:tcPr>
+          <w:p>
+            <w:pPr>
+              <w:pStyle w:val="TableText"/>
+              <w:jc w:val="left"/>
+              <w:wordWrap w:val="0"/>
+              <w:spacing w:before="0" w:after="0" w:line="320" w:lineRule="exact"/>
+            </w:pPr>
+            <w:r>
+              <w:rPr>
+                <w:rFonts w:ascii="Calibri" w:hAnsi="Calibri" w:eastAsia="Microsoft YaHei" w:cs="Calibri"/>
+                <w:sz w:val="18"/>
+                <w:szCs w:val="18"/>
+              </w:rPr>
+              <w:t xml:space="preserve">H⁠o⁠m⁠e U⁠B⁠C⁠C 控制器的 c⁠o⁠m⁠m⁠i⁠t⁠t⁠e⁠d d⁠i⁠r⁠e⁠c⁠t⁠o⁠r⁠y</w:t>
+            </w:r>
+          </w:p>
+        </w:tc>
+      </w:tr>
+      <w:tr>
+        <w:trPr>
+          <w:cantSplit/>
+        </w:trPr>
+        <w:tc>
+          <w:tcPr>
+            <w:tcW w:w="3318" w:type="dxa"/>
+          </w:tcPr>
+          <w:p>
+            <w:pPr>
+              <w:pStyle w:val="TableText"/>
+              <w:jc w:val="left"/>
+              <w:wordWrap w:val="0"/>
+              <w:spacing w:before="0" w:after="0" w:line="320" w:lineRule="exact"/>
+            </w:pPr>
+            <w:r>
+              <w:rPr>
+                <w:rFonts w:ascii="Calibri" w:hAnsi="Calibri" w:eastAsia="Microsoft YaHei" w:cs="Calibri"/>
+                <w:sz w:val="18"/>
+                <w:szCs w:val="18"/>
+              </w:rPr>
+              <w:t xml:space="preserve">d⁠a⁠t⁠a l⁠o⁠c⁠a⁠t⁠i⁠o⁠n</w:t>
+            </w:r>
+          </w:p>
+        </w:tc>
+        <w:tc>
+          <w:tcPr>
+            <w:tcW w:w="2784" w:type="dxa"/>
+          </w:tcPr>
+          <w:p>
+            <w:pPr>
+              <w:pStyle w:val="TableText"/>
+              <w:jc w:val="left"/>
+              <w:wordWrap w:val="0"/>
+              <w:spacing w:before="0" w:after="0" w:line="320" w:lineRule="exact"/>
+            </w:pPr>
+            <w:r>
+              <w:rPr>
+                <w:rFonts w:ascii="Calibri" w:hAnsi="Calibri" w:eastAsia="Microsoft YaHei" w:cs="Calibri"/>
+                <w:sz w:val="18"/>
+                <w:szCs w:val="18"/>
+              </w:rPr>
+              <w:t xml:space="preserve">最新 64 B 数据在哪里？</w:t>
+            </w:r>
+          </w:p>
+        </w:tc>
+        <w:tc>
+          <w:tcPr>
+            <w:tcW w:w="3496" w:type="dxa"/>
+          </w:tcPr>
+          <w:p>
+            <w:pPr>
+              <w:pStyle w:val="TableText"/>
+              <w:jc w:val="left"/>
+              <w:wordWrap w:val="0"/>
+              <w:spacing w:before="0" w:after="0" w:line="320" w:lineRule="exact"/>
+            </w:pPr>
+            <w:r>
+              <w:rPr>
+                <w:rFonts w:ascii="Calibri" w:hAnsi="Calibri" w:eastAsia="Microsoft YaHei" w:cs="Calibri"/>
+                <w:sz w:val="18"/>
+                <w:szCs w:val="18"/>
+              </w:rPr>
+              <w:t xml:space="preserve">H⁠o⁠m⁠e m⁠e⁠m⁠o⁠r⁠y、远程 o⁠w⁠n⁠e⁠r 或事务数据缓冲</w:t>
+            </w:r>
+          </w:p>
+        </w:tc>
+      </w:tr>
+      <w:tr>
+        <w:trPr>
+          <w:cantSplit/>
+        </w:trPr>
+        <w:tc>
+          <w:tcPr>
+            <w:tcW w:w="3318" w:type="dxa"/>
+          </w:tcPr>
+          <w:p>
+            <w:pPr>
+              <w:pStyle w:val="TableText"/>
+              <w:jc w:val="left"/>
+              <w:wordWrap w:val="0"/>
+              <w:spacing w:before="0" w:after="0" w:line="320" w:lineRule="exact"/>
+            </w:pPr>
+            <w:r>
+              <w:rPr>
+                <w:rFonts w:ascii="Calibri" w:hAnsi="Calibri" w:eastAsia="Microsoft YaHei" w:cs="Calibri"/>
+                <w:sz w:val="18"/>
+                <w:szCs w:val="18"/>
+              </w:rPr>
+              <w:t xml:space="preserve">s⁠e⁠r⁠i⁠a⁠l⁠i⁠z⁠a⁠t⁠i⁠o⁠n/c⁠o⁠m⁠m⁠i⁠t a⁠u⁠t⁠h⁠o⁠r⁠i⁠t⁠y</w:t>
+            </w:r>
+          </w:p>
+        </w:tc>
+        <w:tc>
+          <w:tcPr>
+            <w:tcW w:w="2784" w:type="dxa"/>
+          </w:tcPr>
+          <w:p>
+            <w:pPr>
+              <w:pStyle w:val="TableText"/>
+              <w:jc w:val="left"/>
+              <w:wordWrap w:val="0"/>
+              <w:spacing w:before="0" w:after="0" w:line="320" w:lineRule="exact"/>
+            </w:pPr>
+            <w:r>
+              <w:rPr>
+                <w:rFonts w:ascii="Calibri" w:hAnsi="Calibri" w:eastAsia="Microsoft YaHei" w:cs="Calibri"/>
+                <w:sz w:val="18"/>
+                <w:szCs w:val="18"/>
+              </w:rPr>
+              <w:t xml:space="preserve">谁定序并提交同址状态？</w:t>
+            </w:r>
+          </w:p>
+        </w:tc>
+        <w:tc>
+          <w:tcPr>
+            <w:tcW w:w="3496" w:type="dxa"/>
+          </w:tcPr>
+          <w:p>
+            <w:pPr>
+              <w:pStyle w:val="TableText"/>
+              <w:jc w:val="left"/>
+              <w:wordWrap w:val="0"/>
+              <w:spacing w:before="0" w:after="0" w:line="320" w:lineRule="exact"/>
+            </w:pPr>
+            <w:r>
+              <w:rPr>
+                <w:rFonts w:ascii="Calibri" w:hAnsi="Calibri" w:eastAsia="Microsoft YaHei" w:cs="Calibri"/>
+                <w:sz w:val="18"/>
+                <w:szCs w:val="18"/>
+              </w:rPr>
+              <w:t xml:space="preserve">H⁠o⁠m⁠e U⁠B⁠C⁠C 控制器主事务；匹配 C⁠l⁠e⁠a⁠r 后提交</w:t>
+            </w:r>
+          </w:p>
+        </w:tc>
+      </w:tr>
+    </w:tbl>
+    <w:tbl>
+      <w:tblPr>
+        <w:tblStyle w:val="TableGrid"/>
+        <w:tblW w:w="5000" w:type="pct"/>
+        <w:tblLayout w:type="fixed"/>
+        <w:tblCellMar>
+          <w:top w:w="60" w:type="dxa"/>
+          <w:left w:w="90" w:type="dxa"/>
+          <w:bottom w:w="60" w:type="dxa"/>
+          <w:right w:w="90" w:type="dxa"/>
+        </w:tblCellMar>
+      </w:tblPr>
+      <w:tblGrid>
         <w:gridCol w:w="1955"/>
         <w:gridCol w:w="2548"/>
         <w:gridCol w:w="2548"/>
@@ -7417,90 +8969,6 @@
         </w:tc>
       </w:tr>
     </w:tbl>
-    <w:p>
-      <w:pPr>
-        <w:ind w:left="0" w:firstLine="420"/>
-      </w:pPr>
-      <w:r>
-        <w:rPr>
-          <w:rFonts w:ascii="Calibri" w:hAnsi="Calibri" w:eastAsia="Microsoft YaHei" w:cs="Calibri"/>
-        </w:rPr>
-        <w:t xml:space="preserve">直接数据路径减少 Home 数据带宽，但 requester 可见完成仍取决于数据与权限⁠两⁠个⁠分⁠支⁠：</w:t>
-      </w:r>
-    </w:p>
-    <w:p>
-      <w:pPr>
-        <w:ind w:left="0" w:firstLine="420"/>
-      </w:pPr>
-      <w:r>
-        <w:rPr>
-          <w:rFonts w:ascii="STIX Two Math" w:hAnsi="STIX Two Math" w:eastAsia="STIX Two Math" w:cs="STIX Two Math"/>
-        </w:rPr>
-        <w:t xml:space="preserve">T</w:t>
-      </w:r>
-      <w:r>
-        <w:rPr>
-          <w:rFonts w:ascii="STIX Two Math" w:hAnsi="STIX Two Math" w:eastAsia="STIX Two Math" w:cs="STIX Two Math"/>
-          <w:vertAlign w:val="subscript"/>
-          <w:sz w:val="28"/>
-          <w:szCs w:val="28"/>
-        </w:rPr>
-        <w:t xml:space="preserve">visible</w:t>
-      </w:r>
-      <w:r>
-        <w:rPr>
-          <w:rFonts w:ascii="STIX Two Math" w:hAnsi="STIX Two Math" w:eastAsia="STIX Two Math" w:cs="STIX Two Math"/>
-        </w:rPr>
-        <w:t xml:space="preserve"> = max(T</w:t>
-      </w:r>
-      <w:r>
-        <w:rPr>
-          <w:rFonts w:ascii="STIX Two Math" w:hAnsi="STIX Two Math" w:eastAsia="STIX Two Math" w:cs="STIX Two Math"/>
-          <w:vertAlign w:val="subscript"/>
-          <w:sz w:val="28"/>
-          <w:szCs w:val="28"/>
-        </w:rPr>
-        <w:t xml:space="preserve">data</w:t>
-      </w:r>
-      <w:r>
-        <w:rPr>
-          <w:rFonts w:ascii="STIX Two Math" w:hAnsi="STIX Two Math" w:eastAsia="STIX Two Math" w:cs="STIX Two Math"/>
-        </w:rPr>
-        <w:t xml:space="preserve">, T</w:t>
-      </w:r>
-      <w:r>
-        <w:rPr>
-          <w:rFonts w:ascii="STIX Two Math" w:hAnsi="STIX Two Math" w:eastAsia="STIX Two Math" w:cs="STIX Two Math"/>
-          <w:vertAlign w:val="subscript"/>
-          <w:sz w:val="28"/>
-          <w:szCs w:val="28"/>
-        </w:rPr>
-        <w:t xml:space="preserve">authority</w:t>
-      </w:r>
-      <w:r>
-        <w:rPr>
-          <w:rFonts w:ascii="STIX Two Math" w:hAnsi="STIX Two Math" w:eastAsia="STIX Two Math" w:cs="STIX Two Math"/>
-        </w:rPr>
-        <w:t xml:space="preserve">)</w:t>
-      </w:r>
-      <w:r>
-        <w:rPr>
-          <w:rFonts w:ascii="Calibri" w:hAnsi="Calibri" w:eastAsia="Microsoft YaHei" w:cs="Calibri"/>
-        </w:rPr>
-        <w:t xml:space="preserve">。所有权迁移还需要旧 owner 完成释放，并由 Home UBCC</w:t>
-      </w:r>
-    </w:p>
-    <w:p>
-      <w:pPr>
-        <w:ind w:left="0" w:firstLine="420"/>
-      </w:pPr>
-      <w:r>
-        <w:rPr>
-          <w:rFonts w:ascii="Calibri" w:hAnsi="Calibri" w:eastAsia="Microsoft YaHei" w:cs="Calibri"/>
-        </w:rPr>
-        <w:t xml:space="preserve">控制器提交新 owner；减少数据遍历不能取消⁠这⁠一⁠依⁠赖⁠。</w:t>
-      </w:r>
-    </w:p>
     <w:p>
       <w:pPr>
         <w:pStyle w:val="Heading3"/>
@@ -8070,6 +9538,406 @@
     </w:p>
     <w:p>
       <w:pPr>
+        <w:ind w:left="0" w:firstLine="420"/>
+      </w:pPr>
+      <w:r>
+        <w:rPr>
+          <w:rFonts w:ascii="Calibri" w:hAnsi="Calibri" w:eastAsia="Microsoft YaHei" w:cs="Calibri"/>
+        </w:rPr>
+        <w:t xml:space="preserve">组合选择应先识别限制性能的访问模式与资源，再决定是否增加状态责任或改变⁠数⁠据⁠组⁠织⁠。</w:t>
+      </w:r>
+    </w:p>
+    <w:p>
+      <w:pPr>
+        <w:ind w:left="0" w:firstLine="420"/>
+      </w:pPr>
+      <w:r>
+        <w:rPr>
+          <w:rFonts w:ascii="Calibri" w:hAnsi="Calibri" w:eastAsia="Microsoft YaHei" w:cs="Calibri"/>
+        </w:rPr>
+        <w:t xml:space="preserve">前者针对副本关系，后者针对消息与数据承载；两者可以组合，但收益和成本需要⁠分⁠别⁠核⁠算⁠。</w:t>
+      </w:r>
+    </w:p>
+    <w:p>
+      <w:pPr>
+        <w:pStyle w:val="Heading3"/>
+        <w:keepNext/>
+      </w:pPr>
+      <w:r>
+        <w:rPr>
+          <w:rFonts w:ascii="Calibri" w:hAnsi="Calibri" w:eastAsia="SimHei" w:cs="Calibri"/>
+        </w:rPr>
+        <w:t xml:space="preserve">7.8.1 MESI、专用 Home-directory 与 Home 中转</w:t>
+      </w:r>
+    </w:p>
+    <w:p>
+      <w:pPr>
+        <w:ind w:left="0" w:firstLine="420"/>
+      </w:pPr>
+      <w:r>
+        <w:rPr>
+          <w:rFonts w:ascii="Calibri" w:hAnsi="Calibri" w:eastAsia="Microsoft YaHei" w:cs="Calibri"/>
+        </w:rPr>
+        <w:t xml:space="preserve">这一组合利用 E 缩短私有干净数据的写升级，通过精确节点级 sharer 限制失效范围⁠，⁠并⁠将⁠目⁠录</w:t>
+      </w:r>
+    </w:p>
+    <w:p>
+      <w:pPr>
+        <w:ind w:left="0" w:firstLine="420"/>
+      </w:pPr>
+      <w:r>
+        <w:rPr>
+          <w:rFonts w:ascii="Calibri" w:hAnsi="Calibri" w:eastAsia="Microsoft YaHei" w:cs="Calibri"/>
+        </w:rPr>
+        <w:t xml:space="preserve">与同址提交集中在地址对应的 Home UBCC 控制器。它适合同时重视全局权限精度、⁠节⁠点⁠内⁠资⁠源</w:t>
+      </w:r>
+    </w:p>
+    <w:p>
+      <w:pPr>
+        <w:ind w:left="0" w:firstLine="420"/>
+      </w:pPr>
+      <w:r>
+        <w:rPr>
+          <w:rFonts w:ascii="Calibri" w:hAnsi="Calibri" w:eastAsia="Microsoft YaHei" w:cs="Calibri"/>
+        </w:rPr>
+        <w:t xml:space="preserve">隔离和目录容量扩展的系统，也是当前 UBCC 所采⁠用⁠的⁠组⁠合⁠。</w:t>
+      </w:r>
+    </w:p>
+    <w:p>
+      <w:pPr>
+        <w:ind w:left="0" w:firstLine="420"/>
+      </w:pPr>
+      <w:r>
+        <w:rPr>
+          <w:rFonts w:ascii="Calibri" w:hAnsi="Calibri" w:eastAsia="Microsoft YaHei" w:cs="Calibri"/>
+        </w:rPr>
+        <w:t xml:space="preserve">私有读后写访问减少全局升级占用，稀疏共享减少无效控制 traffic；远程脏数据则承担⁠ ⁠H⁠o⁠m⁠e</w:t>
+      </w:r>
+    </w:p>
+    <w:p>
+      <w:pPr>
+        <w:ind w:left="0" w:firstLine="420"/>
+      </w:pPr>
+      <w:r>
+        <w:rPr>
+          <w:rFonts w:ascii="Calibri" w:hAnsi="Calibri" w:eastAsia="Microsoft YaHei" w:cs="Calibri"/>
+        </w:rPr>
+        <w:t xml:space="preserve">中转的 latency 与数据带宽。throughput 需兼顾目录并行度和 Home 端口，而不是只⁠提⁠高⁠事⁠务⁠槽</w:t>
+      </w:r>
+    </w:p>
+    <w:p>
+      <w:pPr>
+        <w:ind w:left="0" w:firstLine="420"/>
+      </w:pPr>
+      <w:r>
+        <w:rPr>
+          <w:rFonts w:ascii="Calibri" w:hAnsi="Calibri" w:eastAsia="Microsoft YaHei" w:cs="Calibri"/>
+        </w:rPr>
+        <w:t xml:space="preserve">数量。storage 由 2-bit 稳定状态、精确位图、分层元数据和专用事务资源组成。Resident⁠D⁠i⁠r⁠ ⁠与</w:t>
+      </w:r>
+    </w:p>
+    <w:p>
+      <w:pPr>
+        <w:ind w:left="0" w:firstLine="420"/>
+      </w:pPr>
+      <w:r>
+        <w:rPr>
+          <w:rFonts w:ascii="Calibri" w:hAnsi="Calibri" w:eastAsia="Microsoft YaHei" w:cs="Calibri"/>
+        </w:rPr>
+        <w:t xml:space="preserve">H64 的价值在于按冷热度分配元数据容量，不改变最新缓存行数据的⁠供⁠数⁠责⁠任⁠。</w:t>
+      </w:r>
+    </w:p>
+    <w:p>
+      <w:pPr>
+        <w:pStyle w:val="Heading3"/>
+        <w:keepNext/>
+      </w:pPr>
+      <w:r>
+        <w:rPr>
+          <w:rFonts w:ascii="Calibri" w:hAnsi="Calibri" w:eastAsia="SimHei" w:cs="Calibri"/>
+        </w:rPr>
+        <w:t xml:space="preserve">7.8.2 MESI/MOESI、专用 Home-directory 与直接数据</w:t>
+      </w:r>
+    </w:p>
+    <w:p>
+      <w:pPr>
+        <w:ind w:left="0" w:firstLine="420"/>
+      </w:pPr>
+      <w:r>
+        <w:rPr>
+          <w:rFonts w:ascii="Calibri" w:hAnsi="Calibri" w:eastAsia="Microsoft YaHei" w:cs="Calibri"/>
+        </w:rPr>
+        <w:t xml:space="preserve">当 owner 供数占比高且 Home 数据端口成为主要瓶颈时，可以保持专用目录权威，⁠将⁠数⁠据⁠分⁠支</w:t>
+      </w:r>
+    </w:p>
+    <w:p>
+      <w:pPr>
+        <w:ind w:left="0" w:firstLine="420"/>
+      </w:pPr>
+      <w:r>
+        <w:rPr>
+          <w:rFonts w:ascii="Calibri" w:hAnsi="Calibri" w:eastAsia="Microsoft YaHei" w:cs="Calibri"/>
+        </w:rPr>
+        <w:t xml:space="preserve">改为授权后的 source→requester。MESI 已可与该组织组合；若脏共享读取还能持续⁠复⁠用⁠数⁠据⁠，</w:t>
+      </w:r>
+    </w:p>
+    <w:p>
+      <w:pPr>
+        <w:ind w:left="0" w:firstLine="420"/>
+      </w:pPr>
+      <w:r>
+        <w:rPr>
+          <w:rFonts w:ascii="Calibri" w:hAnsi="Calibri" w:eastAsia="Microsoft YaHei" w:cs="Calibri"/>
+        </w:rPr>
+        <w:t xml:space="preserve">MOESI 的 O 则进一步减少回写需求。因此“直接数据”和“Owned”分别优化路径与⁠数⁠据⁠责⁠任⁠，</w:t>
+      </w:r>
+    </w:p>
+    <w:p>
+      <w:pPr>
+        <w:ind w:left="0" w:firstLine="420"/>
+      </w:pPr>
+      <w:r>
+        <w:rPr>
+          <w:rFonts w:ascii="Calibri" w:hAnsi="Calibri" w:eastAsia="Microsoft YaHei" w:cs="Calibri"/>
+        </w:rPr>
+        <w:t xml:space="preserve">不能视为必须同时采用的⁠一⁠项⁠能⁠力⁠。</w:t>
+      </w:r>
+    </w:p>
+    <w:p>
+      <w:pPr>
+        <w:ind w:left="0" w:firstLine="420"/>
+      </w:pPr>
+      <w:r>
+        <w:rPr>
+          <w:rFonts w:ascii="Calibri" w:hAnsi="Calibri" w:eastAsia="Microsoft YaHei" w:cs="Calibri"/>
+        </w:rPr>
+        <w:t xml:space="preserve">这类组合减少完整数据线中转，有助于数据受限的 throughput，也可能缩短读或 hand⁠o⁠f⁠f⁠ ⁠的</w:t>
+      </w:r>
+    </w:p>
+    <w:p>
+      <w:pPr>
+        <w:ind w:left="0" w:firstLine="420"/>
+      </w:pPr>
+      <w:r>
+        <w:rPr>
+          <w:rFonts w:ascii="Calibri" w:hAnsi="Calibri" w:eastAsia="Microsoft YaHei" w:cs="Calibri"/>
+        </w:rPr>
+        <w:t xml:space="preserve">数据 latency；权限收敛占主导时，可见完成收益受限。storage 需增加传输授权与⁠完⁠成⁠跟⁠踪⁠，</w:t>
+      </w:r>
+    </w:p>
+    <w:p>
+      <w:pPr>
+        <w:ind w:left="0" w:firstLine="420"/>
+      </w:pPr>
+      <w:r>
+        <w:rPr>
+          <w:rFonts w:ascii="Calibri" w:hAnsi="Calibri" w:eastAsia="Microsoft YaHei" w:cs="Calibri"/>
+        </w:rPr>
+        <w:t xml:space="preserve">采用 O 时还需管理脏共享生命周期。适用判断应同时检查供数节点出口、互连竞争和⁠共⁠享⁠模⁠式⁠，</w:t>
+      </w:r>
+    </w:p>
+    <w:p>
+      <w:pPr>
+        <w:ind w:left="0" w:firstLine="420"/>
+      </w:pPr>
+      <w:r>
+        <w:rPr>
+          <w:rFonts w:ascii="Calibri" w:hAnsi="Calibri" w:eastAsia="Microsoft YaHei" w:cs="Calibri"/>
+        </w:rPr>
+        <w:t xml:space="preserve">避免以 Home traffic 下降代替整个系统收益。该组合在此用于架构⁠取⁠舍⁠分⁠析⁠。</w:t>
+      </w:r>
+    </w:p>
+    <w:p>
+      <w:pPr>
+        <w:pStyle w:val="Heading3"/>
+        <w:keepNext/>
+      </w:pPr>
+      <w:r>
+        <w:rPr>
+          <w:rFonts w:ascii="Calibri" w:hAnsi="Calibri" w:eastAsia="SimHei" w:cs="Calibri"/>
+        </w:rPr>
+        <w:t xml:space="preserve">7.8.3 MOESI/MESIF 与 Outer CHI</w:t>
+      </w:r>
+    </w:p>
+    <w:p>
+      <w:pPr>
+        <w:ind w:left="0" w:firstLine="420"/>
+      </w:pPr>
+      <w:r>
+        <w:rPr>
+          <w:rFonts w:ascii="Calibri" w:hAnsi="Calibri" w:eastAsia="Microsoft YaHei" w:cs="Calibri"/>
+        </w:rPr>
+        <w:t xml:space="preserve">已有跨 die/Socket CHI fabric 的系统，可以将 O 的脏共享责任或 F 的干净响应⁠责⁠任⁠映⁠射⁠到</w:t>
+      </w:r>
+    </w:p>
+    <w:p>
+      <w:pPr>
+        <w:ind w:left="0" w:firstLine="420"/>
+      </w:pPr>
+      <w:r>
+        <w:rPr>
+          <w:rFonts w:ascii="Calibri" w:hAnsi="Calibri" w:eastAsia="Microsoft YaHei" w:cs="Calibri"/>
+        </w:rPr>
+        <w:t xml:space="preserve">相应 agent、目录和事务规则中，复用标准 snoop 与 data 通道组织。O 与 F 解决不同⁠共⁠享⁠模⁠式⁠，</w:t>
+      </w:r>
+    </w:p>
+    <w:p>
+      <w:pPr>
+        <w:ind w:left="0" w:firstLine="420"/>
+      </w:pPr>
+      <w:r>
+        <w:rPr>
+          <w:rFonts w:ascii="Calibri" w:hAnsi="Calibri" w:eastAsia="Microsoft YaHei" w:cs="Calibri"/>
+        </w:rPr>
+        <w:t xml:space="preserve">应由工作负载和 agent 能力选择；使用 CHI 本身不等于实现任意完整⁠状⁠态⁠集⁠合⁠。</w:t>
+      </w:r>
+    </w:p>
+    <w:p>
+      <w:pPr>
+        <w:ind w:left="0" w:firstLine="420"/>
+      </w:pPr>
+      <w:r>
+        <w:rPr>
+          <w:rFonts w:ascii="Calibri" w:hAnsi="Calibri" w:eastAsia="Microsoft YaHei" w:cs="Calibri"/>
+        </w:rPr>
+        <w:t xml:space="preserve">其 latency 与 throughput 收益取决于实际转发路径、通道并行度和 credit 供给，traffic</w:t>
+      </w:r>
+    </w:p>
+    <w:p>
+      <w:pPr>
+        <w:ind w:left="0" w:firstLine="420"/>
+      </w:pPr>
+      <w:r>
+        <w:rPr>
+          <w:rFonts w:ascii="Calibri" w:hAnsi="Calibri" w:eastAsia="Microsoft YaHei" w:cs="Calibri"/>
+        </w:rPr>
+        <w:t xml:space="preserve">取决于 snoop 过滤与数据源选择。storage 则应包含 agent、channel、ID、credit 和跨域 bridge</w:t>
+      </w:r>
+    </w:p>
+    <w:p>
+      <w:pPr>
+        <w:ind w:left="0" w:firstLine="420"/>
+      </w:pPr>
+      <w:r>
+        <w:rPr>
+          <w:rFonts w:ascii="Calibri" w:hAnsi="Calibri" w:eastAsia="Microsoft YaHei" w:cs="Calibri"/>
+        </w:rPr>
+        <w:t xml:space="preserve">状态，而不仅是 3-bit 稳定状态。当互操作或现有 fabric 复用具有明确价值时，这⁠些⁠成⁠本⁠才⁠有</w:t>
+      </w:r>
+    </w:p>
+    <w:p>
+      <w:pPr>
+        <w:ind w:left="0" w:firstLine="420"/>
+      </w:pPr>
+      <w:r>
+        <w:rPr>
+          <w:rFonts w:ascii="Calibri" w:hAnsi="Calibri" w:eastAsia="Microsoft YaHei" w:cs="Calibri"/>
+        </w:rPr>
+        <w:t xml:space="preserve">对应的系统收益。图 7-4 保持节点内 CHI 与 Outer 组织的职责区分，当前 UBCC 的 Outer</w:t>
+      </w:r>
+    </w:p>
+    <w:p>
+      <w:pPr>
+        <w:ind w:left="0" w:firstLine="420"/>
+      </w:pPr>
+      <w:r>
+        <w:rPr>
+          <w:rFonts w:ascii="Calibri" w:hAnsi="Calibri" w:eastAsia="Microsoft YaHei" w:cs="Calibri"/>
+        </w:rPr>
+        <w:t xml:space="preserve">仍由专用消息和 Home UBCC 控⁠制⁠器⁠管⁠理⁠。</w:t>
+      </w:r>
+    </w:p>
+    <w:p>
+      <w:pPr>
+        <w:pStyle w:val="Heading3"/>
+        <w:keepNext/>
+      </w:pPr>
+      <w:r>
+        <w:rPr>
+          <w:rFonts w:ascii="Calibri" w:hAnsi="Calibri" w:eastAsia="SimHei" w:cs="Calibri"/>
+        </w:rPr>
+        <w:t xml:space="preserve">7.8.4 VI/MSI 与广播或探测</w:t>
+      </w:r>
+    </w:p>
+    <w:p>
+      <w:pPr>
+        <w:ind w:left="0" w:firstLine="420"/>
+      </w:pPr>
+      <w:r>
+        <w:rPr>
+          <w:rFonts w:ascii="Calibri" w:hAnsi="Calibri" w:eastAsia="Microsoft YaHei" w:cs="Calibri"/>
+        </w:rPr>
+        <w:t xml:space="preserve">小规模系统可用较简洁的稳定状态结合受控探测域来管理副本，以较小的稳定目⁠录⁠换⁠取⁠节⁠点</w:t>
+      </w:r>
+    </w:p>
+    <w:p>
+      <w:pPr>
+        <w:ind w:left="0" w:firstLine="420"/>
+      </w:pPr>
+      <w:r>
+        <w:rPr>
+          <w:rFonts w:ascii="Calibri" w:hAnsi="Calibri" w:eastAsia="Microsoft YaHei" w:cs="Calibri"/>
+        </w:rPr>
+        <w:t xml:space="preserve">参与权限查询。VI 需要外部机制补足写者与脏数据责任，MSI 则已表达 M 与 S；二⁠者⁠均⁠需⁠完⁠整</w:t>
+      </w:r>
+    </w:p>
+    <w:p>
+      <w:pPr>
+        <w:ind w:left="0" w:firstLine="420"/>
+      </w:pPr>
+      <w:r>
+        <w:rPr>
+          <w:rFonts w:ascii="Calibri" w:hAnsi="Calibri" w:eastAsia="Microsoft YaHei" w:cs="Calibri"/>
+        </w:rPr>
+        <w:t xml:space="preserve">的仲裁、失效和完成规则，不能由局部状态简单推导全局事务也⁠同⁠样⁠简⁠单⁠。</w:t>
+      </w:r>
+    </w:p>
+    <w:p>
+      <w:pPr>
+        <w:ind w:left="0" w:firstLine="420"/>
+      </w:pPr>
+      <w:r>
+        <w:rPr>
+          <w:rFonts w:ascii="Calibri" w:hAnsi="Calibri" w:eastAsia="Microsoft YaHei" w:cs="Calibri"/>
+        </w:rPr>
+        <w:t xml:space="preserve">节点数少且互连负载较低时，并行探测的 latency 可以受到控制；规模扩大后，候选⁠节⁠点⁠工⁠作⁠、</w:t>
+      </w:r>
+    </w:p>
+    <w:p>
+      <w:pPr>
+        <w:ind w:left="0" w:firstLine="420"/>
+      </w:pPr>
+      <w:r>
+        <w:rPr>
+          <w:rFonts w:ascii="Calibri" w:hAnsi="Calibri" w:eastAsia="Microsoft YaHei" w:cs="Calibri"/>
+        </w:rPr>
+        <w:t xml:space="preserve">响应尾部和网络排队会限制 throughput。尤其当实际 sharer 很少时，traffic 仍可能⁠接⁠近⁠全⁠节⁠点</w:t>
+      </w:r>
+    </w:p>
+    <w:p>
+      <w:pPr>
+        <w:ind w:left="0" w:firstLine="420"/>
+      </w:pPr>
+      <w:r>
+        <w:rPr>
+          <w:rFonts w:ascii="Calibri" w:hAnsi="Calibri" w:eastAsia="Microsoft YaHei" w:cs="Calibri"/>
+        </w:rPr>
+        <w:t xml:space="preserve">范围。storage 评估应同时计入接收端与网络瞬态缓冲。该组合适用于探测域足够小⁠或⁠稳⁠定⁠目⁠录</w:t>
+      </w:r>
+    </w:p>
+    <w:p>
+      <w:pPr>
+        <w:ind w:left="0" w:firstLine="420"/>
+      </w:pPr>
+      <w:r>
+        <w:rPr>
+          <w:rFonts w:ascii="Calibri" w:hAnsi="Calibri" w:eastAsia="Microsoft YaHei" w:cs="Calibri"/>
+        </w:rPr>
+        <w:t xml:space="preserve">预算极紧的条件；节点扩展和稀疏共享则更能体现精确目⁠录⁠的⁠价⁠值⁠。</w:t>
+      </w:r>
+    </w:p>
+    <w:p>
+      <w:pPr>
         <w:jc w:val="center"/>
         <w:spacing w:before="100" w:after="40" w:line="240" w:lineRule="auto"/>
       </w:pPr>
@@ -8123,6 +9991,28 @@
         <w:t xml:space="preserve">图 7-4　本地 CHI 与 Outer 组织边界</w:t>
       </w:r>
     </w:p>
+    <w:p>
+      <w:pPr>
+        <w:ind w:left="0" w:firstLine="420"/>
+      </w:pPr>
+      <w:r>
+        <w:rPr>
+          <w:rFonts w:ascii="Calibri" w:hAnsi="Calibri" w:eastAsia="Microsoft YaHei" w:cs="Calibri"/>
+        </w:rPr>
+        <w:t xml:space="preserve">下表汇总组合取舍。当前组合以精确 sharer、稳定事务身份和独立分层目录兼顾权⁠限⁠、⁠流⁠量⁠与</w:t>
+      </w:r>
+    </w:p>
+    <w:p>
+      <w:pPr>
+        <w:ind w:left="0" w:firstLine="420"/>
+      </w:pPr>
+      <w:r>
+        <w:rPr>
+          <w:rFonts w:ascii="Calibri" w:hAnsi="Calibri" w:eastAsia="Microsoft YaHei" w:cs="Calibri"/>
+        </w:rPr>
+        <w:t xml:space="preserve">容量；其他组合分别对应 owner 数据带宽、脏共享复用、互操作或目录预算等不同⁠主⁠导⁠约⁠束⁠。</w:t>
+      </w:r>
+    </w:p>
     <w:tbl>
       <w:tblPr>
         <w:tblStyle w:val="TableGrid"/>
@@ -8704,50 +10594,6 @@
         </w:tc>
       </w:tr>
     </w:tbl>
-    <w:p>
-      <w:pPr>
-        <w:ind w:left="0" w:firstLine="420"/>
-      </w:pPr>
-      <w:r>
-        <w:rPr>
-          <w:rFonts w:ascii="Calibri" w:hAnsi="Calibri" w:eastAsia="Microsoft YaHei" w:cs="Calibri"/>
-        </w:rPr>
-        <w:t xml:space="preserve">当前交付实现采用“节点内 CHI + MESI 类专用 Outer Home-directory + Home 数据中转⁠”⁠。⁠该⁠组⁠合</w:t>
-      </w:r>
-    </w:p>
-    <w:p>
-      <w:pPr>
-        <w:ind w:left="0" w:firstLine="420"/>
-      </w:pPr>
-      <w:r>
-        <w:rPr>
-          <w:rFonts w:ascii="Calibri" w:hAnsi="Calibri" w:eastAsia="Microsoft YaHei" w:cs="Calibri"/>
-        </w:rPr>
-        <w:t xml:space="preserve">将全局目录、事务资源和 H64 容量独立于节点内 HN-F，并以精确 sharer 和稳定事⁠务⁠身⁠份⁠控⁠制</w:t>
-      </w:r>
-    </w:p>
-    <w:p>
-      <w:pPr>
-        <w:ind w:left="0" w:firstLine="420"/>
-      </w:pPr>
-      <w:r>
-        <w:rPr>
-          <w:rFonts w:ascii="Calibri" w:hAnsi="Calibri" w:eastAsia="Microsoft YaHei" w:cs="Calibri"/>
-        </w:rPr>
-        <w:t xml:space="preserve">失效流量与重试。直接数据转发、MOESI/MESIF 状态扩展和 Outer CHI 可以在对应⁠数⁠据⁠路⁠径⁠、</w:t>
-      </w:r>
-    </w:p>
-    <w:p>
-      <w:pPr>
-        <w:ind w:left="0" w:firstLine="420"/>
-      </w:pPr>
-      <w:r>
-        <w:rPr>
-          <w:rFonts w:ascii="Calibri" w:hAnsi="Calibri" w:eastAsia="Microsoft YaHei" w:cs="Calibri"/>
-        </w:rPr>
-        <w:t xml:space="preserve">共享模式或互操作需求成为主要约束时⁠组⁠合⁠引⁠入⁠。</w:t>
-      </w:r>
-    </w:p>
     <w:p>
       <w:pPr>
         <w:pStyle w:val="Heading3"/>

</xml_diff>